<commit_message>
Add expanded Requirements Engineering documentation
Add expanded problem statement, stakeholders, functional and non-functional requirements
</commit_message>
<xml_diff>
--- a/Project Progress Report/Assignment_Phase_1-Thanh_Tran-24247169.docx
+++ b/Project Progress Report/Assignment_Phase_1-Thanh_Tran-24247169.docx
@@ -359,6 +359,7 @@
           <w:ilvl w:val="0"/>
           <w:numId w:val="3"/>
         </w:numPr>
+        <w:spacing w:line="360" w:lineRule="auto"/>
         <w:ind w:left="284"/>
         <w:rPr>
           <w:rFonts w:ascii="Arial" w:hAnsi="Arial" w:cs="Arial"/>
@@ -390,6 +391,7 @@
     </w:p>
     <w:p>
       <w:pPr>
+        <w:spacing w:line="360" w:lineRule="auto"/>
         <w:rPr>
           <w:rFonts w:ascii="Arial" w:eastAsiaTheme="majorEastAsia" w:hAnsi="Arial" w:cs="Arial"/>
           <w:color w:val="0F4761" w:themeColor="accent1" w:themeShade="BF"/>
@@ -411,6 +413,7 @@
           <w:ilvl w:val="0"/>
           <w:numId w:val="3"/>
         </w:numPr>
+        <w:spacing w:line="360" w:lineRule="auto"/>
         <w:ind w:left="284"/>
         <w:rPr>
           <w:rFonts w:ascii="Arial" w:hAnsi="Arial" w:cs="Arial"/>
@@ -436,6 +439,7 @@
     </w:p>
     <w:p>
       <w:pPr>
+        <w:spacing w:line="360" w:lineRule="auto"/>
         <w:ind w:left="284"/>
         <w:jc w:val="both"/>
         <w:rPr>
@@ -460,6 +464,7 @@
     </w:p>
     <w:p>
       <w:pPr>
+        <w:spacing w:line="360" w:lineRule="auto"/>
         <w:ind w:left="284"/>
         <w:jc w:val="both"/>
         <w:rPr>
@@ -502,6 +507,7 @@
     </w:p>
     <w:p>
       <w:pPr>
+        <w:spacing w:line="360" w:lineRule="auto"/>
         <w:ind w:left="284"/>
         <w:jc w:val="both"/>
         <w:rPr>
@@ -517,6 +523,7 @@
     </w:p>
     <w:p>
       <w:pPr>
+        <w:spacing w:line="360" w:lineRule="auto"/>
         <w:ind w:left="284"/>
         <w:jc w:val="both"/>
         <w:rPr>
@@ -543,7 +550,7 @@
           <w:ilvl w:val="0"/>
           <w:numId w:val="3"/>
         </w:numPr>
-        <w:spacing w:before="0" w:after="0"/>
+        <w:spacing w:before="0" w:after="0" w:line="360" w:lineRule="auto"/>
         <w:ind w:left="284"/>
         <w:rPr>
           <w:rFonts w:ascii="Arial" w:hAnsi="Arial" w:cs="Arial"/>
@@ -570,7 +577,7 @@
     <w:p>
       <w:pPr>
         <w:pStyle w:val="Heading1"/>
-        <w:spacing w:before="0"/>
+        <w:spacing w:before="0" w:line="360" w:lineRule="auto"/>
         <w:ind w:left="284"/>
         <w:rPr>
           <w:rFonts w:ascii="Arial" w:hAnsi="Arial" w:cs="Arial"/>
@@ -590,65 +597,9 @@
           <w:sz w:val="28"/>
           <w:szCs w:val="28"/>
         </w:rPr>
-        <w:t>2.1. Problem statement</w:t>
-      </w:r>
-    </w:p>
-    <w:p>
-      <w:pPr>
-        <w:ind w:left="851"/>
-        <w:jc w:val="both"/>
-        <w:rPr>
-          <w:rFonts w:ascii="Arial" w:hAnsi="Arial" w:cs="Arial"/>
-        </w:rPr>
-      </w:pPr>
-      <w:r>
-        <w:rPr>
-          <w:rFonts w:ascii="Arial" w:hAnsi="Arial" w:cs="Arial"/>
-        </w:rPr>
-        <w:t>AUT</w:t>
-      </w:r>
-      <w:r>
-        <w:rPr>
-          <w:rFonts w:ascii="Arial" w:hAnsi="Arial" w:cs="Arial"/>
-        </w:rPr>
-        <w:t xml:space="preserve"> requires a Student Enrolment and Course Management System to manage course selection, enrolment, and related processes. Students should be able to search for available courses, enrol in them, and view their enrolled courses. The system should automatically check prerequisites and course availability before allowing enrolment.</w:t>
-      </w:r>
-    </w:p>
-    <w:p>
-      <w:pPr>
-        <w:ind w:left="851"/>
-        <w:jc w:val="both"/>
-        <w:rPr>
-          <w:rFonts w:ascii="Arial" w:hAnsi="Arial" w:cs="Arial"/>
-        </w:rPr>
-      </w:pPr>
-      <w:r>
-        <w:rPr>
-          <w:rFonts w:ascii="Arial" w:hAnsi="Arial" w:cs="Arial"/>
-        </w:rPr>
-        <w:t>Staff should be able to review and approve enrolment requests, manage course information, and process payments to confirm enrolments. Different responsibilities are handled by different parts of the university, and the system must support smooth coordination between them.</w:t>
-      </w:r>
-    </w:p>
-    <w:p>
-      <w:pPr>
-        <w:ind w:left="851"/>
-        <w:jc w:val="both"/>
-        <w:rPr>
-          <w:rFonts w:ascii="Arial" w:hAnsi="Arial" w:cs="Arial"/>
-        </w:rPr>
-      </w:pPr>
-      <w:r>
-        <w:rPr>
-          <w:rFonts w:ascii="Arial" w:hAnsi="Arial" w:cs="Arial"/>
-        </w:rPr>
-        <w:t>The system should be accessible through a web browser on any device, support multiple users at the same time, and ensure that all data is accurate, secure, and up to date.</w:t>
-      </w:r>
-    </w:p>
-    <w:p>
-      <w:pPr>
-        <w:pStyle w:val="Heading1"/>
-        <w:spacing w:before="0"/>
-        <w:ind w:left="284"/>
+        <w:t>3</w:t>
+      </w:r>
+      <w:r>
         <w:rPr>
           <w:rFonts w:ascii="Arial" w:hAnsi="Arial" w:cs="Arial"/>
           <w:b/>
@@ -657,8 +608,158 @@
           <w:sz w:val="28"/>
           <w:szCs w:val="28"/>
         </w:rPr>
-      </w:pPr>
-      <w:r>
+        <w:t>.1. Problem statement</w:t>
+      </w:r>
+    </w:p>
+    <w:p>
+      <w:pPr>
+        <w:spacing w:line="360" w:lineRule="auto"/>
+        <w:ind w:left="851"/>
+        <w:jc w:val="both"/>
+        <w:rPr>
+          <w:rFonts w:ascii="Arial" w:hAnsi="Arial" w:cs="Arial"/>
+        </w:rPr>
+      </w:pPr>
+      <w:r>
+        <w:rPr>
+          <w:rFonts w:ascii="Arial" w:hAnsi="Arial" w:cs="Arial"/>
+        </w:rPr>
+        <w:t>The current enrolment process at Auckland University of Technology relies heavily on manual, paper-based procedures for managing student enrolment and course administration. This approach creates several operational challenges, including lost or misplaced enrolment forms, manual prerequisite checks prone to errors, delays in enrolment approval—especially during peak periods—and difficulty tracking student progress or course capacity. These inefficiencies result in slow processing times, inconsistent data, limited accessibility, and poor coordination between departments.</w:t>
+      </w:r>
+    </w:p>
+    <w:p>
+      <w:pPr>
+        <w:spacing w:line="360" w:lineRule="auto"/>
+        <w:ind w:left="851"/>
+        <w:jc w:val="both"/>
+        <w:rPr>
+          <w:rFonts w:ascii="Arial" w:hAnsi="Arial" w:cs="Arial"/>
+        </w:rPr>
+      </w:pPr>
+      <w:r>
+        <w:rPr>
+          <w:rFonts w:ascii="Arial" w:hAnsi="Arial" w:cs="Arial"/>
+        </w:rPr>
+        <w:t xml:space="preserve">To address these issues, </w:t>
+      </w:r>
+      <w:r>
+        <w:rPr>
+          <w:rFonts w:ascii="Arial" w:hAnsi="Arial" w:cs="Arial"/>
+        </w:rPr>
+        <w:t>AUT</w:t>
+      </w:r>
+      <w:r>
+        <w:rPr>
+          <w:rFonts w:ascii="Arial" w:hAnsi="Arial" w:cs="Arial"/>
+        </w:rPr>
+        <w:t xml:space="preserve"> requires a Student Enrolment and Course Management System to manage course selection, enrolment, and related </w:t>
+      </w:r>
+      <w:r>
+        <w:rPr>
+          <w:rFonts w:ascii="Arial" w:hAnsi="Arial" w:cs="Arial"/>
+        </w:rPr>
+        <w:t xml:space="preserve">academic </w:t>
+      </w:r>
+      <w:r>
+        <w:rPr>
+          <w:rFonts w:ascii="Arial" w:hAnsi="Arial" w:cs="Arial"/>
+        </w:rPr>
+        <w:t xml:space="preserve">processes. </w:t>
+      </w:r>
+      <w:r>
+        <w:rPr>
+          <w:rFonts w:ascii="Arial" w:hAnsi="Arial" w:cs="Arial"/>
+        </w:rPr>
+        <w:t>The system must operate across multiple departments, including the Academic Department, Registry/Admissions Office, and Finance Department, each responsible for different aspects of the enrolment workflow.</w:t>
+      </w:r>
+      <w:r>
+        <w:t xml:space="preserve"> </w:t>
+      </w:r>
+      <w:r>
+        <w:rPr>
+          <w:rFonts w:ascii="Arial" w:hAnsi="Arial" w:cs="Arial"/>
+        </w:rPr>
+        <w:t>The system must support both domestic and international students, who may have different enrolment requirements, fee structures, and approval processes.</w:t>
+      </w:r>
+    </w:p>
+    <w:p>
+      <w:pPr>
+        <w:spacing w:line="360" w:lineRule="auto"/>
+        <w:ind w:left="851"/>
+        <w:jc w:val="both"/>
+        <w:rPr>
+          <w:rFonts w:ascii="Arial" w:hAnsi="Arial" w:cs="Arial"/>
+        </w:rPr>
+      </w:pPr>
+      <w:r>
+        <w:rPr>
+          <w:rFonts w:ascii="Arial" w:hAnsi="Arial" w:cs="Arial"/>
+        </w:rPr>
+        <w:t>Students should be able to search for available courses, enrol in them, and view their enrolled courses through the system. The system must automatically enforce key business rules, such as checking prerequisites, validating course availability, and preventing timetable conflicts before confirming enrolment. When selecting courses, students will be able to view a timetable of the courses they have chosen, and the system will automatically detect any clashes and display them visually. Students can then adjust their selection based on these clashes to ensure a feasible schedule.</w:t>
+      </w:r>
+    </w:p>
+    <w:p>
+      <w:pPr>
+        <w:spacing w:line="360" w:lineRule="auto"/>
+        <w:ind w:left="851"/>
+        <w:jc w:val="both"/>
+        <w:rPr>
+          <w:rFonts w:ascii="Arial" w:hAnsi="Arial" w:cs="Arial"/>
+        </w:rPr>
+      </w:pPr>
+      <w:r>
+        <w:rPr>
+          <w:rFonts w:ascii="Arial" w:hAnsi="Arial" w:cs="Arial"/>
+        </w:rPr>
+        <w:t xml:space="preserve">Staff members will perform distinct tasks depending on their department. Academic Department staff are responsible for maintaining course information, including course descriptions, prerequisites, capacity limits, and timetable details. Registry/Admissions Office staff review and approve student enrolment requests, </w:t>
+      </w:r>
+      <w:r>
+        <w:rPr>
+          <w:rFonts w:ascii="Arial" w:hAnsi="Arial" w:cs="Arial"/>
+        </w:rPr>
+        <w:lastRenderedPageBreak/>
+        <w:t>ensuring that all prerequisite, course availability, and timetable clash rules are satisfied. Finance Department staff process tuition and course-related payments and confirm enrolments only after successful payment verification. Since these responsibilities are distributed across departments, the system must ensure efficient coordination, secure data sharing, and real-time updates among all stakeholders</w:t>
+      </w:r>
+      <w:r>
+        <w:rPr>
+          <w:rFonts w:ascii="Arial" w:hAnsi="Arial" w:cs="Arial"/>
+        </w:rPr>
+        <w:t>.</w:t>
+      </w:r>
+    </w:p>
+    <w:p>
+      <w:pPr>
+        <w:spacing w:line="360" w:lineRule="auto"/>
+        <w:ind w:left="851"/>
+        <w:jc w:val="both"/>
+        <w:rPr>
+          <w:rFonts w:ascii="Arial" w:hAnsi="Arial" w:cs="Arial"/>
+        </w:rPr>
+      </w:pPr>
+      <w:r>
+        <w:rPr>
+          <w:rFonts w:ascii="Arial" w:hAnsi="Arial" w:cs="Arial"/>
+        </w:rPr>
+        <w:t xml:space="preserve">The proposed system will be a web-based application accessible through a browser on any device. It must support multiple concurrent users while ensuring data accuracy, security, and real-time updates. By replacing the existing manual process, the system aims to improve operational efficiency, reduce errors, and enhance the overall user experience for </w:t>
+      </w:r>
+      <w:r>
+        <w:rPr>
+          <w:rFonts w:ascii="Arial" w:hAnsi="Arial" w:cs="Arial"/>
+        </w:rPr>
+        <w:t>both domestic and international students, as well as staff</w:t>
+      </w:r>
+      <w:r>
+        <w:rPr>
+          <w:rFonts w:ascii="Arial" w:hAnsi="Arial" w:cs="Arial"/>
+        </w:rPr>
+        <w:t>.</w:t>
+      </w:r>
+    </w:p>
+    <w:p>
+      <w:pPr>
+        <w:pStyle w:val="Heading1"/>
+        <w:spacing w:before="0" w:line="360" w:lineRule="auto"/>
+        <w:ind w:left="284"/>
         <w:rPr>
           <w:rFonts w:ascii="Arial" w:hAnsi="Arial" w:cs="Arial"/>
           <w:b/>
@@ -667,8 +768,7 @@
           <w:sz w:val="28"/>
           <w:szCs w:val="28"/>
         </w:rPr>
-        <w:t>2.</w:t>
-      </w:r>
+      </w:pPr>
       <w:r>
         <w:rPr>
           <w:rFonts w:ascii="Arial" w:hAnsi="Arial" w:cs="Arial"/>
@@ -678,7 +778,7 @@
           <w:sz w:val="28"/>
           <w:szCs w:val="28"/>
         </w:rPr>
-        <w:t>2</w:t>
+        <w:t>3</w:t>
       </w:r>
       <w:r>
         <w:rPr>
@@ -689,7 +789,7 @@
           <w:sz w:val="28"/>
           <w:szCs w:val="28"/>
         </w:rPr>
-        <w:t xml:space="preserve">. </w:t>
+        <w:t>.</w:t>
       </w:r>
       <w:r>
         <w:rPr>
@@ -700,16 +800,1840 @@
           <w:sz w:val="28"/>
           <w:szCs w:val="28"/>
         </w:rPr>
+        <w:t>2</w:t>
+      </w:r>
+      <w:r>
+        <w:rPr>
+          <w:rFonts w:ascii="Arial" w:hAnsi="Arial" w:cs="Arial"/>
+          <w:b/>
+          <w:bCs/>
+          <w:color w:val="EE0000"/>
+          <w:sz w:val="28"/>
+          <w:szCs w:val="28"/>
+        </w:rPr>
+        <w:t xml:space="preserve">. </w:t>
+      </w:r>
+      <w:r>
+        <w:rPr>
+          <w:rFonts w:ascii="Arial" w:hAnsi="Arial" w:cs="Arial"/>
+          <w:b/>
+          <w:bCs/>
+          <w:color w:val="EE0000"/>
+          <w:sz w:val="28"/>
+          <w:szCs w:val="28"/>
+        </w:rPr>
         <w:t>Requirement Analysis</w:t>
       </w:r>
     </w:p>
     <w:p>
       <w:pPr>
-        <w:ind w:left="567"/>
-        <w:rPr>
-          <w:rFonts w:ascii="Arial" w:hAnsi="Arial" w:cs="Arial"/>
-        </w:rPr>
-      </w:pPr>
+        <w:pStyle w:val="Heading2"/>
+        <w:ind w:left="851"/>
+        <w:rPr>
+          <w:rFonts w:ascii="Arial" w:hAnsi="Arial" w:cs="Arial"/>
+          <w:b/>
+          <w:bCs/>
+          <w:color w:val="EE0000"/>
+          <w:sz w:val="24"/>
+          <w:szCs w:val="24"/>
+        </w:rPr>
+      </w:pPr>
+      <w:r>
+        <w:rPr>
+          <w:rFonts w:ascii="Arial" w:hAnsi="Arial" w:cs="Arial"/>
+          <w:b/>
+          <w:bCs/>
+          <w:color w:val="EE0000"/>
+          <w:sz w:val="24"/>
+          <w:szCs w:val="24"/>
+        </w:rPr>
+        <w:t>i.</w:t>
+      </w:r>
+      <w:r>
+        <w:rPr>
+          <w:rFonts w:ascii="Arial" w:hAnsi="Arial" w:cs="Arial"/>
+          <w:b/>
+          <w:bCs/>
+          <w:color w:val="EE0000"/>
+          <w:sz w:val="24"/>
+          <w:szCs w:val="24"/>
+        </w:rPr>
+        <w:t xml:space="preserve"> Stakeholders and Roles</w:t>
+      </w:r>
+    </w:p>
+    <w:p>
+      <w:pPr>
+        <w:spacing w:line="360" w:lineRule="auto"/>
+        <w:ind w:left="1134"/>
+        <w:rPr>
+          <w:rFonts w:ascii="Arial" w:hAnsi="Arial" w:cs="Arial"/>
+        </w:rPr>
+      </w:pPr>
+      <w:r>
+        <w:rPr>
+          <w:rFonts w:ascii="Arial" w:hAnsi="Arial" w:cs="Arial"/>
+        </w:rPr>
+        <w:t>Based on the problem statement, the key stakeholders and their respective roles are identified as follows</w:t>
+      </w:r>
+      <w:r>
+        <w:rPr>
+          <w:rFonts w:ascii="Arial" w:hAnsi="Arial" w:cs="Arial"/>
+        </w:rPr>
+        <w:t xml:space="preserve">: </w:t>
+      </w:r>
+    </w:p>
+    <w:p>
+      <w:pPr>
+        <w:pStyle w:val="ListParagraph"/>
+        <w:numPr>
+          <w:ilvl w:val="0"/>
+          <w:numId w:val="4"/>
+        </w:numPr>
+        <w:spacing w:line="360" w:lineRule="auto"/>
+        <w:ind w:left="1560"/>
+        <w:rPr>
+          <w:rFonts w:ascii="Arial" w:hAnsi="Arial" w:cs="Arial"/>
+        </w:rPr>
+      </w:pPr>
+      <w:r>
+        <w:rPr>
+          <w:rFonts w:ascii="Arial" w:hAnsi="Arial" w:cs="Arial"/>
+          <w:b/>
+          <w:bCs/>
+        </w:rPr>
+        <w:t>Student (Domestic / International)</w:t>
+      </w:r>
+      <w:r>
+        <w:rPr>
+          <w:rFonts w:ascii="Arial" w:hAnsi="Arial" w:cs="Arial"/>
+          <w:b/>
+          <w:bCs/>
+        </w:rPr>
+        <w:t>:</w:t>
+      </w:r>
+      <w:r>
+        <w:rPr>
+          <w:rFonts w:ascii="Arial" w:hAnsi="Arial" w:cs="Arial"/>
+        </w:rPr>
+        <w:t xml:space="preserve"> </w:t>
+      </w:r>
+      <w:r>
+        <w:rPr>
+          <w:rFonts w:ascii="Arial" w:hAnsi="Arial" w:cs="Arial"/>
+        </w:rPr>
+        <w:t>Search courses, enrol, view enrolled courses, check timetable and clashes, manage enrolment requests</w:t>
+      </w:r>
+    </w:p>
+    <w:p>
+      <w:pPr>
+        <w:pStyle w:val="ListParagraph"/>
+        <w:numPr>
+          <w:ilvl w:val="0"/>
+          <w:numId w:val="4"/>
+        </w:numPr>
+        <w:spacing w:line="360" w:lineRule="auto"/>
+        <w:ind w:left="1560"/>
+        <w:rPr>
+          <w:rFonts w:ascii="Arial" w:hAnsi="Arial" w:cs="Arial"/>
+        </w:rPr>
+      </w:pPr>
+      <w:r>
+        <w:rPr>
+          <w:rFonts w:ascii="Arial" w:hAnsi="Arial" w:cs="Arial"/>
+          <w:b/>
+          <w:bCs/>
+        </w:rPr>
+        <w:t>Academic Department Staff</w:t>
+      </w:r>
+      <w:r>
+        <w:rPr>
+          <w:rFonts w:ascii="Arial" w:hAnsi="Arial" w:cs="Arial"/>
+          <w:b/>
+          <w:bCs/>
+        </w:rPr>
+        <w:t>:</w:t>
+      </w:r>
+      <w:r>
+        <w:rPr>
+          <w:rFonts w:ascii="Arial" w:hAnsi="Arial" w:cs="Arial"/>
+        </w:rPr>
+        <w:t xml:space="preserve"> </w:t>
+      </w:r>
+      <w:r>
+        <w:rPr>
+          <w:rFonts w:ascii="Arial" w:hAnsi="Arial" w:cs="Arial"/>
+        </w:rPr>
+        <w:t>Maintain course information, prerequisites, capacity, timetable details</w:t>
+      </w:r>
+    </w:p>
+    <w:p>
+      <w:pPr>
+        <w:pStyle w:val="ListParagraph"/>
+        <w:numPr>
+          <w:ilvl w:val="0"/>
+          <w:numId w:val="4"/>
+        </w:numPr>
+        <w:spacing w:line="360" w:lineRule="auto"/>
+        <w:ind w:left="1560"/>
+        <w:rPr>
+          <w:rFonts w:ascii="Arial" w:hAnsi="Arial" w:cs="Arial"/>
+        </w:rPr>
+      </w:pPr>
+      <w:r>
+        <w:rPr>
+          <w:rFonts w:ascii="Arial" w:hAnsi="Arial" w:cs="Arial"/>
+          <w:b/>
+          <w:bCs/>
+        </w:rPr>
+        <w:t>Registry / Admissions Staff</w:t>
+      </w:r>
+      <w:r>
+        <w:rPr>
+          <w:rFonts w:ascii="Arial" w:hAnsi="Arial" w:cs="Arial"/>
+          <w:b/>
+          <w:bCs/>
+        </w:rPr>
+        <w:t>:</w:t>
+      </w:r>
+      <w:r>
+        <w:rPr>
+          <w:rFonts w:ascii="Arial" w:hAnsi="Arial" w:cs="Arial"/>
+        </w:rPr>
+        <w:t xml:space="preserve"> </w:t>
+      </w:r>
+      <w:r>
+        <w:rPr>
+          <w:rFonts w:ascii="Arial" w:hAnsi="Arial" w:cs="Arial"/>
+        </w:rPr>
+        <w:t>Review and approve enrolment requests, enforce enrolment rules (prerequisites, timetable conflicts)</w:t>
+      </w:r>
+    </w:p>
+    <w:p>
+      <w:pPr>
+        <w:pStyle w:val="ListParagraph"/>
+        <w:numPr>
+          <w:ilvl w:val="0"/>
+          <w:numId w:val="4"/>
+        </w:numPr>
+        <w:spacing w:line="360" w:lineRule="auto"/>
+        <w:ind w:left="1560"/>
+        <w:rPr>
+          <w:rFonts w:ascii="Arial" w:hAnsi="Arial" w:cs="Arial"/>
+        </w:rPr>
+      </w:pPr>
+      <w:r>
+        <w:rPr>
+          <w:rFonts w:ascii="Arial" w:hAnsi="Arial" w:cs="Arial"/>
+          <w:b/>
+          <w:bCs/>
+        </w:rPr>
+        <w:t>Finance Department Staff</w:t>
+      </w:r>
+      <w:r>
+        <w:rPr>
+          <w:rFonts w:ascii="Arial" w:hAnsi="Arial" w:cs="Arial"/>
+          <w:b/>
+          <w:bCs/>
+        </w:rPr>
+        <w:t>:</w:t>
+      </w:r>
+      <w:r>
+        <w:rPr>
+          <w:rFonts w:ascii="Arial" w:hAnsi="Arial" w:cs="Arial"/>
+        </w:rPr>
+        <w:t xml:space="preserve"> </w:t>
+      </w:r>
+      <w:r>
+        <w:rPr>
+          <w:rFonts w:ascii="Arial" w:hAnsi="Arial" w:cs="Arial"/>
+        </w:rPr>
+        <w:t>Process tuition/course payments, confirm enrolment upon payment verification</w:t>
+      </w:r>
+    </w:p>
+    <w:p>
+      <w:pPr>
+        <w:pStyle w:val="ListParagraph"/>
+        <w:numPr>
+          <w:ilvl w:val="0"/>
+          <w:numId w:val="4"/>
+        </w:numPr>
+        <w:spacing w:line="360" w:lineRule="auto"/>
+        <w:ind w:left="1560"/>
+        <w:rPr>
+          <w:rFonts w:ascii="Arial" w:hAnsi="Arial" w:cs="Arial"/>
+        </w:rPr>
+      </w:pPr>
+      <w:r>
+        <w:rPr>
+          <w:rFonts w:ascii="Arial" w:hAnsi="Arial" w:cs="Arial"/>
+          <w:b/>
+          <w:bCs/>
+        </w:rPr>
+        <w:t>System Administrator</w:t>
+      </w:r>
+      <w:r>
+        <w:rPr>
+          <w:rFonts w:ascii="Arial" w:hAnsi="Arial" w:cs="Arial"/>
+          <w:b/>
+          <w:bCs/>
+        </w:rPr>
+        <w:t>:</w:t>
+      </w:r>
+      <w:r>
+        <w:rPr>
+          <w:rFonts w:ascii="Arial" w:hAnsi="Arial" w:cs="Arial"/>
+        </w:rPr>
+        <w:t xml:space="preserve"> </w:t>
+      </w:r>
+      <w:r>
+        <w:rPr>
+          <w:rFonts w:ascii="Arial" w:hAnsi="Arial" w:cs="Arial"/>
+        </w:rPr>
+        <w:t>Manage user accounts, access control, ensure system uptime and security</w:t>
+      </w:r>
+    </w:p>
+    <w:p>
+      <w:pPr>
+        <w:pStyle w:val="Heading2"/>
+        <w:ind w:left="851"/>
+        <w:rPr>
+          <w:rFonts w:ascii="Arial" w:hAnsi="Arial" w:cs="Arial"/>
+          <w:b/>
+          <w:bCs/>
+          <w:color w:val="EE0000"/>
+          <w:sz w:val="24"/>
+          <w:szCs w:val="24"/>
+        </w:rPr>
+      </w:pPr>
+      <w:r>
+        <w:rPr>
+          <w:rFonts w:ascii="Arial" w:hAnsi="Arial" w:cs="Arial"/>
+          <w:b/>
+          <w:bCs/>
+          <w:color w:val="EE0000"/>
+          <w:sz w:val="24"/>
+          <w:szCs w:val="24"/>
+        </w:rPr>
+        <w:lastRenderedPageBreak/>
+        <w:t>i</w:t>
+      </w:r>
+      <w:r>
+        <w:rPr>
+          <w:rFonts w:ascii="Arial" w:hAnsi="Arial" w:cs="Arial"/>
+          <w:b/>
+          <w:bCs/>
+          <w:color w:val="EE0000"/>
+          <w:sz w:val="24"/>
+          <w:szCs w:val="24"/>
+        </w:rPr>
+        <w:t>i.</w:t>
+      </w:r>
+      <w:r>
+        <w:rPr>
+          <w:rFonts w:ascii="Arial" w:hAnsi="Arial" w:cs="Arial"/>
+          <w:b/>
+          <w:bCs/>
+          <w:color w:val="EE0000"/>
+          <w:sz w:val="24"/>
+          <w:szCs w:val="24"/>
+        </w:rPr>
+        <w:t xml:space="preserve"> Functional Requirement</w:t>
+      </w:r>
+      <w:r>
+        <w:rPr>
+          <w:rFonts w:ascii="Arial" w:hAnsi="Arial" w:cs="Arial"/>
+          <w:b/>
+          <w:bCs/>
+          <w:color w:val="EE0000"/>
+          <w:sz w:val="24"/>
+          <w:szCs w:val="24"/>
+        </w:rPr>
+        <w:t>s</w:t>
+      </w:r>
+    </w:p>
+    <w:p>
+      <w:pPr>
+        <w:spacing w:line="360" w:lineRule="auto"/>
+        <w:ind w:left="1134"/>
+        <w:rPr>
+          <w:rFonts w:ascii="Arial" w:hAnsi="Arial" w:cs="Arial"/>
+        </w:rPr>
+      </w:pPr>
+      <w:r>
+        <w:rPr>
+          <w:rFonts w:ascii="Arial" w:hAnsi="Arial" w:cs="Arial"/>
+        </w:rPr>
+        <w:t>Based on the problem statement, the system’s key functional requirements</w:t>
+      </w:r>
+      <w:r>
+        <w:rPr>
+          <w:rFonts w:ascii="Arial" w:hAnsi="Arial" w:cs="Arial"/>
+        </w:rPr>
+        <w:t xml:space="preserve"> </w:t>
+      </w:r>
+      <w:r>
+        <w:rPr>
+          <w:rFonts w:ascii="Arial" w:hAnsi="Arial" w:cs="Arial"/>
+        </w:rPr>
+        <w:t>are identified as follows</w:t>
+      </w:r>
+      <w:r>
+        <w:rPr>
+          <w:rFonts w:ascii="Arial" w:hAnsi="Arial" w:cs="Arial"/>
+        </w:rPr>
+        <w:t xml:space="preserve">: </w:t>
+      </w:r>
+    </w:p>
+    <w:p>
+      <w:pPr>
+        <w:pStyle w:val="ListParagraph"/>
+        <w:numPr>
+          <w:ilvl w:val="0"/>
+          <w:numId w:val="5"/>
+        </w:numPr>
+        <w:spacing w:line="360" w:lineRule="auto"/>
+        <w:ind w:left="1560"/>
+        <w:rPr>
+          <w:rFonts w:ascii="Arial" w:hAnsi="Arial" w:cs="Arial"/>
+        </w:rPr>
+      </w:pPr>
+      <w:r>
+        <w:rPr>
+          <w:rFonts w:ascii="Arial" w:hAnsi="Arial" w:cs="Arial"/>
+        </w:rPr>
+        <w:t>Course Search and Viewing</w:t>
+      </w:r>
+      <w:r>
+        <w:rPr>
+          <w:rFonts w:ascii="Arial" w:hAnsi="Arial" w:cs="Arial"/>
+        </w:rPr>
+        <w:t>:</w:t>
+      </w:r>
+    </w:p>
+    <w:p>
+      <w:pPr>
+        <w:pStyle w:val="ListParagraph"/>
+        <w:numPr>
+          <w:ilvl w:val="1"/>
+          <w:numId w:val="5"/>
+        </w:numPr>
+        <w:spacing w:line="360" w:lineRule="auto"/>
+        <w:ind w:left="1843"/>
+        <w:rPr>
+          <w:rFonts w:ascii="Arial" w:hAnsi="Arial" w:cs="Arial"/>
+        </w:rPr>
+      </w:pPr>
+      <w:r>
+        <w:rPr>
+          <w:rFonts w:ascii="Arial" w:hAnsi="Arial" w:cs="Arial"/>
+        </w:rPr>
+        <w:t>The system shall allow students to search for available courses by course code, course name, or department.</w:t>
+      </w:r>
+    </w:p>
+    <w:p>
+      <w:pPr>
+        <w:pStyle w:val="ListParagraph"/>
+        <w:numPr>
+          <w:ilvl w:val="1"/>
+          <w:numId w:val="5"/>
+        </w:numPr>
+        <w:spacing w:line="360" w:lineRule="auto"/>
+        <w:ind w:left="1843"/>
+        <w:rPr>
+          <w:rFonts w:ascii="Arial" w:hAnsi="Arial" w:cs="Arial"/>
+        </w:rPr>
+      </w:pPr>
+      <w:r>
+        <w:rPr>
+          <w:rFonts w:ascii="Arial" w:hAnsi="Arial" w:cs="Arial"/>
+        </w:rPr>
+        <w:t>The system shall display detailed course information, including course description, prerequisites, capacity, and timetable.</w:t>
+      </w:r>
+    </w:p>
+    <w:p>
+      <w:pPr>
+        <w:pStyle w:val="ListParagraph"/>
+        <w:numPr>
+          <w:ilvl w:val="0"/>
+          <w:numId w:val="5"/>
+        </w:numPr>
+        <w:spacing w:line="360" w:lineRule="auto"/>
+        <w:ind w:left="1560"/>
+        <w:rPr>
+          <w:rFonts w:ascii="Arial" w:hAnsi="Arial" w:cs="Arial"/>
+        </w:rPr>
+      </w:pPr>
+      <w:r>
+        <w:rPr>
+          <w:rFonts w:ascii="Arial" w:hAnsi="Arial" w:cs="Arial"/>
+        </w:rPr>
+        <w:t>Course Enrolment</w:t>
+      </w:r>
+      <w:r>
+        <w:rPr>
+          <w:rFonts w:ascii="Arial" w:hAnsi="Arial" w:cs="Arial"/>
+        </w:rPr>
+        <w:t>:</w:t>
+      </w:r>
+    </w:p>
+    <w:p>
+      <w:pPr>
+        <w:pStyle w:val="ListParagraph"/>
+        <w:numPr>
+          <w:ilvl w:val="1"/>
+          <w:numId w:val="5"/>
+        </w:numPr>
+        <w:spacing w:line="360" w:lineRule="auto"/>
+        <w:ind w:left="1843"/>
+        <w:rPr>
+          <w:rFonts w:ascii="Arial" w:hAnsi="Arial" w:cs="Arial"/>
+        </w:rPr>
+      </w:pPr>
+      <w:r>
+        <w:rPr>
+          <w:rFonts w:ascii="Arial" w:hAnsi="Arial" w:cs="Arial"/>
+        </w:rPr>
+        <w:t>The system shall allow students to enrol in selected courses.</w:t>
+      </w:r>
+    </w:p>
+    <w:p>
+      <w:pPr>
+        <w:pStyle w:val="ListParagraph"/>
+        <w:numPr>
+          <w:ilvl w:val="1"/>
+          <w:numId w:val="5"/>
+        </w:numPr>
+        <w:spacing w:line="360" w:lineRule="auto"/>
+        <w:ind w:left="1843"/>
+        <w:rPr>
+          <w:rFonts w:ascii="Arial" w:hAnsi="Arial" w:cs="Arial"/>
+        </w:rPr>
+      </w:pPr>
+      <w:r>
+        <w:rPr>
+          <w:rFonts w:ascii="Arial" w:hAnsi="Arial" w:cs="Arial"/>
+        </w:rPr>
+        <w:t>The system shall automatically check prerequisites before allowing enrolment.</w:t>
+      </w:r>
+    </w:p>
+    <w:p>
+      <w:pPr>
+        <w:pStyle w:val="ListParagraph"/>
+        <w:numPr>
+          <w:ilvl w:val="1"/>
+          <w:numId w:val="5"/>
+        </w:numPr>
+        <w:spacing w:line="360" w:lineRule="auto"/>
+        <w:ind w:left="1843"/>
+        <w:rPr>
+          <w:rFonts w:ascii="Arial" w:hAnsi="Arial" w:cs="Arial"/>
+        </w:rPr>
+      </w:pPr>
+      <w:r>
+        <w:rPr>
+          <w:rFonts w:ascii="Arial" w:hAnsi="Arial" w:cs="Arial"/>
+        </w:rPr>
+        <w:t>The system shall automatically verify course availability before confirming enrolment.</w:t>
+      </w:r>
+    </w:p>
+    <w:p>
+      <w:pPr>
+        <w:pStyle w:val="ListParagraph"/>
+        <w:numPr>
+          <w:ilvl w:val="1"/>
+          <w:numId w:val="5"/>
+        </w:numPr>
+        <w:spacing w:line="360" w:lineRule="auto"/>
+        <w:ind w:left="1843"/>
+        <w:rPr>
+          <w:rFonts w:ascii="Arial" w:hAnsi="Arial" w:cs="Arial"/>
+        </w:rPr>
+      </w:pPr>
+      <w:r>
+        <w:rPr>
+          <w:rFonts w:ascii="Arial" w:hAnsi="Arial" w:cs="Arial"/>
+        </w:rPr>
+        <w:t>The system shall detect timetable clashes and notify students before enrolment confirmation.</w:t>
+      </w:r>
+    </w:p>
+    <w:p>
+      <w:pPr>
+        <w:pStyle w:val="ListParagraph"/>
+        <w:numPr>
+          <w:ilvl w:val="1"/>
+          <w:numId w:val="5"/>
+        </w:numPr>
+        <w:spacing w:line="360" w:lineRule="auto"/>
+        <w:ind w:left="1843"/>
+        <w:rPr>
+          <w:rFonts w:ascii="Arial" w:hAnsi="Arial" w:cs="Arial"/>
+        </w:rPr>
+      </w:pPr>
+      <w:r>
+        <w:rPr>
+          <w:rFonts w:ascii="Arial" w:hAnsi="Arial" w:cs="Arial"/>
+        </w:rPr>
+        <w:t>The system shall allow students to adjust their course selection if timetable conflicts are detected.</w:t>
+      </w:r>
+    </w:p>
+    <w:p>
+      <w:pPr>
+        <w:pStyle w:val="ListParagraph"/>
+        <w:numPr>
+          <w:ilvl w:val="0"/>
+          <w:numId w:val="5"/>
+        </w:numPr>
+        <w:spacing w:line="360" w:lineRule="auto"/>
+        <w:ind w:left="1560"/>
+        <w:rPr>
+          <w:rFonts w:ascii="Arial" w:hAnsi="Arial" w:cs="Arial"/>
+        </w:rPr>
+      </w:pPr>
+      <w:r>
+        <w:rPr>
+          <w:rFonts w:ascii="Arial" w:hAnsi="Arial" w:cs="Arial"/>
+        </w:rPr>
+        <w:t>Timetable Management (Enrolment View)</w:t>
+      </w:r>
+      <w:r>
+        <w:rPr>
+          <w:rFonts w:ascii="Arial" w:hAnsi="Arial" w:cs="Arial"/>
+        </w:rPr>
+        <w:t>:</w:t>
+      </w:r>
+    </w:p>
+    <w:p>
+      <w:pPr>
+        <w:pStyle w:val="ListParagraph"/>
+        <w:numPr>
+          <w:ilvl w:val="1"/>
+          <w:numId w:val="5"/>
+        </w:numPr>
+        <w:spacing w:line="360" w:lineRule="auto"/>
+        <w:ind w:left="1843"/>
+        <w:rPr>
+          <w:rFonts w:ascii="Arial" w:hAnsi="Arial" w:cs="Arial"/>
+        </w:rPr>
+      </w:pPr>
+      <w:r>
+        <w:rPr>
+          <w:rFonts w:ascii="Arial" w:hAnsi="Arial" w:cs="Arial"/>
+        </w:rPr>
+        <w:t>The system shall display a timetable of the student’s enrolled courses.</w:t>
+      </w:r>
+    </w:p>
+    <w:p>
+      <w:pPr>
+        <w:pStyle w:val="ListParagraph"/>
+        <w:numPr>
+          <w:ilvl w:val="1"/>
+          <w:numId w:val="5"/>
+        </w:numPr>
+        <w:spacing w:line="360" w:lineRule="auto"/>
+        <w:ind w:left="1843"/>
+        <w:rPr>
+          <w:rFonts w:ascii="Arial" w:hAnsi="Arial" w:cs="Arial"/>
+        </w:rPr>
+      </w:pPr>
+      <w:r>
+        <w:rPr>
+          <w:rFonts w:ascii="Arial" w:hAnsi="Arial" w:cs="Arial"/>
+        </w:rPr>
+        <w:t>The system shall visually highlight any timetable clashes between selected courses.</w:t>
+      </w:r>
+    </w:p>
+    <w:p>
+      <w:pPr>
+        <w:pStyle w:val="ListParagraph"/>
+        <w:numPr>
+          <w:ilvl w:val="0"/>
+          <w:numId w:val="5"/>
+        </w:numPr>
+        <w:spacing w:line="360" w:lineRule="auto"/>
+        <w:ind w:left="1560"/>
+        <w:rPr>
+          <w:rFonts w:ascii="Arial" w:hAnsi="Arial" w:cs="Arial"/>
+        </w:rPr>
+      </w:pPr>
+      <w:r>
+        <w:rPr>
+          <w:rFonts w:ascii="Arial" w:hAnsi="Arial" w:cs="Arial"/>
+        </w:rPr>
+        <w:t>Staff Course Management</w:t>
+      </w:r>
+      <w:r>
+        <w:rPr>
+          <w:rFonts w:ascii="Arial" w:hAnsi="Arial" w:cs="Arial"/>
+        </w:rPr>
+        <w:t>:</w:t>
+      </w:r>
+    </w:p>
+    <w:p>
+      <w:pPr>
+        <w:pStyle w:val="ListParagraph"/>
+        <w:numPr>
+          <w:ilvl w:val="1"/>
+          <w:numId w:val="5"/>
+        </w:numPr>
+        <w:spacing w:line="360" w:lineRule="auto"/>
+        <w:ind w:left="1843"/>
+        <w:rPr>
+          <w:rFonts w:ascii="Arial" w:hAnsi="Arial" w:cs="Arial"/>
+        </w:rPr>
+      </w:pPr>
+      <w:r>
+        <w:rPr>
+          <w:rFonts w:ascii="Arial" w:hAnsi="Arial" w:cs="Arial"/>
+        </w:rPr>
+        <w:t>The system shall allow Academic Department staff to add, update, and remove course information, including descriptions, prerequisites, capacity, and timetable details.</w:t>
+      </w:r>
+    </w:p>
+    <w:p>
+      <w:pPr>
+        <w:pStyle w:val="ListParagraph"/>
+        <w:numPr>
+          <w:ilvl w:val="1"/>
+          <w:numId w:val="5"/>
+        </w:numPr>
+        <w:spacing w:line="360" w:lineRule="auto"/>
+        <w:ind w:left="1843"/>
+        <w:rPr>
+          <w:rFonts w:ascii="Arial" w:hAnsi="Arial" w:cs="Arial"/>
+        </w:rPr>
+      </w:pPr>
+      <w:r>
+        <w:rPr>
+          <w:rFonts w:ascii="Arial" w:hAnsi="Arial" w:cs="Arial"/>
+        </w:rPr>
+        <w:t>The system shall allow Registry/Admissions staff to review and approve student enrolment requests.</w:t>
+      </w:r>
+    </w:p>
+    <w:p>
+      <w:pPr>
+        <w:pStyle w:val="ListParagraph"/>
+        <w:numPr>
+          <w:ilvl w:val="1"/>
+          <w:numId w:val="5"/>
+        </w:numPr>
+        <w:spacing w:line="360" w:lineRule="auto"/>
+        <w:ind w:left="1843"/>
+        <w:rPr>
+          <w:rFonts w:ascii="Arial" w:hAnsi="Arial" w:cs="Arial"/>
+        </w:rPr>
+      </w:pPr>
+      <w:r>
+        <w:rPr>
+          <w:rFonts w:ascii="Arial" w:hAnsi="Arial" w:cs="Arial"/>
+        </w:rPr>
+        <w:t>The system shall enforce prerequisite, course capacity, and timetable clash rules during approval.</w:t>
+      </w:r>
+    </w:p>
+    <w:p>
+      <w:pPr>
+        <w:pStyle w:val="ListParagraph"/>
+        <w:numPr>
+          <w:ilvl w:val="0"/>
+          <w:numId w:val="5"/>
+        </w:numPr>
+        <w:spacing w:line="360" w:lineRule="auto"/>
+        <w:ind w:left="1560"/>
+        <w:rPr>
+          <w:rFonts w:ascii="Arial" w:hAnsi="Arial" w:cs="Arial"/>
+        </w:rPr>
+      </w:pPr>
+      <w:r>
+        <w:rPr>
+          <w:rFonts w:ascii="Arial" w:hAnsi="Arial" w:cs="Arial"/>
+        </w:rPr>
+        <w:t>Payment Processing and Enrolment Confirmation</w:t>
+      </w:r>
+      <w:r>
+        <w:rPr>
+          <w:rFonts w:ascii="Arial" w:hAnsi="Arial" w:cs="Arial"/>
+        </w:rPr>
+        <w:t>:</w:t>
+      </w:r>
+    </w:p>
+    <w:p>
+      <w:pPr>
+        <w:pStyle w:val="ListParagraph"/>
+        <w:numPr>
+          <w:ilvl w:val="1"/>
+          <w:numId w:val="5"/>
+        </w:numPr>
+        <w:spacing w:line="360" w:lineRule="auto"/>
+        <w:ind w:left="1843"/>
+        <w:rPr>
+          <w:rFonts w:ascii="Arial" w:hAnsi="Arial" w:cs="Arial"/>
+        </w:rPr>
+      </w:pPr>
+      <w:r>
+        <w:rPr>
+          <w:rFonts w:ascii="Arial" w:hAnsi="Arial" w:cs="Arial"/>
+        </w:rPr>
+        <w:lastRenderedPageBreak/>
+        <w:t>The system shall allow Finance Department staff to process tuition and course-related payments.</w:t>
+      </w:r>
+    </w:p>
+    <w:p>
+      <w:pPr>
+        <w:pStyle w:val="ListParagraph"/>
+        <w:numPr>
+          <w:ilvl w:val="1"/>
+          <w:numId w:val="5"/>
+        </w:numPr>
+        <w:spacing w:line="360" w:lineRule="auto"/>
+        <w:ind w:left="1843"/>
+        <w:rPr>
+          <w:rFonts w:ascii="Arial" w:hAnsi="Arial" w:cs="Arial"/>
+        </w:rPr>
+      </w:pPr>
+      <w:r>
+        <w:rPr>
+          <w:rFonts w:ascii="Arial" w:hAnsi="Arial" w:cs="Arial"/>
+        </w:rPr>
+        <w:t>The system shall confirm student enrolment only after successful payment verification.</w:t>
+      </w:r>
+    </w:p>
+    <w:p>
+      <w:pPr>
+        <w:pStyle w:val="ListParagraph"/>
+        <w:numPr>
+          <w:ilvl w:val="1"/>
+          <w:numId w:val="5"/>
+        </w:numPr>
+        <w:spacing w:line="360" w:lineRule="auto"/>
+        <w:ind w:left="1843"/>
+        <w:rPr>
+          <w:rFonts w:ascii="Arial" w:hAnsi="Arial" w:cs="Arial"/>
+        </w:rPr>
+      </w:pPr>
+      <w:r>
+        <w:rPr>
+          <w:rFonts w:ascii="Arial" w:hAnsi="Arial" w:cs="Arial"/>
+        </w:rPr>
+        <w:t>The system shall automatically update enrolment status after payment confirmation.</w:t>
+      </w:r>
+    </w:p>
+    <w:p>
+      <w:pPr>
+        <w:pStyle w:val="ListParagraph"/>
+        <w:numPr>
+          <w:ilvl w:val="0"/>
+          <w:numId w:val="5"/>
+        </w:numPr>
+        <w:spacing w:line="360" w:lineRule="auto"/>
+        <w:ind w:left="1560"/>
+        <w:rPr>
+          <w:rFonts w:ascii="Arial" w:hAnsi="Arial" w:cs="Arial"/>
+        </w:rPr>
+      </w:pPr>
+      <w:r>
+        <w:rPr>
+          <w:rFonts w:ascii="Arial" w:hAnsi="Arial" w:cs="Arial"/>
+        </w:rPr>
+        <w:t>Notifications</w:t>
+      </w:r>
+      <w:r>
+        <w:rPr>
+          <w:rFonts w:ascii="Arial" w:hAnsi="Arial" w:cs="Arial"/>
+        </w:rPr>
+        <w:t>:</w:t>
+      </w:r>
+    </w:p>
+    <w:p>
+      <w:pPr>
+        <w:pStyle w:val="ListParagraph"/>
+        <w:numPr>
+          <w:ilvl w:val="1"/>
+          <w:numId w:val="5"/>
+        </w:numPr>
+        <w:spacing w:line="360" w:lineRule="auto"/>
+        <w:ind w:left="1843"/>
+        <w:rPr>
+          <w:rFonts w:ascii="Arial" w:hAnsi="Arial" w:cs="Arial"/>
+        </w:rPr>
+      </w:pPr>
+      <w:r>
+        <w:rPr>
+          <w:rFonts w:ascii="Arial" w:hAnsi="Arial" w:cs="Arial"/>
+        </w:rPr>
+        <w:t>The system shall notify students of successful enrolment confirmation.</w:t>
+      </w:r>
+    </w:p>
+    <w:p>
+      <w:pPr>
+        <w:pStyle w:val="ListParagraph"/>
+        <w:numPr>
+          <w:ilvl w:val="1"/>
+          <w:numId w:val="5"/>
+        </w:numPr>
+        <w:spacing w:line="360" w:lineRule="auto"/>
+        <w:ind w:left="1843"/>
+        <w:rPr>
+          <w:rFonts w:ascii="Arial" w:hAnsi="Arial" w:cs="Arial"/>
+        </w:rPr>
+      </w:pPr>
+      <w:r>
+        <w:rPr>
+          <w:rFonts w:ascii="Arial" w:hAnsi="Arial" w:cs="Arial"/>
+        </w:rPr>
+        <w:t>The system shall notify students of any enrolment issues, including timetable clashes or prerequisite violations.</w:t>
+      </w:r>
+    </w:p>
+    <w:p>
+      <w:pPr>
+        <w:pStyle w:val="ListParagraph"/>
+        <w:numPr>
+          <w:ilvl w:val="1"/>
+          <w:numId w:val="5"/>
+        </w:numPr>
+        <w:spacing w:line="360" w:lineRule="auto"/>
+        <w:ind w:left="1843"/>
+        <w:rPr>
+          <w:rFonts w:ascii="Arial" w:hAnsi="Arial" w:cs="Arial"/>
+        </w:rPr>
+      </w:pPr>
+      <w:r>
+        <w:rPr>
+          <w:rFonts w:ascii="Arial" w:hAnsi="Arial" w:cs="Arial"/>
+        </w:rPr>
+        <w:t>The system shall notify staff of pending enrolment requests requiring approval.</w:t>
+      </w:r>
+    </w:p>
+    <w:p>
+      <w:pPr>
+        <w:pStyle w:val="ListParagraph"/>
+        <w:numPr>
+          <w:ilvl w:val="0"/>
+          <w:numId w:val="5"/>
+        </w:numPr>
+        <w:spacing w:line="360" w:lineRule="auto"/>
+        <w:ind w:left="1560"/>
+        <w:rPr>
+          <w:rFonts w:ascii="Arial" w:hAnsi="Arial" w:cs="Arial"/>
+        </w:rPr>
+      </w:pPr>
+      <w:r>
+        <w:rPr>
+          <w:rFonts w:ascii="Arial" w:hAnsi="Arial" w:cs="Arial"/>
+        </w:rPr>
+        <w:t>User Access and Security</w:t>
+      </w:r>
+      <w:r>
+        <w:rPr>
+          <w:rFonts w:ascii="Arial" w:hAnsi="Arial" w:cs="Arial"/>
+        </w:rPr>
+        <w:t>:</w:t>
+      </w:r>
+    </w:p>
+    <w:p>
+      <w:pPr>
+        <w:pStyle w:val="ListParagraph"/>
+        <w:numPr>
+          <w:ilvl w:val="1"/>
+          <w:numId w:val="5"/>
+        </w:numPr>
+        <w:spacing w:line="360" w:lineRule="auto"/>
+        <w:ind w:left="1843"/>
+        <w:rPr>
+          <w:rFonts w:ascii="Arial" w:hAnsi="Arial" w:cs="Arial"/>
+        </w:rPr>
+      </w:pPr>
+      <w:r>
+        <w:rPr>
+          <w:rFonts w:ascii="Arial" w:hAnsi="Arial" w:cs="Arial"/>
+        </w:rPr>
+        <w:t>The system shall restrict access to features based on user roles (Student, Academic Staff, Registry Staff, Finance Staff).</w:t>
+      </w:r>
+    </w:p>
+    <w:p>
+      <w:pPr>
+        <w:pStyle w:val="ListParagraph"/>
+        <w:numPr>
+          <w:ilvl w:val="1"/>
+          <w:numId w:val="5"/>
+        </w:numPr>
+        <w:spacing w:line="360" w:lineRule="auto"/>
+        <w:ind w:left="1843"/>
+        <w:rPr>
+          <w:rFonts w:ascii="Arial" w:hAnsi="Arial" w:cs="Arial"/>
+        </w:rPr>
+      </w:pPr>
+      <w:r>
+        <w:rPr>
+          <w:rFonts w:ascii="Arial" w:hAnsi="Arial" w:cs="Arial"/>
+        </w:rPr>
+        <w:t>The system shall require authentication before allowing access to any student or staff data.</w:t>
+      </w:r>
+    </w:p>
+    <w:p>
+      <w:pPr>
+        <w:pStyle w:val="ListParagraph"/>
+        <w:numPr>
+          <w:ilvl w:val="0"/>
+          <w:numId w:val="5"/>
+        </w:numPr>
+        <w:spacing w:line="360" w:lineRule="auto"/>
+        <w:ind w:left="1560"/>
+        <w:rPr>
+          <w:rFonts w:ascii="Arial" w:hAnsi="Arial" w:cs="Arial"/>
+        </w:rPr>
+      </w:pPr>
+      <w:r>
+        <w:rPr>
+          <w:rFonts w:ascii="Arial" w:hAnsi="Arial" w:cs="Arial"/>
+        </w:rPr>
+        <w:t>Reporting and Audit</w:t>
+      </w:r>
+      <w:r>
+        <w:rPr>
+          <w:rFonts w:ascii="Arial" w:hAnsi="Arial" w:cs="Arial"/>
+        </w:rPr>
+        <w:t>:</w:t>
+      </w:r>
+    </w:p>
+    <w:p>
+      <w:pPr>
+        <w:pStyle w:val="ListParagraph"/>
+        <w:numPr>
+          <w:ilvl w:val="1"/>
+          <w:numId w:val="5"/>
+        </w:numPr>
+        <w:spacing w:line="360" w:lineRule="auto"/>
+        <w:ind w:left="1843"/>
+        <w:rPr>
+          <w:rFonts w:ascii="Arial" w:hAnsi="Arial" w:cs="Arial"/>
+        </w:rPr>
+      </w:pPr>
+      <w:r>
+        <w:rPr>
+          <w:rFonts w:ascii="Arial" w:hAnsi="Arial" w:cs="Arial"/>
+        </w:rPr>
+        <w:t>The system shall generate enrolment reports for students, courses, and departments.</w:t>
+      </w:r>
+    </w:p>
+    <w:p>
+      <w:pPr>
+        <w:pStyle w:val="ListParagraph"/>
+        <w:numPr>
+          <w:ilvl w:val="1"/>
+          <w:numId w:val="5"/>
+        </w:numPr>
+        <w:spacing w:line="360" w:lineRule="auto"/>
+        <w:ind w:left="1843"/>
+        <w:rPr>
+          <w:rFonts w:ascii="Arial" w:hAnsi="Arial" w:cs="Arial"/>
+        </w:rPr>
+      </w:pPr>
+      <w:r>
+        <w:rPr>
+          <w:rFonts w:ascii="Arial" w:hAnsi="Arial" w:cs="Arial"/>
+        </w:rPr>
+        <w:t>The system shall maintain an audit trail of all enrolment, approval, and payment transactions.</w:t>
+      </w:r>
+    </w:p>
+    <w:p>
+      <w:pPr>
+        <w:pStyle w:val="Heading2"/>
+        <w:ind w:left="851"/>
+        <w:rPr>
+          <w:rFonts w:ascii="Arial" w:hAnsi="Arial" w:cs="Arial"/>
+          <w:b/>
+          <w:bCs/>
+          <w:color w:val="EE0000"/>
+          <w:sz w:val="24"/>
+          <w:szCs w:val="24"/>
+        </w:rPr>
+      </w:pPr>
+      <w:r>
+        <w:rPr>
+          <w:rFonts w:ascii="Arial" w:hAnsi="Arial" w:cs="Arial"/>
+          <w:b/>
+          <w:bCs/>
+          <w:color w:val="EE0000"/>
+          <w:sz w:val="24"/>
+          <w:szCs w:val="24"/>
+        </w:rPr>
+        <w:t>i</w:t>
+      </w:r>
+      <w:r>
+        <w:rPr>
+          <w:rFonts w:ascii="Arial" w:hAnsi="Arial" w:cs="Arial"/>
+          <w:b/>
+          <w:bCs/>
+          <w:color w:val="EE0000"/>
+          <w:sz w:val="24"/>
+          <w:szCs w:val="24"/>
+        </w:rPr>
+        <w:t>i</w:t>
+      </w:r>
+      <w:r>
+        <w:rPr>
+          <w:rFonts w:ascii="Arial" w:hAnsi="Arial" w:cs="Arial"/>
+          <w:b/>
+          <w:bCs/>
+          <w:color w:val="EE0000"/>
+          <w:sz w:val="24"/>
+          <w:szCs w:val="24"/>
+        </w:rPr>
+        <w:t>i.</w:t>
+      </w:r>
+      <w:r>
+        <w:rPr>
+          <w:rFonts w:ascii="Arial" w:hAnsi="Arial" w:cs="Arial"/>
+          <w:b/>
+          <w:bCs/>
+          <w:color w:val="EE0000"/>
+          <w:sz w:val="24"/>
+          <w:szCs w:val="24"/>
+        </w:rPr>
+        <w:t xml:space="preserve"> </w:t>
+      </w:r>
+      <w:r>
+        <w:rPr>
+          <w:rFonts w:ascii="Arial" w:hAnsi="Arial" w:cs="Arial"/>
+          <w:b/>
+          <w:bCs/>
+          <w:color w:val="EE0000"/>
+          <w:sz w:val="24"/>
+          <w:szCs w:val="24"/>
+        </w:rPr>
+        <w:t>Non-</w:t>
+      </w:r>
+      <w:r>
+        <w:rPr>
+          <w:rFonts w:ascii="Arial" w:hAnsi="Arial" w:cs="Arial"/>
+          <w:b/>
+          <w:bCs/>
+          <w:color w:val="EE0000"/>
+          <w:sz w:val="24"/>
+          <w:szCs w:val="24"/>
+        </w:rPr>
+        <w:t>Functional Requirement</w:t>
+      </w:r>
+      <w:r>
+        <w:rPr>
+          <w:rFonts w:ascii="Arial" w:hAnsi="Arial" w:cs="Arial"/>
+          <w:b/>
+          <w:bCs/>
+          <w:color w:val="EE0000"/>
+          <w:sz w:val="24"/>
+          <w:szCs w:val="24"/>
+        </w:rPr>
+        <w:t>s</w:t>
+      </w:r>
+    </w:p>
+    <w:p>
+      <w:pPr>
+        <w:spacing w:line="360" w:lineRule="auto"/>
+        <w:ind w:left="1134"/>
+        <w:rPr>
+          <w:rFonts w:ascii="Arial" w:hAnsi="Arial" w:cs="Arial"/>
+        </w:rPr>
+      </w:pPr>
+      <w:r>
+        <w:rPr>
+          <w:rFonts w:ascii="Arial" w:hAnsi="Arial" w:cs="Arial"/>
+        </w:rPr>
+        <w:t xml:space="preserve">Based on the problem statement, the system’s key </w:t>
+      </w:r>
+      <w:r>
+        <w:rPr>
+          <w:rFonts w:ascii="Arial" w:hAnsi="Arial" w:cs="Arial"/>
+        </w:rPr>
+        <w:t>non-</w:t>
+      </w:r>
+      <w:r>
+        <w:rPr>
+          <w:rFonts w:ascii="Arial" w:hAnsi="Arial" w:cs="Arial"/>
+        </w:rPr>
+        <w:t>functional requirements</w:t>
+      </w:r>
+      <w:r>
+        <w:rPr>
+          <w:rFonts w:ascii="Arial" w:hAnsi="Arial" w:cs="Arial"/>
+        </w:rPr>
+        <w:t xml:space="preserve"> </w:t>
+      </w:r>
+      <w:r>
+        <w:rPr>
+          <w:rFonts w:ascii="Arial" w:hAnsi="Arial" w:cs="Arial"/>
+        </w:rPr>
+        <w:t>are identified as follows</w:t>
+      </w:r>
+      <w:r>
+        <w:rPr>
+          <w:rFonts w:ascii="Arial" w:hAnsi="Arial" w:cs="Arial"/>
+        </w:rPr>
+        <w:t xml:space="preserve">: </w:t>
+      </w:r>
+    </w:p>
+    <w:p>
+      <w:pPr>
+        <w:pStyle w:val="ListParagraph"/>
+        <w:numPr>
+          <w:ilvl w:val="0"/>
+          <w:numId w:val="6"/>
+        </w:numPr>
+        <w:spacing w:line="360" w:lineRule="auto"/>
+        <w:ind w:left="1560"/>
+        <w:rPr>
+          <w:rFonts w:ascii="Arial" w:hAnsi="Arial" w:cs="Arial"/>
+        </w:rPr>
+      </w:pPr>
+      <w:r>
+        <w:rPr>
+          <w:rFonts w:ascii="Arial" w:hAnsi="Arial" w:cs="Arial"/>
+        </w:rPr>
+        <w:t>Performance</w:t>
+      </w:r>
+      <w:r>
+        <w:rPr>
+          <w:rFonts w:ascii="Arial" w:hAnsi="Arial" w:cs="Arial"/>
+        </w:rPr>
+        <w:t>:</w:t>
+      </w:r>
+    </w:p>
+    <w:p>
+      <w:pPr>
+        <w:pStyle w:val="ListParagraph"/>
+        <w:numPr>
+          <w:ilvl w:val="1"/>
+          <w:numId w:val="6"/>
+        </w:numPr>
+        <w:spacing w:line="360" w:lineRule="auto"/>
+        <w:ind w:left="1843"/>
+        <w:rPr>
+          <w:rFonts w:ascii="Arial" w:hAnsi="Arial" w:cs="Arial"/>
+        </w:rPr>
+      </w:pPr>
+      <w:r>
+        <w:rPr>
+          <w:rFonts w:ascii="Arial" w:hAnsi="Arial" w:cs="Arial"/>
+        </w:rPr>
+        <w:t>The system shall respond to course search, enrolment, or timetable requests within 2 seconds under normal load conditions.</w:t>
+      </w:r>
+    </w:p>
+    <w:p>
+      <w:pPr>
+        <w:pStyle w:val="ListParagraph"/>
+        <w:numPr>
+          <w:ilvl w:val="1"/>
+          <w:numId w:val="6"/>
+        </w:numPr>
+        <w:spacing w:line="360" w:lineRule="auto"/>
+        <w:ind w:left="1843"/>
+        <w:rPr>
+          <w:rFonts w:ascii="Arial" w:hAnsi="Arial" w:cs="Arial"/>
+        </w:rPr>
+      </w:pPr>
+      <w:r>
+        <w:rPr>
+          <w:rFonts w:ascii="Arial" w:hAnsi="Arial" w:cs="Arial"/>
+        </w:rPr>
+        <w:t>Ensures smooth and efficient user experience for students and staff.</w:t>
+      </w:r>
+    </w:p>
+    <w:p>
+      <w:pPr>
+        <w:pStyle w:val="ListParagraph"/>
+        <w:numPr>
+          <w:ilvl w:val="0"/>
+          <w:numId w:val="6"/>
+        </w:numPr>
+        <w:spacing w:line="360" w:lineRule="auto"/>
+        <w:ind w:left="1560"/>
+        <w:rPr>
+          <w:rFonts w:ascii="Arial" w:hAnsi="Arial" w:cs="Arial"/>
+        </w:rPr>
+      </w:pPr>
+      <w:r>
+        <w:rPr>
+          <w:rFonts w:ascii="Arial" w:hAnsi="Arial" w:cs="Arial"/>
+        </w:rPr>
+        <w:t>Scalability</w:t>
+      </w:r>
+      <w:r>
+        <w:rPr>
+          <w:rFonts w:ascii="Arial" w:hAnsi="Arial" w:cs="Arial"/>
+        </w:rPr>
+        <w:t>:</w:t>
+      </w:r>
+    </w:p>
+    <w:p>
+      <w:pPr>
+        <w:pStyle w:val="ListParagraph"/>
+        <w:numPr>
+          <w:ilvl w:val="1"/>
+          <w:numId w:val="6"/>
+        </w:numPr>
+        <w:spacing w:line="360" w:lineRule="auto"/>
+        <w:ind w:left="1843"/>
+        <w:rPr>
+          <w:rFonts w:ascii="Arial" w:hAnsi="Arial" w:cs="Arial"/>
+        </w:rPr>
+      </w:pPr>
+      <w:r>
+        <w:rPr>
+          <w:rFonts w:ascii="Arial" w:hAnsi="Arial" w:cs="Arial"/>
+        </w:rPr>
+        <w:lastRenderedPageBreak/>
+        <w:t xml:space="preserve">The system shall support at least </w:t>
+      </w:r>
+      <w:r>
+        <w:rPr>
+          <w:rFonts w:ascii="Arial" w:hAnsi="Arial" w:cs="Arial"/>
+        </w:rPr>
+        <w:t>10</w:t>
+      </w:r>
+      <w:r>
+        <w:rPr>
+          <w:rFonts w:ascii="Arial" w:hAnsi="Arial" w:cs="Arial"/>
+        </w:rPr>
+        <w:t>,000 concurrent users without degradation of performance.</w:t>
+      </w:r>
+    </w:p>
+    <w:p>
+      <w:pPr>
+        <w:pStyle w:val="ListParagraph"/>
+        <w:numPr>
+          <w:ilvl w:val="1"/>
+          <w:numId w:val="6"/>
+        </w:numPr>
+        <w:spacing w:line="360" w:lineRule="auto"/>
+        <w:ind w:left="1843"/>
+        <w:rPr>
+          <w:rFonts w:ascii="Arial" w:hAnsi="Arial" w:cs="Arial"/>
+        </w:rPr>
+      </w:pPr>
+      <w:r>
+        <w:rPr>
+          <w:rFonts w:ascii="Arial" w:hAnsi="Arial" w:cs="Arial"/>
+        </w:rPr>
+        <w:t>Supports peak enrolment periods and multiple simultaneous users.</w:t>
+      </w:r>
+    </w:p>
+    <w:p>
+      <w:pPr>
+        <w:pStyle w:val="ListParagraph"/>
+        <w:numPr>
+          <w:ilvl w:val="0"/>
+          <w:numId w:val="6"/>
+        </w:numPr>
+        <w:spacing w:line="360" w:lineRule="auto"/>
+        <w:ind w:left="1560"/>
+        <w:rPr>
+          <w:rFonts w:ascii="Arial" w:hAnsi="Arial" w:cs="Arial"/>
+        </w:rPr>
+      </w:pPr>
+      <w:r>
+        <w:rPr>
+          <w:rFonts w:ascii="Arial" w:hAnsi="Arial" w:cs="Arial"/>
+        </w:rPr>
+        <w:t>Security</w:t>
+      </w:r>
+      <w:r>
+        <w:rPr>
+          <w:rFonts w:ascii="Arial" w:hAnsi="Arial" w:cs="Arial"/>
+        </w:rPr>
+        <w:t>:</w:t>
+      </w:r>
+    </w:p>
+    <w:p>
+      <w:pPr>
+        <w:pStyle w:val="ListParagraph"/>
+        <w:numPr>
+          <w:ilvl w:val="1"/>
+          <w:numId w:val="6"/>
+        </w:numPr>
+        <w:spacing w:line="360" w:lineRule="auto"/>
+        <w:ind w:left="1843"/>
+        <w:rPr>
+          <w:rFonts w:ascii="Arial" w:hAnsi="Arial" w:cs="Arial"/>
+        </w:rPr>
+      </w:pPr>
+      <w:r>
+        <w:rPr>
+          <w:rFonts w:ascii="Arial" w:hAnsi="Arial" w:cs="Arial"/>
+        </w:rPr>
+        <w:t>The system shall implement role-based access control to restrict access based on user type (Student, Academic Staff, Registry Staff, Finance Staff).</w:t>
+      </w:r>
+    </w:p>
+    <w:p>
+      <w:pPr>
+        <w:pStyle w:val="ListParagraph"/>
+        <w:numPr>
+          <w:ilvl w:val="1"/>
+          <w:numId w:val="6"/>
+        </w:numPr>
+        <w:spacing w:line="360" w:lineRule="auto"/>
+        <w:ind w:left="1843"/>
+        <w:rPr>
+          <w:rFonts w:ascii="Arial" w:hAnsi="Arial" w:cs="Arial"/>
+        </w:rPr>
+      </w:pPr>
+      <w:r>
+        <w:rPr>
+          <w:rFonts w:ascii="Arial" w:hAnsi="Arial" w:cs="Arial"/>
+        </w:rPr>
+        <w:t>Protects sensitive student and financial data.</w:t>
+      </w:r>
+    </w:p>
+    <w:p>
+      <w:pPr>
+        <w:pStyle w:val="ListParagraph"/>
+        <w:numPr>
+          <w:ilvl w:val="0"/>
+          <w:numId w:val="6"/>
+        </w:numPr>
+        <w:spacing w:line="360" w:lineRule="auto"/>
+        <w:ind w:left="1560"/>
+        <w:rPr>
+          <w:rFonts w:ascii="Arial" w:hAnsi="Arial" w:cs="Arial"/>
+        </w:rPr>
+      </w:pPr>
+      <w:r>
+        <w:rPr>
+          <w:rFonts w:ascii="Arial" w:hAnsi="Arial" w:cs="Arial"/>
+        </w:rPr>
+        <w:t>Data Protection</w:t>
+      </w:r>
+      <w:r>
+        <w:rPr>
+          <w:rFonts w:ascii="Arial" w:hAnsi="Arial" w:cs="Arial"/>
+        </w:rPr>
+        <w:t>:</w:t>
+      </w:r>
+    </w:p>
+    <w:p>
+      <w:pPr>
+        <w:pStyle w:val="ListParagraph"/>
+        <w:numPr>
+          <w:ilvl w:val="1"/>
+          <w:numId w:val="6"/>
+        </w:numPr>
+        <w:spacing w:line="360" w:lineRule="auto"/>
+        <w:ind w:left="1843"/>
+        <w:rPr>
+          <w:rFonts w:ascii="Arial" w:hAnsi="Arial" w:cs="Arial"/>
+        </w:rPr>
+      </w:pPr>
+      <w:r>
+        <w:rPr>
+          <w:rFonts w:ascii="Arial" w:hAnsi="Arial" w:cs="Arial"/>
+        </w:rPr>
+        <w:t>The system shall encrypt sensitive data both at rest and in transit.</w:t>
+      </w:r>
+    </w:p>
+    <w:p>
+      <w:pPr>
+        <w:pStyle w:val="ListParagraph"/>
+        <w:numPr>
+          <w:ilvl w:val="1"/>
+          <w:numId w:val="6"/>
+        </w:numPr>
+        <w:spacing w:line="360" w:lineRule="auto"/>
+        <w:ind w:left="1843"/>
+        <w:rPr>
+          <w:rFonts w:ascii="Arial" w:hAnsi="Arial" w:cs="Arial"/>
+        </w:rPr>
+      </w:pPr>
+      <w:r>
+        <w:rPr>
+          <w:rFonts w:ascii="Arial" w:hAnsi="Arial" w:cs="Arial"/>
+        </w:rPr>
+        <w:t>Ensures confidentiality and compliance with privacy regulations.</w:t>
+      </w:r>
+    </w:p>
+    <w:p>
+      <w:pPr>
+        <w:pStyle w:val="ListParagraph"/>
+        <w:numPr>
+          <w:ilvl w:val="0"/>
+          <w:numId w:val="6"/>
+        </w:numPr>
+        <w:spacing w:line="360" w:lineRule="auto"/>
+        <w:ind w:left="1560"/>
+        <w:rPr>
+          <w:rFonts w:ascii="Arial" w:hAnsi="Arial" w:cs="Arial"/>
+        </w:rPr>
+      </w:pPr>
+      <w:r>
+        <w:rPr>
+          <w:rFonts w:ascii="Arial" w:hAnsi="Arial" w:cs="Arial"/>
+        </w:rPr>
+        <w:t>Availability / Reliability</w:t>
+      </w:r>
+      <w:r>
+        <w:rPr>
+          <w:rFonts w:ascii="Arial" w:hAnsi="Arial" w:cs="Arial"/>
+        </w:rPr>
+        <w:t>:</w:t>
+      </w:r>
+    </w:p>
+    <w:p>
+      <w:pPr>
+        <w:pStyle w:val="ListParagraph"/>
+        <w:numPr>
+          <w:ilvl w:val="1"/>
+          <w:numId w:val="6"/>
+        </w:numPr>
+        <w:spacing w:line="360" w:lineRule="auto"/>
+        <w:ind w:left="1843"/>
+        <w:rPr>
+          <w:rFonts w:ascii="Arial" w:hAnsi="Arial" w:cs="Arial"/>
+        </w:rPr>
+      </w:pPr>
+      <w:r>
+        <w:rPr>
+          <w:rFonts w:ascii="Arial" w:hAnsi="Arial" w:cs="Arial"/>
+        </w:rPr>
+        <w:t>The system shall maintain at least 99.5% uptime during enrolment periods.</w:t>
+      </w:r>
+    </w:p>
+    <w:p>
+      <w:pPr>
+        <w:pStyle w:val="ListParagraph"/>
+        <w:numPr>
+          <w:ilvl w:val="1"/>
+          <w:numId w:val="6"/>
+        </w:numPr>
+        <w:spacing w:line="360" w:lineRule="auto"/>
+        <w:ind w:left="1843"/>
+        <w:rPr>
+          <w:rFonts w:ascii="Arial" w:hAnsi="Arial" w:cs="Arial"/>
+        </w:rPr>
+      </w:pPr>
+      <w:r>
+        <w:rPr>
+          <w:rFonts w:ascii="Arial" w:hAnsi="Arial" w:cs="Arial"/>
+        </w:rPr>
+        <w:t>Ensures continuous availability for critical university operations.</w:t>
+      </w:r>
+    </w:p>
+    <w:p>
+      <w:pPr>
+        <w:pStyle w:val="ListParagraph"/>
+        <w:numPr>
+          <w:ilvl w:val="0"/>
+          <w:numId w:val="6"/>
+        </w:numPr>
+        <w:spacing w:line="360" w:lineRule="auto"/>
+        <w:ind w:left="1560"/>
+        <w:rPr>
+          <w:rFonts w:ascii="Arial" w:hAnsi="Arial" w:cs="Arial"/>
+        </w:rPr>
+      </w:pPr>
+      <w:r>
+        <w:rPr>
+          <w:rFonts w:ascii="Arial" w:hAnsi="Arial" w:cs="Arial"/>
+        </w:rPr>
+        <w:t>Usability</w:t>
+      </w:r>
+      <w:r>
+        <w:rPr>
+          <w:rFonts w:ascii="Arial" w:hAnsi="Arial" w:cs="Arial"/>
+        </w:rPr>
+        <w:t>:</w:t>
+      </w:r>
+    </w:p>
+    <w:p>
+      <w:pPr>
+        <w:pStyle w:val="ListParagraph"/>
+        <w:numPr>
+          <w:ilvl w:val="1"/>
+          <w:numId w:val="6"/>
+        </w:numPr>
+        <w:spacing w:line="360" w:lineRule="auto"/>
+        <w:ind w:left="1843"/>
+        <w:rPr>
+          <w:rFonts w:ascii="Arial" w:hAnsi="Arial" w:cs="Arial"/>
+        </w:rPr>
+      </w:pPr>
+      <w:r>
+        <w:rPr>
+          <w:rFonts w:ascii="Arial" w:hAnsi="Arial" w:cs="Arial"/>
+        </w:rPr>
+        <w:t>The system shall provide a web interface accessible on desktop, tablet, and mobile devices.</w:t>
+      </w:r>
+    </w:p>
+    <w:p>
+      <w:pPr>
+        <w:pStyle w:val="ListParagraph"/>
+        <w:numPr>
+          <w:ilvl w:val="1"/>
+          <w:numId w:val="6"/>
+        </w:numPr>
+        <w:spacing w:line="360" w:lineRule="auto"/>
+        <w:ind w:left="1843"/>
+        <w:rPr>
+          <w:rFonts w:ascii="Arial" w:hAnsi="Arial" w:cs="Arial"/>
+        </w:rPr>
+      </w:pPr>
+      <w:r>
+        <w:rPr>
+          <w:rFonts w:ascii="Arial" w:hAnsi="Arial" w:cs="Arial"/>
+        </w:rPr>
+        <w:t>Enhances accessibility and user satisfaction.</w:t>
+      </w:r>
+    </w:p>
+    <w:p>
+      <w:pPr>
+        <w:pStyle w:val="ListParagraph"/>
+        <w:numPr>
+          <w:ilvl w:val="0"/>
+          <w:numId w:val="6"/>
+        </w:numPr>
+        <w:spacing w:line="360" w:lineRule="auto"/>
+        <w:ind w:left="1560"/>
+        <w:rPr>
+          <w:rFonts w:ascii="Arial" w:hAnsi="Arial" w:cs="Arial"/>
+        </w:rPr>
+      </w:pPr>
+      <w:r>
+        <w:rPr>
+          <w:rFonts w:ascii="Arial" w:hAnsi="Arial" w:cs="Arial"/>
+        </w:rPr>
+        <w:t>Data Accuracy</w:t>
+      </w:r>
+      <w:r>
+        <w:rPr>
+          <w:rFonts w:ascii="Arial" w:hAnsi="Arial" w:cs="Arial"/>
+        </w:rPr>
+        <w:t>:</w:t>
+      </w:r>
+    </w:p>
+    <w:p>
+      <w:pPr>
+        <w:pStyle w:val="ListParagraph"/>
+        <w:numPr>
+          <w:ilvl w:val="1"/>
+          <w:numId w:val="6"/>
+        </w:numPr>
+        <w:spacing w:line="360" w:lineRule="auto"/>
+        <w:ind w:left="1843"/>
+        <w:rPr>
+          <w:rFonts w:ascii="Arial" w:hAnsi="Arial" w:cs="Arial"/>
+        </w:rPr>
+      </w:pPr>
+      <w:r>
+        <w:rPr>
+          <w:rFonts w:ascii="Arial" w:hAnsi="Arial" w:cs="Arial"/>
+        </w:rPr>
+        <w:t>The system shall maintain accurate and up-to-date course, enrolment, and student data.</w:t>
+      </w:r>
+    </w:p>
+    <w:p>
+      <w:pPr>
+        <w:pStyle w:val="ListParagraph"/>
+        <w:numPr>
+          <w:ilvl w:val="1"/>
+          <w:numId w:val="6"/>
+        </w:numPr>
+        <w:spacing w:line="360" w:lineRule="auto"/>
+        <w:ind w:left="1843"/>
+        <w:rPr>
+          <w:rFonts w:ascii="Arial" w:hAnsi="Arial" w:cs="Arial"/>
+        </w:rPr>
+      </w:pPr>
+      <w:r>
+        <w:rPr>
+          <w:rFonts w:ascii="Arial" w:hAnsi="Arial" w:cs="Arial"/>
+        </w:rPr>
+        <w:t>Prevents enrolment errors and ensures reliable reporting.</w:t>
+      </w:r>
+    </w:p>
+    <w:p>
+      <w:pPr>
+        <w:pStyle w:val="ListParagraph"/>
+        <w:numPr>
+          <w:ilvl w:val="0"/>
+          <w:numId w:val="6"/>
+        </w:numPr>
+        <w:spacing w:line="360" w:lineRule="auto"/>
+        <w:ind w:left="1560"/>
+        <w:rPr>
+          <w:rFonts w:ascii="Arial" w:hAnsi="Arial" w:cs="Arial"/>
+        </w:rPr>
+      </w:pPr>
+      <w:r>
+        <w:rPr>
+          <w:rFonts w:ascii="Arial" w:hAnsi="Arial" w:cs="Arial"/>
+        </w:rPr>
+        <w:t>Maintainability</w:t>
+      </w:r>
+      <w:r>
+        <w:rPr>
+          <w:rFonts w:ascii="Arial" w:hAnsi="Arial" w:cs="Arial"/>
+        </w:rPr>
+        <w:t>:</w:t>
+      </w:r>
+    </w:p>
+    <w:p>
+      <w:pPr>
+        <w:pStyle w:val="ListParagraph"/>
+        <w:numPr>
+          <w:ilvl w:val="1"/>
+          <w:numId w:val="6"/>
+        </w:numPr>
+        <w:spacing w:line="360" w:lineRule="auto"/>
+        <w:ind w:left="1843"/>
+        <w:rPr>
+          <w:rFonts w:ascii="Arial" w:hAnsi="Arial" w:cs="Arial"/>
+        </w:rPr>
+      </w:pPr>
+      <w:r>
+        <w:rPr>
+          <w:rFonts w:ascii="Arial" w:hAnsi="Arial" w:cs="Arial"/>
+        </w:rPr>
+        <w:t>The system shall follow object-oriented principles and align with UML design specifications.</w:t>
+      </w:r>
+    </w:p>
+    <w:p>
+      <w:pPr>
+        <w:pStyle w:val="ListParagraph"/>
+        <w:numPr>
+          <w:ilvl w:val="1"/>
+          <w:numId w:val="6"/>
+        </w:numPr>
+        <w:spacing w:line="360" w:lineRule="auto"/>
+        <w:ind w:left="1843"/>
+        <w:rPr>
+          <w:rFonts w:ascii="Arial" w:hAnsi="Arial" w:cs="Arial"/>
+        </w:rPr>
+      </w:pPr>
+      <w:r>
+        <w:rPr>
+          <w:rFonts w:ascii="Arial" w:hAnsi="Arial" w:cs="Arial"/>
+        </w:rPr>
+        <w:t>Simplifies future updates or modifications.</w:t>
+      </w:r>
+    </w:p>
+    <w:p>
+      <w:pPr>
+        <w:pStyle w:val="ListParagraph"/>
+        <w:numPr>
+          <w:ilvl w:val="0"/>
+          <w:numId w:val="6"/>
+        </w:numPr>
+        <w:spacing w:line="360" w:lineRule="auto"/>
+        <w:ind w:left="1560"/>
+        <w:rPr>
+          <w:rFonts w:ascii="Arial" w:hAnsi="Arial" w:cs="Arial"/>
+        </w:rPr>
+      </w:pPr>
+      <w:r>
+        <w:rPr>
+          <w:rFonts w:ascii="Arial" w:hAnsi="Arial" w:cs="Arial"/>
+        </w:rPr>
+        <w:t>Auditability</w:t>
+      </w:r>
+      <w:r>
+        <w:rPr>
+          <w:rFonts w:ascii="Arial" w:hAnsi="Arial" w:cs="Arial"/>
+        </w:rPr>
+        <w:t>:</w:t>
+      </w:r>
+    </w:p>
+    <w:p>
+      <w:pPr>
+        <w:pStyle w:val="ListParagraph"/>
+        <w:numPr>
+          <w:ilvl w:val="1"/>
+          <w:numId w:val="6"/>
+        </w:numPr>
+        <w:spacing w:line="360" w:lineRule="auto"/>
+        <w:rPr>
+          <w:rFonts w:ascii="Arial" w:hAnsi="Arial" w:cs="Arial"/>
+        </w:rPr>
+      </w:pPr>
+      <w:r>
+        <w:rPr>
+          <w:rFonts w:ascii="Arial" w:hAnsi="Arial" w:cs="Arial"/>
+        </w:rPr>
+        <w:t>The system shall log all enrolment, approval, and payment transactions.</w:t>
+      </w:r>
+    </w:p>
+    <w:p>
+      <w:pPr>
+        <w:pStyle w:val="ListParagraph"/>
+        <w:numPr>
+          <w:ilvl w:val="1"/>
+          <w:numId w:val="6"/>
+        </w:numPr>
+        <w:spacing w:line="360" w:lineRule="auto"/>
+        <w:rPr>
+          <w:rFonts w:ascii="Arial" w:hAnsi="Arial" w:cs="Arial"/>
+        </w:rPr>
+      </w:pPr>
+      <w:r>
+        <w:rPr>
+          <w:rFonts w:ascii="Arial" w:hAnsi="Arial" w:cs="Arial"/>
+        </w:rPr>
+        <w:t>Supports accountability, transparency, and dispute resolution.</w:t>
+      </w:r>
+    </w:p>
+    <w:p>
+      <w:pPr>
+        <w:pStyle w:val="ListParagraph"/>
+        <w:numPr>
+          <w:ilvl w:val="0"/>
+          <w:numId w:val="6"/>
+        </w:numPr>
+        <w:spacing w:line="360" w:lineRule="auto"/>
+        <w:ind w:left="1560"/>
+        <w:rPr>
+          <w:rFonts w:ascii="Arial" w:hAnsi="Arial" w:cs="Arial"/>
+        </w:rPr>
+      </w:pPr>
+      <w:r>
+        <w:rPr>
+          <w:rFonts w:ascii="Arial" w:hAnsi="Arial" w:cs="Arial"/>
+        </w:rPr>
+        <w:lastRenderedPageBreak/>
+        <w:t>Interoperability</w:t>
+      </w:r>
+    </w:p>
+    <w:p>
+      <w:pPr>
+        <w:pStyle w:val="ListParagraph"/>
+        <w:numPr>
+          <w:ilvl w:val="1"/>
+          <w:numId w:val="6"/>
+        </w:numPr>
+        <w:spacing w:line="360" w:lineRule="auto"/>
+        <w:ind w:left="1843"/>
+        <w:rPr>
+          <w:rFonts w:ascii="Arial" w:hAnsi="Arial" w:cs="Arial"/>
+        </w:rPr>
+      </w:pPr>
+      <w:r>
+        <w:rPr>
+          <w:rFonts w:ascii="Arial" w:hAnsi="Arial" w:cs="Arial"/>
+        </w:rPr>
+        <w:t>The system shall support integration with existing AUT systems (e.g., student database, finance system).</w:t>
+      </w:r>
+    </w:p>
+    <w:p>
+      <w:pPr>
+        <w:pStyle w:val="ListParagraph"/>
+        <w:numPr>
+          <w:ilvl w:val="1"/>
+          <w:numId w:val="6"/>
+        </w:numPr>
+        <w:spacing w:line="360" w:lineRule="auto"/>
+        <w:ind w:left="1843"/>
+        <w:rPr>
+          <w:rFonts w:ascii="Arial" w:hAnsi="Arial" w:cs="Arial"/>
+        </w:rPr>
+      </w:pPr>
+      <w:r>
+        <w:rPr>
+          <w:rFonts w:ascii="Arial" w:hAnsi="Arial" w:cs="Arial"/>
+        </w:rPr>
+        <w:t>Ensures smooth coordination between departments and prevents data silos.</w:t>
+      </w:r>
     </w:p>
     <w:sectPr>
       <w:pgSz w:w="12240" w:h="15840"/>
@@ -899,6 +2823,232 @@
     </w:lvl>
   </w:abstractNum>
   <w:abstractNum w:abstractNumId="2" w15:restartNumberingAfterBreak="0">
+    <w:nsid w:val="443143D4"/>
+    <w:multiLevelType w:val="hybridMultilevel"/>
+    <w:tmpl w:val="BC7C5D7E"/>
+    <w:lvl w:ilvl="0" w:tplc="04090001">
+      <w:start w:val="1"/>
+      <w:numFmt w:val="bullet"/>
+      <w:lvlText w:val=""/>
+      <w:lvlJc w:val="left"/>
+      <w:pPr>
+        <w:ind w:left="2280" w:hanging="360"/>
+      </w:pPr>
+      <w:rPr>
+        <w:rFonts w:ascii="Symbol" w:hAnsi="Symbol" w:hint="default"/>
+      </w:rPr>
+    </w:lvl>
+    <w:lvl w:ilvl="1" w:tplc="04090003">
+      <w:start w:val="1"/>
+      <w:numFmt w:val="bullet"/>
+      <w:lvlText w:val="o"/>
+      <w:lvlJc w:val="left"/>
+      <w:pPr>
+        <w:ind w:left="3000" w:hanging="360"/>
+      </w:pPr>
+      <w:rPr>
+        <w:rFonts w:ascii="Courier New" w:hAnsi="Courier New" w:cs="Courier New" w:hint="default"/>
+      </w:rPr>
+    </w:lvl>
+    <w:lvl w:ilvl="2" w:tplc="04090005" w:tentative="1">
+      <w:start w:val="1"/>
+      <w:numFmt w:val="bullet"/>
+      <w:lvlText w:val=""/>
+      <w:lvlJc w:val="left"/>
+      <w:pPr>
+        <w:ind w:left="3720" w:hanging="360"/>
+      </w:pPr>
+      <w:rPr>
+        <w:rFonts w:ascii="Wingdings" w:hAnsi="Wingdings" w:hint="default"/>
+      </w:rPr>
+    </w:lvl>
+    <w:lvl w:ilvl="3" w:tplc="04090001" w:tentative="1">
+      <w:start w:val="1"/>
+      <w:numFmt w:val="bullet"/>
+      <w:lvlText w:val=""/>
+      <w:lvlJc w:val="left"/>
+      <w:pPr>
+        <w:ind w:left="4440" w:hanging="360"/>
+      </w:pPr>
+      <w:rPr>
+        <w:rFonts w:ascii="Symbol" w:hAnsi="Symbol" w:hint="default"/>
+      </w:rPr>
+    </w:lvl>
+    <w:lvl w:ilvl="4" w:tplc="04090003" w:tentative="1">
+      <w:start w:val="1"/>
+      <w:numFmt w:val="bullet"/>
+      <w:lvlText w:val="o"/>
+      <w:lvlJc w:val="left"/>
+      <w:pPr>
+        <w:ind w:left="5160" w:hanging="360"/>
+      </w:pPr>
+      <w:rPr>
+        <w:rFonts w:ascii="Courier New" w:hAnsi="Courier New" w:cs="Courier New" w:hint="default"/>
+      </w:rPr>
+    </w:lvl>
+    <w:lvl w:ilvl="5" w:tplc="04090005" w:tentative="1">
+      <w:start w:val="1"/>
+      <w:numFmt w:val="bullet"/>
+      <w:lvlText w:val=""/>
+      <w:lvlJc w:val="left"/>
+      <w:pPr>
+        <w:ind w:left="5880" w:hanging="360"/>
+      </w:pPr>
+      <w:rPr>
+        <w:rFonts w:ascii="Wingdings" w:hAnsi="Wingdings" w:hint="default"/>
+      </w:rPr>
+    </w:lvl>
+    <w:lvl w:ilvl="6" w:tplc="04090001" w:tentative="1">
+      <w:start w:val="1"/>
+      <w:numFmt w:val="bullet"/>
+      <w:lvlText w:val=""/>
+      <w:lvlJc w:val="left"/>
+      <w:pPr>
+        <w:ind w:left="6600" w:hanging="360"/>
+      </w:pPr>
+      <w:rPr>
+        <w:rFonts w:ascii="Symbol" w:hAnsi="Symbol" w:hint="default"/>
+      </w:rPr>
+    </w:lvl>
+    <w:lvl w:ilvl="7" w:tplc="04090003" w:tentative="1">
+      <w:start w:val="1"/>
+      <w:numFmt w:val="bullet"/>
+      <w:lvlText w:val="o"/>
+      <w:lvlJc w:val="left"/>
+      <w:pPr>
+        <w:ind w:left="7320" w:hanging="360"/>
+      </w:pPr>
+      <w:rPr>
+        <w:rFonts w:ascii="Courier New" w:hAnsi="Courier New" w:cs="Courier New" w:hint="default"/>
+      </w:rPr>
+    </w:lvl>
+    <w:lvl w:ilvl="8" w:tplc="04090005" w:tentative="1">
+      <w:start w:val="1"/>
+      <w:numFmt w:val="bullet"/>
+      <w:lvlText w:val=""/>
+      <w:lvlJc w:val="left"/>
+      <w:pPr>
+        <w:ind w:left="8040" w:hanging="360"/>
+      </w:pPr>
+      <w:rPr>
+        <w:rFonts w:ascii="Wingdings" w:hAnsi="Wingdings" w:hint="default"/>
+      </w:rPr>
+    </w:lvl>
+  </w:abstractNum>
+  <w:abstractNum w:abstractNumId="3" w15:restartNumberingAfterBreak="0">
+    <w:nsid w:val="4E9208C8"/>
+    <w:multiLevelType w:val="hybridMultilevel"/>
+    <w:tmpl w:val="054A6BDE"/>
+    <w:lvl w:ilvl="0" w:tplc="04090001">
+      <w:start w:val="1"/>
+      <w:numFmt w:val="bullet"/>
+      <w:lvlText w:val=""/>
+      <w:lvlJc w:val="left"/>
+      <w:pPr>
+        <w:ind w:left="1854" w:hanging="360"/>
+      </w:pPr>
+      <w:rPr>
+        <w:rFonts w:ascii="Symbol" w:hAnsi="Symbol" w:hint="default"/>
+      </w:rPr>
+    </w:lvl>
+    <w:lvl w:ilvl="1" w:tplc="04090003" w:tentative="1">
+      <w:start w:val="1"/>
+      <w:numFmt w:val="bullet"/>
+      <w:lvlText w:val="o"/>
+      <w:lvlJc w:val="left"/>
+      <w:pPr>
+        <w:ind w:left="2574" w:hanging="360"/>
+      </w:pPr>
+      <w:rPr>
+        <w:rFonts w:ascii="Courier New" w:hAnsi="Courier New" w:cs="Courier New" w:hint="default"/>
+      </w:rPr>
+    </w:lvl>
+    <w:lvl w:ilvl="2" w:tplc="04090005" w:tentative="1">
+      <w:start w:val="1"/>
+      <w:numFmt w:val="bullet"/>
+      <w:lvlText w:val=""/>
+      <w:lvlJc w:val="left"/>
+      <w:pPr>
+        <w:ind w:left="3294" w:hanging="360"/>
+      </w:pPr>
+      <w:rPr>
+        <w:rFonts w:ascii="Wingdings" w:hAnsi="Wingdings" w:hint="default"/>
+      </w:rPr>
+    </w:lvl>
+    <w:lvl w:ilvl="3" w:tplc="04090001" w:tentative="1">
+      <w:start w:val="1"/>
+      <w:numFmt w:val="bullet"/>
+      <w:lvlText w:val=""/>
+      <w:lvlJc w:val="left"/>
+      <w:pPr>
+        <w:ind w:left="4014" w:hanging="360"/>
+      </w:pPr>
+      <w:rPr>
+        <w:rFonts w:ascii="Symbol" w:hAnsi="Symbol" w:hint="default"/>
+      </w:rPr>
+    </w:lvl>
+    <w:lvl w:ilvl="4" w:tplc="04090003" w:tentative="1">
+      <w:start w:val="1"/>
+      <w:numFmt w:val="bullet"/>
+      <w:lvlText w:val="o"/>
+      <w:lvlJc w:val="left"/>
+      <w:pPr>
+        <w:ind w:left="4734" w:hanging="360"/>
+      </w:pPr>
+      <w:rPr>
+        <w:rFonts w:ascii="Courier New" w:hAnsi="Courier New" w:cs="Courier New" w:hint="default"/>
+      </w:rPr>
+    </w:lvl>
+    <w:lvl w:ilvl="5" w:tplc="04090005" w:tentative="1">
+      <w:start w:val="1"/>
+      <w:numFmt w:val="bullet"/>
+      <w:lvlText w:val=""/>
+      <w:lvlJc w:val="left"/>
+      <w:pPr>
+        <w:ind w:left="5454" w:hanging="360"/>
+      </w:pPr>
+      <w:rPr>
+        <w:rFonts w:ascii="Wingdings" w:hAnsi="Wingdings" w:hint="default"/>
+      </w:rPr>
+    </w:lvl>
+    <w:lvl w:ilvl="6" w:tplc="04090001" w:tentative="1">
+      <w:start w:val="1"/>
+      <w:numFmt w:val="bullet"/>
+      <w:lvlText w:val=""/>
+      <w:lvlJc w:val="left"/>
+      <w:pPr>
+        <w:ind w:left="6174" w:hanging="360"/>
+      </w:pPr>
+      <w:rPr>
+        <w:rFonts w:ascii="Symbol" w:hAnsi="Symbol" w:hint="default"/>
+      </w:rPr>
+    </w:lvl>
+    <w:lvl w:ilvl="7" w:tplc="04090003" w:tentative="1">
+      <w:start w:val="1"/>
+      <w:numFmt w:val="bullet"/>
+      <w:lvlText w:val="o"/>
+      <w:lvlJc w:val="left"/>
+      <w:pPr>
+        <w:ind w:left="6894" w:hanging="360"/>
+      </w:pPr>
+      <w:rPr>
+        <w:rFonts w:ascii="Courier New" w:hAnsi="Courier New" w:cs="Courier New" w:hint="default"/>
+      </w:rPr>
+    </w:lvl>
+    <w:lvl w:ilvl="8" w:tplc="04090005" w:tentative="1">
+      <w:start w:val="1"/>
+      <w:numFmt w:val="bullet"/>
+      <w:lvlText w:val=""/>
+      <w:lvlJc w:val="left"/>
+      <w:pPr>
+        <w:ind w:left="7614" w:hanging="360"/>
+      </w:pPr>
+      <w:rPr>
+        <w:rFonts w:ascii="Wingdings" w:hAnsi="Wingdings" w:hint="default"/>
+      </w:rPr>
+    </w:lvl>
+  </w:abstractNum>
+  <w:abstractNum w:abstractNumId="4" w15:restartNumberingAfterBreak="0">
     <w:nsid w:val="50B90995"/>
     <w:multiLevelType w:val="hybridMultilevel"/>
     <w:tmpl w:val="F4EC91BE"/>
@@ -987,14 +3137,136 @@
       </w:pPr>
     </w:lvl>
   </w:abstractNum>
+  <w:abstractNum w:abstractNumId="5" w15:restartNumberingAfterBreak="0">
+    <w:nsid w:val="584223CC"/>
+    <w:multiLevelType w:val="hybridMultilevel"/>
+    <w:tmpl w:val="15AE2CB0"/>
+    <w:lvl w:ilvl="0" w:tplc="04090001">
+      <w:start w:val="1"/>
+      <w:numFmt w:val="bullet"/>
+      <w:lvlText w:val=""/>
+      <w:lvlJc w:val="left"/>
+      <w:pPr>
+        <w:ind w:left="720" w:hanging="360"/>
+      </w:pPr>
+      <w:rPr>
+        <w:rFonts w:ascii="Symbol" w:hAnsi="Symbol" w:hint="default"/>
+      </w:rPr>
+    </w:lvl>
+    <w:lvl w:ilvl="1" w:tplc="04090003">
+      <w:start w:val="1"/>
+      <w:numFmt w:val="bullet"/>
+      <w:lvlText w:val="o"/>
+      <w:lvlJc w:val="left"/>
+      <w:pPr>
+        <w:ind w:left="1440" w:hanging="360"/>
+      </w:pPr>
+      <w:rPr>
+        <w:rFonts w:ascii="Courier New" w:hAnsi="Courier New" w:cs="Courier New" w:hint="default"/>
+      </w:rPr>
+    </w:lvl>
+    <w:lvl w:ilvl="2" w:tplc="04090005" w:tentative="1">
+      <w:start w:val="1"/>
+      <w:numFmt w:val="bullet"/>
+      <w:lvlText w:val=""/>
+      <w:lvlJc w:val="left"/>
+      <w:pPr>
+        <w:ind w:left="2160" w:hanging="360"/>
+      </w:pPr>
+      <w:rPr>
+        <w:rFonts w:ascii="Wingdings" w:hAnsi="Wingdings" w:hint="default"/>
+      </w:rPr>
+    </w:lvl>
+    <w:lvl w:ilvl="3" w:tplc="04090001" w:tentative="1">
+      <w:start w:val="1"/>
+      <w:numFmt w:val="bullet"/>
+      <w:lvlText w:val=""/>
+      <w:lvlJc w:val="left"/>
+      <w:pPr>
+        <w:ind w:left="2880" w:hanging="360"/>
+      </w:pPr>
+      <w:rPr>
+        <w:rFonts w:ascii="Symbol" w:hAnsi="Symbol" w:hint="default"/>
+      </w:rPr>
+    </w:lvl>
+    <w:lvl w:ilvl="4" w:tplc="04090003" w:tentative="1">
+      <w:start w:val="1"/>
+      <w:numFmt w:val="bullet"/>
+      <w:lvlText w:val="o"/>
+      <w:lvlJc w:val="left"/>
+      <w:pPr>
+        <w:ind w:left="3600" w:hanging="360"/>
+      </w:pPr>
+      <w:rPr>
+        <w:rFonts w:ascii="Courier New" w:hAnsi="Courier New" w:cs="Courier New" w:hint="default"/>
+      </w:rPr>
+    </w:lvl>
+    <w:lvl w:ilvl="5" w:tplc="04090005" w:tentative="1">
+      <w:start w:val="1"/>
+      <w:numFmt w:val="bullet"/>
+      <w:lvlText w:val=""/>
+      <w:lvlJc w:val="left"/>
+      <w:pPr>
+        <w:ind w:left="4320" w:hanging="360"/>
+      </w:pPr>
+      <w:rPr>
+        <w:rFonts w:ascii="Wingdings" w:hAnsi="Wingdings" w:hint="default"/>
+      </w:rPr>
+    </w:lvl>
+    <w:lvl w:ilvl="6" w:tplc="04090001" w:tentative="1">
+      <w:start w:val="1"/>
+      <w:numFmt w:val="bullet"/>
+      <w:lvlText w:val=""/>
+      <w:lvlJc w:val="left"/>
+      <w:pPr>
+        <w:ind w:left="5040" w:hanging="360"/>
+      </w:pPr>
+      <w:rPr>
+        <w:rFonts w:ascii="Symbol" w:hAnsi="Symbol" w:hint="default"/>
+      </w:rPr>
+    </w:lvl>
+    <w:lvl w:ilvl="7" w:tplc="04090003" w:tentative="1">
+      <w:start w:val="1"/>
+      <w:numFmt w:val="bullet"/>
+      <w:lvlText w:val="o"/>
+      <w:lvlJc w:val="left"/>
+      <w:pPr>
+        <w:ind w:left="5760" w:hanging="360"/>
+      </w:pPr>
+      <w:rPr>
+        <w:rFonts w:ascii="Courier New" w:hAnsi="Courier New" w:cs="Courier New" w:hint="default"/>
+      </w:rPr>
+    </w:lvl>
+    <w:lvl w:ilvl="8" w:tplc="04090005" w:tentative="1">
+      <w:start w:val="1"/>
+      <w:numFmt w:val="bullet"/>
+      <w:lvlText w:val=""/>
+      <w:lvlJc w:val="left"/>
+      <w:pPr>
+        <w:ind w:left="6480" w:hanging="360"/>
+      </w:pPr>
+      <w:rPr>
+        <w:rFonts w:ascii="Wingdings" w:hAnsi="Wingdings" w:hint="default"/>
+      </w:rPr>
+    </w:lvl>
+  </w:abstractNum>
   <w:num w:numId="1" w16cid:durableId="1045522712">
-    <w:abstractNumId w:val="2"/>
+    <w:abstractNumId w:val="4"/>
   </w:num>
   <w:num w:numId="2" w16cid:durableId="1914701475">
     <w:abstractNumId w:val="0"/>
   </w:num>
   <w:num w:numId="3" w16cid:durableId="1264529151">
     <w:abstractNumId w:val="1"/>
+  </w:num>
+  <w:num w:numId="4" w16cid:durableId="1411461418">
+    <w:abstractNumId w:val="3"/>
+  </w:num>
+  <w:num w:numId="5" w16cid:durableId="185103095">
+    <w:abstractNumId w:val="2"/>
+  </w:num>
+  <w:num w:numId="6" w16cid:durableId="1852379492">
+    <w:abstractNumId w:val="5"/>
   </w:num>
 </w:numbering>
 </file>
@@ -1432,7 +3704,6 @@
     <w:next w:val="Normal"/>
     <w:link w:val="Heading2Char"/>
     <w:uiPriority w:val="9"/>
-    <w:semiHidden/>
     <w:unhideWhenUsed/>
     <w:qFormat/>
     <w:rsid w:val="0045132F"/>
@@ -1607,7 +3878,6 @@
   <w:style w:type="character" w:default="1" w:styleId="DefaultParagraphFont">
     <w:name w:val="Default Paragraph Font"/>
     <w:uiPriority w:val="1"/>
-    <w:semiHidden/>
     <w:unhideWhenUsed/>
   </w:style>
   <w:style w:type="table" w:default="1" w:styleId="TableNormal">
@@ -1649,7 +3919,6 @@
     <w:basedOn w:val="DefaultParagraphFont"/>
     <w:link w:val="Heading2"/>
     <w:uiPriority w:val="9"/>
-    <w:semiHidden/>
     <w:rsid w:val="0045132F"/>
     <w:rPr>
       <w:rFonts w:asciiTheme="majorHAnsi" w:eastAsiaTheme="majorEastAsia" w:hAnsiTheme="majorHAnsi" w:cstheme="majorBidi"/>

</xml_diff>

<commit_message>
Upload the introduction and report structure
</commit_message>
<xml_diff>
--- a/Project Progress Report/Assignment_Phase_1-Thanh_Tran-24247169.docx
+++ b/Project Progress Report/Assignment_Phase_1-Thanh_Tran-24247169.docx
@@ -43,7 +43,7 @@
                     </pic:cNvPicPr>
                   </pic:nvPicPr>
                   <pic:blipFill>
-                    <a:blip r:embed="rId5" cstate="print">
+                    <a:blip r:embed="rId8" cstate="print">
                       <a:extLst>
                         <a:ext uri="{28A0092B-C50C-407E-A947-70E740481C1C}">
                           <a14:useLocalDpi xmlns:a14="http://schemas.microsoft.com/office/drawing/2010/main" val="0"/>
@@ -354,44 +354,6 @@
     </w:p>
     <w:p>
       <w:pPr>
-        <w:pStyle w:val="Heading1"/>
-        <w:numPr>
-          <w:ilvl w:val="0"/>
-          <w:numId w:val="3"/>
-        </w:numPr>
-        <w:spacing w:line="360" w:lineRule="auto"/>
-        <w:ind w:left="284"/>
-        <w:rPr>
-          <w:rFonts w:ascii="Arial" w:hAnsi="Arial" w:cs="Arial"/>
-          <w:b/>
-          <w:bCs/>
-          <w:color w:val="EE0000"/>
-          <w:sz w:val="32"/>
-          <w:szCs w:val="32"/>
-        </w:rPr>
-      </w:pPr>
-      <w:r>
-        <w:rPr>
-          <w:rFonts w:ascii="Arial" w:hAnsi="Arial" w:cs="Arial"/>
-        </w:rPr>
-        <w:br w:type="page"/>
-      </w:r>
-      <w:r>
-        <w:rPr>
-          <w:rFonts w:ascii="Arial" w:hAnsi="Arial" w:cs="Arial"/>
-          <w:b/>
-          <w:bCs/>
-          <w:color w:val="EE0000"/>
-          <w:sz w:val="32"/>
-          <w:szCs w:val="32"/>
-        </w:rPr>
-        <w:lastRenderedPageBreak/>
-        <w:t>Introduction</w:t>
-      </w:r>
-    </w:p>
-    <w:p>
-      <w:pPr>
-        <w:spacing w:line="360" w:lineRule="auto"/>
         <w:rPr>
           <w:rFonts w:ascii="Arial" w:eastAsiaTheme="majorEastAsia" w:hAnsi="Arial" w:cs="Arial"/>
           <w:color w:val="0F4761" w:themeColor="accent1" w:themeShade="BF"/>
@@ -406,15 +368,8 @@
         <w:br w:type="page"/>
       </w:r>
     </w:p>
-    <w:p>
-      <w:pPr>
-        <w:pStyle w:val="Heading1"/>
-        <w:numPr>
-          <w:ilvl w:val="0"/>
-          <w:numId w:val="3"/>
-        </w:numPr>
-        <w:spacing w:line="360" w:lineRule="auto"/>
-        <w:ind w:left="284"/>
+    <w:sdt>
+      <w:sdtPr>
         <w:rPr>
           <w:rFonts w:ascii="Arial" w:hAnsi="Arial" w:cs="Arial"/>
           <w:b/>
@@ -423,8 +378,1156 @@
           <w:sz w:val="32"/>
           <w:szCs w:val="32"/>
         </w:rPr>
-      </w:pPr>
-      <w:r>
+        <w:id w:val="-89772428"/>
+        <w:docPartObj>
+          <w:docPartGallery w:val="Table of Contents"/>
+          <w:docPartUnique/>
+        </w:docPartObj>
+      </w:sdtPr>
+      <w:sdtEndPr>
+        <w:rPr>
+          <w:rFonts w:asciiTheme="minorHAnsi" w:hAnsiTheme="minorHAnsi" w:cstheme="minorBidi"/>
+          <w:noProof/>
+          <w:color w:val="auto"/>
+          <w:sz w:val="24"/>
+          <w:szCs w:val="24"/>
+        </w:rPr>
+      </w:sdtEndPr>
+      <w:sdtContent>
+        <w:p>
+          <w:pPr>
+            <w:rPr>
+              <w:rFonts w:ascii="Arial" w:hAnsi="Arial" w:cs="Arial"/>
+              <w:b/>
+              <w:bCs/>
+              <w:color w:val="EE0000"/>
+              <w:sz w:val="32"/>
+              <w:szCs w:val="32"/>
+            </w:rPr>
+          </w:pPr>
+          <w:r>
+            <w:rPr>
+              <w:rFonts w:ascii="Arial" w:hAnsi="Arial" w:cs="Arial"/>
+              <w:b/>
+              <w:bCs/>
+              <w:color w:val="EE0000"/>
+              <w:sz w:val="32"/>
+              <w:szCs w:val="32"/>
+            </w:rPr>
+            <w:t>Contents</w:t>
+          </w:r>
+        </w:p>
+        <w:p>
+          <w:pPr>
+            <w:pStyle w:val="TOC1"/>
+            <w:tabs>
+              <w:tab w:val="left" w:pos="480"/>
+              <w:tab w:val="right" w:leader="dot" w:pos="9350"/>
+            </w:tabs>
+            <w:rPr>
+              <w:noProof/>
+              <w:lang w:val="en-US" w:eastAsia="en-US"/>
+            </w:rPr>
+          </w:pPr>
+          <w:r>
+            <w:fldChar w:fldCharType="begin"/>
+          </w:r>
+          <w:r>
+            <w:instrText xml:space="preserve"> TOC \o "1-3" \h \z \u </w:instrText>
+          </w:r>
+          <w:r>
+            <w:fldChar w:fldCharType="separate"/>
+          </w:r>
+          <w:hyperlink w:anchor="_Toc226030421" w:history="1">
+            <w:r>
+              <w:rPr>
+                <w:rStyle w:val="Hyperlink"/>
+                <w:rFonts w:ascii="Arial" w:hAnsi="Arial" w:cs="Arial"/>
+                <w:b/>
+                <w:bCs/>
+                <w:noProof/>
+              </w:rPr>
+              <w:t>1.</w:t>
+            </w:r>
+            <w:r>
+              <w:rPr>
+                <w:noProof/>
+                <w:lang w:val="en-US" w:eastAsia="en-US"/>
+              </w:rPr>
+              <w:tab/>
+            </w:r>
+            <w:r>
+              <w:rPr>
+                <w:rStyle w:val="Hyperlink"/>
+                <w:rFonts w:ascii="Arial" w:hAnsi="Arial" w:cs="Arial"/>
+                <w:b/>
+                <w:bCs/>
+                <w:noProof/>
+              </w:rPr>
+              <w:t>Introduction</w:t>
+            </w:r>
+            <w:r>
+              <w:rPr>
+                <w:noProof/>
+                <w:webHidden/>
+              </w:rPr>
+              <w:tab/>
+            </w:r>
+            <w:r>
+              <w:rPr>
+                <w:noProof/>
+                <w:webHidden/>
+              </w:rPr>
+              <w:fldChar w:fldCharType="begin"/>
+            </w:r>
+            <w:r>
+              <w:rPr>
+                <w:noProof/>
+                <w:webHidden/>
+              </w:rPr>
+              <w:instrText xml:space="preserve"> PAGEREF _Toc226030421 \h </w:instrText>
+            </w:r>
+            <w:r>
+              <w:rPr>
+                <w:noProof/>
+                <w:webHidden/>
+              </w:rPr>
+            </w:r>
+            <w:r>
+              <w:rPr>
+                <w:noProof/>
+                <w:webHidden/>
+              </w:rPr>
+              <w:fldChar w:fldCharType="separate"/>
+            </w:r>
+            <w:r>
+              <w:rPr>
+                <w:noProof/>
+                <w:webHidden/>
+              </w:rPr>
+              <w:t>1</w:t>
+            </w:r>
+            <w:r>
+              <w:rPr>
+                <w:noProof/>
+                <w:webHidden/>
+              </w:rPr>
+              <w:fldChar w:fldCharType="end"/>
+            </w:r>
+          </w:hyperlink>
+        </w:p>
+        <w:p>
+          <w:pPr>
+            <w:pStyle w:val="TOC1"/>
+            <w:tabs>
+              <w:tab w:val="left" w:pos="480"/>
+              <w:tab w:val="right" w:leader="dot" w:pos="9350"/>
+            </w:tabs>
+            <w:rPr>
+              <w:noProof/>
+              <w:lang w:val="en-US" w:eastAsia="en-US"/>
+            </w:rPr>
+          </w:pPr>
+          <w:hyperlink w:anchor="_Toc226030422" w:history="1">
+            <w:r>
+              <w:rPr>
+                <w:rStyle w:val="Hyperlink"/>
+                <w:rFonts w:ascii="Arial" w:hAnsi="Arial" w:cs="Arial"/>
+                <w:b/>
+                <w:bCs/>
+                <w:noProof/>
+              </w:rPr>
+              <w:t>2.</w:t>
+            </w:r>
+            <w:r>
+              <w:rPr>
+                <w:noProof/>
+                <w:lang w:val="en-US" w:eastAsia="en-US"/>
+              </w:rPr>
+              <w:tab/>
+            </w:r>
+            <w:r>
+              <w:rPr>
+                <w:rStyle w:val="Hyperlink"/>
+                <w:rFonts w:ascii="Arial" w:hAnsi="Arial" w:cs="Arial"/>
+                <w:b/>
+                <w:bCs/>
+                <w:noProof/>
+              </w:rPr>
+              <w:t>Organisation Selection and Analysis</w:t>
+            </w:r>
+            <w:r>
+              <w:rPr>
+                <w:noProof/>
+                <w:webHidden/>
+              </w:rPr>
+              <w:tab/>
+            </w:r>
+            <w:r>
+              <w:rPr>
+                <w:noProof/>
+                <w:webHidden/>
+              </w:rPr>
+              <w:fldChar w:fldCharType="begin"/>
+            </w:r>
+            <w:r>
+              <w:rPr>
+                <w:noProof/>
+                <w:webHidden/>
+              </w:rPr>
+              <w:instrText xml:space="preserve"> PAGEREF _Toc226030422 \h </w:instrText>
+            </w:r>
+            <w:r>
+              <w:rPr>
+                <w:noProof/>
+                <w:webHidden/>
+              </w:rPr>
+            </w:r>
+            <w:r>
+              <w:rPr>
+                <w:noProof/>
+                <w:webHidden/>
+              </w:rPr>
+              <w:fldChar w:fldCharType="separate"/>
+            </w:r>
+            <w:r>
+              <w:rPr>
+                <w:noProof/>
+                <w:webHidden/>
+              </w:rPr>
+              <w:t>2</w:t>
+            </w:r>
+            <w:r>
+              <w:rPr>
+                <w:noProof/>
+                <w:webHidden/>
+              </w:rPr>
+              <w:fldChar w:fldCharType="end"/>
+            </w:r>
+          </w:hyperlink>
+        </w:p>
+        <w:p>
+          <w:pPr>
+            <w:pStyle w:val="TOC1"/>
+            <w:tabs>
+              <w:tab w:val="left" w:pos="480"/>
+              <w:tab w:val="right" w:leader="dot" w:pos="9350"/>
+            </w:tabs>
+            <w:rPr>
+              <w:noProof/>
+              <w:lang w:val="en-US" w:eastAsia="en-US"/>
+            </w:rPr>
+          </w:pPr>
+          <w:hyperlink w:anchor="_Toc226030423" w:history="1">
+            <w:r>
+              <w:rPr>
+                <w:rStyle w:val="Hyperlink"/>
+                <w:rFonts w:ascii="Arial" w:hAnsi="Arial" w:cs="Arial"/>
+                <w:b/>
+                <w:bCs/>
+                <w:noProof/>
+              </w:rPr>
+              <w:t>3.</w:t>
+            </w:r>
+            <w:r>
+              <w:rPr>
+                <w:noProof/>
+                <w:lang w:val="en-US" w:eastAsia="en-US"/>
+              </w:rPr>
+              <w:tab/>
+            </w:r>
+            <w:r>
+              <w:rPr>
+                <w:rStyle w:val="Hyperlink"/>
+                <w:rFonts w:ascii="Arial" w:hAnsi="Arial" w:cs="Arial"/>
+                <w:b/>
+                <w:bCs/>
+                <w:noProof/>
+              </w:rPr>
+              <w:t>Requirements Engineering</w:t>
+            </w:r>
+            <w:r>
+              <w:rPr>
+                <w:noProof/>
+                <w:webHidden/>
+              </w:rPr>
+              <w:tab/>
+            </w:r>
+            <w:r>
+              <w:rPr>
+                <w:noProof/>
+                <w:webHidden/>
+              </w:rPr>
+              <w:fldChar w:fldCharType="begin"/>
+            </w:r>
+            <w:r>
+              <w:rPr>
+                <w:noProof/>
+                <w:webHidden/>
+              </w:rPr>
+              <w:instrText xml:space="preserve"> PAGEREF _Toc226030423 \h </w:instrText>
+            </w:r>
+            <w:r>
+              <w:rPr>
+                <w:noProof/>
+                <w:webHidden/>
+              </w:rPr>
+            </w:r>
+            <w:r>
+              <w:rPr>
+                <w:noProof/>
+                <w:webHidden/>
+              </w:rPr>
+              <w:fldChar w:fldCharType="separate"/>
+            </w:r>
+            <w:r>
+              <w:rPr>
+                <w:noProof/>
+                <w:webHidden/>
+              </w:rPr>
+              <w:t>3</w:t>
+            </w:r>
+            <w:r>
+              <w:rPr>
+                <w:noProof/>
+                <w:webHidden/>
+              </w:rPr>
+              <w:fldChar w:fldCharType="end"/>
+            </w:r>
+          </w:hyperlink>
+        </w:p>
+        <w:p>
+          <w:pPr>
+            <w:pStyle w:val="TOC2"/>
+            <w:tabs>
+              <w:tab w:val="right" w:leader="dot" w:pos="9350"/>
+            </w:tabs>
+            <w:rPr>
+              <w:noProof/>
+              <w:lang w:val="en-US" w:eastAsia="en-US"/>
+            </w:rPr>
+          </w:pPr>
+          <w:hyperlink w:anchor="_Toc226030424" w:history="1">
+            <w:r>
+              <w:rPr>
+                <w:rStyle w:val="Hyperlink"/>
+                <w:rFonts w:ascii="Arial" w:hAnsi="Arial" w:cs="Arial"/>
+                <w:b/>
+                <w:bCs/>
+                <w:noProof/>
+              </w:rPr>
+              <w:t>3.1. Problem statement</w:t>
+            </w:r>
+            <w:r>
+              <w:rPr>
+                <w:noProof/>
+                <w:webHidden/>
+              </w:rPr>
+              <w:tab/>
+            </w:r>
+            <w:r>
+              <w:rPr>
+                <w:noProof/>
+                <w:webHidden/>
+              </w:rPr>
+              <w:fldChar w:fldCharType="begin"/>
+            </w:r>
+            <w:r>
+              <w:rPr>
+                <w:noProof/>
+                <w:webHidden/>
+              </w:rPr>
+              <w:instrText xml:space="preserve"> PAGEREF _Toc226030424 \h </w:instrText>
+            </w:r>
+            <w:r>
+              <w:rPr>
+                <w:noProof/>
+                <w:webHidden/>
+              </w:rPr>
+            </w:r>
+            <w:r>
+              <w:rPr>
+                <w:noProof/>
+                <w:webHidden/>
+              </w:rPr>
+              <w:fldChar w:fldCharType="separate"/>
+            </w:r>
+            <w:r>
+              <w:rPr>
+                <w:noProof/>
+                <w:webHidden/>
+              </w:rPr>
+              <w:t>3</w:t>
+            </w:r>
+            <w:r>
+              <w:rPr>
+                <w:noProof/>
+                <w:webHidden/>
+              </w:rPr>
+              <w:fldChar w:fldCharType="end"/>
+            </w:r>
+          </w:hyperlink>
+        </w:p>
+        <w:p>
+          <w:pPr>
+            <w:pStyle w:val="TOC2"/>
+            <w:tabs>
+              <w:tab w:val="right" w:leader="dot" w:pos="9350"/>
+            </w:tabs>
+            <w:rPr>
+              <w:noProof/>
+              <w:lang w:val="en-US" w:eastAsia="en-US"/>
+            </w:rPr>
+          </w:pPr>
+          <w:hyperlink w:anchor="_Toc226030425" w:history="1">
+            <w:r>
+              <w:rPr>
+                <w:rStyle w:val="Hyperlink"/>
+                <w:rFonts w:ascii="Arial" w:hAnsi="Arial" w:cs="Arial"/>
+                <w:b/>
+                <w:bCs/>
+                <w:noProof/>
+              </w:rPr>
+              <w:t>3.2. Requirement Analysis</w:t>
+            </w:r>
+            <w:r>
+              <w:rPr>
+                <w:noProof/>
+                <w:webHidden/>
+              </w:rPr>
+              <w:tab/>
+            </w:r>
+            <w:r>
+              <w:rPr>
+                <w:noProof/>
+                <w:webHidden/>
+              </w:rPr>
+              <w:fldChar w:fldCharType="begin"/>
+            </w:r>
+            <w:r>
+              <w:rPr>
+                <w:noProof/>
+                <w:webHidden/>
+              </w:rPr>
+              <w:instrText xml:space="preserve"> PAGEREF _Toc226030425 \h </w:instrText>
+            </w:r>
+            <w:r>
+              <w:rPr>
+                <w:noProof/>
+                <w:webHidden/>
+              </w:rPr>
+            </w:r>
+            <w:r>
+              <w:rPr>
+                <w:noProof/>
+                <w:webHidden/>
+              </w:rPr>
+              <w:fldChar w:fldCharType="separate"/>
+            </w:r>
+            <w:r>
+              <w:rPr>
+                <w:noProof/>
+                <w:webHidden/>
+              </w:rPr>
+              <w:t>4</w:t>
+            </w:r>
+            <w:r>
+              <w:rPr>
+                <w:noProof/>
+                <w:webHidden/>
+              </w:rPr>
+              <w:fldChar w:fldCharType="end"/>
+            </w:r>
+          </w:hyperlink>
+        </w:p>
+        <w:p>
+          <w:pPr>
+            <w:pStyle w:val="TOC3"/>
+            <w:tabs>
+              <w:tab w:val="right" w:leader="dot" w:pos="9350"/>
+            </w:tabs>
+            <w:rPr>
+              <w:noProof/>
+              <w:lang w:val="en-US" w:eastAsia="en-US"/>
+            </w:rPr>
+          </w:pPr>
+          <w:hyperlink w:anchor="_Toc226030426" w:history="1">
+            <w:r>
+              <w:rPr>
+                <w:rStyle w:val="Hyperlink"/>
+                <w:rFonts w:ascii="Arial" w:hAnsi="Arial" w:cs="Arial"/>
+                <w:b/>
+                <w:bCs/>
+                <w:noProof/>
+              </w:rPr>
+              <w:t>i. Stakeholders and Roles</w:t>
+            </w:r>
+            <w:r>
+              <w:rPr>
+                <w:noProof/>
+                <w:webHidden/>
+              </w:rPr>
+              <w:tab/>
+            </w:r>
+            <w:r>
+              <w:rPr>
+                <w:noProof/>
+                <w:webHidden/>
+              </w:rPr>
+              <w:fldChar w:fldCharType="begin"/>
+            </w:r>
+            <w:r>
+              <w:rPr>
+                <w:noProof/>
+                <w:webHidden/>
+              </w:rPr>
+              <w:instrText xml:space="preserve"> PAGEREF _Toc226030426 \h </w:instrText>
+            </w:r>
+            <w:r>
+              <w:rPr>
+                <w:noProof/>
+                <w:webHidden/>
+              </w:rPr>
+            </w:r>
+            <w:r>
+              <w:rPr>
+                <w:noProof/>
+                <w:webHidden/>
+              </w:rPr>
+              <w:fldChar w:fldCharType="separate"/>
+            </w:r>
+            <w:r>
+              <w:rPr>
+                <w:noProof/>
+                <w:webHidden/>
+              </w:rPr>
+              <w:t>4</w:t>
+            </w:r>
+            <w:r>
+              <w:rPr>
+                <w:noProof/>
+                <w:webHidden/>
+              </w:rPr>
+              <w:fldChar w:fldCharType="end"/>
+            </w:r>
+          </w:hyperlink>
+        </w:p>
+        <w:p>
+          <w:pPr>
+            <w:pStyle w:val="TOC3"/>
+            <w:tabs>
+              <w:tab w:val="right" w:leader="dot" w:pos="9350"/>
+            </w:tabs>
+            <w:rPr>
+              <w:noProof/>
+              <w:lang w:val="en-US" w:eastAsia="en-US"/>
+            </w:rPr>
+          </w:pPr>
+          <w:hyperlink w:anchor="_Toc226030427" w:history="1">
+            <w:r>
+              <w:rPr>
+                <w:rStyle w:val="Hyperlink"/>
+                <w:rFonts w:ascii="Arial" w:hAnsi="Arial" w:cs="Arial"/>
+                <w:b/>
+                <w:bCs/>
+                <w:noProof/>
+              </w:rPr>
+              <w:t>ii. Functional Requirements</w:t>
+            </w:r>
+            <w:r>
+              <w:rPr>
+                <w:noProof/>
+                <w:webHidden/>
+              </w:rPr>
+              <w:tab/>
+            </w:r>
+            <w:r>
+              <w:rPr>
+                <w:noProof/>
+                <w:webHidden/>
+              </w:rPr>
+              <w:fldChar w:fldCharType="begin"/>
+            </w:r>
+            <w:r>
+              <w:rPr>
+                <w:noProof/>
+                <w:webHidden/>
+              </w:rPr>
+              <w:instrText xml:space="preserve"> PAGEREF _Toc226030427 \h </w:instrText>
+            </w:r>
+            <w:r>
+              <w:rPr>
+                <w:noProof/>
+                <w:webHidden/>
+              </w:rPr>
+            </w:r>
+            <w:r>
+              <w:rPr>
+                <w:noProof/>
+                <w:webHidden/>
+              </w:rPr>
+              <w:fldChar w:fldCharType="separate"/>
+            </w:r>
+            <w:r>
+              <w:rPr>
+                <w:noProof/>
+                <w:webHidden/>
+              </w:rPr>
+              <w:t>5</w:t>
+            </w:r>
+            <w:r>
+              <w:rPr>
+                <w:noProof/>
+                <w:webHidden/>
+              </w:rPr>
+              <w:fldChar w:fldCharType="end"/>
+            </w:r>
+          </w:hyperlink>
+        </w:p>
+        <w:p>
+          <w:pPr>
+            <w:pStyle w:val="TOC3"/>
+            <w:tabs>
+              <w:tab w:val="right" w:leader="dot" w:pos="9350"/>
+            </w:tabs>
+            <w:rPr>
+              <w:noProof/>
+              <w:lang w:val="en-US" w:eastAsia="en-US"/>
+            </w:rPr>
+          </w:pPr>
+          <w:hyperlink w:anchor="_Toc226030428" w:history="1">
+            <w:r>
+              <w:rPr>
+                <w:rStyle w:val="Hyperlink"/>
+                <w:rFonts w:ascii="Arial" w:hAnsi="Arial" w:cs="Arial"/>
+                <w:b/>
+                <w:bCs/>
+                <w:noProof/>
+              </w:rPr>
+              <w:t>iii. Non-Functional Requirements</w:t>
+            </w:r>
+            <w:r>
+              <w:rPr>
+                <w:noProof/>
+                <w:webHidden/>
+              </w:rPr>
+              <w:tab/>
+            </w:r>
+            <w:r>
+              <w:rPr>
+                <w:noProof/>
+                <w:webHidden/>
+              </w:rPr>
+              <w:fldChar w:fldCharType="begin"/>
+            </w:r>
+            <w:r>
+              <w:rPr>
+                <w:noProof/>
+                <w:webHidden/>
+              </w:rPr>
+              <w:instrText xml:space="preserve"> PAGEREF _Toc226030428 \h </w:instrText>
+            </w:r>
+            <w:r>
+              <w:rPr>
+                <w:noProof/>
+                <w:webHidden/>
+              </w:rPr>
+            </w:r>
+            <w:r>
+              <w:rPr>
+                <w:noProof/>
+                <w:webHidden/>
+              </w:rPr>
+              <w:fldChar w:fldCharType="separate"/>
+            </w:r>
+            <w:r>
+              <w:rPr>
+                <w:noProof/>
+                <w:webHidden/>
+              </w:rPr>
+              <w:t>6</w:t>
+            </w:r>
+            <w:r>
+              <w:rPr>
+                <w:noProof/>
+                <w:webHidden/>
+              </w:rPr>
+              <w:fldChar w:fldCharType="end"/>
+            </w:r>
+          </w:hyperlink>
+        </w:p>
+        <w:p>
+          <w:pPr>
+            <w:pStyle w:val="TOC1"/>
+            <w:tabs>
+              <w:tab w:val="left" w:pos="480"/>
+              <w:tab w:val="right" w:leader="dot" w:pos="9350"/>
+            </w:tabs>
+            <w:rPr>
+              <w:noProof/>
+              <w:lang w:val="en-US" w:eastAsia="en-US"/>
+            </w:rPr>
+          </w:pPr>
+          <w:hyperlink w:anchor="_Toc226030429" w:history="1">
+            <w:r>
+              <w:rPr>
+                <w:rStyle w:val="Hyperlink"/>
+                <w:rFonts w:ascii="Arial" w:hAnsi="Arial" w:cs="Arial"/>
+                <w:b/>
+                <w:bCs/>
+                <w:noProof/>
+              </w:rPr>
+              <w:t>4.</w:t>
+            </w:r>
+            <w:r>
+              <w:rPr>
+                <w:noProof/>
+                <w:lang w:val="en-US" w:eastAsia="en-US"/>
+              </w:rPr>
+              <w:tab/>
+            </w:r>
+            <w:r>
+              <w:rPr>
+                <w:rStyle w:val="Hyperlink"/>
+                <w:rFonts w:ascii="Arial" w:hAnsi="Arial" w:cs="Arial"/>
+                <w:b/>
+                <w:bCs/>
+                <w:noProof/>
+              </w:rPr>
+              <w:t>Use case diagram</w:t>
+            </w:r>
+            <w:r>
+              <w:rPr>
+                <w:noProof/>
+                <w:webHidden/>
+              </w:rPr>
+              <w:tab/>
+            </w:r>
+            <w:r>
+              <w:rPr>
+                <w:noProof/>
+                <w:webHidden/>
+              </w:rPr>
+              <w:fldChar w:fldCharType="begin"/>
+            </w:r>
+            <w:r>
+              <w:rPr>
+                <w:noProof/>
+                <w:webHidden/>
+              </w:rPr>
+              <w:instrText xml:space="preserve"> PAGEREF _Toc226030429 \h </w:instrText>
+            </w:r>
+            <w:r>
+              <w:rPr>
+                <w:noProof/>
+                <w:webHidden/>
+              </w:rPr>
+            </w:r>
+            <w:r>
+              <w:rPr>
+                <w:noProof/>
+                <w:webHidden/>
+              </w:rPr>
+              <w:fldChar w:fldCharType="separate"/>
+            </w:r>
+            <w:r>
+              <w:rPr>
+                <w:noProof/>
+                <w:webHidden/>
+              </w:rPr>
+              <w:t>9</w:t>
+            </w:r>
+            <w:r>
+              <w:rPr>
+                <w:noProof/>
+                <w:webHidden/>
+              </w:rPr>
+              <w:fldChar w:fldCharType="end"/>
+            </w:r>
+          </w:hyperlink>
+        </w:p>
+        <w:p>
+          <w:pPr>
+            <w:pStyle w:val="TOC1"/>
+            <w:tabs>
+              <w:tab w:val="left" w:pos="480"/>
+              <w:tab w:val="right" w:leader="dot" w:pos="9350"/>
+            </w:tabs>
+            <w:rPr>
+              <w:noProof/>
+              <w:lang w:val="en-US" w:eastAsia="en-US"/>
+            </w:rPr>
+          </w:pPr>
+          <w:hyperlink w:anchor="_Toc226030430" w:history="1">
+            <w:r>
+              <w:rPr>
+                <w:rStyle w:val="Hyperlink"/>
+                <w:rFonts w:ascii="Arial" w:hAnsi="Arial" w:cs="Arial"/>
+                <w:b/>
+                <w:bCs/>
+                <w:noProof/>
+              </w:rPr>
+              <w:t>5.</w:t>
+            </w:r>
+            <w:r>
+              <w:rPr>
+                <w:noProof/>
+                <w:lang w:val="en-US" w:eastAsia="en-US"/>
+              </w:rPr>
+              <w:tab/>
+            </w:r>
+            <w:r>
+              <w:rPr>
+                <w:rStyle w:val="Hyperlink"/>
+                <w:rFonts w:ascii="Arial" w:hAnsi="Arial" w:cs="Arial"/>
+                <w:b/>
+                <w:bCs/>
+                <w:noProof/>
+              </w:rPr>
+              <w:t>Class diagram</w:t>
+            </w:r>
+            <w:r>
+              <w:rPr>
+                <w:noProof/>
+                <w:webHidden/>
+              </w:rPr>
+              <w:tab/>
+            </w:r>
+            <w:r>
+              <w:rPr>
+                <w:noProof/>
+                <w:webHidden/>
+              </w:rPr>
+              <w:fldChar w:fldCharType="begin"/>
+            </w:r>
+            <w:r>
+              <w:rPr>
+                <w:noProof/>
+                <w:webHidden/>
+              </w:rPr>
+              <w:instrText xml:space="preserve"> PAGEREF _Toc226030430 \h </w:instrText>
+            </w:r>
+            <w:r>
+              <w:rPr>
+                <w:noProof/>
+                <w:webHidden/>
+              </w:rPr>
+            </w:r>
+            <w:r>
+              <w:rPr>
+                <w:noProof/>
+                <w:webHidden/>
+              </w:rPr>
+              <w:fldChar w:fldCharType="separate"/>
+            </w:r>
+            <w:r>
+              <w:rPr>
+                <w:noProof/>
+                <w:webHidden/>
+              </w:rPr>
+              <w:t>10</w:t>
+            </w:r>
+            <w:r>
+              <w:rPr>
+                <w:noProof/>
+                <w:webHidden/>
+              </w:rPr>
+              <w:fldChar w:fldCharType="end"/>
+            </w:r>
+          </w:hyperlink>
+        </w:p>
+        <w:p>
+          <w:pPr>
+            <w:pStyle w:val="TOC1"/>
+            <w:tabs>
+              <w:tab w:val="left" w:pos="480"/>
+              <w:tab w:val="right" w:leader="dot" w:pos="9350"/>
+            </w:tabs>
+            <w:rPr>
+              <w:noProof/>
+              <w:lang w:val="en-US" w:eastAsia="en-US"/>
+            </w:rPr>
+          </w:pPr>
+          <w:hyperlink w:anchor="_Toc226030431" w:history="1">
+            <w:r>
+              <w:rPr>
+                <w:rStyle w:val="Hyperlink"/>
+                <w:rFonts w:ascii="Arial" w:hAnsi="Arial" w:cs="Arial"/>
+                <w:b/>
+                <w:bCs/>
+                <w:noProof/>
+              </w:rPr>
+              <w:t>6.</w:t>
+            </w:r>
+            <w:r>
+              <w:rPr>
+                <w:noProof/>
+                <w:lang w:val="en-US" w:eastAsia="en-US"/>
+              </w:rPr>
+              <w:tab/>
+            </w:r>
+            <w:r>
+              <w:rPr>
+                <w:rStyle w:val="Hyperlink"/>
+                <w:rFonts w:ascii="Arial" w:hAnsi="Arial" w:cs="Arial"/>
+                <w:b/>
+                <w:bCs/>
+                <w:noProof/>
+              </w:rPr>
+              <w:t>C# Implementation</w:t>
+            </w:r>
+            <w:r>
+              <w:rPr>
+                <w:noProof/>
+                <w:webHidden/>
+              </w:rPr>
+              <w:tab/>
+            </w:r>
+            <w:r>
+              <w:rPr>
+                <w:noProof/>
+                <w:webHidden/>
+              </w:rPr>
+              <w:fldChar w:fldCharType="begin"/>
+            </w:r>
+            <w:r>
+              <w:rPr>
+                <w:noProof/>
+                <w:webHidden/>
+              </w:rPr>
+              <w:instrText xml:space="preserve"> PAGEREF _Toc226030431 \h </w:instrText>
+            </w:r>
+            <w:r>
+              <w:rPr>
+                <w:noProof/>
+                <w:webHidden/>
+              </w:rPr>
+            </w:r>
+            <w:r>
+              <w:rPr>
+                <w:noProof/>
+                <w:webHidden/>
+              </w:rPr>
+              <w:fldChar w:fldCharType="separate"/>
+            </w:r>
+            <w:r>
+              <w:rPr>
+                <w:noProof/>
+                <w:webHidden/>
+              </w:rPr>
+              <w:t>11</w:t>
+            </w:r>
+            <w:r>
+              <w:rPr>
+                <w:noProof/>
+                <w:webHidden/>
+              </w:rPr>
+              <w:fldChar w:fldCharType="end"/>
+            </w:r>
+          </w:hyperlink>
+        </w:p>
+        <w:p>
+          <w:pPr>
+            <w:pStyle w:val="TOC1"/>
+            <w:tabs>
+              <w:tab w:val="left" w:pos="480"/>
+              <w:tab w:val="right" w:leader="dot" w:pos="9350"/>
+            </w:tabs>
+            <w:rPr>
+              <w:noProof/>
+              <w:lang w:val="en-US" w:eastAsia="en-US"/>
+            </w:rPr>
+          </w:pPr>
+          <w:hyperlink w:anchor="_Toc226030432" w:history="1">
+            <w:r>
+              <w:rPr>
+                <w:rStyle w:val="Hyperlink"/>
+                <w:rFonts w:ascii="Arial" w:hAnsi="Arial" w:cs="Arial"/>
+                <w:b/>
+                <w:bCs/>
+                <w:noProof/>
+              </w:rPr>
+              <w:t>7.</w:t>
+            </w:r>
+            <w:r>
+              <w:rPr>
+                <w:noProof/>
+                <w:lang w:val="en-US" w:eastAsia="en-US"/>
+              </w:rPr>
+              <w:tab/>
+            </w:r>
+            <w:r>
+              <w:rPr>
+                <w:rStyle w:val="Hyperlink"/>
+                <w:rFonts w:ascii="Arial" w:hAnsi="Arial" w:cs="Arial"/>
+                <w:b/>
+                <w:bCs/>
+                <w:noProof/>
+              </w:rPr>
+              <w:t>Conclusion</w:t>
+            </w:r>
+            <w:r>
+              <w:rPr>
+                <w:noProof/>
+                <w:webHidden/>
+              </w:rPr>
+              <w:tab/>
+            </w:r>
+            <w:r>
+              <w:rPr>
+                <w:noProof/>
+                <w:webHidden/>
+              </w:rPr>
+              <w:fldChar w:fldCharType="begin"/>
+            </w:r>
+            <w:r>
+              <w:rPr>
+                <w:noProof/>
+                <w:webHidden/>
+              </w:rPr>
+              <w:instrText xml:space="preserve"> PAGEREF _Toc226030432 \h </w:instrText>
+            </w:r>
+            <w:r>
+              <w:rPr>
+                <w:noProof/>
+                <w:webHidden/>
+              </w:rPr>
+            </w:r>
+            <w:r>
+              <w:rPr>
+                <w:noProof/>
+                <w:webHidden/>
+              </w:rPr>
+              <w:fldChar w:fldCharType="separate"/>
+            </w:r>
+            <w:r>
+              <w:rPr>
+                <w:noProof/>
+                <w:webHidden/>
+              </w:rPr>
+              <w:t>12</w:t>
+            </w:r>
+            <w:r>
+              <w:rPr>
+                <w:noProof/>
+                <w:webHidden/>
+              </w:rPr>
+              <w:fldChar w:fldCharType="end"/>
+            </w:r>
+          </w:hyperlink>
+        </w:p>
+        <w:p>
+          <w:pPr>
+            <w:pStyle w:val="TOC1"/>
+            <w:tabs>
+              <w:tab w:val="right" w:leader="dot" w:pos="9350"/>
+            </w:tabs>
+            <w:rPr>
+              <w:noProof/>
+              <w:lang w:val="en-US" w:eastAsia="en-US"/>
+            </w:rPr>
+          </w:pPr>
+          <w:hyperlink w:anchor="_Toc226030433" w:history="1">
+            <w:r>
+              <w:rPr>
+                <w:rStyle w:val="Hyperlink"/>
+                <w:rFonts w:ascii="Arial" w:hAnsi="Arial" w:cs="Arial"/>
+                <w:b/>
+                <w:bCs/>
+                <w:noProof/>
+              </w:rPr>
+              <w:t>References</w:t>
+            </w:r>
+            <w:r>
+              <w:rPr>
+                <w:noProof/>
+                <w:webHidden/>
+              </w:rPr>
+              <w:tab/>
+            </w:r>
+            <w:r>
+              <w:rPr>
+                <w:noProof/>
+                <w:webHidden/>
+              </w:rPr>
+              <w:fldChar w:fldCharType="begin"/>
+            </w:r>
+            <w:r>
+              <w:rPr>
+                <w:noProof/>
+                <w:webHidden/>
+              </w:rPr>
+              <w:instrText xml:space="preserve"> PAGEREF _Toc226030433 \h </w:instrText>
+            </w:r>
+            <w:r>
+              <w:rPr>
+                <w:noProof/>
+                <w:webHidden/>
+              </w:rPr>
+            </w:r>
+            <w:r>
+              <w:rPr>
+                <w:noProof/>
+                <w:webHidden/>
+              </w:rPr>
+              <w:fldChar w:fldCharType="separate"/>
+            </w:r>
+            <w:r>
+              <w:rPr>
+                <w:noProof/>
+                <w:webHidden/>
+              </w:rPr>
+              <w:t>13</w:t>
+            </w:r>
+            <w:r>
+              <w:rPr>
+                <w:noProof/>
+                <w:webHidden/>
+              </w:rPr>
+              <w:fldChar w:fldCharType="end"/>
+            </w:r>
+          </w:hyperlink>
+        </w:p>
+        <w:p>
+          <w:r>
+            <w:rPr>
+              <w:b/>
+              <w:bCs/>
+              <w:noProof/>
+            </w:rPr>
+            <w:fldChar w:fldCharType="end"/>
+          </w:r>
+        </w:p>
+      </w:sdtContent>
+    </w:sdt>
+    <w:p>
+      <w:pPr>
+        <w:rPr>
+          <w:rFonts w:ascii="Arial" w:hAnsi="Arial" w:cs="Arial"/>
+        </w:rPr>
+        <w:sectPr>
+          <w:pgSz w:w="12240" w:h="15840"/>
+          <w:pgMar w:top="1440" w:right="1440" w:bottom="1440" w:left="1440" w:header="708" w:footer="708" w:gutter="0"/>
+          <w:cols w:space="708"/>
+          <w:docGrid w:linePitch="360"/>
+        </w:sectPr>
+      </w:pPr>
+      <w:r>
+        <w:rPr>
+          <w:rFonts w:ascii="Arial" w:hAnsi="Arial" w:cs="Arial"/>
+        </w:rPr>
+        <w:br w:type="page"/>
+      </w:r>
+    </w:p>
+    <w:p>
+      <w:pPr>
+        <w:pStyle w:val="Heading1"/>
+        <w:numPr>
+          <w:ilvl w:val="0"/>
+          <w:numId w:val="3"/>
+        </w:numPr>
+        <w:spacing w:line="360" w:lineRule="auto"/>
+        <w:ind w:left="284"/>
         <w:rPr>
           <w:rFonts w:ascii="Arial" w:hAnsi="Arial" w:cs="Arial"/>
           <w:b/>
@@ -433,125 +1536,9 @@
           <w:sz w:val="32"/>
           <w:szCs w:val="32"/>
         </w:rPr>
-        <w:lastRenderedPageBreak/>
-        <w:t>Organisation Selection and Analysis</w:t>
-      </w:r>
-    </w:p>
-    <w:p>
-      <w:pPr>
-        <w:spacing w:line="360" w:lineRule="auto"/>
-        <w:ind w:left="284"/>
-        <w:jc w:val="both"/>
-        <w:rPr>
-          <w:rFonts w:ascii="Arial" w:hAnsi="Arial" w:cs="Arial"/>
-        </w:rPr>
-      </w:pPr>
-      <w:r>
-        <w:rPr>
-          <w:rFonts w:ascii="Arial" w:hAnsi="Arial" w:cs="Arial"/>
-        </w:rPr>
-        <w:t>The selected organisation for this project is Auckland University of Technology (AUT), a well-established public university located in New Zealand. AUT is recognised as one of the country’s largest tertiary institutions, with 26,708 of enrolled students and over 4,046 staff members.</w:t>
-      </w:r>
-      <w:r>
-        <w:t xml:space="preserve"> </w:t>
-      </w:r>
-      <w:r>
-        <w:rPr>
-          <w:rFonts w:ascii="Arial" w:hAnsi="Arial" w:cs="Arial"/>
-        </w:rPr>
-        <w:t>The university operates across multiple campuses and delivers a wide range of undergraduate and postgraduate programmes, demonstrating both its scale and operational complexity.</w:t>
-      </w:r>
-    </w:p>
-    <w:p>
-      <w:pPr>
-        <w:spacing w:line="360" w:lineRule="auto"/>
-        <w:ind w:left="284"/>
-        <w:jc w:val="both"/>
-        <w:rPr>
-          <w:rFonts w:ascii="Arial" w:hAnsi="Arial" w:cs="Arial"/>
-        </w:rPr>
-      </w:pPr>
-      <w:r>
-        <w:rPr>
-          <w:rFonts w:ascii="Arial" w:hAnsi="Arial" w:cs="Arial"/>
-        </w:rPr>
-        <w:t>AUT has a well-established organisational structure consisting of multiple departments that support its academic and administrative functions. These include academic faculties responsible for teaching and course delivery, administrative units managing student records and enrolment processes, financial services handling tuition fees and payments, and information technology services maintaining system infrastructure.</w:t>
-      </w:r>
-      <w:r>
-        <w:t xml:space="preserve"> </w:t>
-      </w:r>
-      <w:r>
-        <w:rPr>
-          <w:rFonts w:ascii="Arial" w:hAnsi="Arial" w:cs="Arial"/>
-        </w:rPr>
-        <w:t>The presence of these distinct functional areas requires coordinated operations supported by integrated information systems.</w:t>
-      </w:r>
-      <w:r>
-        <w:rPr>
-          <w:rFonts w:ascii="Arial" w:hAnsi="Arial" w:cs="Arial"/>
-        </w:rPr>
-        <w:t xml:space="preserve"> Among these systems, t</w:t>
-      </w:r>
-      <w:r>
-        <w:rPr>
-          <w:rFonts w:ascii="Arial" w:hAnsi="Arial" w:cs="Arial"/>
-        </w:rPr>
-        <w:t>he Student Enrolment and Course Management System is selected as the focus of this project</w:t>
-      </w:r>
-      <w:r>
-        <w:rPr>
-          <w:rFonts w:ascii="Arial" w:hAnsi="Arial" w:cs="Arial"/>
-        </w:rPr>
-        <w:t>.</w:t>
-      </w:r>
-    </w:p>
-    <w:p>
-      <w:pPr>
-        <w:spacing w:line="360" w:lineRule="auto"/>
-        <w:ind w:left="284"/>
-        <w:jc w:val="both"/>
-        <w:rPr>
-          <w:rFonts w:ascii="Arial" w:hAnsi="Arial" w:cs="Arial"/>
-        </w:rPr>
-      </w:pPr>
-      <w:r>
-        <w:rPr>
-          <w:rFonts w:ascii="Arial" w:hAnsi="Arial" w:cs="Arial"/>
-        </w:rPr>
-        <w:t xml:space="preserve">The selected system involves several key stakeholders and user roles with distinct responsibilities. Students interact with the system to search for courses, submit enrolment requests, and view their enrolment status. Academic staff are responsible for managing course-related information and monitoring enrolled students. Administrative staff handle the review and approval of enrolment requests, while finance staff process payments required to confirm enrolments. In addition, IT staff support the technical operation of the system, and university management may rely on system data for planning and decision-making. These roles demonstrate the need for a system that supports multiple users with different responsibilities and access levels. </w:t>
-      </w:r>
-    </w:p>
-    <w:p>
-      <w:pPr>
-        <w:spacing w:line="360" w:lineRule="auto"/>
-        <w:ind w:left="284"/>
-        <w:jc w:val="both"/>
-        <w:rPr>
-          <w:rFonts w:ascii="Arial" w:hAnsi="Arial" w:cs="Arial"/>
-        </w:rPr>
-      </w:pPr>
-      <w:r>
-        <w:rPr>
-          <w:rFonts w:ascii="Arial" w:hAnsi="Arial" w:cs="Arial"/>
-        </w:rPr>
-        <w:t xml:space="preserve">The selected system directly supports the university’s core function of delivering education by enabling students to enrol in courses and ensuring that institutional rules, such as prerequisites and course capacity limits, are enforced. The system also facilitates coordination between different parts of the organisation by supporting workflows such as enrolment submission, approval, and payment processing. </w:t>
-      </w:r>
-      <w:r>
-        <w:rPr>
-          <w:rFonts w:ascii="Arial" w:hAnsi="Arial" w:cs="Arial"/>
-        </w:rPr>
-        <w:br w:type="page"/>
-      </w:r>
-    </w:p>
-    <w:p>
-      <w:pPr>
-        <w:pStyle w:val="Heading1"/>
-        <w:numPr>
-          <w:ilvl w:val="0"/>
-          <w:numId w:val="3"/>
-        </w:numPr>
-        <w:spacing w:before="0" w:after="0" w:line="360" w:lineRule="auto"/>
-        <w:ind w:left="284"/>
+      </w:pPr>
+      <w:bookmarkStart w:id="1" w:name="_Toc226030421"/>
+      <w:r>
         <w:rPr>
           <w:rFonts w:ascii="Arial" w:hAnsi="Arial" w:cs="Arial"/>
           <w:b/>
@@ -560,8 +1547,107 @@
           <w:sz w:val="32"/>
           <w:szCs w:val="32"/>
         </w:rPr>
-      </w:pPr>
-      <w:r>
+        <w:lastRenderedPageBreak/>
+        <w:t>Introduction</w:t>
+      </w:r>
+      <w:bookmarkEnd w:id="1"/>
+    </w:p>
+    <w:p>
+      <w:pPr>
+        <w:spacing w:line="360" w:lineRule="auto"/>
+        <w:ind w:left="284"/>
+        <w:jc w:val="both"/>
+        <w:rPr>
+          <w:rFonts w:ascii="Arial" w:hAnsi="Arial" w:cs="Arial"/>
+        </w:rPr>
+      </w:pPr>
+      <w:r>
+        <w:rPr>
+          <w:rFonts w:ascii="Arial" w:hAnsi="Arial" w:cs="Arial"/>
+        </w:rPr>
+        <w:t xml:space="preserve">Modern medium to large organisations </w:t>
+      </w:r>
+      <w:proofErr w:type="gramStart"/>
+      <w:r>
+        <w:rPr>
+          <w:rFonts w:ascii="Arial" w:hAnsi="Arial" w:cs="Arial"/>
+        </w:rPr>
+        <w:t>depend</w:t>
+      </w:r>
+      <w:proofErr w:type="gramEnd"/>
+      <w:r>
+        <w:rPr>
+          <w:rFonts w:ascii="Arial" w:hAnsi="Arial" w:cs="Arial"/>
+        </w:rPr>
+        <w:t xml:space="preserve"> on advanced software systems to manage operations, coordinate between departments, and support decision-making. However, these systems are often developed over time without proper design practices, leading to maintenance challenges, scalability issues, and increased long-term risks.</w:t>
+      </w:r>
+    </w:p>
+    <w:p>
+      <w:pPr>
+        <w:spacing w:line="360" w:lineRule="auto"/>
+        <w:ind w:left="284"/>
+        <w:jc w:val="both"/>
+        <w:rPr>
+          <w:rFonts w:ascii="Arial" w:hAnsi="Arial" w:cs="Arial"/>
+        </w:rPr>
+      </w:pPr>
+      <w:r>
+        <w:rPr>
+          <w:rFonts w:ascii="Arial" w:hAnsi="Arial" w:cs="Arial"/>
+        </w:rPr>
+        <w:t>This project focuses on analysing, modelling, and designing a business-critical information system within a real-world organisational context. The aim is to apply rigorous engineering techniques and Unified Modelling Language (UML) to develop a clear and structured system model, which will later be translated into an object-oriented implementation using C#.</w:t>
+      </w:r>
+    </w:p>
+    <w:p>
+      <w:pPr>
+        <w:spacing w:line="360" w:lineRule="auto"/>
+        <w:ind w:left="284"/>
+        <w:jc w:val="both"/>
+        <w:rPr>
+          <w:rFonts w:ascii="Arial" w:hAnsi="Arial" w:cs="Arial"/>
+        </w:rPr>
+      </w:pPr>
+      <w:r>
+        <w:rPr>
+          <w:rFonts w:ascii="Arial" w:hAnsi="Arial" w:cs="Arial"/>
+        </w:rPr>
+        <w:t>The report is structured into several stages. It begins with organisational selection and system analysis, identifying the departmental structure, stakeholders, and system scope. This is followed by requirements engineering, where functional and non-functional requirements are defined and linked to stakeholder needs. UML modelling is then used to represent system functionality through use case diagrams and descriptions, followed by an initial class diagram that outlines the system’s structure and supports implementation planning.</w:t>
+      </w:r>
+    </w:p>
+    <w:p>
+      <w:pPr>
+        <w:spacing w:line="360" w:lineRule="auto"/>
+        <w:ind w:left="284"/>
+        <w:jc w:val="both"/>
+        <w:rPr>
+          <w:rFonts w:ascii="Arial" w:eastAsiaTheme="majorEastAsia" w:hAnsi="Arial" w:cs="Arial"/>
+          <w:color w:val="0F4761" w:themeColor="accent1" w:themeShade="BF"/>
+          <w:sz w:val="40"/>
+          <w:szCs w:val="40"/>
+        </w:rPr>
+      </w:pPr>
+      <w:r>
+        <w:rPr>
+          <w:rFonts w:ascii="Arial" w:hAnsi="Arial" w:cs="Arial"/>
+        </w:rPr>
+        <w:t>The project also considers potential design limitations before implementation and incorporates version control practices using GitHub to reflect real-world development. Overall, this project demonstrates how structured modelling supports the software development lifecycle and contributes to building scalable, maintainable, and reliable systems.</w:t>
+      </w:r>
+      <w:r>
+        <w:rPr>
+          <w:rFonts w:ascii="Arial" w:hAnsi="Arial" w:cs="Arial"/>
+        </w:rPr>
+        <w:br w:type="page"/>
+      </w:r>
+    </w:p>
+    <w:p>
+      <w:pPr>
+        <w:pStyle w:val="Heading1"/>
+        <w:numPr>
+          <w:ilvl w:val="0"/>
+          <w:numId w:val="3"/>
+        </w:numPr>
+        <w:spacing w:line="360" w:lineRule="auto"/>
+        <w:ind w:left="284"/>
         <w:rPr>
           <w:rFonts w:ascii="Arial" w:hAnsi="Arial" w:cs="Arial"/>
           <w:b/>
@@ -570,13 +1656,164 @@
           <w:sz w:val="32"/>
           <w:szCs w:val="32"/>
         </w:rPr>
+      </w:pPr>
+      <w:bookmarkStart w:id="2" w:name="_Toc226030422"/>
+      <w:r>
+        <w:rPr>
+          <w:rFonts w:ascii="Arial" w:hAnsi="Arial" w:cs="Arial"/>
+          <w:b/>
+          <w:bCs/>
+          <w:color w:val="EE0000"/>
+          <w:sz w:val="32"/>
+          <w:szCs w:val="32"/>
+        </w:rPr>
+        <w:lastRenderedPageBreak/>
+        <w:t>Organisation Selection and Analysis</w:t>
+      </w:r>
+      <w:bookmarkEnd w:id="2"/>
+    </w:p>
+    <w:p>
+      <w:pPr>
+        <w:spacing w:line="360" w:lineRule="auto"/>
+        <w:ind w:left="284"/>
+        <w:jc w:val="both"/>
+        <w:rPr>
+          <w:rFonts w:ascii="Arial" w:hAnsi="Arial" w:cs="Arial"/>
+        </w:rPr>
+      </w:pPr>
+      <w:r>
+        <w:rPr>
+          <w:rFonts w:ascii="Arial" w:hAnsi="Arial" w:cs="Arial"/>
+        </w:rPr>
+        <w:t>The selected organisation for this project is Auckland University of Technology (AUT), a well-established public university located in New Zealand. AUT is recognised as one of the country’s largest tertiary institutions, with 26,708 of enrolled students and over 4,046 staff members.</w:t>
+      </w:r>
+      <w:r>
+        <w:t xml:space="preserve"> </w:t>
+      </w:r>
+      <w:r>
+        <w:rPr>
+          <w:rFonts w:ascii="Arial" w:hAnsi="Arial" w:cs="Arial"/>
+        </w:rPr>
+        <w:t>The university operates across multiple campuses and delivers a wide range of undergraduate and postgraduate programmes, demonstrating both its scale and operational complexity.</w:t>
+      </w:r>
+    </w:p>
+    <w:p>
+      <w:pPr>
+        <w:spacing w:line="360" w:lineRule="auto"/>
+        <w:ind w:left="284"/>
+        <w:jc w:val="both"/>
+        <w:rPr>
+          <w:rFonts w:ascii="Arial" w:hAnsi="Arial" w:cs="Arial"/>
+        </w:rPr>
+      </w:pPr>
+      <w:r>
+        <w:rPr>
+          <w:rFonts w:ascii="Arial" w:hAnsi="Arial" w:cs="Arial"/>
+        </w:rPr>
+        <w:t>AUT has a well-established organisational structure consisting of multiple departments that support its academic and administrative functions. These include academic faculties responsible for teaching and course delivery, administrative units managing student records and enrolment processes, financial services handling tuition fees and payments, and information technology services maintaining system infrastructure.</w:t>
+      </w:r>
+      <w:r>
+        <w:t xml:space="preserve"> </w:t>
+      </w:r>
+      <w:r>
+        <w:rPr>
+          <w:rFonts w:ascii="Arial" w:hAnsi="Arial" w:cs="Arial"/>
+        </w:rPr>
+        <w:t>The presence of these distinct functional areas requires coordinated operations supported by integrated information systems.</w:t>
+      </w:r>
+      <w:r>
+        <w:rPr>
+          <w:rFonts w:ascii="Arial" w:hAnsi="Arial" w:cs="Arial"/>
+        </w:rPr>
+        <w:t xml:space="preserve"> Among these systems, t</w:t>
+      </w:r>
+      <w:r>
+        <w:rPr>
+          <w:rFonts w:ascii="Arial" w:hAnsi="Arial" w:cs="Arial"/>
+        </w:rPr>
+        <w:t>he Student Enrolment and Course Management System is selected as the focus of this project</w:t>
+      </w:r>
+      <w:r>
+        <w:rPr>
+          <w:rFonts w:ascii="Arial" w:hAnsi="Arial" w:cs="Arial"/>
+        </w:rPr>
+        <w:t>.</w:t>
+      </w:r>
+    </w:p>
+    <w:p>
+      <w:pPr>
+        <w:spacing w:line="360" w:lineRule="auto"/>
+        <w:ind w:left="284"/>
+        <w:jc w:val="both"/>
+        <w:rPr>
+          <w:rFonts w:ascii="Arial" w:hAnsi="Arial" w:cs="Arial"/>
+        </w:rPr>
+      </w:pPr>
+      <w:r>
+        <w:rPr>
+          <w:rFonts w:ascii="Arial" w:hAnsi="Arial" w:cs="Arial"/>
+        </w:rPr>
+        <w:t xml:space="preserve">The selected system involves several key stakeholders and user roles with distinct responsibilities. Students interact with the system to search for courses, submit enrolment requests, and view their enrolment status. Academic staff are responsible for managing course-related information and monitoring enrolled students. Administrative staff handle the review and approval of enrolment requests, while finance staff process payments required to confirm enrolments. In addition, IT staff support the technical operation of the system, and university management may rely on system data for planning and decision-making. These roles demonstrate the need for a system that supports multiple users with different responsibilities and access levels. </w:t>
+      </w:r>
+    </w:p>
+    <w:p>
+      <w:pPr>
+        <w:spacing w:line="360" w:lineRule="auto"/>
+        <w:ind w:left="284"/>
+        <w:jc w:val="both"/>
+        <w:rPr>
+          <w:rFonts w:ascii="Arial" w:hAnsi="Arial" w:cs="Arial"/>
+        </w:rPr>
+      </w:pPr>
+      <w:r>
+        <w:rPr>
+          <w:rFonts w:ascii="Arial" w:hAnsi="Arial" w:cs="Arial"/>
+        </w:rPr>
+        <w:t xml:space="preserve">The selected system directly supports the university’s core function of delivering education by enabling students to enrol in courses and ensuring that institutional rules, such as prerequisites and course capacity limits, are enforced. The system also facilitates coordination between different parts of the organisation by supporting workflows such as enrolment submission, approval, and payment processing. </w:t>
+      </w:r>
+      <w:r>
+        <w:rPr>
+          <w:rFonts w:ascii="Arial" w:hAnsi="Arial" w:cs="Arial"/>
+        </w:rPr>
+        <w:br w:type="page"/>
+      </w:r>
+    </w:p>
+    <w:p>
+      <w:pPr>
+        <w:pStyle w:val="Heading1"/>
+        <w:numPr>
+          <w:ilvl w:val="0"/>
+          <w:numId w:val="3"/>
+        </w:numPr>
+        <w:spacing w:before="0" w:after="0" w:line="360" w:lineRule="auto"/>
+        <w:ind w:left="284"/>
+        <w:rPr>
+          <w:rFonts w:ascii="Arial" w:hAnsi="Arial" w:cs="Arial"/>
+          <w:b/>
+          <w:bCs/>
+          <w:color w:val="EE0000"/>
+          <w:sz w:val="32"/>
+          <w:szCs w:val="32"/>
+        </w:rPr>
+      </w:pPr>
+      <w:bookmarkStart w:id="3" w:name="_Toc226030423"/>
+      <w:r>
+        <w:rPr>
+          <w:rFonts w:ascii="Arial" w:hAnsi="Arial" w:cs="Arial"/>
+          <w:b/>
+          <w:bCs/>
+          <w:color w:val="EE0000"/>
+          <w:sz w:val="32"/>
+          <w:szCs w:val="32"/>
+        </w:rPr>
         <w:lastRenderedPageBreak/>
         <w:t>Requirements Engineering</w:t>
       </w:r>
-    </w:p>
-    <w:p>
-      <w:pPr>
-        <w:pStyle w:val="Heading1"/>
+      <w:bookmarkEnd w:id="3"/>
+    </w:p>
+    <w:p>
+      <w:pPr>
+        <w:pStyle w:val="Heading2"/>
         <w:spacing w:before="0" w:line="360" w:lineRule="auto"/>
         <w:ind w:left="284"/>
         <w:rPr>
@@ -588,6 +1825,7 @@
           <w:szCs w:val="28"/>
         </w:rPr>
       </w:pPr>
+      <w:bookmarkStart w:id="4" w:name="_Toc226030424"/>
       <w:r>
         <w:rPr>
           <w:rFonts w:ascii="Arial" w:hAnsi="Arial" w:cs="Arial"/>
@@ -610,6 +1848,7 @@
         </w:rPr>
         <w:t>.1. Problem statement</w:t>
       </w:r>
+      <w:bookmarkEnd w:id="4"/>
     </w:p>
     <w:p>
       <w:pPr>
@@ -757,7 +1996,7 @@
     </w:p>
     <w:p>
       <w:pPr>
-        <w:pStyle w:val="Heading1"/>
+        <w:pStyle w:val="Heading2"/>
         <w:spacing w:before="0" w:line="360" w:lineRule="auto"/>
         <w:ind w:left="284"/>
         <w:rPr>
@@ -769,6 +2008,7 @@
           <w:szCs w:val="28"/>
         </w:rPr>
       </w:pPr>
+      <w:bookmarkStart w:id="5" w:name="_Toc226030425"/>
       <w:r>
         <w:rPr>
           <w:rFonts w:ascii="Arial" w:hAnsi="Arial" w:cs="Arial"/>
@@ -824,10 +2064,11 @@
         </w:rPr>
         <w:t>Requirement Analysis</w:t>
       </w:r>
-    </w:p>
-    <w:p>
-      <w:pPr>
-        <w:pStyle w:val="Heading2"/>
+      <w:bookmarkEnd w:id="5"/>
+    </w:p>
+    <w:p>
+      <w:pPr>
+        <w:pStyle w:val="Heading3"/>
         <w:ind w:left="851"/>
         <w:rPr>
           <w:rFonts w:ascii="Arial" w:hAnsi="Arial" w:cs="Arial"/>
@@ -838,6 +2079,7 @@
           <w:szCs w:val="24"/>
         </w:rPr>
       </w:pPr>
+      <w:bookmarkStart w:id="6" w:name="_Toc226030426"/>
       <w:r>
         <w:rPr>
           <w:rFonts w:ascii="Arial" w:hAnsi="Arial" w:cs="Arial"/>
@@ -860,6 +2102,7 @@
         </w:rPr>
         <w:t xml:space="preserve"> Stakeholders and Roles</w:t>
       </w:r>
+      <w:bookmarkEnd w:id="6"/>
     </w:p>
     <w:p>
       <w:pPr>
@@ -901,27 +2144,13 @@
           <w:b/>
           <w:bCs/>
         </w:rPr>
-        <w:t>Student (Domestic / International)</w:t>
-      </w:r>
-      <w:r>
-        <w:rPr>
-          <w:rFonts w:ascii="Arial" w:hAnsi="Arial" w:cs="Arial"/>
-          <w:b/>
-          <w:bCs/>
-        </w:rPr>
-        <w:t>:</w:t>
-      </w:r>
-      <w:r>
-        <w:rPr>
-          <w:rFonts w:ascii="Arial" w:hAnsi="Arial" w:cs="Arial"/>
-        </w:rPr>
-        <w:t xml:space="preserve"> </w:t>
-      </w:r>
-      <w:r>
-        <w:rPr>
-          <w:rFonts w:ascii="Arial" w:hAnsi="Arial" w:cs="Arial"/>
-        </w:rPr>
-        <w:t>Search courses, enrol, view enrolled courses, check timetable and clashes, manage enrolment requests</w:t>
+        <w:t>Student (Domestic / International):</w:t>
+      </w:r>
+      <w:r>
+        <w:rPr>
+          <w:rFonts w:ascii="Arial" w:hAnsi="Arial" w:cs="Arial"/>
+        </w:rPr>
+        <w:t xml:space="preserve"> Search courses, enrol, view enrolled courses, check timetable and clashes, manage enrolment requests</w:t>
       </w:r>
     </w:p>
     <w:p>
@@ -943,27 +2172,13 @@
           <w:b/>
           <w:bCs/>
         </w:rPr>
-        <w:t>Academic Department Staff</w:t>
-      </w:r>
-      <w:r>
-        <w:rPr>
-          <w:rFonts w:ascii="Arial" w:hAnsi="Arial" w:cs="Arial"/>
-          <w:b/>
-          <w:bCs/>
-        </w:rPr>
-        <w:t>:</w:t>
-      </w:r>
-      <w:r>
-        <w:rPr>
-          <w:rFonts w:ascii="Arial" w:hAnsi="Arial" w:cs="Arial"/>
-        </w:rPr>
-        <w:t xml:space="preserve"> </w:t>
-      </w:r>
-      <w:r>
-        <w:rPr>
-          <w:rFonts w:ascii="Arial" w:hAnsi="Arial" w:cs="Arial"/>
-        </w:rPr>
-        <w:t>Maintain course information, prerequisites, capacity, timetable details</w:t>
+        <w:t>Academic Department Staff:</w:t>
+      </w:r>
+      <w:r>
+        <w:rPr>
+          <w:rFonts w:ascii="Arial" w:hAnsi="Arial" w:cs="Arial"/>
+        </w:rPr>
+        <w:t xml:space="preserve"> Maintain course information, prerequisites, capacity, timetable details</w:t>
       </w:r>
     </w:p>
     <w:p>
@@ -985,27 +2200,13 @@
           <w:b/>
           <w:bCs/>
         </w:rPr>
-        <w:t>Registry / Admissions Staff</w:t>
-      </w:r>
-      <w:r>
-        <w:rPr>
-          <w:rFonts w:ascii="Arial" w:hAnsi="Arial" w:cs="Arial"/>
-          <w:b/>
-          <w:bCs/>
-        </w:rPr>
-        <w:t>:</w:t>
-      </w:r>
-      <w:r>
-        <w:rPr>
-          <w:rFonts w:ascii="Arial" w:hAnsi="Arial" w:cs="Arial"/>
-        </w:rPr>
-        <w:t xml:space="preserve"> </w:t>
-      </w:r>
-      <w:r>
-        <w:rPr>
-          <w:rFonts w:ascii="Arial" w:hAnsi="Arial" w:cs="Arial"/>
-        </w:rPr>
-        <w:t>Review and approve enrolment requests, enforce enrolment rules (prerequisites, timetable conflicts)</w:t>
+        <w:t>Registry / Admissions Staff:</w:t>
+      </w:r>
+      <w:r>
+        <w:rPr>
+          <w:rFonts w:ascii="Arial" w:hAnsi="Arial" w:cs="Arial"/>
+        </w:rPr>
+        <w:t xml:space="preserve"> Review and approve enrolment requests, enforce enrolment rules (prerequisites, timetable conflicts)</w:t>
       </w:r>
     </w:p>
     <w:p>
@@ -1027,27 +2228,13 @@
           <w:b/>
           <w:bCs/>
         </w:rPr>
-        <w:t>Finance Department Staff</w:t>
-      </w:r>
-      <w:r>
-        <w:rPr>
-          <w:rFonts w:ascii="Arial" w:hAnsi="Arial" w:cs="Arial"/>
-          <w:b/>
-          <w:bCs/>
-        </w:rPr>
-        <w:t>:</w:t>
-      </w:r>
-      <w:r>
-        <w:rPr>
-          <w:rFonts w:ascii="Arial" w:hAnsi="Arial" w:cs="Arial"/>
-        </w:rPr>
-        <w:t xml:space="preserve"> </w:t>
-      </w:r>
-      <w:r>
-        <w:rPr>
-          <w:rFonts w:ascii="Arial" w:hAnsi="Arial" w:cs="Arial"/>
-        </w:rPr>
-        <w:t>Process tuition/course payments, confirm enrolment upon payment verification</w:t>
+        <w:t>Finance Department Staff:</w:t>
+      </w:r>
+      <w:r>
+        <w:rPr>
+          <w:rFonts w:ascii="Arial" w:hAnsi="Arial" w:cs="Arial"/>
+        </w:rPr>
+        <w:t xml:space="preserve"> Process tuition/course payments, confirm enrolment upon payment verification</w:t>
       </w:r>
     </w:p>
     <w:p>
@@ -1069,32 +2256,18 @@
           <w:b/>
           <w:bCs/>
         </w:rPr>
-        <w:t>System Administrator</w:t>
-      </w:r>
-      <w:r>
-        <w:rPr>
-          <w:rFonts w:ascii="Arial" w:hAnsi="Arial" w:cs="Arial"/>
-          <w:b/>
-          <w:bCs/>
-        </w:rPr>
-        <w:t>:</w:t>
-      </w:r>
-      <w:r>
-        <w:rPr>
-          <w:rFonts w:ascii="Arial" w:hAnsi="Arial" w:cs="Arial"/>
-        </w:rPr>
-        <w:t xml:space="preserve"> </w:t>
-      </w:r>
-      <w:r>
-        <w:rPr>
-          <w:rFonts w:ascii="Arial" w:hAnsi="Arial" w:cs="Arial"/>
-        </w:rPr>
-        <w:t>Manage user accounts, access control, ensure system uptime and security</w:t>
-      </w:r>
-    </w:p>
-    <w:p>
-      <w:pPr>
-        <w:pStyle w:val="Heading2"/>
+        <w:t>System Administrator:</w:t>
+      </w:r>
+      <w:r>
+        <w:rPr>
+          <w:rFonts w:ascii="Arial" w:hAnsi="Arial" w:cs="Arial"/>
+        </w:rPr>
+        <w:t xml:space="preserve"> Manage user accounts, access control, ensure system uptime and security</w:t>
+      </w:r>
+    </w:p>
+    <w:p>
+      <w:pPr>
+        <w:pStyle w:val="Heading3"/>
         <w:ind w:left="851"/>
         <w:rPr>
           <w:rFonts w:ascii="Arial" w:hAnsi="Arial" w:cs="Arial"/>
@@ -1105,6 +2278,7 @@
           <w:szCs w:val="24"/>
         </w:rPr>
       </w:pPr>
+      <w:bookmarkStart w:id="7" w:name="_Toc226030427"/>
       <w:r>
         <w:rPr>
           <w:rFonts w:ascii="Arial" w:hAnsi="Arial" w:cs="Arial"/>
@@ -1115,7 +2289,7 @@
           <w:szCs w:val="24"/>
         </w:rPr>
         <w:lastRenderedPageBreak/>
-        <w:t>i</w:t>
+        <w:t>ii.</w:t>
       </w:r>
       <w:r>
         <w:rPr>
@@ -1126,7 +2300,7 @@
           <w:sz w:val="24"/>
           <w:szCs w:val="24"/>
         </w:rPr>
-        <w:t>i.</w:t>
+        <w:t xml:space="preserve"> Functional Requirement</w:t>
       </w:r>
       <w:r>
         <w:rPr>
@@ -1137,9 +2311,696 @@
           <w:sz w:val="24"/>
           <w:szCs w:val="24"/>
         </w:rPr>
-        <w:t xml:space="preserve"> Functional Requirement</w:t>
-      </w:r>
-      <w:r>
+        <w:t>s</w:t>
+      </w:r>
+      <w:bookmarkEnd w:id="7"/>
+    </w:p>
+    <w:p>
+      <w:pPr>
+        <w:spacing w:line="360" w:lineRule="auto"/>
+        <w:ind w:left="1134"/>
+        <w:rPr>
+          <w:rFonts w:ascii="Arial" w:hAnsi="Arial" w:cs="Arial"/>
+        </w:rPr>
+      </w:pPr>
+      <w:r>
+        <w:rPr>
+          <w:rFonts w:ascii="Arial" w:hAnsi="Arial" w:cs="Arial"/>
+        </w:rPr>
+        <w:t>Based on the problem statement, the system’s key functional requirements</w:t>
+      </w:r>
+      <w:r>
+        <w:rPr>
+          <w:rFonts w:ascii="Arial" w:hAnsi="Arial" w:cs="Arial"/>
+        </w:rPr>
+        <w:t xml:space="preserve"> </w:t>
+      </w:r>
+      <w:r>
+        <w:rPr>
+          <w:rFonts w:ascii="Arial" w:hAnsi="Arial" w:cs="Arial"/>
+        </w:rPr>
+        <w:t>are identified as follows</w:t>
+      </w:r>
+      <w:r>
+        <w:rPr>
+          <w:rFonts w:ascii="Arial" w:hAnsi="Arial" w:cs="Arial"/>
+        </w:rPr>
+        <w:t xml:space="preserve">: </w:t>
+      </w:r>
+    </w:p>
+    <w:p>
+      <w:pPr>
+        <w:pStyle w:val="ListParagraph"/>
+        <w:numPr>
+          <w:ilvl w:val="0"/>
+          <w:numId w:val="5"/>
+        </w:numPr>
+        <w:spacing w:line="360" w:lineRule="auto"/>
+        <w:ind w:left="1560"/>
+        <w:rPr>
+          <w:rFonts w:ascii="Arial" w:hAnsi="Arial" w:cs="Arial"/>
+        </w:rPr>
+      </w:pPr>
+      <w:r>
+        <w:rPr>
+          <w:rFonts w:ascii="Arial" w:hAnsi="Arial" w:cs="Arial"/>
+        </w:rPr>
+        <w:t>Course Search and Viewing</w:t>
+      </w:r>
+      <w:r>
+        <w:rPr>
+          <w:rFonts w:ascii="Arial" w:hAnsi="Arial" w:cs="Arial"/>
+        </w:rPr>
+        <w:t>:</w:t>
+      </w:r>
+    </w:p>
+    <w:p>
+      <w:pPr>
+        <w:pStyle w:val="ListParagraph"/>
+        <w:numPr>
+          <w:ilvl w:val="1"/>
+          <w:numId w:val="5"/>
+        </w:numPr>
+        <w:spacing w:line="360" w:lineRule="auto"/>
+        <w:ind w:left="1843"/>
+        <w:rPr>
+          <w:rFonts w:ascii="Arial" w:hAnsi="Arial" w:cs="Arial"/>
+        </w:rPr>
+      </w:pPr>
+      <w:r>
+        <w:rPr>
+          <w:rFonts w:ascii="Arial" w:hAnsi="Arial" w:cs="Arial"/>
+        </w:rPr>
+        <w:t>The system shall allow students to search for available courses by course code, course name, or department.</w:t>
+      </w:r>
+    </w:p>
+    <w:p>
+      <w:pPr>
+        <w:pStyle w:val="ListParagraph"/>
+        <w:numPr>
+          <w:ilvl w:val="1"/>
+          <w:numId w:val="5"/>
+        </w:numPr>
+        <w:spacing w:line="360" w:lineRule="auto"/>
+        <w:ind w:left="1843"/>
+        <w:rPr>
+          <w:rFonts w:ascii="Arial" w:hAnsi="Arial" w:cs="Arial"/>
+        </w:rPr>
+      </w:pPr>
+      <w:r>
+        <w:rPr>
+          <w:rFonts w:ascii="Arial" w:hAnsi="Arial" w:cs="Arial"/>
+        </w:rPr>
+        <w:t>The system shall display detailed course information, including course description, prerequisites, capacity, and timetable.</w:t>
+      </w:r>
+    </w:p>
+    <w:p>
+      <w:pPr>
+        <w:pStyle w:val="ListParagraph"/>
+        <w:numPr>
+          <w:ilvl w:val="0"/>
+          <w:numId w:val="5"/>
+        </w:numPr>
+        <w:spacing w:line="360" w:lineRule="auto"/>
+        <w:ind w:left="1560"/>
+        <w:rPr>
+          <w:rFonts w:ascii="Arial" w:hAnsi="Arial" w:cs="Arial"/>
+        </w:rPr>
+      </w:pPr>
+      <w:r>
+        <w:rPr>
+          <w:rFonts w:ascii="Arial" w:hAnsi="Arial" w:cs="Arial"/>
+        </w:rPr>
+        <w:t>Course Enrolment</w:t>
+      </w:r>
+      <w:r>
+        <w:rPr>
+          <w:rFonts w:ascii="Arial" w:hAnsi="Arial" w:cs="Arial"/>
+        </w:rPr>
+        <w:t>:</w:t>
+      </w:r>
+    </w:p>
+    <w:p>
+      <w:pPr>
+        <w:pStyle w:val="ListParagraph"/>
+        <w:numPr>
+          <w:ilvl w:val="1"/>
+          <w:numId w:val="5"/>
+        </w:numPr>
+        <w:spacing w:line="360" w:lineRule="auto"/>
+        <w:ind w:left="1843"/>
+        <w:rPr>
+          <w:rFonts w:ascii="Arial" w:hAnsi="Arial" w:cs="Arial"/>
+        </w:rPr>
+      </w:pPr>
+      <w:r>
+        <w:rPr>
+          <w:rFonts w:ascii="Arial" w:hAnsi="Arial" w:cs="Arial"/>
+        </w:rPr>
+        <w:t>The system shall allow students to enrol in selected courses.</w:t>
+      </w:r>
+    </w:p>
+    <w:p>
+      <w:pPr>
+        <w:pStyle w:val="ListParagraph"/>
+        <w:numPr>
+          <w:ilvl w:val="1"/>
+          <w:numId w:val="5"/>
+        </w:numPr>
+        <w:spacing w:line="360" w:lineRule="auto"/>
+        <w:ind w:left="1843"/>
+        <w:rPr>
+          <w:rFonts w:ascii="Arial" w:hAnsi="Arial" w:cs="Arial"/>
+        </w:rPr>
+      </w:pPr>
+      <w:r>
+        <w:rPr>
+          <w:rFonts w:ascii="Arial" w:hAnsi="Arial" w:cs="Arial"/>
+        </w:rPr>
+        <w:t>The system shall automatically check prerequisites before allowing enrolment.</w:t>
+      </w:r>
+    </w:p>
+    <w:p>
+      <w:pPr>
+        <w:pStyle w:val="ListParagraph"/>
+        <w:numPr>
+          <w:ilvl w:val="1"/>
+          <w:numId w:val="5"/>
+        </w:numPr>
+        <w:spacing w:line="360" w:lineRule="auto"/>
+        <w:ind w:left="1843"/>
+        <w:rPr>
+          <w:rFonts w:ascii="Arial" w:hAnsi="Arial" w:cs="Arial"/>
+        </w:rPr>
+      </w:pPr>
+      <w:r>
+        <w:rPr>
+          <w:rFonts w:ascii="Arial" w:hAnsi="Arial" w:cs="Arial"/>
+        </w:rPr>
+        <w:t>The system shall automatically verify course availability before confirming enrolment.</w:t>
+      </w:r>
+    </w:p>
+    <w:p>
+      <w:pPr>
+        <w:pStyle w:val="ListParagraph"/>
+        <w:numPr>
+          <w:ilvl w:val="1"/>
+          <w:numId w:val="5"/>
+        </w:numPr>
+        <w:spacing w:line="360" w:lineRule="auto"/>
+        <w:ind w:left="1843"/>
+        <w:rPr>
+          <w:rFonts w:ascii="Arial" w:hAnsi="Arial" w:cs="Arial"/>
+        </w:rPr>
+      </w:pPr>
+      <w:r>
+        <w:rPr>
+          <w:rFonts w:ascii="Arial" w:hAnsi="Arial" w:cs="Arial"/>
+        </w:rPr>
+        <w:t>The system shall detect timetable clashes and notify students before enrolment confirmation.</w:t>
+      </w:r>
+    </w:p>
+    <w:p>
+      <w:pPr>
+        <w:pStyle w:val="ListParagraph"/>
+        <w:numPr>
+          <w:ilvl w:val="1"/>
+          <w:numId w:val="5"/>
+        </w:numPr>
+        <w:spacing w:line="360" w:lineRule="auto"/>
+        <w:ind w:left="1843"/>
+        <w:rPr>
+          <w:rFonts w:ascii="Arial" w:hAnsi="Arial" w:cs="Arial"/>
+        </w:rPr>
+      </w:pPr>
+      <w:r>
+        <w:rPr>
+          <w:rFonts w:ascii="Arial" w:hAnsi="Arial" w:cs="Arial"/>
+        </w:rPr>
+        <w:t>The system shall allow students to adjust their course selection if timetable conflicts are detected.</w:t>
+      </w:r>
+    </w:p>
+    <w:p>
+      <w:pPr>
+        <w:pStyle w:val="ListParagraph"/>
+        <w:numPr>
+          <w:ilvl w:val="0"/>
+          <w:numId w:val="5"/>
+        </w:numPr>
+        <w:spacing w:line="360" w:lineRule="auto"/>
+        <w:ind w:left="1560"/>
+        <w:rPr>
+          <w:rFonts w:ascii="Arial" w:hAnsi="Arial" w:cs="Arial"/>
+        </w:rPr>
+      </w:pPr>
+      <w:r>
+        <w:rPr>
+          <w:rFonts w:ascii="Arial" w:hAnsi="Arial" w:cs="Arial"/>
+        </w:rPr>
+        <w:t>Timetable Management (Enrolment View)</w:t>
+      </w:r>
+      <w:r>
+        <w:rPr>
+          <w:rFonts w:ascii="Arial" w:hAnsi="Arial" w:cs="Arial"/>
+        </w:rPr>
+        <w:t>:</w:t>
+      </w:r>
+    </w:p>
+    <w:p>
+      <w:pPr>
+        <w:pStyle w:val="ListParagraph"/>
+        <w:numPr>
+          <w:ilvl w:val="1"/>
+          <w:numId w:val="5"/>
+        </w:numPr>
+        <w:spacing w:line="360" w:lineRule="auto"/>
+        <w:ind w:left="1843"/>
+        <w:rPr>
+          <w:rFonts w:ascii="Arial" w:hAnsi="Arial" w:cs="Arial"/>
+        </w:rPr>
+      </w:pPr>
+      <w:r>
+        <w:rPr>
+          <w:rFonts w:ascii="Arial" w:hAnsi="Arial" w:cs="Arial"/>
+        </w:rPr>
+        <w:t>The system shall display a timetable of the student’s enrolled courses.</w:t>
+      </w:r>
+    </w:p>
+    <w:p>
+      <w:pPr>
+        <w:pStyle w:val="ListParagraph"/>
+        <w:numPr>
+          <w:ilvl w:val="1"/>
+          <w:numId w:val="5"/>
+        </w:numPr>
+        <w:spacing w:line="360" w:lineRule="auto"/>
+        <w:ind w:left="1843"/>
+        <w:rPr>
+          <w:rFonts w:ascii="Arial" w:hAnsi="Arial" w:cs="Arial"/>
+        </w:rPr>
+      </w:pPr>
+      <w:r>
+        <w:rPr>
+          <w:rFonts w:ascii="Arial" w:hAnsi="Arial" w:cs="Arial"/>
+        </w:rPr>
+        <w:t>The system shall visually highlight any timetable clashes between selected courses.</w:t>
+      </w:r>
+    </w:p>
+    <w:p>
+      <w:pPr>
+        <w:pStyle w:val="ListParagraph"/>
+        <w:numPr>
+          <w:ilvl w:val="0"/>
+          <w:numId w:val="5"/>
+        </w:numPr>
+        <w:spacing w:line="360" w:lineRule="auto"/>
+        <w:ind w:left="1560"/>
+        <w:rPr>
+          <w:rFonts w:ascii="Arial" w:hAnsi="Arial" w:cs="Arial"/>
+        </w:rPr>
+      </w:pPr>
+      <w:r>
+        <w:rPr>
+          <w:rFonts w:ascii="Arial" w:hAnsi="Arial" w:cs="Arial"/>
+        </w:rPr>
+        <w:t>Staff Course Management</w:t>
+      </w:r>
+      <w:r>
+        <w:rPr>
+          <w:rFonts w:ascii="Arial" w:hAnsi="Arial" w:cs="Arial"/>
+        </w:rPr>
+        <w:t>:</w:t>
+      </w:r>
+    </w:p>
+    <w:p>
+      <w:pPr>
+        <w:pStyle w:val="ListParagraph"/>
+        <w:numPr>
+          <w:ilvl w:val="1"/>
+          <w:numId w:val="5"/>
+        </w:numPr>
+        <w:spacing w:line="360" w:lineRule="auto"/>
+        <w:ind w:left="1843"/>
+        <w:rPr>
+          <w:rFonts w:ascii="Arial" w:hAnsi="Arial" w:cs="Arial"/>
+        </w:rPr>
+      </w:pPr>
+      <w:r>
+        <w:rPr>
+          <w:rFonts w:ascii="Arial" w:hAnsi="Arial" w:cs="Arial"/>
+        </w:rPr>
+        <w:t>The system shall allow Academic Department staff to add, update, and remove course information, including descriptions, prerequisites, capacity, and timetable details.</w:t>
+      </w:r>
+    </w:p>
+    <w:p>
+      <w:pPr>
+        <w:pStyle w:val="ListParagraph"/>
+        <w:numPr>
+          <w:ilvl w:val="1"/>
+          <w:numId w:val="5"/>
+        </w:numPr>
+        <w:spacing w:line="360" w:lineRule="auto"/>
+        <w:ind w:left="1843"/>
+        <w:rPr>
+          <w:rFonts w:ascii="Arial" w:hAnsi="Arial" w:cs="Arial"/>
+        </w:rPr>
+      </w:pPr>
+      <w:r>
+        <w:rPr>
+          <w:rFonts w:ascii="Arial" w:hAnsi="Arial" w:cs="Arial"/>
+        </w:rPr>
+        <w:t>The system shall allow Registry/Admissions staff to review and approve student enrolment requests.</w:t>
+      </w:r>
+    </w:p>
+    <w:p>
+      <w:pPr>
+        <w:pStyle w:val="ListParagraph"/>
+        <w:numPr>
+          <w:ilvl w:val="1"/>
+          <w:numId w:val="5"/>
+        </w:numPr>
+        <w:spacing w:line="360" w:lineRule="auto"/>
+        <w:ind w:left="1843"/>
+        <w:rPr>
+          <w:rFonts w:ascii="Arial" w:hAnsi="Arial" w:cs="Arial"/>
+        </w:rPr>
+      </w:pPr>
+      <w:r>
+        <w:rPr>
+          <w:rFonts w:ascii="Arial" w:hAnsi="Arial" w:cs="Arial"/>
+        </w:rPr>
+        <w:t>The system shall enforce prerequisite, course capacity, and timetable clash rules during approval.</w:t>
+      </w:r>
+    </w:p>
+    <w:p>
+      <w:pPr>
+        <w:pStyle w:val="ListParagraph"/>
+        <w:numPr>
+          <w:ilvl w:val="0"/>
+          <w:numId w:val="5"/>
+        </w:numPr>
+        <w:spacing w:line="360" w:lineRule="auto"/>
+        <w:ind w:left="1560"/>
+        <w:rPr>
+          <w:rFonts w:ascii="Arial" w:hAnsi="Arial" w:cs="Arial"/>
+        </w:rPr>
+      </w:pPr>
+      <w:r>
+        <w:rPr>
+          <w:rFonts w:ascii="Arial" w:hAnsi="Arial" w:cs="Arial"/>
+        </w:rPr>
+        <w:t>Payment Processing and Enrolment Confirmation</w:t>
+      </w:r>
+      <w:r>
+        <w:rPr>
+          <w:rFonts w:ascii="Arial" w:hAnsi="Arial" w:cs="Arial"/>
+        </w:rPr>
+        <w:t>:</w:t>
+      </w:r>
+    </w:p>
+    <w:p>
+      <w:pPr>
+        <w:pStyle w:val="ListParagraph"/>
+        <w:numPr>
+          <w:ilvl w:val="1"/>
+          <w:numId w:val="5"/>
+        </w:numPr>
+        <w:spacing w:line="360" w:lineRule="auto"/>
+        <w:ind w:left="1843"/>
+        <w:rPr>
+          <w:rFonts w:ascii="Arial" w:hAnsi="Arial" w:cs="Arial"/>
+        </w:rPr>
+      </w:pPr>
+      <w:r>
+        <w:rPr>
+          <w:rFonts w:ascii="Arial" w:hAnsi="Arial" w:cs="Arial"/>
+        </w:rPr>
+        <w:lastRenderedPageBreak/>
+        <w:t>The system shall allow Finance Department staff to process tuition and course-related payments.</w:t>
+      </w:r>
+    </w:p>
+    <w:p>
+      <w:pPr>
+        <w:pStyle w:val="ListParagraph"/>
+        <w:numPr>
+          <w:ilvl w:val="1"/>
+          <w:numId w:val="5"/>
+        </w:numPr>
+        <w:spacing w:line="360" w:lineRule="auto"/>
+        <w:ind w:left="1843"/>
+        <w:rPr>
+          <w:rFonts w:ascii="Arial" w:hAnsi="Arial" w:cs="Arial"/>
+        </w:rPr>
+      </w:pPr>
+      <w:r>
+        <w:rPr>
+          <w:rFonts w:ascii="Arial" w:hAnsi="Arial" w:cs="Arial"/>
+        </w:rPr>
+        <w:t>The system shall confirm student enrolment only after successful payment verification.</w:t>
+      </w:r>
+    </w:p>
+    <w:p>
+      <w:pPr>
+        <w:pStyle w:val="ListParagraph"/>
+        <w:numPr>
+          <w:ilvl w:val="1"/>
+          <w:numId w:val="5"/>
+        </w:numPr>
+        <w:spacing w:line="360" w:lineRule="auto"/>
+        <w:ind w:left="1843"/>
+        <w:rPr>
+          <w:rFonts w:ascii="Arial" w:hAnsi="Arial" w:cs="Arial"/>
+        </w:rPr>
+      </w:pPr>
+      <w:r>
+        <w:rPr>
+          <w:rFonts w:ascii="Arial" w:hAnsi="Arial" w:cs="Arial"/>
+        </w:rPr>
+        <w:t>The system shall automatically update enrolment status after payment confirmation.</w:t>
+      </w:r>
+    </w:p>
+    <w:p>
+      <w:pPr>
+        <w:pStyle w:val="ListParagraph"/>
+        <w:numPr>
+          <w:ilvl w:val="0"/>
+          <w:numId w:val="5"/>
+        </w:numPr>
+        <w:spacing w:line="360" w:lineRule="auto"/>
+        <w:ind w:left="1560"/>
+        <w:rPr>
+          <w:rFonts w:ascii="Arial" w:hAnsi="Arial" w:cs="Arial"/>
+        </w:rPr>
+      </w:pPr>
+      <w:r>
+        <w:rPr>
+          <w:rFonts w:ascii="Arial" w:hAnsi="Arial" w:cs="Arial"/>
+        </w:rPr>
+        <w:t>Notifications</w:t>
+      </w:r>
+      <w:r>
+        <w:rPr>
+          <w:rFonts w:ascii="Arial" w:hAnsi="Arial" w:cs="Arial"/>
+        </w:rPr>
+        <w:t>:</w:t>
+      </w:r>
+    </w:p>
+    <w:p>
+      <w:pPr>
+        <w:pStyle w:val="ListParagraph"/>
+        <w:numPr>
+          <w:ilvl w:val="1"/>
+          <w:numId w:val="5"/>
+        </w:numPr>
+        <w:spacing w:line="360" w:lineRule="auto"/>
+        <w:ind w:left="1843"/>
+        <w:rPr>
+          <w:rFonts w:ascii="Arial" w:hAnsi="Arial" w:cs="Arial"/>
+        </w:rPr>
+      </w:pPr>
+      <w:r>
+        <w:rPr>
+          <w:rFonts w:ascii="Arial" w:hAnsi="Arial" w:cs="Arial"/>
+        </w:rPr>
+        <w:t>The system shall notify students of successful enrolment confirmation.</w:t>
+      </w:r>
+    </w:p>
+    <w:p>
+      <w:pPr>
+        <w:pStyle w:val="ListParagraph"/>
+        <w:numPr>
+          <w:ilvl w:val="1"/>
+          <w:numId w:val="5"/>
+        </w:numPr>
+        <w:spacing w:line="360" w:lineRule="auto"/>
+        <w:ind w:left="1843"/>
+        <w:rPr>
+          <w:rFonts w:ascii="Arial" w:hAnsi="Arial" w:cs="Arial"/>
+        </w:rPr>
+      </w:pPr>
+      <w:r>
+        <w:rPr>
+          <w:rFonts w:ascii="Arial" w:hAnsi="Arial" w:cs="Arial"/>
+        </w:rPr>
+        <w:t>The system shall notify students of any enrolment issues, including timetable clashes or prerequisite violations.</w:t>
+      </w:r>
+    </w:p>
+    <w:p>
+      <w:pPr>
+        <w:pStyle w:val="ListParagraph"/>
+        <w:numPr>
+          <w:ilvl w:val="1"/>
+          <w:numId w:val="5"/>
+        </w:numPr>
+        <w:spacing w:line="360" w:lineRule="auto"/>
+        <w:ind w:left="1843"/>
+        <w:rPr>
+          <w:rFonts w:ascii="Arial" w:hAnsi="Arial" w:cs="Arial"/>
+        </w:rPr>
+      </w:pPr>
+      <w:r>
+        <w:rPr>
+          <w:rFonts w:ascii="Arial" w:hAnsi="Arial" w:cs="Arial"/>
+        </w:rPr>
+        <w:t>The system shall notify staff of pending enrolment requests requiring approval.</w:t>
+      </w:r>
+    </w:p>
+    <w:p>
+      <w:pPr>
+        <w:pStyle w:val="ListParagraph"/>
+        <w:numPr>
+          <w:ilvl w:val="0"/>
+          <w:numId w:val="5"/>
+        </w:numPr>
+        <w:spacing w:line="360" w:lineRule="auto"/>
+        <w:ind w:left="1560"/>
+        <w:rPr>
+          <w:rFonts w:ascii="Arial" w:hAnsi="Arial" w:cs="Arial"/>
+        </w:rPr>
+      </w:pPr>
+      <w:r>
+        <w:rPr>
+          <w:rFonts w:ascii="Arial" w:hAnsi="Arial" w:cs="Arial"/>
+        </w:rPr>
+        <w:t>User Access and Security</w:t>
+      </w:r>
+      <w:r>
+        <w:rPr>
+          <w:rFonts w:ascii="Arial" w:hAnsi="Arial" w:cs="Arial"/>
+        </w:rPr>
+        <w:t>:</w:t>
+      </w:r>
+    </w:p>
+    <w:p>
+      <w:pPr>
+        <w:pStyle w:val="ListParagraph"/>
+        <w:numPr>
+          <w:ilvl w:val="1"/>
+          <w:numId w:val="5"/>
+        </w:numPr>
+        <w:spacing w:line="360" w:lineRule="auto"/>
+        <w:ind w:left="1843"/>
+        <w:rPr>
+          <w:rFonts w:ascii="Arial" w:hAnsi="Arial" w:cs="Arial"/>
+        </w:rPr>
+      </w:pPr>
+      <w:r>
+        <w:rPr>
+          <w:rFonts w:ascii="Arial" w:hAnsi="Arial" w:cs="Arial"/>
+        </w:rPr>
+        <w:t>The system shall restrict access to features based on user roles (Student, Academic Staff, Registry Staff, Finance Staff).</w:t>
+      </w:r>
+    </w:p>
+    <w:p>
+      <w:pPr>
+        <w:pStyle w:val="ListParagraph"/>
+        <w:numPr>
+          <w:ilvl w:val="1"/>
+          <w:numId w:val="5"/>
+        </w:numPr>
+        <w:spacing w:line="360" w:lineRule="auto"/>
+        <w:ind w:left="1843"/>
+        <w:rPr>
+          <w:rFonts w:ascii="Arial" w:hAnsi="Arial" w:cs="Arial"/>
+        </w:rPr>
+      </w:pPr>
+      <w:r>
+        <w:rPr>
+          <w:rFonts w:ascii="Arial" w:hAnsi="Arial" w:cs="Arial"/>
+        </w:rPr>
+        <w:t>The system shall require authentication before allowing access to any student or staff data.</w:t>
+      </w:r>
+    </w:p>
+    <w:p>
+      <w:pPr>
+        <w:pStyle w:val="ListParagraph"/>
+        <w:numPr>
+          <w:ilvl w:val="0"/>
+          <w:numId w:val="5"/>
+        </w:numPr>
+        <w:spacing w:line="360" w:lineRule="auto"/>
+        <w:ind w:left="1560"/>
+        <w:rPr>
+          <w:rFonts w:ascii="Arial" w:hAnsi="Arial" w:cs="Arial"/>
+        </w:rPr>
+      </w:pPr>
+      <w:r>
+        <w:rPr>
+          <w:rFonts w:ascii="Arial" w:hAnsi="Arial" w:cs="Arial"/>
+        </w:rPr>
+        <w:t>Reporting and Audit</w:t>
+      </w:r>
+      <w:r>
+        <w:rPr>
+          <w:rFonts w:ascii="Arial" w:hAnsi="Arial" w:cs="Arial"/>
+        </w:rPr>
+        <w:t>:</w:t>
+      </w:r>
+    </w:p>
+    <w:p>
+      <w:pPr>
+        <w:pStyle w:val="ListParagraph"/>
+        <w:numPr>
+          <w:ilvl w:val="1"/>
+          <w:numId w:val="5"/>
+        </w:numPr>
+        <w:spacing w:line="360" w:lineRule="auto"/>
+        <w:ind w:left="1843"/>
+        <w:rPr>
+          <w:rFonts w:ascii="Arial" w:hAnsi="Arial" w:cs="Arial"/>
+        </w:rPr>
+      </w:pPr>
+      <w:r>
+        <w:rPr>
+          <w:rFonts w:ascii="Arial" w:hAnsi="Arial" w:cs="Arial"/>
+        </w:rPr>
+        <w:t>The system shall generate enrolment reports for students, courses, and departments.</w:t>
+      </w:r>
+    </w:p>
+    <w:p>
+      <w:pPr>
+        <w:pStyle w:val="ListParagraph"/>
+        <w:numPr>
+          <w:ilvl w:val="1"/>
+          <w:numId w:val="5"/>
+        </w:numPr>
+        <w:spacing w:line="360" w:lineRule="auto"/>
+        <w:ind w:left="1843"/>
+        <w:rPr>
+          <w:rFonts w:ascii="Arial" w:hAnsi="Arial" w:cs="Arial"/>
+        </w:rPr>
+      </w:pPr>
+      <w:r>
+        <w:rPr>
+          <w:rFonts w:ascii="Arial" w:hAnsi="Arial" w:cs="Arial"/>
+        </w:rPr>
+        <w:t>The system shall maintain an audit trail of all enrolment, approval, and payment transactions.</w:t>
+      </w:r>
+    </w:p>
+    <w:p>
+      <w:pPr>
+        <w:pStyle w:val="Heading3"/>
+        <w:ind w:left="851"/>
         <w:rPr>
           <w:rFonts w:ascii="Arial" w:hAnsi="Arial" w:cs="Arial"/>
           <w:b/>
@@ -1148,695 +3009,9 @@
           <w:sz w:val="24"/>
           <w:szCs w:val="24"/>
         </w:rPr>
-        <w:t>s</w:t>
-      </w:r>
-    </w:p>
-    <w:p>
-      <w:pPr>
-        <w:spacing w:line="360" w:lineRule="auto"/>
-        <w:ind w:left="1134"/>
-        <w:rPr>
-          <w:rFonts w:ascii="Arial" w:hAnsi="Arial" w:cs="Arial"/>
-        </w:rPr>
-      </w:pPr>
-      <w:r>
-        <w:rPr>
-          <w:rFonts w:ascii="Arial" w:hAnsi="Arial" w:cs="Arial"/>
-        </w:rPr>
-        <w:t>Based on the problem statement, the system’s key functional requirements</w:t>
-      </w:r>
-      <w:r>
-        <w:rPr>
-          <w:rFonts w:ascii="Arial" w:hAnsi="Arial" w:cs="Arial"/>
-        </w:rPr>
-        <w:t xml:space="preserve"> </w:t>
-      </w:r>
-      <w:r>
-        <w:rPr>
-          <w:rFonts w:ascii="Arial" w:hAnsi="Arial" w:cs="Arial"/>
-        </w:rPr>
-        <w:t>are identified as follows</w:t>
-      </w:r>
-      <w:r>
-        <w:rPr>
-          <w:rFonts w:ascii="Arial" w:hAnsi="Arial" w:cs="Arial"/>
-        </w:rPr>
-        <w:t xml:space="preserve">: </w:t>
-      </w:r>
-    </w:p>
-    <w:p>
-      <w:pPr>
-        <w:pStyle w:val="ListParagraph"/>
-        <w:numPr>
-          <w:ilvl w:val="0"/>
-          <w:numId w:val="5"/>
-        </w:numPr>
-        <w:spacing w:line="360" w:lineRule="auto"/>
-        <w:ind w:left="1560"/>
-        <w:rPr>
-          <w:rFonts w:ascii="Arial" w:hAnsi="Arial" w:cs="Arial"/>
-        </w:rPr>
-      </w:pPr>
-      <w:r>
-        <w:rPr>
-          <w:rFonts w:ascii="Arial" w:hAnsi="Arial" w:cs="Arial"/>
-        </w:rPr>
-        <w:t>Course Search and Viewing</w:t>
-      </w:r>
-      <w:r>
-        <w:rPr>
-          <w:rFonts w:ascii="Arial" w:hAnsi="Arial" w:cs="Arial"/>
-        </w:rPr>
-        <w:t>:</w:t>
-      </w:r>
-    </w:p>
-    <w:p>
-      <w:pPr>
-        <w:pStyle w:val="ListParagraph"/>
-        <w:numPr>
-          <w:ilvl w:val="1"/>
-          <w:numId w:val="5"/>
-        </w:numPr>
-        <w:spacing w:line="360" w:lineRule="auto"/>
-        <w:ind w:left="1843"/>
-        <w:rPr>
-          <w:rFonts w:ascii="Arial" w:hAnsi="Arial" w:cs="Arial"/>
-        </w:rPr>
-      </w:pPr>
-      <w:r>
-        <w:rPr>
-          <w:rFonts w:ascii="Arial" w:hAnsi="Arial" w:cs="Arial"/>
-        </w:rPr>
-        <w:t>The system shall allow students to search for available courses by course code, course name, or department.</w:t>
-      </w:r>
-    </w:p>
-    <w:p>
-      <w:pPr>
-        <w:pStyle w:val="ListParagraph"/>
-        <w:numPr>
-          <w:ilvl w:val="1"/>
-          <w:numId w:val="5"/>
-        </w:numPr>
-        <w:spacing w:line="360" w:lineRule="auto"/>
-        <w:ind w:left="1843"/>
-        <w:rPr>
-          <w:rFonts w:ascii="Arial" w:hAnsi="Arial" w:cs="Arial"/>
-        </w:rPr>
-      </w:pPr>
-      <w:r>
-        <w:rPr>
-          <w:rFonts w:ascii="Arial" w:hAnsi="Arial" w:cs="Arial"/>
-        </w:rPr>
-        <w:t>The system shall display detailed course information, including course description, prerequisites, capacity, and timetable.</w:t>
-      </w:r>
-    </w:p>
-    <w:p>
-      <w:pPr>
-        <w:pStyle w:val="ListParagraph"/>
-        <w:numPr>
-          <w:ilvl w:val="0"/>
-          <w:numId w:val="5"/>
-        </w:numPr>
-        <w:spacing w:line="360" w:lineRule="auto"/>
-        <w:ind w:left="1560"/>
-        <w:rPr>
-          <w:rFonts w:ascii="Arial" w:hAnsi="Arial" w:cs="Arial"/>
-        </w:rPr>
-      </w:pPr>
-      <w:r>
-        <w:rPr>
-          <w:rFonts w:ascii="Arial" w:hAnsi="Arial" w:cs="Arial"/>
-        </w:rPr>
-        <w:t>Course Enrolment</w:t>
-      </w:r>
-      <w:r>
-        <w:rPr>
-          <w:rFonts w:ascii="Arial" w:hAnsi="Arial" w:cs="Arial"/>
-        </w:rPr>
-        <w:t>:</w:t>
-      </w:r>
-    </w:p>
-    <w:p>
-      <w:pPr>
-        <w:pStyle w:val="ListParagraph"/>
-        <w:numPr>
-          <w:ilvl w:val="1"/>
-          <w:numId w:val="5"/>
-        </w:numPr>
-        <w:spacing w:line="360" w:lineRule="auto"/>
-        <w:ind w:left="1843"/>
-        <w:rPr>
-          <w:rFonts w:ascii="Arial" w:hAnsi="Arial" w:cs="Arial"/>
-        </w:rPr>
-      </w:pPr>
-      <w:r>
-        <w:rPr>
-          <w:rFonts w:ascii="Arial" w:hAnsi="Arial" w:cs="Arial"/>
-        </w:rPr>
-        <w:t>The system shall allow students to enrol in selected courses.</w:t>
-      </w:r>
-    </w:p>
-    <w:p>
-      <w:pPr>
-        <w:pStyle w:val="ListParagraph"/>
-        <w:numPr>
-          <w:ilvl w:val="1"/>
-          <w:numId w:val="5"/>
-        </w:numPr>
-        <w:spacing w:line="360" w:lineRule="auto"/>
-        <w:ind w:left="1843"/>
-        <w:rPr>
-          <w:rFonts w:ascii="Arial" w:hAnsi="Arial" w:cs="Arial"/>
-        </w:rPr>
-      </w:pPr>
-      <w:r>
-        <w:rPr>
-          <w:rFonts w:ascii="Arial" w:hAnsi="Arial" w:cs="Arial"/>
-        </w:rPr>
-        <w:t>The system shall automatically check prerequisites before allowing enrolment.</w:t>
-      </w:r>
-    </w:p>
-    <w:p>
-      <w:pPr>
-        <w:pStyle w:val="ListParagraph"/>
-        <w:numPr>
-          <w:ilvl w:val="1"/>
-          <w:numId w:val="5"/>
-        </w:numPr>
-        <w:spacing w:line="360" w:lineRule="auto"/>
-        <w:ind w:left="1843"/>
-        <w:rPr>
-          <w:rFonts w:ascii="Arial" w:hAnsi="Arial" w:cs="Arial"/>
-        </w:rPr>
-      </w:pPr>
-      <w:r>
-        <w:rPr>
-          <w:rFonts w:ascii="Arial" w:hAnsi="Arial" w:cs="Arial"/>
-        </w:rPr>
-        <w:t>The system shall automatically verify course availability before confirming enrolment.</w:t>
-      </w:r>
-    </w:p>
-    <w:p>
-      <w:pPr>
-        <w:pStyle w:val="ListParagraph"/>
-        <w:numPr>
-          <w:ilvl w:val="1"/>
-          <w:numId w:val="5"/>
-        </w:numPr>
-        <w:spacing w:line="360" w:lineRule="auto"/>
-        <w:ind w:left="1843"/>
-        <w:rPr>
-          <w:rFonts w:ascii="Arial" w:hAnsi="Arial" w:cs="Arial"/>
-        </w:rPr>
-      </w:pPr>
-      <w:r>
-        <w:rPr>
-          <w:rFonts w:ascii="Arial" w:hAnsi="Arial" w:cs="Arial"/>
-        </w:rPr>
-        <w:t>The system shall detect timetable clashes and notify students before enrolment confirmation.</w:t>
-      </w:r>
-    </w:p>
-    <w:p>
-      <w:pPr>
-        <w:pStyle w:val="ListParagraph"/>
-        <w:numPr>
-          <w:ilvl w:val="1"/>
-          <w:numId w:val="5"/>
-        </w:numPr>
-        <w:spacing w:line="360" w:lineRule="auto"/>
-        <w:ind w:left="1843"/>
-        <w:rPr>
-          <w:rFonts w:ascii="Arial" w:hAnsi="Arial" w:cs="Arial"/>
-        </w:rPr>
-      </w:pPr>
-      <w:r>
-        <w:rPr>
-          <w:rFonts w:ascii="Arial" w:hAnsi="Arial" w:cs="Arial"/>
-        </w:rPr>
-        <w:t>The system shall allow students to adjust their course selection if timetable conflicts are detected.</w:t>
-      </w:r>
-    </w:p>
-    <w:p>
-      <w:pPr>
-        <w:pStyle w:val="ListParagraph"/>
-        <w:numPr>
-          <w:ilvl w:val="0"/>
-          <w:numId w:val="5"/>
-        </w:numPr>
-        <w:spacing w:line="360" w:lineRule="auto"/>
-        <w:ind w:left="1560"/>
-        <w:rPr>
-          <w:rFonts w:ascii="Arial" w:hAnsi="Arial" w:cs="Arial"/>
-        </w:rPr>
-      </w:pPr>
-      <w:r>
-        <w:rPr>
-          <w:rFonts w:ascii="Arial" w:hAnsi="Arial" w:cs="Arial"/>
-        </w:rPr>
-        <w:t>Timetable Management (Enrolment View)</w:t>
-      </w:r>
-      <w:r>
-        <w:rPr>
-          <w:rFonts w:ascii="Arial" w:hAnsi="Arial" w:cs="Arial"/>
-        </w:rPr>
-        <w:t>:</w:t>
-      </w:r>
-    </w:p>
-    <w:p>
-      <w:pPr>
-        <w:pStyle w:val="ListParagraph"/>
-        <w:numPr>
-          <w:ilvl w:val="1"/>
-          <w:numId w:val="5"/>
-        </w:numPr>
-        <w:spacing w:line="360" w:lineRule="auto"/>
-        <w:ind w:left="1843"/>
-        <w:rPr>
-          <w:rFonts w:ascii="Arial" w:hAnsi="Arial" w:cs="Arial"/>
-        </w:rPr>
-      </w:pPr>
-      <w:r>
-        <w:rPr>
-          <w:rFonts w:ascii="Arial" w:hAnsi="Arial" w:cs="Arial"/>
-        </w:rPr>
-        <w:t>The system shall display a timetable of the student’s enrolled courses.</w:t>
-      </w:r>
-    </w:p>
-    <w:p>
-      <w:pPr>
-        <w:pStyle w:val="ListParagraph"/>
-        <w:numPr>
-          <w:ilvl w:val="1"/>
-          <w:numId w:val="5"/>
-        </w:numPr>
-        <w:spacing w:line="360" w:lineRule="auto"/>
-        <w:ind w:left="1843"/>
-        <w:rPr>
-          <w:rFonts w:ascii="Arial" w:hAnsi="Arial" w:cs="Arial"/>
-        </w:rPr>
-      </w:pPr>
-      <w:r>
-        <w:rPr>
-          <w:rFonts w:ascii="Arial" w:hAnsi="Arial" w:cs="Arial"/>
-        </w:rPr>
-        <w:t>The system shall visually highlight any timetable clashes between selected courses.</w:t>
-      </w:r>
-    </w:p>
-    <w:p>
-      <w:pPr>
-        <w:pStyle w:val="ListParagraph"/>
-        <w:numPr>
-          <w:ilvl w:val="0"/>
-          <w:numId w:val="5"/>
-        </w:numPr>
-        <w:spacing w:line="360" w:lineRule="auto"/>
-        <w:ind w:left="1560"/>
-        <w:rPr>
-          <w:rFonts w:ascii="Arial" w:hAnsi="Arial" w:cs="Arial"/>
-        </w:rPr>
-      </w:pPr>
-      <w:r>
-        <w:rPr>
-          <w:rFonts w:ascii="Arial" w:hAnsi="Arial" w:cs="Arial"/>
-        </w:rPr>
-        <w:t>Staff Course Management</w:t>
-      </w:r>
-      <w:r>
-        <w:rPr>
-          <w:rFonts w:ascii="Arial" w:hAnsi="Arial" w:cs="Arial"/>
-        </w:rPr>
-        <w:t>:</w:t>
-      </w:r>
-    </w:p>
-    <w:p>
-      <w:pPr>
-        <w:pStyle w:val="ListParagraph"/>
-        <w:numPr>
-          <w:ilvl w:val="1"/>
-          <w:numId w:val="5"/>
-        </w:numPr>
-        <w:spacing w:line="360" w:lineRule="auto"/>
-        <w:ind w:left="1843"/>
-        <w:rPr>
-          <w:rFonts w:ascii="Arial" w:hAnsi="Arial" w:cs="Arial"/>
-        </w:rPr>
-      </w:pPr>
-      <w:r>
-        <w:rPr>
-          <w:rFonts w:ascii="Arial" w:hAnsi="Arial" w:cs="Arial"/>
-        </w:rPr>
-        <w:t>The system shall allow Academic Department staff to add, update, and remove course information, including descriptions, prerequisites, capacity, and timetable details.</w:t>
-      </w:r>
-    </w:p>
-    <w:p>
-      <w:pPr>
-        <w:pStyle w:val="ListParagraph"/>
-        <w:numPr>
-          <w:ilvl w:val="1"/>
-          <w:numId w:val="5"/>
-        </w:numPr>
-        <w:spacing w:line="360" w:lineRule="auto"/>
-        <w:ind w:left="1843"/>
-        <w:rPr>
-          <w:rFonts w:ascii="Arial" w:hAnsi="Arial" w:cs="Arial"/>
-        </w:rPr>
-      </w:pPr>
-      <w:r>
-        <w:rPr>
-          <w:rFonts w:ascii="Arial" w:hAnsi="Arial" w:cs="Arial"/>
-        </w:rPr>
-        <w:t>The system shall allow Registry/Admissions staff to review and approve student enrolment requests.</w:t>
-      </w:r>
-    </w:p>
-    <w:p>
-      <w:pPr>
-        <w:pStyle w:val="ListParagraph"/>
-        <w:numPr>
-          <w:ilvl w:val="1"/>
-          <w:numId w:val="5"/>
-        </w:numPr>
-        <w:spacing w:line="360" w:lineRule="auto"/>
-        <w:ind w:left="1843"/>
-        <w:rPr>
-          <w:rFonts w:ascii="Arial" w:hAnsi="Arial" w:cs="Arial"/>
-        </w:rPr>
-      </w:pPr>
-      <w:r>
-        <w:rPr>
-          <w:rFonts w:ascii="Arial" w:hAnsi="Arial" w:cs="Arial"/>
-        </w:rPr>
-        <w:t>The system shall enforce prerequisite, course capacity, and timetable clash rules during approval.</w:t>
-      </w:r>
-    </w:p>
-    <w:p>
-      <w:pPr>
-        <w:pStyle w:val="ListParagraph"/>
-        <w:numPr>
-          <w:ilvl w:val="0"/>
-          <w:numId w:val="5"/>
-        </w:numPr>
-        <w:spacing w:line="360" w:lineRule="auto"/>
-        <w:ind w:left="1560"/>
-        <w:rPr>
-          <w:rFonts w:ascii="Arial" w:hAnsi="Arial" w:cs="Arial"/>
-        </w:rPr>
-      </w:pPr>
-      <w:r>
-        <w:rPr>
-          <w:rFonts w:ascii="Arial" w:hAnsi="Arial" w:cs="Arial"/>
-        </w:rPr>
-        <w:t>Payment Processing and Enrolment Confirmation</w:t>
-      </w:r>
-      <w:r>
-        <w:rPr>
-          <w:rFonts w:ascii="Arial" w:hAnsi="Arial" w:cs="Arial"/>
-        </w:rPr>
-        <w:t>:</w:t>
-      </w:r>
-    </w:p>
-    <w:p>
-      <w:pPr>
-        <w:pStyle w:val="ListParagraph"/>
-        <w:numPr>
-          <w:ilvl w:val="1"/>
-          <w:numId w:val="5"/>
-        </w:numPr>
-        <w:spacing w:line="360" w:lineRule="auto"/>
-        <w:ind w:left="1843"/>
-        <w:rPr>
-          <w:rFonts w:ascii="Arial" w:hAnsi="Arial" w:cs="Arial"/>
-        </w:rPr>
-      </w:pPr>
-      <w:r>
-        <w:rPr>
-          <w:rFonts w:ascii="Arial" w:hAnsi="Arial" w:cs="Arial"/>
-        </w:rPr>
-        <w:lastRenderedPageBreak/>
-        <w:t>The system shall allow Finance Department staff to process tuition and course-related payments.</w:t>
-      </w:r>
-    </w:p>
-    <w:p>
-      <w:pPr>
-        <w:pStyle w:val="ListParagraph"/>
-        <w:numPr>
-          <w:ilvl w:val="1"/>
-          <w:numId w:val="5"/>
-        </w:numPr>
-        <w:spacing w:line="360" w:lineRule="auto"/>
-        <w:ind w:left="1843"/>
-        <w:rPr>
-          <w:rFonts w:ascii="Arial" w:hAnsi="Arial" w:cs="Arial"/>
-        </w:rPr>
-      </w:pPr>
-      <w:r>
-        <w:rPr>
-          <w:rFonts w:ascii="Arial" w:hAnsi="Arial" w:cs="Arial"/>
-        </w:rPr>
-        <w:t>The system shall confirm student enrolment only after successful payment verification.</w:t>
-      </w:r>
-    </w:p>
-    <w:p>
-      <w:pPr>
-        <w:pStyle w:val="ListParagraph"/>
-        <w:numPr>
-          <w:ilvl w:val="1"/>
-          <w:numId w:val="5"/>
-        </w:numPr>
-        <w:spacing w:line="360" w:lineRule="auto"/>
-        <w:ind w:left="1843"/>
-        <w:rPr>
-          <w:rFonts w:ascii="Arial" w:hAnsi="Arial" w:cs="Arial"/>
-        </w:rPr>
-      </w:pPr>
-      <w:r>
-        <w:rPr>
-          <w:rFonts w:ascii="Arial" w:hAnsi="Arial" w:cs="Arial"/>
-        </w:rPr>
-        <w:t>The system shall automatically update enrolment status after payment confirmation.</w:t>
-      </w:r>
-    </w:p>
-    <w:p>
-      <w:pPr>
-        <w:pStyle w:val="ListParagraph"/>
-        <w:numPr>
-          <w:ilvl w:val="0"/>
-          <w:numId w:val="5"/>
-        </w:numPr>
-        <w:spacing w:line="360" w:lineRule="auto"/>
-        <w:ind w:left="1560"/>
-        <w:rPr>
-          <w:rFonts w:ascii="Arial" w:hAnsi="Arial" w:cs="Arial"/>
-        </w:rPr>
-      </w:pPr>
-      <w:r>
-        <w:rPr>
-          <w:rFonts w:ascii="Arial" w:hAnsi="Arial" w:cs="Arial"/>
-        </w:rPr>
-        <w:t>Notifications</w:t>
-      </w:r>
-      <w:r>
-        <w:rPr>
-          <w:rFonts w:ascii="Arial" w:hAnsi="Arial" w:cs="Arial"/>
-        </w:rPr>
-        <w:t>:</w:t>
-      </w:r>
-    </w:p>
-    <w:p>
-      <w:pPr>
-        <w:pStyle w:val="ListParagraph"/>
-        <w:numPr>
-          <w:ilvl w:val="1"/>
-          <w:numId w:val="5"/>
-        </w:numPr>
-        <w:spacing w:line="360" w:lineRule="auto"/>
-        <w:ind w:left="1843"/>
-        <w:rPr>
-          <w:rFonts w:ascii="Arial" w:hAnsi="Arial" w:cs="Arial"/>
-        </w:rPr>
-      </w:pPr>
-      <w:r>
-        <w:rPr>
-          <w:rFonts w:ascii="Arial" w:hAnsi="Arial" w:cs="Arial"/>
-        </w:rPr>
-        <w:t>The system shall notify students of successful enrolment confirmation.</w:t>
-      </w:r>
-    </w:p>
-    <w:p>
-      <w:pPr>
-        <w:pStyle w:val="ListParagraph"/>
-        <w:numPr>
-          <w:ilvl w:val="1"/>
-          <w:numId w:val="5"/>
-        </w:numPr>
-        <w:spacing w:line="360" w:lineRule="auto"/>
-        <w:ind w:left="1843"/>
-        <w:rPr>
-          <w:rFonts w:ascii="Arial" w:hAnsi="Arial" w:cs="Arial"/>
-        </w:rPr>
-      </w:pPr>
-      <w:r>
-        <w:rPr>
-          <w:rFonts w:ascii="Arial" w:hAnsi="Arial" w:cs="Arial"/>
-        </w:rPr>
-        <w:t>The system shall notify students of any enrolment issues, including timetable clashes or prerequisite violations.</w:t>
-      </w:r>
-    </w:p>
-    <w:p>
-      <w:pPr>
-        <w:pStyle w:val="ListParagraph"/>
-        <w:numPr>
-          <w:ilvl w:val="1"/>
-          <w:numId w:val="5"/>
-        </w:numPr>
-        <w:spacing w:line="360" w:lineRule="auto"/>
-        <w:ind w:left="1843"/>
-        <w:rPr>
-          <w:rFonts w:ascii="Arial" w:hAnsi="Arial" w:cs="Arial"/>
-        </w:rPr>
-      </w:pPr>
-      <w:r>
-        <w:rPr>
-          <w:rFonts w:ascii="Arial" w:hAnsi="Arial" w:cs="Arial"/>
-        </w:rPr>
-        <w:t>The system shall notify staff of pending enrolment requests requiring approval.</w:t>
-      </w:r>
-    </w:p>
-    <w:p>
-      <w:pPr>
-        <w:pStyle w:val="ListParagraph"/>
-        <w:numPr>
-          <w:ilvl w:val="0"/>
-          <w:numId w:val="5"/>
-        </w:numPr>
-        <w:spacing w:line="360" w:lineRule="auto"/>
-        <w:ind w:left="1560"/>
-        <w:rPr>
-          <w:rFonts w:ascii="Arial" w:hAnsi="Arial" w:cs="Arial"/>
-        </w:rPr>
-      </w:pPr>
-      <w:r>
-        <w:rPr>
-          <w:rFonts w:ascii="Arial" w:hAnsi="Arial" w:cs="Arial"/>
-        </w:rPr>
-        <w:t>User Access and Security</w:t>
-      </w:r>
-      <w:r>
-        <w:rPr>
-          <w:rFonts w:ascii="Arial" w:hAnsi="Arial" w:cs="Arial"/>
-        </w:rPr>
-        <w:t>:</w:t>
-      </w:r>
-    </w:p>
-    <w:p>
-      <w:pPr>
-        <w:pStyle w:val="ListParagraph"/>
-        <w:numPr>
-          <w:ilvl w:val="1"/>
-          <w:numId w:val="5"/>
-        </w:numPr>
-        <w:spacing w:line="360" w:lineRule="auto"/>
-        <w:ind w:left="1843"/>
-        <w:rPr>
-          <w:rFonts w:ascii="Arial" w:hAnsi="Arial" w:cs="Arial"/>
-        </w:rPr>
-      </w:pPr>
-      <w:r>
-        <w:rPr>
-          <w:rFonts w:ascii="Arial" w:hAnsi="Arial" w:cs="Arial"/>
-        </w:rPr>
-        <w:t>The system shall restrict access to features based on user roles (Student, Academic Staff, Registry Staff, Finance Staff).</w:t>
-      </w:r>
-    </w:p>
-    <w:p>
-      <w:pPr>
-        <w:pStyle w:val="ListParagraph"/>
-        <w:numPr>
-          <w:ilvl w:val="1"/>
-          <w:numId w:val="5"/>
-        </w:numPr>
-        <w:spacing w:line="360" w:lineRule="auto"/>
-        <w:ind w:left="1843"/>
-        <w:rPr>
-          <w:rFonts w:ascii="Arial" w:hAnsi="Arial" w:cs="Arial"/>
-        </w:rPr>
-      </w:pPr>
-      <w:r>
-        <w:rPr>
-          <w:rFonts w:ascii="Arial" w:hAnsi="Arial" w:cs="Arial"/>
-        </w:rPr>
-        <w:t>The system shall require authentication before allowing access to any student or staff data.</w:t>
-      </w:r>
-    </w:p>
-    <w:p>
-      <w:pPr>
-        <w:pStyle w:val="ListParagraph"/>
-        <w:numPr>
-          <w:ilvl w:val="0"/>
-          <w:numId w:val="5"/>
-        </w:numPr>
-        <w:spacing w:line="360" w:lineRule="auto"/>
-        <w:ind w:left="1560"/>
-        <w:rPr>
-          <w:rFonts w:ascii="Arial" w:hAnsi="Arial" w:cs="Arial"/>
-        </w:rPr>
-      </w:pPr>
-      <w:r>
-        <w:rPr>
-          <w:rFonts w:ascii="Arial" w:hAnsi="Arial" w:cs="Arial"/>
-        </w:rPr>
-        <w:t>Reporting and Audit</w:t>
-      </w:r>
-      <w:r>
-        <w:rPr>
-          <w:rFonts w:ascii="Arial" w:hAnsi="Arial" w:cs="Arial"/>
-        </w:rPr>
-        <w:t>:</w:t>
-      </w:r>
-    </w:p>
-    <w:p>
-      <w:pPr>
-        <w:pStyle w:val="ListParagraph"/>
-        <w:numPr>
-          <w:ilvl w:val="1"/>
-          <w:numId w:val="5"/>
-        </w:numPr>
-        <w:spacing w:line="360" w:lineRule="auto"/>
-        <w:ind w:left="1843"/>
-        <w:rPr>
-          <w:rFonts w:ascii="Arial" w:hAnsi="Arial" w:cs="Arial"/>
-        </w:rPr>
-      </w:pPr>
-      <w:r>
-        <w:rPr>
-          <w:rFonts w:ascii="Arial" w:hAnsi="Arial" w:cs="Arial"/>
-        </w:rPr>
-        <w:t>The system shall generate enrolment reports for students, courses, and departments.</w:t>
-      </w:r>
-    </w:p>
-    <w:p>
-      <w:pPr>
-        <w:pStyle w:val="ListParagraph"/>
-        <w:numPr>
-          <w:ilvl w:val="1"/>
-          <w:numId w:val="5"/>
-        </w:numPr>
-        <w:spacing w:line="360" w:lineRule="auto"/>
-        <w:ind w:left="1843"/>
-        <w:rPr>
-          <w:rFonts w:ascii="Arial" w:hAnsi="Arial" w:cs="Arial"/>
-        </w:rPr>
-      </w:pPr>
-      <w:r>
-        <w:rPr>
-          <w:rFonts w:ascii="Arial" w:hAnsi="Arial" w:cs="Arial"/>
-        </w:rPr>
-        <w:t>The system shall maintain an audit trail of all enrolment, approval, and payment transactions.</w:t>
-      </w:r>
-    </w:p>
-    <w:p>
-      <w:pPr>
-        <w:pStyle w:val="Heading2"/>
-        <w:ind w:left="851"/>
+      </w:pPr>
+      <w:bookmarkStart w:id="8" w:name="_Toc226030428"/>
+      <w:r>
         <w:rPr>
           <w:rFonts w:ascii="Arial" w:hAnsi="Arial" w:cs="Arial"/>
           <w:b/>
@@ -1845,7 +3020,8 @@
           <w:sz w:val="24"/>
           <w:szCs w:val="24"/>
         </w:rPr>
-      </w:pPr>
+        <w:t>i</w:t>
+      </w:r>
       <w:r>
         <w:rPr>
           <w:rFonts w:ascii="Arial" w:hAnsi="Arial" w:cs="Arial"/>
@@ -1866,7 +3042,7 @@
           <w:sz w:val="24"/>
           <w:szCs w:val="24"/>
         </w:rPr>
-        <w:t>i</w:t>
+        <w:t>i.</w:t>
       </w:r>
       <w:r>
         <w:rPr>
@@ -1877,7 +3053,7 @@
           <w:sz w:val="24"/>
           <w:szCs w:val="24"/>
         </w:rPr>
-        <w:t>i.</w:t>
+        <w:t xml:space="preserve"> </w:t>
       </w:r>
       <w:r>
         <w:rPr>
@@ -1888,7 +3064,7 @@
           <w:sz w:val="24"/>
           <w:szCs w:val="24"/>
         </w:rPr>
-        <w:t xml:space="preserve"> </w:t>
+        <w:t>Non-</w:t>
       </w:r>
       <w:r>
         <w:rPr>
@@ -1899,7 +3075,7 @@
           <w:sz w:val="24"/>
           <w:szCs w:val="24"/>
         </w:rPr>
-        <w:t>Non-</w:t>
+        <w:t>Functional Requirement</w:t>
       </w:r>
       <w:r>
         <w:rPr>
@@ -1910,19 +3086,9 @@
           <w:sz w:val="24"/>
           <w:szCs w:val="24"/>
         </w:rPr>
-        <w:t>Functional Requirement</w:t>
-      </w:r>
-      <w:r>
-        <w:rPr>
-          <w:rFonts w:ascii="Arial" w:hAnsi="Arial" w:cs="Arial"/>
-          <w:b/>
-          <w:bCs/>
-          <w:color w:val="EE0000"/>
-          <w:sz w:val="24"/>
-          <w:szCs w:val="24"/>
-        </w:rPr>
         <w:t>s</w:t>
       </w:r>
+      <w:bookmarkEnd w:id="8"/>
     </w:p>
     <w:p>
       <w:pPr>
@@ -2591,7 +3757,6 @@
         <w:rPr>
           <w:rFonts w:ascii="Arial" w:hAnsi="Arial" w:cs="Arial"/>
         </w:rPr>
-        <w:lastRenderedPageBreak/>
         <w:t>Interoperability</w:t>
       </w:r>
     </w:p>
@@ -2612,6 +3777,7 @@
         <w:rPr>
           <w:rFonts w:ascii="Arial" w:hAnsi="Arial" w:cs="Arial"/>
         </w:rPr>
+        <w:lastRenderedPageBreak/>
         <w:t>The system shall support integration with existing AUT systems (e.g., student database, finance system).</w:t>
       </w:r>
     </w:p>
@@ -2635,14 +3801,521 @@
         <w:t>Ensures smooth coordination between departments and prevents data silos.</w:t>
       </w:r>
     </w:p>
+    <w:p>
+      <w:pPr>
+        <w:rPr>
+          <w:rFonts w:ascii="Arial" w:hAnsi="Arial" w:cs="Arial"/>
+        </w:rPr>
+      </w:pPr>
+      <w:r>
+        <w:rPr>
+          <w:rFonts w:ascii="Arial" w:hAnsi="Arial" w:cs="Arial"/>
+        </w:rPr>
+        <w:br w:type="page"/>
+      </w:r>
+    </w:p>
+    <w:p>
+      <w:pPr>
+        <w:pStyle w:val="Heading1"/>
+        <w:numPr>
+          <w:ilvl w:val="0"/>
+          <w:numId w:val="3"/>
+        </w:numPr>
+        <w:spacing w:before="0" w:after="0" w:line="360" w:lineRule="auto"/>
+        <w:ind w:left="284"/>
+        <w:rPr>
+          <w:rFonts w:ascii="Arial" w:hAnsi="Arial" w:cs="Arial"/>
+          <w:b/>
+          <w:bCs/>
+          <w:color w:val="EE0000"/>
+          <w:sz w:val="32"/>
+          <w:szCs w:val="32"/>
+        </w:rPr>
+      </w:pPr>
+      <w:bookmarkStart w:id="9" w:name="_Toc226030429"/>
+      <w:r>
+        <w:rPr>
+          <w:rFonts w:ascii="Arial" w:hAnsi="Arial" w:cs="Arial"/>
+          <w:b/>
+          <w:bCs/>
+          <w:color w:val="EE0000"/>
+          <w:sz w:val="32"/>
+          <w:szCs w:val="32"/>
+        </w:rPr>
+        <w:lastRenderedPageBreak/>
+        <w:t xml:space="preserve">Use </w:t>
+      </w:r>
+      <w:r>
+        <w:rPr>
+          <w:rFonts w:ascii="Arial" w:hAnsi="Arial" w:cs="Arial"/>
+          <w:b/>
+          <w:bCs/>
+          <w:color w:val="EE0000"/>
+          <w:sz w:val="32"/>
+          <w:szCs w:val="32"/>
+        </w:rPr>
+        <w:t>c</w:t>
+      </w:r>
+      <w:r>
+        <w:rPr>
+          <w:rFonts w:ascii="Arial" w:hAnsi="Arial" w:cs="Arial"/>
+          <w:b/>
+          <w:bCs/>
+          <w:color w:val="EE0000"/>
+          <w:sz w:val="32"/>
+          <w:szCs w:val="32"/>
+        </w:rPr>
+        <w:t>ase diagram</w:t>
+      </w:r>
+      <w:bookmarkEnd w:id="9"/>
+    </w:p>
+    <w:p>
+      <w:pPr>
+        <w:spacing w:line="360" w:lineRule="auto"/>
+        <w:ind w:left="284"/>
+        <w:rPr>
+          <w:rFonts w:ascii="Arial" w:hAnsi="Arial" w:cs="Arial"/>
+        </w:rPr>
+      </w:pPr>
+    </w:p>
+    <w:p>
+      <w:pPr>
+        <w:rPr>
+          <w:rFonts w:ascii="Arial" w:hAnsi="Arial" w:cs="Arial"/>
+        </w:rPr>
+      </w:pPr>
+      <w:r>
+        <w:rPr>
+          <w:rFonts w:ascii="Arial" w:hAnsi="Arial" w:cs="Arial"/>
+        </w:rPr>
+        <w:br w:type="page"/>
+      </w:r>
+    </w:p>
+    <w:p>
+      <w:pPr>
+        <w:pStyle w:val="Heading1"/>
+        <w:numPr>
+          <w:ilvl w:val="0"/>
+          <w:numId w:val="3"/>
+        </w:numPr>
+        <w:spacing w:before="0" w:after="0" w:line="360" w:lineRule="auto"/>
+        <w:ind w:left="284"/>
+        <w:rPr>
+          <w:rFonts w:ascii="Arial" w:hAnsi="Arial" w:cs="Arial"/>
+          <w:b/>
+          <w:bCs/>
+          <w:color w:val="EE0000"/>
+          <w:sz w:val="32"/>
+          <w:szCs w:val="32"/>
+        </w:rPr>
+      </w:pPr>
+      <w:bookmarkStart w:id="10" w:name="_Toc226030430"/>
+      <w:r>
+        <w:rPr>
+          <w:rFonts w:ascii="Arial" w:hAnsi="Arial" w:cs="Arial"/>
+          <w:b/>
+          <w:bCs/>
+          <w:color w:val="EE0000"/>
+          <w:sz w:val="32"/>
+          <w:szCs w:val="32"/>
+        </w:rPr>
+        <w:lastRenderedPageBreak/>
+        <w:t>Class</w:t>
+      </w:r>
+      <w:r>
+        <w:rPr>
+          <w:rFonts w:ascii="Arial" w:hAnsi="Arial" w:cs="Arial"/>
+          <w:b/>
+          <w:bCs/>
+          <w:color w:val="EE0000"/>
+          <w:sz w:val="32"/>
+          <w:szCs w:val="32"/>
+        </w:rPr>
+        <w:t xml:space="preserve"> diagram</w:t>
+      </w:r>
+      <w:bookmarkEnd w:id="10"/>
+    </w:p>
+    <w:p>
+      <w:pPr>
+        <w:spacing w:line="360" w:lineRule="auto"/>
+        <w:ind w:left="284"/>
+        <w:rPr>
+          <w:rFonts w:ascii="Arial" w:hAnsi="Arial" w:cs="Arial"/>
+        </w:rPr>
+      </w:pPr>
+    </w:p>
+    <w:p>
+      <w:pPr>
+        <w:rPr>
+          <w:rFonts w:ascii="Arial" w:hAnsi="Arial" w:cs="Arial"/>
+        </w:rPr>
+      </w:pPr>
+      <w:r>
+        <w:rPr>
+          <w:rFonts w:ascii="Arial" w:hAnsi="Arial" w:cs="Arial"/>
+        </w:rPr>
+        <w:br w:type="page"/>
+      </w:r>
+    </w:p>
+    <w:p>
+      <w:pPr>
+        <w:pStyle w:val="Heading1"/>
+        <w:numPr>
+          <w:ilvl w:val="0"/>
+          <w:numId w:val="3"/>
+        </w:numPr>
+        <w:spacing w:before="0" w:after="0" w:line="360" w:lineRule="auto"/>
+        <w:ind w:left="284"/>
+        <w:rPr>
+          <w:rFonts w:ascii="Arial" w:hAnsi="Arial" w:cs="Arial"/>
+          <w:b/>
+          <w:bCs/>
+          <w:color w:val="EE0000"/>
+          <w:sz w:val="32"/>
+          <w:szCs w:val="32"/>
+        </w:rPr>
+      </w:pPr>
+      <w:bookmarkStart w:id="11" w:name="_Toc226030431"/>
+      <w:r>
+        <w:rPr>
+          <w:rFonts w:ascii="Arial" w:hAnsi="Arial" w:cs="Arial"/>
+          <w:b/>
+          <w:bCs/>
+          <w:color w:val="EE0000"/>
+          <w:sz w:val="32"/>
+          <w:szCs w:val="32"/>
+        </w:rPr>
+        <w:lastRenderedPageBreak/>
+        <w:t>C# Implementation</w:t>
+      </w:r>
+      <w:bookmarkEnd w:id="11"/>
+    </w:p>
+    <w:p>
+      <w:pPr>
+        <w:spacing w:line="360" w:lineRule="auto"/>
+        <w:ind w:left="284"/>
+        <w:rPr>
+          <w:rFonts w:ascii="Arial" w:hAnsi="Arial" w:cs="Arial"/>
+        </w:rPr>
+      </w:pPr>
+    </w:p>
+    <w:p>
+      <w:pPr>
+        <w:spacing w:line="360" w:lineRule="auto"/>
+        <w:ind w:left="284"/>
+        <w:rPr>
+          <w:rFonts w:ascii="Arial" w:hAnsi="Arial" w:cs="Arial"/>
+        </w:rPr>
+      </w:pPr>
+    </w:p>
+    <w:p>
+      <w:pPr>
+        <w:rPr>
+          <w:rFonts w:ascii="Arial" w:hAnsi="Arial" w:cs="Arial"/>
+        </w:rPr>
+      </w:pPr>
+      <w:r>
+        <w:rPr>
+          <w:rFonts w:ascii="Arial" w:hAnsi="Arial" w:cs="Arial"/>
+        </w:rPr>
+        <w:br w:type="page"/>
+      </w:r>
+    </w:p>
+    <w:p>
+      <w:pPr>
+        <w:pStyle w:val="Heading1"/>
+        <w:numPr>
+          <w:ilvl w:val="0"/>
+          <w:numId w:val="3"/>
+        </w:numPr>
+        <w:spacing w:before="0" w:after="0" w:line="360" w:lineRule="auto"/>
+        <w:ind w:left="284"/>
+        <w:rPr>
+          <w:rFonts w:ascii="Arial" w:hAnsi="Arial" w:cs="Arial"/>
+          <w:b/>
+          <w:bCs/>
+          <w:color w:val="EE0000"/>
+          <w:sz w:val="32"/>
+          <w:szCs w:val="32"/>
+        </w:rPr>
+      </w:pPr>
+      <w:bookmarkStart w:id="12" w:name="_Toc226030432"/>
+      <w:r>
+        <w:rPr>
+          <w:rFonts w:ascii="Arial" w:hAnsi="Arial" w:cs="Arial"/>
+          <w:b/>
+          <w:bCs/>
+          <w:color w:val="EE0000"/>
+          <w:sz w:val="32"/>
+          <w:szCs w:val="32"/>
+        </w:rPr>
+        <w:lastRenderedPageBreak/>
+        <w:t>C</w:t>
+      </w:r>
+      <w:r>
+        <w:rPr>
+          <w:rFonts w:ascii="Arial" w:hAnsi="Arial" w:cs="Arial"/>
+          <w:b/>
+          <w:bCs/>
+          <w:color w:val="EE0000"/>
+          <w:sz w:val="32"/>
+          <w:szCs w:val="32"/>
+        </w:rPr>
+        <w:t>onclusion</w:t>
+      </w:r>
+      <w:bookmarkEnd w:id="12"/>
+    </w:p>
+    <w:p>
+      <w:pPr>
+        <w:spacing w:line="360" w:lineRule="auto"/>
+        <w:ind w:left="284"/>
+        <w:rPr>
+          <w:rFonts w:ascii="Arial" w:hAnsi="Arial" w:cs="Arial"/>
+        </w:rPr>
+      </w:pPr>
+    </w:p>
+    <w:p>
+      <w:pPr>
+        <w:spacing w:line="360" w:lineRule="auto"/>
+        <w:ind w:left="284"/>
+        <w:rPr>
+          <w:rFonts w:ascii="Arial" w:hAnsi="Arial" w:cs="Arial"/>
+        </w:rPr>
+      </w:pPr>
+    </w:p>
+    <w:p>
+      <w:pPr>
+        <w:spacing w:line="360" w:lineRule="auto"/>
+        <w:ind w:left="284"/>
+        <w:rPr>
+          <w:rFonts w:ascii="Arial" w:hAnsi="Arial" w:cs="Arial"/>
+        </w:rPr>
+      </w:pPr>
+    </w:p>
+    <w:p>
+      <w:pPr>
+        <w:rPr>
+          <w:rFonts w:ascii="Arial" w:hAnsi="Arial" w:cs="Arial"/>
+        </w:rPr>
+      </w:pPr>
+      <w:r>
+        <w:rPr>
+          <w:rFonts w:ascii="Arial" w:hAnsi="Arial" w:cs="Arial"/>
+        </w:rPr>
+        <w:br w:type="page"/>
+      </w:r>
+    </w:p>
+    <w:p>
+      <w:pPr>
+        <w:pStyle w:val="Heading1"/>
+        <w:spacing w:before="0" w:after="0" w:line="360" w:lineRule="auto"/>
+        <w:rPr>
+          <w:rFonts w:ascii="Arial" w:hAnsi="Arial" w:cs="Arial"/>
+          <w:b/>
+          <w:bCs/>
+          <w:color w:val="EE0000"/>
+          <w:sz w:val="32"/>
+          <w:szCs w:val="32"/>
+        </w:rPr>
+      </w:pPr>
+      <w:bookmarkStart w:id="13" w:name="_Toc226030433"/>
+      <w:r>
+        <w:rPr>
+          <w:rFonts w:ascii="Arial" w:hAnsi="Arial" w:cs="Arial"/>
+          <w:b/>
+          <w:bCs/>
+          <w:color w:val="EE0000"/>
+          <w:sz w:val="32"/>
+          <w:szCs w:val="32"/>
+        </w:rPr>
+        <w:lastRenderedPageBreak/>
+        <w:t>References</w:t>
+      </w:r>
+      <w:bookmarkEnd w:id="13"/>
+    </w:p>
+    <w:p>
+      <w:pPr>
+        <w:spacing w:line="360" w:lineRule="auto"/>
+        <w:ind w:left="284"/>
+        <w:rPr>
+          <w:rFonts w:ascii="Arial" w:hAnsi="Arial" w:cs="Arial"/>
+        </w:rPr>
+      </w:pPr>
+    </w:p>
+    <w:p>
+      <w:pPr>
+        <w:spacing w:line="360" w:lineRule="auto"/>
+        <w:ind w:left="284"/>
+        <w:rPr>
+          <w:rFonts w:ascii="Arial" w:hAnsi="Arial" w:cs="Arial"/>
+        </w:rPr>
+      </w:pPr>
+    </w:p>
+    <w:p>
+      <w:pPr>
+        <w:spacing w:line="360" w:lineRule="auto"/>
+        <w:ind w:left="284"/>
+        <w:rPr>
+          <w:rFonts w:ascii="Arial" w:hAnsi="Arial" w:cs="Arial"/>
+        </w:rPr>
+      </w:pPr>
+    </w:p>
+    <w:p>
+      <w:pPr>
+        <w:spacing w:line="360" w:lineRule="auto"/>
+        <w:ind w:left="284"/>
+        <w:rPr>
+          <w:rFonts w:ascii="Arial" w:hAnsi="Arial" w:cs="Arial"/>
+        </w:rPr>
+      </w:pPr>
+    </w:p>
     <w:sectPr>
+      <w:footerReference w:type="default" r:id="rId9"/>
       <w:pgSz w:w="12240" w:h="15840"/>
       <w:pgMar w:top="1440" w:right="1440" w:bottom="1440" w:left="1440" w:header="708" w:footer="708" w:gutter="0"/>
+      <w:pgNumType w:start="1"/>
       <w:cols w:space="708"/>
       <w:docGrid w:linePitch="360"/>
     </w:sectPr>
   </w:body>
 </w:document>
+</file>
+
+<file path=word/endnotes.xml><?xml version="1.0" encoding="utf-8"?>
+<w:endnotes xmlns:wpc="http://schemas.microsoft.com/office/word/2010/wordprocessingCanvas" xmlns:cx="http://schemas.microsoft.com/office/drawing/2014/chartex" xmlns:cx1="http://schemas.microsoft.com/office/drawing/2015/9/8/chartex" xmlns:cx2="http://schemas.microsoft.com/office/drawing/2015/10/21/chartex" xmlns:cx3="http://schemas.microsoft.com/office/drawing/2016/5/9/chartex" xmlns:cx4="http://schemas.microsoft.com/office/drawing/2016/5/10/chartex" xmlns:cx5="http://schemas.microsoft.com/office/drawing/2016/5/11/chartex" xmlns:cx6="http://schemas.microsoft.com/office/drawing/2016/5/12/chartex" xmlns:cx7="http://schemas.microsoft.com/office/drawing/2016/5/13/chartex" xmlns:cx8="http://schemas.microsoft.com/office/drawing/2016/5/14/chartex" xmlns:mc="http://schemas.openxmlformats.org/markup-compatibility/2006" xmlns:aink="http://schemas.microsoft.com/office/drawing/2016/ink" xmlns:am3d="http://schemas.microsoft.com/office/drawing/2017/model3d" xmlns:o="urn:schemas-microsoft-com:office:office" xmlns:oel="http://schemas.microsoft.com/office/2019/extlst" xmlns:r="http://schemas.openxmlformats.org/officeDocument/2006/relationships" xmlns:m="http://schemas.openxmlformats.org/officeDocument/2006/math" xmlns:v="urn:schemas-microsoft-com:vml" xmlns:wp14="http://schemas.microsoft.com/office/word/2010/wordprocessingDrawing" xmlns:wp="http://schemas.openxmlformats.org/drawingml/2006/wordprocessingDrawing" xmlns:w10="urn:schemas-microsoft-com:office:word" xmlns:w="http://schemas.openxmlformats.org/wordprocessingml/2006/main" xmlns:w14="http://schemas.microsoft.com/office/word/2010/wordml" xmlns:w15="http://schemas.microsoft.com/office/word/2012/wordml" xmlns:w16cex="http://schemas.microsoft.com/office/word/2018/wordml/cex" xmlns:w16cid="http://schemas.microsoft.com/office/word/2016/wordml/cid" xmlns:w16="http://schemas.microsoft.com/office/word/2018/wordml" xmlns:w16du="http://schemas.microsoft.com/office/word/2023/wordml/word16du" xmlns:w16sdtdh="http://schemas.microsoft.com/office/word/2020/wordml/sdtdatahash" xmlns:w16sdtfl="http://schemas.microsoft.com/office/word/2024/wordml/sdtformatlock" xmlns:w16se="http://schemas.microsoft.com/office/word/2015/wordml/symex" xmlns:wpg="http://schemas.microsoft.com/office/word/2010/wordprocessingGroup" xmlns:wpi="http://schemas.microsoft.com/office/word/2010/wordprocessingInk" xmlns:wne="http://schemas.microsoft.com/office/word/2006/wordml" xmlns:wps="http://schemas.microsoft.com/office/word/2010/wordprocessingShape" mc:Ignorable="w14 w15 w16se w16cid w16 w16cex w16sdtdh w16sdtfl w16du wp14">
+  <w:endnote w:type="separator" w:id="-1">
+    <w:p>
+      <w:pPr>
+        <w:spacing w:after="0" w:line="240" w:lineRule="auto"/>
+      </w:pPr>
+      <w:r>
+        <w:separator/>
+      </w:r>
+    </w:p>
+  </w:endnote>
+  <w:endnote w:type="continuationSeparator" w:id="0">
+    <w:p>
+      <w:pPr>
+        <w:spacing w:after="0" w:line="240" w:lineRule="auto"/>
+      </w:pPr>
+      <w:r>
+        <w:continuationSeparator/>
+      </w:r>
+    </w:p>
+  </w:endnote>
+</w:endnotes>
+</file>
+
+<file path=word/footer1.xml><?xml version="1.0" encoding="utf-8"?>
+<w:ftr xmlns:wpc="http://schemas.microsoft.com/office/word/2010/wordprocessingCanvas" xmlns:cx="http://schemas.microsoft.com/office/drawing/2014/chartex" xmlns:cx1="http://schemas.microsoft.com/office/drawing/2015/9/8/chartex" xmlns:cx2="http://schemas.microsoft.com/office/drawing/2015/10/21/chartex" xmlns:cx3="http://schemas.microsoft.com/office/drawing/2016/5/9/chartex" xmlns:cx4="http://schemas.microsoft.com/office/drawing/2016/5/10/chartex" xmlns:cx5="http://schemas.microsoft.com/office/drawing/2016/5/11/chartex" xmlns:cx6="http://schemas.microsoft.com/office/drawing/2016/5/12/chartex" xmlns:cx7="http://schemas.microsoft.com/office/drawing/2016/5/13/chartex" xmlns:cx8="http://schemas.microsoft.com/office/drawing/2016/5/14/chartex" xmlns:mc="http://schemas.openxmlformats.org/markup-compatibility/2006" xmlns:aink="http://schemas.microsoft.com/office/drawing/2016/ink" xmlns:am3d="http://schemas.microsoft.com/office/drawing/2017/model3d" xmlns:o="urn:schemas-microsoft-com:office:office" xmlns:oel="http://schemas.microsoft.com/office/2019/extlst" xmlns:r="http://schemas.openxmlformats.org/officeDocument/2006/relationships" xmlns:m="http://schemas.openxmlformats.org/officeDocument/2006/math" xmlns:v="urn:schemas-microsoft-com:vml" xmlns:wp14="http://schemas.microsoft.com/office/word/2010/wordprocessingDrawing" xmlns:wp="http://schemas.openxmlformats.org/drawingml/2006/wordprocessingDrawing" xmlns:w10="urn:schemas-microsoft-com:office:word" xmlns:w="http://schemas.openxmlformats.org/wordprocessingml/2006/main" xmlns:w14="http://schemas.microsoft.com/office/word/2010/wordml" xmlns:w15="http://schemas.microsoft.com/office/word/2012/wordml" xmlns:w16cex="http://schemas.microsoft.com/office/word/2018/wordml/cex" xmlns:w16cid="http://schemas.microsoft.com/office/word/2016/wordml/cid" xmlns:w16="http://schemas.microsoft.com/office/word/2018/wordml" xmlns:w16du="http://schemas.microsoft.com/office/word/2023/wordml/word16du" xmlns:w16sdtdh="http://schemas.microsoft.com/office/word/2020/wordml/sdtdatahash" xmlns:w16sdtfl="http://schemas.microsoft.com/office/word/2024/wordml/sdtformatlock" xmlns:w16se="http://schemas.microsoft.com/office/word/2015/wordml/symex" xmlns:wpg="http://schemas.microsoft.com/office/word/2010/wordprocessingGroup" xmlns:wpi="http://schemas.microsoft.com/office/word/2010/wordprocessingInk" xmlns:wne="http://schemas.microsoft.com/office/word/2006/wordml" xmlns:wps="http://schemas.microsoft.com/office/word/2010/wordprocessingShape" mc:Ignorable="w14 w15 w16se w16cid w16 w16cex w16sdtdh w16sdtfl w16du wp14">
+  <w:sdt>
+    <w:sdtPr>
+      <w:id w:val="-1366671273"/>
+      <w:docPartObj>
+        <w:docPartGallery w:val="Page Numbers (Bottom of Page)"/>
+        <w:docPartUnique/>
+      </w:docPartObj>
+    </w:sdtPr>
+    <w:sdtContent>
+      <w:sdt>
+        <w:sdtPr>
+          <w:id w:val="-1657149182"/>
+          <w:docPartObj>
+            <w:docPartGallery w:val="Page Numbers (Top of Page)"/>
+            <w:docPartUnique/>
+          </w:docPartObj>
+        </w:sdtPr>
+        <w:sdtContent>
+          <w:p>
+            <w:pPr>
+              <w:pStyle w:val="Footer"/>
+              <w:jc w:val="right"/>
+            </w:pPr>
+            <w:r>
+              <w:t xml:space="preserve">Page </w:t>
+            </w:r>
+            <w:r>
+              <w:rPr>
+                <w:b/>
+                <w:bCs/>
+              </w:rPr>
+              <w:fldChar w:fldCharType="begin"/>
+            </w:r>
+            <w:r>
+              <w:rPr>
+                <w:b/>
+                <w:bCs/>
+              </w:rPr>
+              <w:instrText xml:space="preserve"> PAGE </w:instrText>
+            </w:r>
+            <w:r>
+              <w:rPr>
+                <w:b/>
+                <w:bCs/>
+              </w:rPr>
+              <w:fldChar w:fldCharType="separate"/>
+            </w:r>
+            <w:r>
+              <w:rPr>
+                <w:b/>
+                <w:bCs/>
+                <w:noProof/>
+              </w:rPr>
+              <w:t>2</w:t>
+            </w:r>
+            <w:r>
+              <w:rPr>
+                <w:b/>
+                <w:bCs/>
+              </w:rPr>
+              <w:fldChar w:fldCharType="end"/>
+            </w:r>
+            <w:r>
+              <w:t xml:space="preserve"> of </w:t>
+            </w:r>
+            <w:r>
+              <w:rPr>
+                <w:b/>
+                <w:bCs/>
+              </w:rPr>
+              <w:t>13</w:t>
+            </w:r>
+          </w:p>
+        </w:sdtContent>
+      </w:sdt>
+    </w:sdtContent>
+  </w:sdt>
+  <w:p>
+    <w:pPr>
+      <w:pStyle w:val="Footer"/>
+    </w:pPr>
+  </w:p>
+</w:ftr>
+</file>
+
+<file path=word/footnotes.xml><?xml version="1.0" encoding="utf-8"?>
+<w:footnotes xmlns:wpc="http://schemas.microsoft.com/office/word/2010/wordprocessingCanvas" xmlns:cx="http://schemas.microsoft.com/office/drawing/2014/chartex" xmlns:cx1="http://schemas.microsoft.com/office/drawing/2015/9/8/chartex" xmlns:cx2="http://schemas.microsoft.com/office/drawing/2015/10/21/chartex" xmlns:cx3="http://schemas.microsoft.com/office/drawing/2016/5/9/chartex" xmlns:cx4="http://schemas.microsoft.com/office/drawing/2016/5/10/chartex" xmlns:cx5="http://schemas.microsoft.com/office/drawing/2016/5/11/chartex" xmlns:cx6="http://schemas.microsoft.com/office/drawing/2016/5/12/chartex" xmlns:cx7="http://schemas.microsoft.com/office/drawing/2016/5/13/chartex" xmlns:cx8="http://schemas.microsoft.com/office/drawing/2016/5/14/chartex" xmlns:mc="http://schemas.openxmlformats.org/markup-compatibility/2006" xmlns:aink="http://schemas.microsoft.com/office/drawing/2016/ink" xmlns:am3d="http://schemas.microsoft.com/office/drawing/2017/model3d" xmlns:o="urn:schemas-microsoft-com:office:office" xmlns:oel="http://schemas.microsoft.com/office/2019/extlst" xmlns:r="http://schemas.openxmlformats.org/officeDocument/2006/relationships" xmlns:m="http://schemas.openxmlformats.org/officeDocument/2006/math" xmlns:v="urn:schemas-microsoft-com:vml" xmlns:wp14="http://schemas.microsoft.com/office/word/2010/wordprocessingDrawing" xmlns:wp="http://schemas.openxmlformats.org/drawingml/2006/wordprocessingDrawing" xmlns:w10="urn:schemas-microsoft-com:office:word" xmlns:w="http://schemas.openxmlformats.org/wordprocessingml/2006/main" xmlns:w14="http://schemas.microsoft.com/office/word/2010/wordml" xmlns:w15="http://schemas.microsoft.com/office/word/2012/wordml" xmlns:w16cex="http://schemas.microsoft.com/office/word/2018/wordml/cex" xmlns:w16cid="http://schemas.microsoft.com/office/word/2016/wordml/cid" xmlns:w16="http://schemas.microsoft.com/office/word/2018/wordml" xmlns:w16du="http://schemas.microsoft.com/office/word/2023/wordml/word16du" xmlns:w16sdtdh="http://schemas.microsoft.com/office/word/2020/wordml/sdtdatahash" xmlns:w16sdtfl="http://schemas.microsoft.com/office/word/2024/wordml/sdtformatlock" xmlns:w16se="http://schemas.microsoft.com/office/word/2015/wordml/symex" xmlns:wpg="http://schemas.microsoft.com/office/word/2010/wordprocessingGroup" xmlns:wpi="http://schemas.microsoft.com/office/word/2010/wordprocessingInk" xmlns:wne="http://schemas.microsoft.com/office/word/2006/wordml" xmlns:wps="http://schemas.microsoft.com/office/word/2010/wordprocessingShape" mc:Ignorable="w14 w15 w16se w16cid w16 w16cex w16sdtdh w16sdtfl w16du wp14">
+  <w:footnote w:type="separator" w:id="-1">
+    <w:p>
+      <w:pPr>
+        <w:spacing w:after="0" w:line="240" w:lineRule="auto"/>
+      </w:pPr>
+      <w:r>
+        <w:separator/>
+      </w:r>
+    </w:p>
+  </w:footnote>
+  <w:footnote w:type="continuationSeparator" w:id="0">
+    <w:p>
+      <w:pPr>
+        <w:spacing w:after="0" w:line="240" w:lineRule="auto"/>
+      </w:pPr>
+      <w:r>
+        <w:continuationSeparator/>
+      </w:r>
+    </w:p>
+  </w:footnote>
+</w:footnotes>
 </file>
 
 <file path=word/numbering.xml><?xml version="1.0" encoding="utf-8"?>
@@ -3726,7 +5399,6 @@
     <w:next w:val="Normal"/>
     <w:link w:val="Heading3Char"/>
     <w:uiPriority w:val="9"/>
-    <w:semiHidden/>
     <w:unhideWhenUsed/>
     <w:qFormat/>
     <w:rsid w:val="0045132F"/>
@@ -3932,7 +5604,6 @@
     <w:basedOn w:val="DefaultParagraphFont"/>
     <w:link w:val="Heading3"/>
     <w:uiPriority w:val="9"/>
-    <w:semiHidden/>
     <w:rsid w:val="0045132F"/>
     <w:rPr>
       <w:rFonts w:eastAsiaTheme="majorEastAsia" w:cstheme="majorBidi"/>
@@ -4208,6 +5879,127 @@
         <w:insideV w:val="single" w:sz="4" w:space="0" w:color="auto"/>
       </w:tblBorders>
     </w:tblPr>
+  </w:style>
+  <w:style w:type="paragraph" w:styleId="TOCHeading">
+    <w:name w:val="TOC Heading"/>
+    <w:basedOn w:val="Heading1"/>
+    <w:next w:val="Normal"/>
+    <w:uiPriority w:val="39"/>
+    <w:unhideWhenUsed/>
+    <w:qFormat/>
+    <w:rsid w:val="00274CF3"/>
+    <w:pPr>
+      <w:spacing w:before="240" w:after="0" w:line="259" w:lineRule="auto"/>
+      <w:outlineLvl w:val="9"/>
+    </w:pPr>
+    <w:rPr>
+      <w:kern w:val="0"/>
+      <w:sz w:val="32"/>
+      <w:szCs w:val="32"/>
+      <w:lang w:val="en-US" w:eastAsia="en-US"/>
+      <w14:ligatures w14:val="none"/>
+    </w:rPr>
+  </w:style>
+  <w:style w:type="paragraph" w:styleId="TOC1">
+    <w:name w:val="toc 1"/>
+    <w:basedOn w:val="Normal"/>
+    <w:next w:val="Normal"/>
+    <w:autoRedefine/>
+    <w:uiPriority w:val="39"/>
+    <w:unhideWhenUsed/>
+    <w:rsid w:val="00274CF3"/>
+    <w:pPr>
+      <w:spacing w:after="100"/>
+    </w:pPr>
+  </w:style>
+  <w:style w:type="paragraph" w:styleId="TOC2">
+    <w:name w:val="toc 2"/>
+    <w:basedOn w:val="Normal"/>
+    <w:next w:val="Normal"/>
+    <w:autoRedefine/>
+    <w:uiPriority w:val="39"/>
+    <w:unhideWhenUsed/>
+    <w:rsid w:val="00274CF3"/>
+    <w:pPr>
+      <w:spacing w:after="100"/>
+      <w:ind w:left="240"/>
+    </w:pPr>
+  </w:style>
+  <w:style w:type="character" w:styleId="Hyperlink">
+    <w:name w:val="Hyperlink"/>
+    <w:basedOn w:val="DefaultParagraphFont"/>
+    <w:uiPriority w:val="99"/>
+    <w:unhideWhenUsed/>
+    <w:rsid w:val="00274CF3"/>
+    <w:rPr>
+      <w:color w:val="467886" w:themeColor="hyperlink"/>
+      <w:u w:val="single"/>
+    </w:rPr>
+  </w:style>
+  <w:style w:type="paragraph" w:styleId="TOC3">
+    <w:name w:val="toc 3"/>
+    <w:basedOn w:val="Normal"/>
+    <w:next w:val="Normal"/>
+    <w:autoRedefine/>
+    <w:uiPriority w:val="39"/>
+    <w:unhideWhenUsed/>
+    <w:rsid w:val="00C2236E"/>
+    <w:pPr>
+      <w:spacing w:after="100"/>
+      <w:ind w:left="480"/>
+    </w:pPr>
+  </w:style>
+  <w:style w:type="paragraph" w:styleId="Header">
+    <w:name w:val="header"/>
+    <w:basedOn w:val="Normal"/>
+    <w:link w:val="HeaderChar"/>
+    <w:uiPriority w:val="99"/>
+    <w:unhideWhenUsed/>
+    <w:rsid w:val="006A29BC"/>
+    <w:pPr>
+      <w:tabs>
+        <w:tab w:val="center" w:pos="4680"/>
+        <w:tab w:val="right" w:pos="9360"/>
+      </w:tabs>
+      <w:spacing w:after="0" w:line="240" w:lineRule="auto"/>
+    </w:pPr>
+  </w:style>
+  <w:style w:type="character" w:customStyle="1" w:styleId="HeaderChar">
+    <w:name w:val="Header Char"/>
+    <w:basedOn w:val="DefaultParagraphFont"/>
+    <w:link w:val="Header"/>
+    <w:uiPriority w:val="99"/>
+    <w:rsid w:val="006A29BC"/>
+    <w:rPr>
+      <w:rFonts w:eastAsiaTheme="minorEastAsia"/>
+      <w:lang w:val="en-NZ" w:eastAsia="zh-CN"/>
+    </w:rPr>
+  </w:style>
+  <w:style w:type="paragraph" w:styleId="Footer">
+    <w:name w:val="footer"/>
+    <w:basedOn w:val="Normal"/>
+    <w:link w:val="FooterChar"/>
+    <w:uiPriority w:val="99"/>
+    <w:unhideWhenUsed/>
+    <w:rsid w:val="006A29BC"/>
+    <w:pPr>
+      <w:tabs>
+        <w:tab w:val="center" w:pos="4680"/>
+        <w:tab w:val="right" w:pos="9360"/>
+      </w:tabs>
+      <w:spacing w:after="0" w:line="240" w:lineRule="auto"/>
+    </w:pPr>
+  </w:style>
+  <w:style w:type="character" w:customStyle="1" w:styleId="FooterChar">
+    <w:name w:val="Footer Char"/>
+    <w:basedOn w:val="DefaultParagraphFont"/>
+    <w:link w:val="Footer"/>
+    <w:uiPriority w:val="99"/>
+    <w:rsid w:val="006A29BC"/>
+    <w:rPr>
+      <w:rFonts w:eastAsiaTheme="minorEastAsia"/>
+      <w:lang w:val="en-NZ" w:eastAsia="zh-CN"/>
+    </w:rPr>
   </w:style>
 </w:styles>
 </file>
@@ -4525,4 +6317,16 @@
     </a:ext>
   </a:extLst>
 </a:theme>
+</file>
+
+<file path=customXml/item1.xml><?xml version="1.0" encoding="utf-8"?>
+<b:Sources xmlns:b="http://schemas.openxmlformats.org/officeDocument/2006/bibliography" xmlns="http://schemas.openxmlformats.org/officeDocument/2006/bibliography" SelectedStyle="\APASixthEditionOfficeOnline.xsl" StyleName="APA" Version="6"/>
+</file>
+
+<file path=customXml/itemProps1.xml><?xml version="1.0" encoding="utf-8"?>
+<ds:datastoreItem xmlns:ds="http://schemas.openxmlformats.org/officeDocument/2006/customXml" ds:itemID="{CA99E9EE-01C5-450B-8A1F-209CDEC2E104}">
+  <ds:schemaRefs>
+    <ds:schemaRef ds:uri="http://schemas.openxmlformats.org/officeDocument/2006/bibliography"/>
+  </ds:schemaRefs>
+</ds:datastoreItem>
 </file>
</xml_diff>

<commit_message>
Fix and update part 2. Organisational and System Analysis
</commit_message>
<xml_diff>
--- a/Project Progress Report/Assignment_Phase_1-Thanh_Tran-24247169.docx
+++ b/Project Progress Report/Assignment_Phase_1-Thanh_Tran-24247169.docx
@@ -371,14 +371,17 @@
     <w:sdt>
       <w:sdtPr>
         <w:rPr>
-          <w:rFonts w:ascii="Arial" w:hAnsi="Arial" w:cs="Arial"/>
-          <w:b/>
-          <w:bCs/>
-          <w:color w:val="EE0000"/>
-          <w:sz w:val="32"/>
-          <w:szCs w:val="32"/>
-        </w:rPr>
-        <w:id w:val="-89772428"/>
+          <w:rFonts w:ascii="Arial" w:eastAsiaTheme="minorEastAsia" w:hAnsi="Arial" w:cs="Arial"/>
+          <w:b/>
+          <w:bCs/>
+          <w:color w:val="EE0000"/>
+          <w:kern w:val="2"/>
+          <w:sz w:val="24"/>
+          <w:szCs w:val="24"/>
+          <w:lang w:val="en-NZ" w:eastAsia="zh-CN"/>
+          <w14:ligatures w14:val="standardContextual"/>
+        </w:rPr>
+        <w:id w:val="-559936108"/>
         <w:docPartObj>
           <w:docPartGallery w:val="Table of Contents"/>
           <w:docPartUnique/>
@@ -389,20 +392,17 @@
           <w:rFonts w:asciiTheme="minorHAnsi" w:hAnsiTheme="minorHAnsi" w:cstheme="minorBidi"/>
           <w:noProof/>
           <w:color w:val="auto"/>
-          <w:sz w:val="24"/>
-          <w:szCs w:val="24"/>
         </w:rPr>
       </w:sdtEndPr>
       <w:sdtContent>
         <w:p>
           <w:pPr>
+            <w:pStyle w:val="TOCHeading"/>
             <w:rPr>
               <w:rFonts w:ascii="Arial" w:hAnsi="Arial" w:cs="Arial"/>
               <w:b/>
               <w:bCs/>
               <w:color w:val="EE0000"/>
-              <w:sz w:val="32"/>
-              <w:szCs w:val="32"/>
             </w:rPr>
           </w:pPr>
           <w:r>
@@ -411,10 +411,8 @@
               <w:b/>
               <w:bCs/>
               <w:color w:val="EE0000"/>
-              <w:sz w:val="32"/>
-              <w:szCs w:val="32"/>
             </w:rPr>
-            <w:t>Contents</w:t>
+            <w:t>Table of Contents</w:t>
           </w:r>
         </w:p>
         <w:p>
@@ -438,7 +436,7 @@
           <w:r>
             <w:fldChar w:fldCharType="separate"/>
           </w:r>
-          <w:hyperlink w:anchor="_Toc226030421" w:history="1">
+          <w:hyperlink w:anchor="_Toc226899721" w:history="1">
             <w:r>
               <w:rPr>
                 <w:rStyle w:val="Hyperlink"/>
@@ -485,7 +483,7 @@
                 <w:noProof/>
                 <w:webHidden/>
               </w:rPr>
-              <w:instrText xml:space="preserve"> PAGEREF _Toc226030421 \h </w:instrText>
+              <w:instrText xml:space="preserve"> PAGEREF _Toc226899721 \h </w:instrText>
             </w:r>
             <w:r>
               <w:rPr>
@@ -528,7 +526,7 @@
               <w:lang w:val="en-US" w:eastAsia="en-US"/>
             </w:rPr>
           </w:pPr>
-          <w:hyperlink w:anchor="_Toc226030422" w:history="1">
+          <w:hyperlink w:anchor="_Toc226899722" w:history="1">
             <w:r>
               <w:rPr>
                 <w:rStyle w:val="Hyperlink"/>
@@ -554,7 +552,7 @@
                 <w:bCs/>
                 <w:noProof/>
               </w:rPr>
-              <w:t>Organisation Selection and Analysis</w:t>
+              <w:t>Organisational and System Analysis</w:t>
             </w:r>
             <w:r>
               <w:rPr>
@@ -575,7 +573,7 @@
                 <w:noProof/>
                 <w:webHidden/>
               </w:rPr>
-              <w:instrText xml:space="preserve"> PAGEREF _Toc226030422 \h </w:instrText>
+              <w:instrText xml:space="preserve"> PAGEREF _Toc226899722 \h </w:instrText>
             </w:r>
             <w:r>
               <w:rPr>
@@ -596,6 +594,582 @@
                 <w:webHidden/>
               </w:rPr>
               <w:t>2</w:t>
+            </w:r>
+            <w:r>
+              <w:rPr>
+                <w:noProof/>
+                <w:webHidden/>
+              </w:rPr>
+              <w:fldChar w:fldCharType="end"/>
+            </w:r>
+          </w:hyperlink>
+        </w:p>
+        <w:p>
+          <w:pPr>
+            <w:pStyle w:val="TOC2"/>
+            <w:tabs>
+              <w:tab w:val="right" w:leader="dot" w:pos="9350"/>
+            </w:tabs>
+            <w:rPr>
+              <w:noProof/>
+              <w:lang w:val="en-US" w:eastAsia="en-US"/>
+            </w:rPr>
+          </w:pPr>
+          <w:hyperlink w:anchor="_Toc226899723" w:history="1">
+            <w:r>
+              <w:rPr>
+                <w:rStyle w:val="Hyperlink"/>
+                <w:rFonts w:ascii="Arial" w:hAnsi="Arial" w:cs="Arial"/>
+                <w:b/>
+                <w:bCs/>
+                <w:noProof/>
+              </w:rPr>
+              <w:t>2.1. Overview of the selected organisation</w:t>
+            </w:r>
+            <w:r>
+              <w:rPr>
+                <w:noProof/>
+                <w:webHidden/>
+              </w:rPr>
+              <w:tab/>
+            </w:r>
+            <w:r>
+              <w:rPr>
+                <w:noProof/>
+                <w:webHidden/>
+              </w:rPr>
+              <w:fldChar w:fldCharType="begin"/>
+            </w:r>
+            <w:r>
+              <w:rPr>
+                <w:noProof/>
+                <w:webHidden/>
+              </w:rPr>
+              <w:instrText xml:space="preserve"> PAGEREF _Toc226899723 \h </w:instrText>
+            </w:r>
+            <w:r>
+              <w:rPr>
+                <w:noProof/>
+                <w:webHidden/>
+              </w:rPr>
+            </w:r>
+            <w:r>
+              <w:rPr>
+                <w:noProof/>
+                <w:webHidden/>
+              </w:rPr>
+              <w:fldChar w:fldCharType="separate"/>
+            </w:r>
+            <w:r>
+              <w:rPr>
+                <w:noProof/>
+                <w:webHidden/>
+              </w:rPr>
+              <w:t>2</w:t>
+            </w:r>
+            <w:r>
+              <w:rPr>
+                <w:noProof/>
+                <w:webHidden/>
+              </w:rPr>
+              <w:fldChar w:fldCharType="end"/>
+            </w:r>
+          </w:hyperlink>
+        </w:p>
+        <w:p>
+          <w:pPr>
+            <w:pStyle w:val="TOC2"/>
+            <w:tabs>
+              <w:tab w:val="right" w:leader="dot" w:pos="9350"/>
+            </w:tabs>
+            <w:rPr>
+              <w:noProof/>
+              <w:lang w:val="en-US" w:eastAsia="en-US"/>
+            </w:rPr>
+          </w:pPr>
+          <w:hyperlink w:anchor="_Toc226899724" w:history="1">
+            <w:r>
+              <w:rPr>
+                <w:rStyle w:val="Hyperlink"/>
+                <w:rFonts w:ascii="Arial" w:hAnsi="Arial" w:cs="Arial"/>
+                <w:b/>
+                <w:bCs/>
+                <w:noProof/>
+              </w:rPr>
+              <w:t>2.2. Departmental structure and responsibilities</w:t>
+            </w:r>
+            <w:r>
+              <w:rPr>
+                <w:noProof/>
+                <w:webHidden/>
+              </w:rPr>
+              <w:tab/>
+            </w:r>
+            <w:r>
+              <w:rPr>
+                <w:noProof/>
+                <w:webHidden/>
+              </w:rPr>
+              <w:fldChar w:fldCharType="begin"/>
+            </w:r>
+            <w:r>
+              <w:rPr>
+                <w:noProof/>
+                <w:webHidden/>
+              </w:rPr>
+              <w:instrText xml:space="preserve"> PAGEREF _Toc226899724 \h </w:instrText>
+            </w:r>
+            <w:r>
+              <w:rPr>
+                <w:noProof/>
+                <w:webHidden/>
+              </w:rPr>
+            </w:r>
+            <w:r>
+              <w:rPr>
+                <w:noProof/>
+                <w:webHidden/>
+              </w:rPr>
+              <w:fldChar w:fldCharType="separate"/>
+            </w:r>
+            <w:r>
+              <w:rPr>
+                <w:noProof/>
+                <w:webHidden/>
+              </w:rPr>
+              <w:t>2</w:t>
+            </w:r>
+            <w:r>
+              <w:rPr>
+                <w:noProof/>
+                <w:webHidden/>
+              </w:rPr>
+              <w:fldChar w:fldCharType="end"/>
+            </w:r>
+          </w:hyperlink>
+        </w:p>
+        <w:p>
+          <w:pPr>
+            <w:pStyle w:val="TOC2"/>
+            <w:tabs>
+              <w:tab w:val="right" w:leader="dot" w:pos="9350"/>
+            </w:tabs>
+            <w:rPr>
+              <w:noProof/>
+              <w:lang w:val="en-US" w:eastAsia="en-US"/>
+            </w:rPr>
+          </w:pPr>
+          <w:hyperlink w:anchor="_Toc226899725" w:history="1">
+            <w:r>
+              <w:rPr>
+                <w:rStyle w:val="Hyperlink"/>
+                <w:rFonts w:ascii="Arial" w:hAnsi="Arial" w:cs="Arial"/>
+                <w:b/>
+                <w:bCs/>
+                <w:noProof/>
+              </w:rPr>
+              <w:t>2.3. Stakeholders and user roles</w:t>
+            </w:r>
+            <w:r>
+              <w:rPr>
+                <w:noProof/>
+                <w:webHidden/>
+              </w:rPr>
+              <w:tab/>
+            </w:r>
+            <w:r>
+              <w:rPr>
+                <w:noProof/>
+                <w:webHidden/>
+              </w:rPr>
+              <w:fldChar w:fldCharType="begin"/>
+            </w:r>
+            <w:r>
+              <w:rPr>
+                <w:noProof/>
+                <w:webHidden/>
+              </w:rPr>
+              <w:instrText xml:space="preserve"> PAGEREF _Toc226899725 \h </w:instrText>
+            </w:r>
+            <w:r>
+              <w:rPr>
+                <w:noProof/>
+                <w:webHidden/>
+              </w:rPr>
+            </w:r>
+            <w:r>
+              <w:rPr>
+                <w:noProof/>
+                <w:webHidden/>
+              </w:rPr>
+              <w:fldChar w:fldCharType="separate"/>
+            </w:r>
+            <w:r>
+              <w:rPr>
+                <w:noProof/>
+                <w:webHidden/>
+              </w:rPr>
+              <w:t>3</w:t>
+            </w:r>
+            <w:r>
+              <w:rPr>
+                <w:noProof/>
+                <w:webHidden/>
+              </w:rPr>
+              <w:fldChar w:fldCharType="end"/>
+            </w:r>
+          </w:hyperlink>
+        </w:p>
+        <w:p>
+          <w:pPr>
+            <w:pStyle w:val="TOC2"/>
+            <w:tabs>
+              <w:tab w:val="right" w:leader="dot" w:pos="9350"/>
+            </w:tabs>
+            <w:rPr>
+              <w:noProof/>
+              <w:lang w:val="en-US" w:eastAsia="en-US"/>
+            </w:rPr>
+          </w:pPr>
+          <w:hyperlink w:anchor="_Toc226899726" w:history="1">
+            <w:r>
+              <w:rPr>
+                <w:rStyle w:val="Hyperlink"/>
+                <w:rFonts w:ascii="Arial" w:hAnsi="Arial" w:cs="Arial"/>
+                <w:b/>
+                <w:bCs/>
+                <w:noProof/>
+              </w:rPr>
+              <w:t>2.4. Problem statement</w:t>
+            </w:r>
+            <w:r>
+              <w:rPr>
+                <w:noProof/>
+                <w:webHidden/>
+              </w:rPr>
+              <w:tab/>
+            </w:r>
+            <w:r>
+              <w:rPr>
+                <w:noProof/>
+                <w:webHidden/>
+              </w:rPr>
+              <w:fldChar w:fldCharType="begin"/>
+            </w:r>
+            <w:r>
+              <w:rPr>
+                <w:noProof/>
+                <w:webHidden/>
+              </w:rPr>
+              <w:instrText xml:space="preserve"> PAGEREF _Toc226899726 \h </w:instrText>
+            </w:r>
+            <w:r>
+              <w:rPr>
+                <w:noProof/>
+                <w:webHidden/>
+              </w:rPr>
+            </w:r>
+            <w:r>
+              <w:rPr>
+                <w:noProof/>
+                <w:webHidden/>
+              </w:rPr>
+              <w:fldChar w:fldCharType="separate"/>
+            </w:r>
+            <w:r>
+              <w:rPr>
+                <w:noProof/>
+                <w:webHidden/>
+              </w:rPr>
+              <w:t>3</w:t>
+            </w:r>
+            <w:r>
+              <w:rPr>
+                <w:noProof/>
+                <w:webHidden/>
+              </w:rPr>
+              <w:fldChar w:fldCharType="end"/>
+            </w:r>
+          </w:hyperlink>
+        </w:p>
+        <w:p>
+          <w:pPr>
+            <w:pStyle w:val="TOC2"/>
+            <w:tabs>
+              <w:tab w:val="right" w:leader="dot" w:pos="9350"/>
+            </w:tabs>
+            <w:rPr>
+              <w:noProof/>
+              <w:lang w:val="en-US" w:eastAsia="en-US"/>
+            </w:rPr>
+          </w:pPr>
+          <w:hyperlink w:anchor="_Toc226899727" w:history="1">
+            <w:r>
+              <w:rPr>
+                <w:rStyle w:val="Hyperlink"/>
+                <w:rFonts w:ascii="Arial" w:hAnsi="Arial" w:cs="Arial"/>
+                <w:b/>
+                <w:bCs/>
+                <w:noProof/>
+              </w:rPr>
+              <w:t>2.5. System scope, boundaries, and assumptions</w:t>
+            </w:r>
+            <w:r>
+              <w:rPr>
+                <w:noProof/>
+                <w:webHidden/>
+              </w:rPr>
+              <w:tab/>
+            </w:r>
+            <w:r>
+              <w:rPr>
+                <w:noProof/>
+                <w:webHidden/>
+              </w:rPr>
+              <w:fldChar w:fldCharType="begin"/>
+            </w:r>
+            <w:r>
+              <w:rPr>
+                <w:noProof/>
+                <w:webHidden/>
+              </w:rPr>
+              <w:instrText xml:space="preserve"> PAGEREF _Toc226899727 \h </w:instrText>
+            </w:r>
+            <w:r>
+              <w:rPr>
+                <w:noProof/>
+                <w:webHidden/>
+              </w:rPr>
+            </w:r>
+            <w:r>
+              <w:rPr>
+                <w:noProof/>
+                <w:webHidden/>
+              </w:rPr>
+              <w:fldChar w:fldCharType="separate"/>
+            </w:r>
+            <w:r>
+              <w:rPr>
+                <w:noProof/>
+                <w:webHidden/>
+              </w:rPr>
+              <w:t>5</w:t>
+            </w:r>
+            <w:r>
+              <w:rPr>
+                <w:noProof/>
+                <w:webHidden/>
+              </w:rPr>
+              <w:fldChar w:fldCharType="end"/>
+            </w:r>
+          </w:hyperlink>
+        </w:p>
+        <w:p>
+          <w:pPr>
+            <w:pStyle w:val="TOC3"/>
+            <w:tabs>
+              <w:tab w:val="right" w:leader="dot" w:pos="9350"/>
+            </w:tabs>
+            <w:rPr>
+              <w:noProof/>
+              <w:lang w:val="en-US" w:eastAsia="en-US"/>
+            </w:rPr>
+          </w:pPr>
+          <w:hyperlink w:anchor="_Toc226899728" w:history="1">
+            <w:r>
+              <w:rPr>
+                <w:rStyle w:val="Hyperlink"/>
+                <w:rFonts w:ascii="Arial" w:hAnsi="Arial" w:cs="Arial"/>
+                <w:b/>
+                <w:bCs/>
+                <w:noProof/>
+              </w:rPr>
+              <w:t>i. System scope</w:t>
+            </w:r>
+            <w:r>
+              <w:rPr>
+                <w:noProof/>
+                <w:webHidden/>
+              </w:rPr>
+              <w:tab/>
+            </w:r>
+            <w:r>
+              <w:rPr>
+                <w:noProof/>
+                <w:webHidden/>
+              </w:rPr>
+              <w:fldChar w:fldCharType="begin"/>
+            </w:r>
+            <w:r>
+              <w:rPr>
+                <w:noProof/>
+                <w:webHidden/>
+              </w:rPr>
+              <w:instrText xml:space="preserve"> PAGEREF _Toc226899728 \h </w:instrText>
+            </w:r>
+            <w:r>
+              <w:rPr>
+                <w:noProof/>
+                <w:webHidden/>
+              </w:rPr>
+            </w:r>
+            <w:r>
+              <w:rPr>
+                <w:noProof/>
+                <w:webHidden/>
+              </w:rPr>
+              <w:fldChar w:fldCharType="separate"/>
+            </w:r>
+            <w:r>
+              <w:rPr>
+                <w:noProof/>
+                <w:webHidden/>
+              </w:rPr>
+              <w:t>5</w:t>
+            </w:r>
+            <w:r>
+              <w:rPr>
+                <w:noProof/>
+                <w:webHidden/>
+              </w:rPr>
+              <w:fldChar w:fldCharType="end"/>
+            </w:r>
+          </w:hyperlink>
+        </w:p>
+        <w:p>
+          <w:pPr>
+            <w:pStyle w:val="TOC3"/>
+            <w:tabs>
+              <w:tab w:val="right" w:leader="dot" w:pos="9350"/>
+            </w:tabs>
+            <w:rPr>
+              <w:noProof/>
+              <w:lang w:val="en-US" w:eastAsia="en-US"/>
+            </w:rPr>
+          </w:pPr>
+          <w:hyperlink w:anchor="_Toc226899729" w:history="1">
+            <w:r>
+              <w:rPr>
+                <w:rStyle w:val="Hyperlink"/>
+                <w:rFonts w:ascii="Arial" w:hAnsi="Arial" w:cs="Arial"/>
+                <w:b/>
+                <w:bCs/>
+                <w:noProof/>
+              </w:rPr>
+              <w:t>ii. System boundaries</w:t>
+            </w:r>
+            <w:r>
+              <w:rPr>
+                <w:noProof/>
+                <w:webHidden/>
+              </w:rPr>
+              <w:tab/>
+            </w:r>
+            <w:r>
+              <w:rPr>
+                <w:noProof/>
+                <w:webHidden/>
+              </w:rPr>
+              <w:fldChar w:fldCharType="begin"/>
+            </w:r>
+            <w:r>
+              <w:rPr>
+                <w:noProof/>
+                <w:webHidden/>
+              </w:rPr>
+              <w:instrText xml:space="preserve"> PAGEREF _Toc226899729 \h </w:instrText>
+            </w:r>
+            <w:r>
+              <w:rPr>
+                <w:noProof/>
+                <w:webHidden/>
+              </w:rPr>
+            </w:r>
+            <w:r>
+              <w:rPr>
+                <w:noProof/>
+                <w:webHidden/>
+              </w:rPr>
+              <w:fldChar w:fldCharType="separate"/>
+            </w:r>
+            <w:r>
+              <w:rPr>
+                <w:noProof/>
+                <w:webHidden/>
+              </w:rPr>
+              <w:t>5</w:t>
+            </w:r>
+            <w:r>
+              <w:rPr>
+                <w:noProof/>
+                <w:webHidden/>
+              </w:rPr>
+              <w:fldChar w:fldCharType="end"/>
+            </w:r>
+          </w:hyperlink>
+        </w:p>
+        <w:p>
+          <w:pPr>
+            <w:pStyle w:val="TOC3"/>
+            <w:tabs>
+              <w:tab w:val="right" w:leader="dot" w:pos="9350"/>
+            </w:tabs>
+            <w:rPr>
+              <w:noProof/>
+              <w:lang w:val="en-US" w:eastAsia="en-US"/>
+            </w:rPr>
+          </w:pPr>
+          <w:hyperlink w:anchor="_Toc226899730" w:history="1">
+            <w:r>
+              <w:rPr>
+                <w:rStyle w:val="Hyperlink"/>
+                <w:rFonts w:ascii="Arial" w:hAnsi="Arial" w:cs="Arial"/>
+                <w:b/>
+                <w:bCs/>
+                <w:noProof/>
+              </w:rPr>
+              <w:t>iii. Assumptions</w:t>
+            </w:r>
+            <w:r>
+              <w:rPr>
+                <w:noProof/>
+                <w:webHidden/>
+              </w:rPr>
+              <w:tab/>
+            </w:r>
+            <w:r>
+              <w:rPr>
+                <w:noProof/>
+                <w:webHidden/>
+              </w:rPr>
+              <w:fldChar w:fldCharType="begin"/>
+            </w:r>
+            <w:r>
+              <w:rPr>
+                <w:noProof/>
+                <w:webHidden/>
+              </w:rPr>
+              <w:instrText xml:space="preserve"> PAGEREF _Toc226899730 \h </w:instrText>
+            </w:r>
+            <w:r>
+              <w:rPr>
+                <w:noProof/>
+                <w:webHidden/>
+              </w:rPr>
+            </w:r>
+            <w:r>
+              <w:rPr>
+                <w:noProof/>
+                <w:webHidden/>
+              </w:rPr>
+              <w:fldChar w:fldCharType="separate"/>
+            </w:r>
+            <w:r>
+              <w:rPr>
+                <w:noProof/>
+                <w:webHidden/>
+              </w:rPr>
+              <w:t>5</w:t>
             </w:r>
             <w:r>
               <w:rPr>
@@ -618,7 +1192,7 @@
               <w:lang w:val="en-US" w:eastAsia="en-US"/>
             </w:rPr>
           </w:pPr>
-          <w:hyperlink w:anchor="_Toc226030423" w:history="1">
+          <w:hyperlink w:anchor="_Toc226899731" w:history="1">
             <w:r>
               <w:rPr>
                 <w:rStyle w:val="Hyperlink"/>
@@ -665,7 +1239,7 @@
                 <w:noProof/>
                 <w:webHidden/>
               </w:rPr>
-              <w:instrText xml:space="preserve"> PAGEREF _Toc226030423 \h </w:instrText>
+              <w:instrText xml:space="preserve"> PAGEREF _Toc226899731 \h </w:instrText>
             </w:r>
             <w:r>
               <w:rPr>
@@ -685,7 +1259,7 @@
                 <w:noProof/>
                 <w:webHidden/>
               </w:rPr>
-              <w:t>3</w:t>
+              <w:t>6</w:t>
             </w:r>
             <w:r>
               <w:rPr>
@@ -707,7 +1281,7 @@
               <w:lang w:val="en-US" w:eastAsia="en-US"/>
             </w:rPr>
           </w:pPr>
-          <w:hyperlink w:anchor="_Toc226030424" w:history="1">
+          <w:hyperlink w:anchor="_Toc226899732" w:history="1">
             <w:r>
               <w:rPr>
                 <w:rStyle w:val="Hyperlink"/>
@@ -716,7 +1290,7 @@
                 <w:bCs/>
                 <w:noProof/>
               </w:rPr>
-              <w:t>3.1. Problem statement</w:t>
+              <w:t>3.1. Requirement Analysis</w:t>
             </w:r>
             <w:r>
               <w:rPr>
@@ -737,7 +1311,7 @@
                 <w:noProof/>
                 <w:webHidden/>
               </w:rPr>
-              <w:instrText xml:space="preserve"> PAGEREF _Toc226030424 \h </w:instrText>
+              <w:instrText xml:space="preserve"> PAGEREF _Toc226899732 \h </w:instrText>
             </w:r>
             <w:r>
               <w:rPr>
@@ -757,79 +1331,7 @@
                 <w:noProof/>
                 <w:webHidden/>
               </w:rPr>
-              <w:t>3</w:t>
-            </w:r>
-            <w:r>
-              <w:rPr>
-                <w:noProof/>
-                <w:webHidden/>
-              </w:rPr>
-              <w:fldChar w:fldCharType="end"/>
-            </w:r>
-          </w:hyperlink>
-        </w:p>
-        <w:p>
-          <w:pPr>
-            <w:pStyle w:val="TOC2"/>
-            <w:tabs>
-              <w:tab w:val="right" w:leader="dot" w:pos="9350"/>
-            </w:tabs>
-            <w:rPr>
-              <w:noProof/>
-              <w:lang w:val="en-US" w:eastAsia="en-US"/>
-            </w:rPr>
-          </w:pPr>
-          <w:hyperlink w:anchor="_Toc226030425" w:history="1">
-            <w:r>
-              <w:rPr>
-                <w:rStyle w:val="Hyperlink"/>
-                <w:rFonts w:ascii="Arial" w:hAnsi="Arial" w:cs="Arial"/>
-                <w:b/>
-                <w:bCs/>
-                <w:noProof/>
-              </w:rPr>
-              <w:t>3.2. Requirement Analysis</w:t>
-            </w:r>
-            <w:r>
-              <w:rPr>
-                <w:noProof/>
-                <w:webHidden/>
-              </w:rPr>
-              <w:tab/>
-            </w:r>
-            <w:r>
-              <w:rPr>
-                <w:noProof/>
-                <w:webHidden/>
-              </w:rPr>
-              <w:fldChar w:fldCharType="begin"/>
-            </w:r>
-            <w:r>
-              <w:rPr>
-                <w:noProof/>
-                <w:webHidden/>
-              </w:rPr>
-              <w:instrText xml:space="preserve"> PAGEREF _Toc226030425 \h </w:instrText>
-            </w:r>
-            <w:r>
-              <w:rPr>
-                <w:noProof/>
-                <w:webHidden/>
-              </w:rPr>
-            </w:r>
-            <w:r>
-              <w:rPr>
-                <w:noProof/>
-                <w:webHidden/>
-              </w:rPr>
-              <w:fldChar w:fldCharType="separate"/>
-            </w:r>
-            <w:r>
-              <w:rPr>
-                <w:noProof/>
-                <w:webHidden/>
-              </w:rPr>
-              <w:t>4</w:t>
+              <w:t>6</w:t>
             </w:r>
             <w:r>
               <w:rPr>
@@ -851,7 +1353,7 @@
               <w:lang w:val="en-US" w:eastAsia="en-US"/>
             </w:rPr>
           </w:pPr>
-          <w:hyperlink w:anchor="_Toc226030426" w:history="1">
+          <w:hyperlink w:anchor="_Toc226899733" w:history="1">
             <w:r>
               <w:rPr>
                 <w:rStyle w:val="Hyperlink"/>
@@ -881,7 +1383,7 @@
                 <w:noProof/>
                 <w:webHidden/>
               </w:rPr>
-              <w:instrText xml:space="preserve"> PAGEREF _Toc226030426 \h </w:instrText>
+              <w:instrText xml:space="preserve"> PAGEREF _Toc226899733 \h </w:instrText>
             </w:r>
             <w:r>
               <w:rPr>
@@ -901,7 +1403,7 @@
                 <w:noProof/>
                 <w:webHidden/>
               </w:rPr>
-              <w:t>4</w:t>
+              <w:t>6</w:t>
             </w:r>
             <w:r>
               <w:rPr>
@@ -923,7 +1425,7 @@
               <w:lang w:val="en-US" w:eastAsia="en-US"/>
             </w:rPr>
           </w:pPr>
-          <w:hyperlink w:anchor="_Toc226030427" w:history="1">
+          <w:hyperlink w:anchor="_Toc226899734" w:history="1">
             <w:r>
               <w:rPr>
                 <w:rStyle w:val="Hyperlink"/>
@@ -953,7 +1455,7 @@
                 <w:noProof/>
                 <w:webHidden/>
               </w:rPr>
-              <w:instrText xml:space="preserve"> PAGEREF _Toc226030427 \h </w:instrText>
+              <w:instrText xml:space="preserve"> PAGEREF _Toc226899734 \h </w:instrText>
             </w:r>
             <w:r>
               <w:rPr>
@@ -973,7 +1475,7 @@
                 <w:noProof/>
                 <w:webHidden/>
               </w:rPr>
-              <w:t>5</w:t>
+              <w:t>6</w:t>
             </w:r>
             <w:r>
               <w:rPr>
@@ -995,7 +1497,7 @@
               <w:lang w:val="en-US" w:eastAsia="en-US"/>
             </w:rPr>
           </w:pPr>
-          <w:hyperlink w:anchor="_Toc226030428" w:history="1">
+          <w:hyperlink w:anchor="_Toc226899735" w:history="1">
             <w:r>
               <w:rPr>
                 <w:rStyle w:val="Hyperlink"/>
@@ -1025,7 +1527,7 @@
                 <w:noProof/>
                 <w:webHidden/>
               </w:rPr>
-              <w:instrText xml:space="preserve"> PAGEREF _Toc226030428 \h </w:instrText>
+              <w:instrText xml:space="preserve"> PAGEREF _Toc226899735 \h </w:instrText>
             </w:r>
             <w:r>
               <w:rPr>
@@ -1045,7 +1547,7 @@
                 <w:noProof/>
                 <w:webHidden/>
               </w:rPr>
-              <w:t>6</w:t>
+              <w:t>8</w:t>
             </w:r>
             <w:r>
               <w:rPr>
@@ -1068,7 +1570,7 @@
               <w:lang w:val="en-US" w:eastAsia="en-US"/>
             </w:rPr>
           </w:pPr>
-          <w:hyperlink w:anchor="_Toc226030429" w:history="1">
+          <w:hyperlink w:anchor="_Toc226899736" w:history="1">
             <w:r>
               <w:rPr>
                 <w:rStyle w:val="Hyperlink"/>
@@ -1115,7 +1617,7 @@
                 <w:noProof/>
                 <w:webHidden/>
               </w:rPr>
-              <w:instrText xml:space="preserve"> PAGEREF _Toc226030429 \h </w:instrText>
+              <w:instrText xml:space="preserve"> PAGEREF _Toc226899736 \h </w:instrText>
             </w:r>
             <w:r>
               <w:rPr>
@@ -1135,7 +1637,7 @@
                 <w:noProof/>
                 <w:webHidden/>
               </w:rPr>
-              <w:t>9</w:t>
+              <w:t>10</w:t>
             </w:r>
             <w:r>
               <w:rPr>
@@ -1158,7 +1660,7 @@
               <w:lang w:val="en-US" w:eastAsia="en-US"/>
             </w:rPr>
           </w:pPr>
-          <w:hyperlink w:anchor="_Toc226030430" w:history="1">
+          <w:hyperlink w:anchor="_Toc226899737" w:history="1">
             <w:r>
               <w:rPr>
                 <w:rStyle w:val="Hyperlink"/>
@@ -1205,7 +1707,7 @@
                 <w:noProof/>
                 <w:webHidden/>
               </w:rPr>
-              <w:instrText xml:space="preserve"> PAGEREF _Toc226030430 \h </w:instrText>
+              <w:instrText xml:space="preserve"> PAGEREF _Toc226899737 \h </w:instrText>
             </w:r>
             <w:r>
               <w:rPr>
@@ -1225,7 +1727,7 @@
                 <w:noProof/>
                 <w:webHidden/>
               </w:rPr>
-              <w:t>10</w:t>
+              <w:t>11</w:t>
             </w:r>
             <w:r>
               <w:rPr>
@@ -1248,7 +1750,7 @@
               <w:lang w:val="en-US" w:eastAsia="en-US"/>
             </w:rPr>
           </w:pPr>
-          <w:hyperlink w:anchor="_Toc226030431" w:history="1">
+          <w:hyperlink w:anchor="_Toc226899738" w:history="1">
             <w:r>
               <w:rPr>
                 <w:rStyle w:val="Hyperlink"/>
@@ -1295,7 +1797,7 @@
                 <w:noProof/>
                 <w:webHidden/>
               </w:rPr>
-              <w:instrText xml:space="preserve"> PAGEREF _Toc226030431 \h </w:instrText>
+              <w:instrText xml:space="preserve"> PAGEREF _Toc226899738 \h </w:instrText>
             </w:r>
             <w:r>
               <w:rPr>
@@ -1315,7 +1817,7 @@
                 <w:noProof/>
                 <w:webHidden/>
               </w:rPr>
-              <w:t>11</w:t>
+              <w:t>12</w:t>
             </w:r>
             <w:r>
               <w:rPr>
@@ -1338,7 +1840,7 @@
               <w:lang w:val="en-US" w:eastAsia="en-US"/>
             </w:rPr>
           </w:pPr>
-          <w:hyperlink w:anchor="_Toc226030432" w:history="1">
+          <w:hyperlink w:anchor="_Toc226899739" w:history="1">
             <w:r>
               <w:rPr>
                 <w:rStyle w:val="Hyperlink"/>
@@ -1385,7 +1887,7 @@
                 <w:noProof/>
                 <w:webHidden/>
               </w:rPr>
-              <w:instrText xml:space="preserve"> PAGEREF _Toc226030432 \h </w:instrText>
+              <w:instrText xml:space="preserve"> PAGEREF _Toc226899739 \h </w:instrText>
             </w:r>
             <w:r>
               <w:rPr>
@@ -1405,7 +1907,7 @@
                 <w:noProof/>
                 <w:webHidden/>
               </w:rPr>
-              <w:t>12</w:t>
+              <w:t>13</w:t>
             </w:r>
             <w:r>
               <w:rPr>
@@ -1427,7 +1929,7 @@
               <w:lang w:val="en-US" w:eastAsia="en-US"/>
             </w:rPr>
           </w:pPr>
-          <w:hyperlink w:anchor="_Toc226030433" w:history="1">
+          <w:hyperlink w:anchor="_Toc226899740" w:history="1">
             <w:r>
               <w:rPr>
                 <w:rStyle w:val="Hyperlink"/>
@@ -1457,7 +1959,7 @@
                 <w:noProof/>
                 <w:webHidden/>
               </w:rPr>
-              <w:instrText xml:space="preserve"> PAGEREF _Toc226030433 \h </w:instrText>
+              <w:instrText xml:space="preserve"> PAGEREF _Toc226899740 \h </w:instrText>
             </w:r>
             <w:r>
               <w:rPr>
@@ -1477,7 +1979,7 @@
                 <w:noProof/>
                 <w:webHidden/>
               </w:rPr>
-              <w:t>13</w:t>
+              <w:t>14</w:t>
             </w:r>
             <w:r>
               <w:rPr>
@@ -1537,7 +2039,7 @@
           <w:szCs w:val="32"/>
         </w:rPr>
       </w:pPr>
-      <w:bookmarkStart w:id="1" w:name="_Toc226030421"/>
+      <w:bookmarkStart w:id="1" w:name="_Toc226899721"/>
       <w:r>
         <w:rPr>
           <w:rFonts w:ascii="Arial" w:hAnsi="Arial" w:cs="Arial"/>
@@ -1565,21 +2067,7 @@
         <w:rPr>
           <w:rFonts w:ascii="Arial" w:hAnsi="Arial" w:cs="Arial"/>
         </w:rPr>
-        <w:t xml:space="preserve">Modern medium to large organisations </w:t>
-      </w:r>
-      <w:proofErr w:type="gramStart"/>
-      <w:r>
-        <w:rPr>
-          <w:rFonts w:ascii="Arial" w:hAnsi="Arial" w:cs="Arial"/>
-        </w:rPr>
-        <w:t>depend</w:t>
-      </w:r>
-      <w:proofErr w:type="gramEnd"/>
-      <w:r>
-        <w:rPr>
-          <w:rFonts w:ascii="Arial" w:hAnsi="Arial" w:cs="Arial"/>
-        </w:rPr>
-        <w:t xml:space="preserve"> on advanced software systems to manage operations, coordinate between departments, and support decision-making. However, these systems are often developed over time without proper design practices, leading to maintenance challenges, scalability issues, and increased long-term risks.</w:t>
+        <w:t>Modern medium to large organisations depend on advanced software systems to manage operations, coordinate between departments, and support decision-making. However, these systems are often developed over time without proper design practices, leading to maintenance challenges, scalability issues, and increased long-term risks.</w:t>
       </w:r>
     </w:p>
     <w:p>
@@ -1657,7 +2145,7 @@
           <w:szCs w:val="32"/>
         </w:rPr>
       </w:pPr>
-      <w:bookmarkStart w:id="2" w:name="_Toc226030422"/>
+      <w:bookmarkStart w:id="2" w:name="_Toc226899722"/>
       <w:r>
         <w:rPr>
           <w:rFonts w:ascii="Arial" w:hAnsi="Arial" w:cs="Arial"/>
@@ -1668,14 +2156,86 @@
           <w:szCs w:val="32"/>
         </w:rPr>
         <w:lastRenderedPageBreak/>
-        <w:t>Organisation Selection and Analysis</w:t>
+        <w:t>Organisational and System</w:t>
+      </w:r>
+      <w:r>
+        <w:rPr>
+          <w:rFonts w:ascii="Arial" w:hAnsi="Arial" w:cs="Arial"/>
+          <w:b/>
+          <w:bCs/>
+          <w:color w:val="EE0000"/>
+          <w:sz w:val="32"/>
+          <w:szCs w:val="32"/>
+        </w:rPr>
+        <w:t xml:space="preserve"> </w:t>
+      </w:r>
+      <w:r>
+        <w:rPr>
+          <w:rFonts w:ascii="Arial" w:hAnsi="Arial" w:cs="Arial"/>
+          <w:b/>
+          <w:bCs/>
+          <w:color w:val="EE0000"/>
+          <w:sz w:val="32"/>
+          <w:szCs w:val="32"/>
+        </w:rPr>
+        <w:t>Analysis</w:t>
       </w:r>
       <w:bookmarkEnd w:id="2"/>
     </w:p>
     <w:p>
       <w:pPr>
-        <w:spacing w:line="360" w:lineRule="auto"/>
+        <w:pStyle w:val="Heading2"/>
+        <w:spacing w:before="0" w:line="360" w:lineRule="auto"/>
         <w:ind w:left="284"/>
+        <w:rPr>
+          <w:rFonts w:ascii="Arial" w:hAnsi="Arial" w:cs="Arial"/>
+          <w:b/>
+          <w:bCs/>
+          <w:color w:val="EE0000"/>
+          <w:sz w:val="28"/>
+          <w:szCs w:val="28"/>
+        </w:rPr>
+      </w:pPr>
+      <w:bookmarkStart w:id="3" w:name="_Toc226899723"/>
+      <w:r>
+        <w:rPr>
+          <w:rFonts w:ascii="Arial" w:hAnsi="Arial" w:cs="Arial"/>
+          <w:b/>
+          <w:bCs/>
+          <w:color w:val="EE0000"/>
+          <w:sz w:val="28"/>
+          <w:szCs w:val="28"/>
+        </w:rPr>
+        <w:t>2</w:t>
+      </w:r>
+      <w:r>
+        <w:rPr>
+          <w:rFonts w:ascii="Arial" w:hAnsi="Arial" w:cs="Arial"/>
+          <w:b/>
+          <w:bCs/>
+          <w:color w:val="EE0000"/>
+          <w:sz w:val="28"/>
+          <w:szCs w:val="28"/>
+        </w:rPr>
+        <w:t xml:space="preserve">.1. </w:t>
+      </w:r>
+      <w:r>
+        <w:rPr>
+          <w:rFonts w:ascii="Arial" w:hAnsi="Arial" w:cs="Arial"/>
+          <w:b/>
+          <w:bCs/>
+          <w:color w:val="EE0000"/>
+          <w:sz w:val="28"/>
+          <w:szCs w:val="28"/>
+        </w:rPr>
+        <w:t>Overview of the selected organisation</w:t>
+      </w:r>
+      <w:bookmarkEnd w:id="3"/>
+    </w:p>
+    <w:p>
+      <w:pPr>
+        <w:spacing w:line="360" w:lineRule="auto"/>
+        <w:ind w:left="567"/>
         <w:jc w:val="both"/>
         <w:rPr>
           <w:rFonts w:ascii="Arial" w:hAnsi="Arial" w:cs="Arial"/>
@@ -1685,7 +2245,223 @@
         <w:rPr>
           <w:rFonts w:ascii="Arial" w:hAnsi="Arial" w:cs="Arial"/>
         </w:rPr>
-        <w:t>The selected organisation for this project is Auckland University of Technology (AUT), a well-established public university located in New Zealand. AUT is recognised as one of the country’s largest tertiary institutions, with 26,708 of enrolled students and over 4,046 staff members.</w:t>
+        <w:t>The selected organisation for this project is Auckland University of Technology (AUT), a prominent public university formally established in 2000 in New Zealand</w:t>
+      </w:r>
+      <w:r>
+        <w:rPr>
+          <w:rFonts w:ascii="Arial" w:hAnsi="Arial" w:cs="Arial"/>
+        </w:rPr>
+        <w:t xml:space="preserve">. AUT is recognised as one of </w:t>
+      </w:r>
+      <w:r>
+        <w:rPr>
+          <w:rFonts w:ascii="Arial" w:hAnsi="Arial" w:cs="Arial"/>
+        </w:rPr>
+        <w:t xml:space="preserve">the nation's </w:t>
+      </w:r>
+      <w:r>
+        <w:rPr>
+          <w:rFonts w:ascii="Arial" w:hAnsi="Arial" w:cs="Arial"/>
+        </w:rPr>
+        <w:t xml:space="preserve">largest tertiary institutions, </w:t>
+      </w:r>
+      <w:r>
+        <w:rPr>
+          <w:rFonts w:ascii="Arial" w:hAnsi="Arial" w:cs="Arial"/>
+        </w:rPr>
+        <w:t xml:space="preserve">with 26,708 enrolled domestic and international students and over 4,046 staff members </w:t>
+      </w:r>
+      <w:r>
+        <w:rPr>
+          <w:rFonts w:ascii="Arial" w:hAnsi="Arial" w:cs="Arial"/>
+        </w:rPr>
+        <w:t>in 2025</w:t>
+      </w:r>
+      <w:r>
+        <w:rPr>
+          <w:rFonts w:ascii="Arial" w:hAnsi="Arial" w:cs="Arial"/>
+        </w:rPr>
+        <w:t xml:space="preserve">. </w:t>
+      </w:r>
+      <w:r>
+        <w:rPr>
+          <w:rFonts w:ascii="Arial" w:hAnsi="Arial" w:cs="Arial"/>
+        </w:rPr>
+        <w:t xml:space="preserve">The university operates across multiple campuses and delivers a wide range of undergraduate and postgraduate programmes, </w:t>
+      </w:r>
+      <w:r>
+        <w:rPr>
+          <w:rFonts w:ascii="Arial" w:hAnsi="Arial" w:cs="Arial"/>
+        </w:rPr>
+        <w:t>reflecting a high degree of operational scale</w:t>
+      </w:r>
+      <w:r>
+        <w:rPr>
+          <w:rFonts w:ascii="Arial" w:hAnsi="Arial" w:cs="Arial"/>
+        </w:rPr>
+        <w:t xml:space="preserve"> and complexity</w:t>
+      </w:r>
+      <w:r>
+        <w:rPr>
+          <w:rFonts w:ascii="Arial" w:hAnsi="Arial" w:cs="Arial"/>
+        </w:rPr>
+        <w:t xml:space="preserve"> (</w:t>
+      </w:r>
+      <w:r>
+        <w:rPr>
+          <w:rFonts w:ascii="Arial" w:hAnsi="Arial" w:cs="Arial"/>
+        </w:rPr>
+        <w:t>AUT</w:t>
+      </w:r>
+      <w:r>
+        <w:rPr>
+          <w:rFonts w:ascii="Arial" w:hAnsi="Arial" w:cs="Arial"/>
+        </w:rPr>
+        <w:t>,</w:t>
+      </w:r>
+      <w:r>
+        <w:rPr>
+          <w:rFonts w:ascii="Arial" w:hAnsi="Arial" w:cs="Arial"/>
+        </w:rPr>
+        <w:t xml:space="preserve"> n.d.</w:t>
+      </w:r>
+      <w:r>
+        <w:rPr>
+          <w:rFonts w:ascii="Arial" w:hAnsi="Arial" w:cs="Arial"/>
+        </w:rPr>
+        <w:t>-a</w:t>
+      </w:r>
+      <w:r>
+        <w:rPr>
+          <w:rFonts w:ascii="Arial" w:hAnsi="Arial" w:cs="Arial"/>
+        </w:rPr>
+        <w:t>)</w:t>
+      </w:r>
+      <w:r>
+        <w:rPr>
+          <w:rFonts w:ascii="Arial" w:hAnsi="Arial" w:cs="Arial"/>
+        </w:rPr>
+        <w:t>.</w:t>
+      </w:r>
+    </w:p>
+    <w:p>
+      <w:pPr>
+        <w:pStyle w:val="Heading2"/>
+        <w:spacing w:before="0" w:line="360" w:lineRule="auto"/>
+        <w:ind w:left="284"/>
+        <w:rPr>
+          <w:rFonts w:ascii="Arial" w:hAnsi="Arial" w:cs="Arial"/>
+          <w:b/>
+          <w:bCs/>
+          <w:color w:val="EE0000"/>
+          <w:sz w:val="28"/>
+          <w:szCs w:val="28"/>
+        </w:rPr>
+      </w:pPr>
+      <w:bookmarkStart w:id="4" w:name="_Toc226899724"/>
+      <w:r>
+        <w:rPr>
+          <w:rFonts w:ascii="Arial" w:hAnsi="Arial" w:cs="Arial"/>
+          <w:b/>
+          <w:bCs/>
+          <w:color w:val="EE0000"/>
+          <w:sz w:val="28"/>
+          <w:szCs w:val="28"/>
+        </w:rPr>
+        <w:t>2</w:t>
+      </w:r>
+      <w:r>
+        <w:rPr>
+          <w:rFonts w:ascii="Arial" w:hAnsi="Arial" w:cs="Arial"/>
+          <w:b/>
+          <w:bCs/>
+          <w:color w:val="EE0000"/>
+          <w:sz w:val="28"/>
+          <w:szCs w:val="28"/>
+        </w:rPr>
+        <w:t>.</w:t>
+      </w:r>
+      <w:r>
+        <w:rPr>
+          <w:rFonts w:ascii="Arial" w:hAnsi="Arial" w:cs="Arial"/>
+          <w:b/>
+          <w:bCs/>
+          <w:color w:val="EE0000"/>
+          <w:sz w:val="28"/>
+          <w:szCs w:val="28"/>
+        </w:rPr>
+        <w:t>2</w:t>
+      </w:r>
+      <w:r>
+        <w:rPr>
+          <w:rFonts w:ascii="Arial" w:hAnsi="Arial" w:cs="Arial"/>
+          <w:b/>
+          <w:bCs/>
+          <w:color w:val="EE0000"/>
+          <w:sz w:val="28"/>
+          <w:szCs w:val="28"/>
+        </w:rPr>
+        <w:t xml:space="preserve">. </w:t>
+      </w:r>
+      <w:r>
+        <w:rPr>
+          <w:rFonts w:ascii="Arial" w:hAnsi="Arial" w:cs="Arial"/>
+          <w:b/>
+          <w:bCs/>
+          <w:color w:val="EE0000"/>
+          <w:sz w:val="28"/>
+          <w:szCs w:val="28"/>
+        </w:rPr>
+        <w:t>Departmental structure and responsibilities</w:t>
+      </w:r>
+      <w:bookmarkEnd w:id="4"/>
+    </w:p>
+    <w:p>
+      <w:pPr>
+        <w:spacing w:line="360" w:lineRule="auto"/>
+        <w:ind w:left="567"/>
+        <w:jc w:val="both"/>
+        <w:rPr>
+          <w:rFonts w:ascii="Arial" w:hAnsi="Arial" w:cs="Arial"/>
+        </w:rPr>
+      </w:pPr>
+      <w:r>
+        <w:rPr>
+          <w:rFonts w:ascii="Arial" w:hAnsi="Arial" w:cs="Arial"/>
+        </w:rPr>
+        <w:t>AUT has a well-established organisational structure consisting of multiple departments that support its academic and administrative functions</w:t>
+      </w:r>
+      <w:r>
+        <w:rPr>
+          <w:rFonts w:ascii="Arial" w:hAnsi="Arial" w:cs="Arial"/>
+        </w:rPr>
+        <w:t xml:space="preserve">, </w:t>
+      </w:r>
+      <w:r>
+        <w:rPr>
+          <w:rFonts w:ascii="Arial" w:hAnsi="Arial" w:cs="Arial"/>
+        </w:rPr>
+        <w:t>including but not limited to the following:</w:t>
+      </w:r>
+    </w:p>
+    <w:p>
+      <w:pPr>
+        <w:pStyle w:val="ListParagraph"/>
+        <w:numPr>
+          <w:ilvl w:val="0"/>
+          <w:numId w:val="7"/>
+        </w:numPr>
+        <w:spacing w:line="360" w:lineRule="auto"/>
+        <w:jc w:val="both"/>
+        <w:rPr>
+          <w:rFonts w:ascii="Arial" w:hAnsi="Arial" w:cs="Arial"/>
+        </w:rPr>
+      </w:pPr>
+      <w:r>
+        <w:rPr>
+          <w:rFonts w:ascii="Arial" w:hAnsi="Arial" w:cs="Arial"/>
+        </w:rPr>
+        <w:t>Academic Departments</w:t>
       </w:r>
       <w:r>
         <w:t xml:space="preserve"> </w:t>
@@ -1694,13 +2470,532 @@
         <w:rPr>
           <w:rFonts w:ascii="Arial" w:hAnsi="Arial" w:cs="Arial"/>
         </w:rPr>
-        <w:t>The university operates across multiple campuses and delivers a wide range of undergraduate and postgraduate programmes, demonstrating both its scale and operational complexity.</w:t>
-      </w:r>
-    </w:p>
-    <w:p>
-      <w:pPr>
-        <w:spacing w:line="360" w:lineRule="auto"/>
+        <w:t>(Faculties)</w:t>
+      </w:r>
+      <w:r>
+        <w:rPr>
+          <w:rFonts w:ascii="Arial" w:hAnsi="Arial" w:cs="Arial"/>
+        </w:rPr>
+        <w:t>: Responsible for course delivery, curriculum design, research activities, and maintaining academic standards</w:t>
+      </w:r>
+      <w:r>
+        <w:rPr>
+          <w:rFonts w:ascii="Arial" w:hAnsi="Arial" w:cs="Arial"/>
+        </w:rPr>
+        <w:t xml:space="preserve"> </w:t>
+      </w:r>
+      <w:r>
+        <w:rPr>
+          <w:rFonts w:ascii="Arial" w:hAnsi="Arial" w:cs="Arial"/>
+        </w:rPr>
+        <w:t>across</w:t>
+      </w:r>
+      <w:r>
+        <w:rPr>
+          <w:rFonts w:ascii="Arial" w:hAnsi="Arial" w:cs="Arial"/>
+        </w:rPr>
+        <w:t xml:space="preserve"> 5</w:t>
+      </w:r>
+      <w:r>
+        <w:rPr>
+          <w:rFonts w:ascii="Arial" w:hAnsi="Arial" w:cs="Arial"/>
+        </w:rPr>
+        <w:t xml:space="preserve"> faculties and 15 schools </w:t>
+      </w:r>
+      <w:r>
+        <w:rPr>
+          <w:rFonts w:ascii="Arial" w:hAnsi="Arial" w:cs="Arial"/>
+        </w:rPr>
+        <w:t xml:space="preserve">(AUT, </w:t>
+      </w:r>
+      <w:r>
+        <w:rPr>
+          <w:rFonts w:ascii="Arial" w:hAnsi="Arial" w:cs="Arial"/>
+        </w:rPr>
+        <w:t>n.d.</w:t>
+      </w:r>
+      <w:r>
+        <w:rPr>
+          <w:rFonts w:ascii="Arial" w:hAnsi="Arial" w:cs="Arial"/>
+        </w:rPr>
+        <w:t>-b</w:t>
+      </w:r>
+      <w:r>
+        <w:rPr>
+          <w:rFonts w:ascii="Arial" w:hAnsi="Arial" w:cs="Arial"/>
+        </w:rPr>
+        <w:t>)</w:t>
+      </w:r>
+      <w:r>
+        <w:rPr>
+          <w:rFonts w:ascii="Arial" w:hAnsi="Arial" w:cs="Arial"/>
+        </w:rPr>
+        <w:t>.</w:t>
+      </w:r>
+    </w:p>
+    <w:p>
+      <w:pPr>
+        <w:pStyle w:val="ListParagraph"/>
+        <w:numPr>
+          <w:ilvl w:val="0"/>
+          <w:numId w:val="7"/>
+        </w:numPr>
+        <w:spacing w:line="360" w:lineRule="auto"/>
+        <w:jc w:val="both"/>
+        <w:rPr>
+          <w:rFonts w:ascii="Arial" w:hAnsi="Arial" w:cs="Arial"/>
+        </w:rPr>
+      </w:pPr>
+      <w:r>
+        <w:rPr>
+          <w:rFonts w:ascii="Arial" w:hAnsi="Arial" w:cs="Arial"/>
+        </w:rPr>
+        <w:t>Student Services</w:t>
+      </w:r>
+      <w:r>
+        <w:rPr>
+          <w:rFonts w:ascii="Arial" w:hAnsi="Arial" w:cs="Arial"/>
+        </w:rPr>
+        <w:t xml:space="preserve"> </w:t>
+      </w:r>
+      <w:r>
+        <w:rPr>
+          <w:rFonts w:ascii="Arial" w:hAnsi="Arial" w:cs="Arial"/>
+        </w:rPr>
+        <w:t>Department</w:t>
+      </w:r>
+      <w:r>
+        <w:rPr>
+          <w:rFonts w:ascii="Arial" w:hAnsi="Arial" w:cs="Arial"/>
+        </w:rPr>
+        <w:t xml:space="preserve">: Provides student support including enrolment assistance, </w:t>
+      </w:r>
+      <w:r>
+        <w:rPr>
+          <w:rFonts w:ascii="Arial" w:hAnsi="Arial" w:cs="Arial"/>
+        </w:rPr>
+        <w:t xml:space="preserve">academic advice, counselling, and career </w:t>
+      </w:r>
+      <w:r>
+        <w:rPr>
+          <w:rFonts w:ascii="Arial" w:hAnsi="Arial" w:cs="Arial"/>
+        </w:rPr>
+        <w:t>support</w:t>
+      </w:r>
+      <w:r>
+        <w:rPr>
+          <w:rFonts w:ascii="Arial" w:hAnsi="Arial" w:cs="Arial"/>
+        </w:rPr>
+        <w:t xml:space="preserve"> (AUT, </w:t>
+      </w:r>
+      <w:r>
+        <w:rPr>
+          <w:rFonts w:ascii="Arial" w:hAnsi="Arial" w:cs="Arial"/>
+        </w:rPr>
+        <w:t>n.d.</w:t>
+      </w:r>
+      <w:r>
+        <w:rPr>
+          <w:rFonts w:ascii="Arial" w:hAnsi="Arial" w:cs="Arial"/>
+        </w:rPr>
+        <w:t>-c</w:t>
+      </w:r>
+      <w:r>
+        <w:rPr>
+          <w:rFonts w:ascii="Arial" w:hAnsi="Arial" w:cs="Arial"/>
+        </w:rPr>
+        <w:t>)</w:t>
+      </w:r>
+      <w:r>
+        <w:rPr>
+          <w:rFonts w:ascii="Arial" w:hAnsi="Arial" w:cs="Arial"/>
+        </w:rPr>
+        <w:t>.</w:t>
+      </w:r>
+    </w:p>
+    <w:p>
+      <w:pPr>
+        <w:pStyle w:val="ListParagraph"/>
+        <w:numPr>
+          <w:ilvl w:val="0"/>
+          <w:numId w:val="7"/>
+        </w:numPr>
+        <w:spacing w:line="360" w:lineRule="auto"/>
+        <w:jc w:val="both"/>
+        <w:rPr>
+          <w:rFonts w:ascii="Arial" w:hAnsi="Arial" w:cs="Arial"/>
+        </w:rPr>
+      </w:pPr>
+      <w:r>
+        <w:rPr>
+          <w:rFonts w:ascii="Arial" w:hAnsi="Arial" w:cs="Arial"/>
+        </w:rPr>
+        <w:t>Academic Registry</w:t>
+      </w:r>
+      <w:r>
+        <w:rPr>
+          <w:rFonts w:ascii="Arial" w:hAnsi="Arial" w:cs="Arial"/>
+        </w:rPr>
+        <w:t xml:space="preserve"> </w:t>
+      </w:r>
+      <w:r>
+        <w:rPr>
+          <w:rFonts w:ascii="Arial" w:hAnsi="Arial" w:cs="Arial"/>
+        </w:rPr>
+        <w:t>Department</w:t>
+      </w:r>
+      <w:r>
+        <w:rPr>
+          <w:rFonts w:ascii="Arial" w:hAnsi="Arial" w:cs="Arial"/>
+        </w:rPr>
+        <w:t>: Manages</w:t>
+      </w:r>
+      <w:r>
+        <w:rPr>
+          <w:rFonts w:ascii="Arial" w:hAnsi="Arial" w:cs="Arial"/>
+        </w:rPr>
+        <w:t xml:space="preserve"> </w:t>
+      </w:r>
+      <w:r>
+        <w:rPr>
+          <w:rFonts w:ascii="Arial" w:hAnsi="Arial" w:cs="Arial"/>
+        </w:rPr>
+        <w:t>enrolments, course registration, academic records, timetables, and graduation processes</w:t>
+      </w:r>
+      <w:r>
+        <w:rPr>
+          <w:rFonts w:ascii="Arial" w:hAnsi="Arial" w:cs="Arial"/>
+        </w:rPr>
+        <w:t xml:space="preserve"> (AUT, </w:t>
+      </w:r>
+      <w:r>
+        <w:rPr>
+          <w:rFonts w:ascii="Arial" w:hAnsi="Arial" w:cs="Arial"/>
+        </w:rPr>
+        <w:t>n.d.</w:t>
+      </w:r>
+      <w:r>
+        <w:rPr>
+          <w:rFonts w:ascii="Arial" w:hAnsi="Arial" w:cs="Arial"/>
+        </w:rPr>
+        <w:t>-d</w:t>
+      </w:r>
+      <w:r>
+        <w:rPr>
+          <w:rFonts w:ascii="Arial" w:hAnsi="Arial" w:cs="Arial"/>
+        </w:rPr>
+        <w:t>)</w:t>
+      </w:r>
+      <w:r>
+        <w:rPr>
+          <w:rFonts w:ascii="Arial" w:hAnsi="Arial" w:cs="Arial"/>
+        </w:rPr>
+        <w:t>.</w:t>
+      </w:r>
+    </w:p>
+    <w:p>
+      <w:pPr>
+        <w:pStyle w:val="ListParagraph"/>
+        <w:numPr>
+          <w:ilvl w:val="0"/>
+          <w:numId w:val="7"/>
+        </w:numPr>
+        <w:spacing w:line="360" w:lineRule="auto"/>
+        <w:jc w:val="both"/>
+        <w:rPr>
+          <w:rFonts w:ascii="Arial" w:hAnsi="Arial" w:cs="Arial"/>
+        </w:rPr>
+      </w:pPr>
+      <w:r>
+        <w:rPr>
+          <w:rFonts w:ascii="Arial" w:hAnsi="Arial" w:cs="Arial"/>
+        </w:rPr>
+        <w:t>IT</w:t>
+      </w:r>
+      <w:r>
+        <w:rPr>
+          <w:rFonts w:ascii="Arial" w:hAnsi="Arial" w:cs="Arial"/>
+        </w:rPr>
+        <w:t xml:space="preserve"> </w:t>
+      </w:r>
+      <w:r>
+        <w:rPr>
+          <w:rFonts w:ascii="Arial" w:hAnsi="Arial" w:cs="Arial"/>
+        </w:rPr>
+        <w:t>Department</w:t>
+      </w:r>
+      <w:r>
+        <w:rPr>
+          <w:rFonts w:ascii="Arial" w:hAnsi="Arial" w:cs="Arial"/>
+        </w:rPr>
+        <w:t xml:space="preserve">: </w:t>
+      </w:r>
+      <w:r>
+        <w:rPr>
+          <w:rFonts w:ascii="Arial" w:hAnsi="Arial" w:cs="Arial"/>
+        </w:rPr>
+        <w:t xml:space="preserve">Responsible for managing university-wide digital infrastructure and services, including network access, user authentication, email systems, cybersecurity, printing services, and technical support </w:t>
+      </w:r>
+      <w:r>
+        <w:rPr>
+          <w:rFonts w:ascii="Arial" w:hAnsi="Arial" w:cs="Arial"/>
+        </w:rPr>
+        <w:t xml:space="preserve">(AUT, </w:t>
+      </w:r>
+      <w:r>
+        <w:rPr>
+          <w:rFonts w:ascii="Arial" w:hAnsi="Arial" w:cs="Arial"/>
+        </w:rPr>
+        <w:t>n.d.-e</w:t>
+      </w:r>
+      <w:r>
+        <w:rPr>
+          <w:rFonts w:ascii="Arial" w:hAnsi="Arial" w:cs="Arial"/>
+        </w:rPr>
+        <w:t>)</w:t>
+      </w:r>
+      <w:r>
+        <w:rPr>
+          <w:rFonts w:ascii="Arial" w:hAnsi="Arial" w:cs="Arial"/>
+        </w:rPr>
+        <w:t>.</w:t>
+      </w:r>
+    </w:p>
+    <w:p>
+      <w:pPr>
+        <w:pStyle w:val="ListParagraph"/>
+        <w:numPr>
+          <w:ilvl w:val="0"/>
+          <w:numId w:val="7"/>
+        </w:numPr>
+        <w:spacing w:line="360" w:lineRule="auto"/>
+        <w:jc w:val="both"/>
+        <w:rPr>
+          <w:rFonts w:ascii="Arial" w:hAnsi="Arial" w:cs="Arial"/>
+        </w:rPr>
+      </w:pPr>
+      <w:r>
+        <w:rPr>
+          <w:rFonts w:ascii="Arial" w:hAnsi="Arial" w:cs="Arial"/>
+        </w:rPr>
+        <w:t xml:space="preserve">Finance Department: </w:t>
+      </w:r>
+      <w:r>
+        <w:rPr>
+          <w:rFonts w:ascii="Arial" w:hAnsi="Arial" w:cs="Arial"/>
+        </w:rPr>
+        <w:t>Responsible for managing institutional budgeting, financial planning, tuition fee administration, procurement support, financial reporting, and allocation of university resources</w:t>
+      </w:r>
+      <w:r>
+        <w:rPr>
+          <w:rFonts w:ascii="Arial" w:hAnsi="Arial" w:cs="Arial"/>
+        </w:rPr>
+        <w:t xml:space="preserve"> (AUT, </w:t>
+      </w:r>
+      <w:r>
+        <w:rPr>
+          <w:rFonts w:ascii="Arial" w:hAnsi="Arial" w:cs="Arial"/>
+        </w:rPr>
+        <w:t>n.d.-f</w:t>
+      </w:r>
+      <w:r>
+        <w:rPr>
+          <w:rFonts w:ascii="Arial" w:hAnsi="Arial" w:cs="Arial"/>
+        </w:rPr>
+        <w:t>)</w:t>
+      </w:r>
+      <w:r>
+        <w:rPr>
+          <w:rFonts w:ascii="Arial" w:hAnsi="Arial" w:cs="Arial"/>
+        </w:rPr>
+        <w:t>.</w:t>
+      </w:r>
+    </w:p>
+    <w:p>
+      <w:pPr>
+        <w:spacing w:line="360" w:lineRule="auto"/>
+        <w:ind w:left="567"/>
+        <w:jc w:val="both"/>
+        <w:rPr>
+          <w:rFonts w:ascii="Arial" w:hAnsi="Arial" w:cs="Arial"/>
+        </w:rPr>
+      </w:pPr>
+      <w:r>
+        <w:rPr>
+          <w:rFonts w:ascii="Arial" w:hAnsi="Arial" w:cs="Arial"/>
+        </w:rPr>
+        <w:t>The presence of these distinct functional areas requires coordinated operations supported by integrated information systems</w:t>
+      </w:r>
+      <w:r>
+        <w:rPr>
+          <w:rFonts w:ascii="Arial" w:hAnsi="Arial" w:cs="Arial"/>
+        </w:rPr>
+        <w:t xml:space="preserve">, such as the </w:t>
+      </w:r>
+      <w:r>
+        <w:rPr>
+          <w:rFonts w:ascii="Arial" w:hAnsi="Arial" w:cs="Arial"/>
+        </w:rPr>
+        <w:t xml:space="preserve">Student Enrolment and </w:t>
+      </w:r>
+      <w:r>
+        <w:rPr>
+          <w:rFonts w:ascii="Arial" w:hAnsi="Arial" w:cs="Arial"/>
+        </w:rPr>
+        <w:lastRenderedPageBreak/>
+        <w:t>Course Management System</w:t>
+      </w:r>
+      <w:r>
+        <w:rPr>
+          <w:rFonts w:ascii="Arial" w:hAnsi="Arial" w:cs="Arial"/>
+        </w:rPr>
+        <w:t xml:space="preserve">, </w:t>
+      </w:r>
+      <w:r>
+        <w:rPr>
+          <w:rFonts w:ascii="Arial" w:hAnsi="Arial" w:cs="Arial"/>
+        </w:rPr>
+        <w:t>Finance and Payment System</w:t>
+      </w:r>
+      <w:r>
+        <w:rPr>
+          <w:rFonts w:ascii="Arial" w:hAnsi="Arial" w:cs="Arial"/>
+        </w:rPr>
+        <w:t xml:space="preserve">, and </w:t>
+      </w:r>
+      <w:r>
+        <w:rPr>
+          <w:rFonts w:ascii="Arial" w:hAnsi="Arial" w:cs="Arial"/>
+        </w:rPr>
+        <w:t>Library Management System</w:t>
+      </w:r>
+      <w:r>
+        <w:rPr>
+          <w:rFonts w:ascii="Arial" w:hAnsi="Arial" w:cs="Arial"/>
+        </w:rPr>
+        <w:t>.</w:t>
+      </w:r>
+    </w:p>
+    <w:p>
+      <w:pPr>
+        <w:pStyle w:val="Heading2"/>
+        <w:spacing w:before="0" w:line="360" w:lineRule="auto"/>
         <w:ind w:left="284"/>
+        <w:rPr>
+          <w:rFonts w:ascii="Arial" w:hAnsi="Arial" w:cs="Arial"/>
+          <w:b/>
+          <w:bCs/>
+          <w:color w:val="EE0000"/>
+          <w:sz w:val="28"/>
+          <w:szCs w:val="28"/>
+        </w:rPr>
+      </w:pPr>
+      <w:bookmarkStart w:id="5" w:name="_Toc226899725"/>
+      <w:r>
+        <w:rPr>
+          <w:rFonts w:ascii="Arial" w:hAnsi="Arial" w:cs="Arial"/>
+          <w:b/>
+          <w:bCs/>
+          <w:color w:val="EE0000"/>
+          <w:sz w:val="28"/>
+          <w:szCs w:val="28"/>
+        </w:rPr>
+        <w:t>2</w:t>
+      </w:r>
+      <w:r>
+        <w:rPr>
+          <w:rFonts w:ascii="Arial" w:hAnsi="Arial" w:cs="Arial"/>
+          <w:b/>
+          <w:bCs/>
+          <w:color w:val="EE0000"/>
+          <w:sz w:val="28"/>
+          <w:szCs w:val="28"/>
+        </w:rPr>
+        <w:t>.</w:t>
+      </w:r>
+      <w:r>
+        <w:rPr>
+          <w:rFonts w:ascii="Arial" w:hAnsi="Arial" w:cs="Arial"/>
+          <w:b/>
+          <w:bCs/>
+          <w:color w:val="EE0000"/>
+          <w:sz w:val="28"/>
+          <w:szCs w:val="28"/>
+        </w:rPr>
+        <w:t>3</w:t>
+      </w:r>
+      <w:r>
+        <w:rPr>
+          <w:rFonts w:ascii="Arial" w:hAnsi="Arial" w:cs="Arial"/>
+          <w:b/>
+          <w:bCs/>
+          <w:color w:val="EE0000"/>
+          <w:sz w:val="28"/>
+          <w:szCs w:val="28"/>
+        </w:rPr>
+        <w:t xml:space="preserve">. </w:t>
+      </w:r>
+      <w:r>
+        <w:rPr>
+          <w:rFonts w:ascii="Arial" w:hAnsi="Arial" w:cs="Arial"/>
+          <w:b/>
+          <w:bCs/>
+          <w:color w:val="EE0000"/>
+          <w:sz w:val="28"/>
+          <w:szCs w:val="28"/>
+        </w:rPr>
+        <w:t xml:space="preserve">Stakeholders and </w:t>
+      </w:r>
+      <w:r>
+        <w:rPr>
+          <w:rFonts w:ascii="Arial" w:hAnsi="Arial" w:cs="Arial"/>
+          <w:b/>
+          <w:bCs/>
+          <w:color w:val="EE0000"/>
+          <w:sz w:val="28"/>
+          <w:szCs w:val="28"/>
+        </w:rPr>
+        <w:t>u</w:t>
+      </w:r>
+      <w:r>
+        <w:rPr>
+          <w:rFonts w:ascii="Arial" w:hAnsi="Arial" w:cs="Arial"/>
+          <w:b/>
+          <w:bCs/>
+          <w:color w:val="EE0000"/>
+          <w:sz w:val="28"/>
+          <w:szCs w:val="28"/>
+        </w:rPr>
+        <w:t xml:space="preserve">ser </w:t>
+      </w:r>
+      <w:r>
+        <w:rPr>
+          <w:rFonts w:ascii="Arial" w:hAnsi="Arial" w:cs="Arial"/>
+          <w:b/>
+          <w:bCs/>
+          <w:color w:val="EE0000"/>
+          <w:sz w:val="28"/>
+          <w:szCs w:val="28"/>
+        </w:rPr>
+        <w:t>r</w:t>
+      </w:r>
+      <w:r>
+        <w:rPr>
+          <w:rFonts w:ascii="Arial" w:hAnsi="Arial" w:cs="Arial"/>
+          <w:b/>
+          <w:bCs/>
+          <w:color w:val="EE0000"/>
+          <w:sz w:val="28"/>
+          <w:szCs w:val="28"/>
+        </w:rPr>
+        <w:t>oles</w:t>
+      </w:r>
+      <w:bookmarkEnd w:id="5"/>
+    </w:p>
+    <w:p>
+      <w:pPr>
+        <w:spacing w:line="360" w:lineRule="auto"/>
+        <w:ind w:left="567"/>
         <w:jc w:val="both"/>
         <w:rPr>
           <w:rFonts w:ascii="Arial" w:hAnsi="Arial" w:cs="Arial"/>
@@ -1710,7 +3005,333 @@
         <w:rPr>
           <w:rFonts w:ascii="Arial" w:hAnsi="Arial" w:cs="Arial"/>
         </w:rPr>
-        <w:t>AUT has a well-established organisational structure consisting of multiple departments that support its academic and administrative functions. These include academic faculties responsible for teaching and course delivery, administrative units managing student records and enrolment processes, financial services handling tuition fees and payments, and information technology services maintaining system infrastructure.</w:t>
+        <w:t>The</w:t>
+      </w:r>
+      <w:r>
+        <w:rPr>
+          <w:rFonts w:ascii="Arial" w:hAnsi="Arial" w:cs="Arial"/>
+        </w:rPr>
+        <w:t>se</w:t>
+      </w:r>
+      <w:r>
+        <w:rPr>
+          <w:rFonts w:ascii="Arial" w:hAnsi="Arial" w:cs="Arial"/>
+        </w:rPr>
+        <w:t xml:space="preserve"> system</w:t>
+      </w:r>
+      <w:r>
+        <w:rPr>
+          <w:rFonts w:ascii="Arial" w:hAnsi="Arial" w:cs="Arial"/>
+        </w:rPr>
+        <w:t>s</w:t>
+      </w:r>
+      <w:r>
+        <w:rPr>
+          <w:rFonts w:ascii="Arial" w:hAnsi="Arial" w:cs="Arial"/>
+        </w:rPr>
+        <w:t xml:space="preserve"> involve multiple stakeholders with distinct roles and responsibilities</w:t>
+      </w:r>
+      <w:r>
+        <w:rPr>
+          <w:rFonts w:ascii="Arial" w:hAnsi="Arial" w:cs="Arial"/>
+        </w:rPr>
+        <w:t xml:space="preserve"> such as</w:t>
+      </w:r>
+      <w:r>
+        <w:rPr>
+          <w:rFonts w:ascii="Arial" w:hAnsi="Arial" w:cs="Arial"/>
+        </w:rPr>
+        <w:t>:</w:t>
+      </w:r>
+    </w:p>
+    <w:p>
+      <w:pPr>
+        <w:pStyle w:val="ListParagraph"/>
+        <w:numPr>
+          <w:ilvl w:val="0"/>
+          <w:numId w:val="8"/>
+        </w:numPr>
+        <w:spacing w:line="360" w:lineRule="auto"/>
+        <w:jc w:val="both"/>
+        <w:rPr>
+          <w:rFonts w:ascii="Arial" w:hAnsi="Arial" w:cs="Arial"/>
+        </w:rPr>
+      </w:pPr>
+      <w:r>
+        <w:rPr>
+          <w:rFonts w:ascii="Arial" w:hAnsi="Arial" w:cs="Arial"/>
+        </w:rPr>
+        <w:t>Students: Search for courses, submit enrolment requests, and view enrolment status and timetables.</w:t>
+      </w:r>
+    </w:p>
+    <w:p>
+      <w:pPr>
+        <w:pStyle w:val="ListParagraph"/>
+        <w:numPr>
+          <w:ilvl w:val="0"/>
+          <w:numId w:val="8"/>
+        </w:numPr>
+        <w:spacing w:line="360" w:lineRule="auto"/>
+        <w:jc w:val="both"/>
+        <w:rPr>
+          <w:rFonts w:ascii="Arial" w:hAnsi="Arial" w:cs="Arial"/>
+        </w:rPr>
+      </w:pPr>
+      <w:r>
+        <w:rPr>
+          <w:rFonts w:ascii="Arial" w:hAnsi="Arial" w:cs="Arial"/>
+        </w:rPr>
+        <w:t>Academic Staff: Manage course information, including prerequisites, schedules, and capacity limits.</w:t>
+      </w:r>
+    </w:p>
+    <w:p>
+      <w:pPr>
+        <w:pStyle w:val="ListParagraph"/>
+        <w:numPr>
+          <w:ilvl w:val="0"/>
+          <w:numId w:val="8"/>
+        </w:numPr>
+        <w:spacing w:line="360" w:lineRule="auto"/>
+        <w:jc w:val="both"/>
+        <w:rPr>
+          <w:rFonts w:ascii="Arial" w:hAnsi="Arial" w:cs="Arial"/>
+        </w:rPr>
+      </w:pPr>
+      <w:r>
+        <w:rPr>
+          <w:rFonts w:ascii="Arial" w:hAnsi="Arial" w:cs="Arial"/>
+        </w:rPr>
+        <w:t>Registry Staff: Review and approve enrolment requests in accordance with academic and administrative rules.</w:t>
+      </w:r>
+    </w:p>
+    <w:p>
+      <w:pPr>
+        <w:pStyle w:val="ListParagraph"/>
+        <w:numPr>
+          <w:ilvl w:val="0"/>
+          <w:numId w:val="8"/>
+        </w:numPr>
+        <w:spacing w:line="360" w:lineRule="auto"/>
+        <w:jc w:val="both"/>
+        <w:rPr>
+          <w:rFonts w:ascii="Arial" w:hAnsi="Arial" w:cs="Arial"/>
+        </w:rPr>
+      </w:pPr>
+      <w:r>
+        <w:rPr>
+          <w:rFonts w:ascii="Arial" w:hAnsi="Arial" w:cs="Arial"/>
+        </w:rPr>
+        <w:t>Finance Staff: Process payments and confirm enrolments upon successful payment verification.</w:t>
+      </w:r>
+    </w:p>
+    <w:p>
+      <w:pPr>
+        <w:pStyle w:val="ListParagraph"/>
+        <w:numPr>
+          <w:ilvl w:val="0"/>
+          <w:numId w:val="8"/>
+        </w:numPr>
+        <w:spacing w:line="360" w:lineRule="auto"/>
+        <w:jc w:val="both"/>
+        <w:rPr>
+          <w:rFonts w:ascii="Arial" w:hAnsi="Arial" w:cs="Arial"/>
+        </w:rPr>
+      </w:pPr>
+      <w:r>
+        <w:rPr>
+          <w:rFonts w:ascii="Arial" w:hAnsi="Arial" w:cs="Arial"/>
+        </w:rPr>
+        <w:t>IT Staff: Maintain system infrastructure, ensure availability, and provide technical support.</w:t>
+      </w:r>
+    </w:p>
+    <w:p>
+      <w:pPr>
+        <w:pStyle w:val="ListParagraph"/>
+        <w:numPr>
+          <w:ilvl w:val="0"/>
+          <w:numId w:val="8"/>
+        </w:numPr>
+        <w:spacing w:line="360" w:lineRule="auto"/>
+        <w:jc w:val="both"/>
+        <w:rPr>
+          <w:rFonts w:ascii="Arial" w:hAnsi="Arial" w:cs="Arial"/>
+        </w:rPr>
+      </w:pPr>
+      <w:r>
+        <w:rPr>
+          <w:rFonts w:ascii="Arial" w:hAnsi="Arial" w:cs="Arial"/>
+        </w:rPr>
+        <w:t>University Management: Access system data for reporting, strategic planning, and decision-making</w:t>
+      </w:r>
+      <w:r>
+        <w:rPr>
+          <w:rFonts w:ascii="Arial" w:hAnsi="Arial" w:cs="Arial"/>
+        </w:rPr>
+        <w:t>.</w:t>
+      </w:r>
+    </w:p>
+    <w:p>
+      <w:pPr>
+        <w:spacing w:line="360" w:lineRule="auto"/>
+        <w:ind w:left="567"/>
+        <w:jc w:val="both"/>
+        <w:rPr>
+          <w:rFonts w:ascii="Arial" w:hAnsi="Arial" w:cs="Arial"/>
+        </w:rPr>
+      </w:pPr>
+      <w:r>
+        <w:rPr>
+          <w:rFonts w:ascii="Arial" w:hAnsi="Arial" w:cs="Arial"/>
+        </w:rPr>
+        <w:t>The diversity of stakeholders highlights the need for a system that supports multiple user roles with controlled access and responsibilities.</w:t>
+      </w:r>
+      <w:r>
+        <w:rPr>
+          <w:rFonts w:ascii="Arial" w:hAnsi="Arial" w:cs="Arial"/>
+        </w:rPr>
+        <w:t xml:space="preserve"> Among these systems, t</w:t>
+      </w:r>
+      <w:r>
+        <w:rPr>
+          <w:rFonts w:ascii="Arial" w:hAnsi="Arial" w:cs="Arial"/>
+        </w:rPr>
+        <w:t>he Student Enrolment and Course Management System is selected as the focus of this project</w:t>
+      </w:r>
+      <w:r>
+        <w:rPr>
+          <w:rFonts w:ascii="Arial" w:hAnsi="Arial" w:cs="Arial"/>
+        </w:rPr>
+        <w:t>.</w:t>
+      </w:r>
+    </w:p>
+    <w:p>
+      <w:pPr>
+        <w:pStyle w:val="Heading2"/>
+        <w:spacing w:before="0" w:line="360" w:lineRule="auto"/>
+        <w:ind w:left="284"/>
+        <w:rPr>
+          <w:rFonts w:ascii="Arial" w:hAnsi="Arial" w:cs="Arial"/>
+          <w:b/>
+          <w:bCs/>
+          <w:color w:val="EE0000"/>
+          <w:sz w:val="28"/>
+          <w:szCs w:val="28"/>
+        </w:rPr>
+      </w:pPr>
+      <w:bookmarkStart w:id="6" w:name="_Toc226899726"/>
+      <w:r>
+        <w:rPr>
+          <w:rFonts w:ascii="Arial" w:hAnsi="Arial" w:cs="Arial"/>
+          <w:b/>
+          <w:bCs/>
+          <w:color w:val="EE0000"/>
+          <w:sz w:val="28"/>
+          <w:szCs w:val="28"/>
+        </w:rPr>
+        <w:t>2</w:t>
+      </w:r>
+      <w:r>
+        <w:rPr>
+          <w:rFonts w:ascii="Arial" w:hAnsi="Arial" w:cs="Arial"/>
+          <w:b/>
+          <w:bCs/>
+          <w:color w:val="EE0000"/>
+          <w:sz w:val="28"/>
+          <w:szCs w:val="28"/>
+        </w:rPr>
+        <w:t>.</w:t>
+      </w:r>
+      <w:r>
+        <w:rPr>
+          <w:rFonts w:ascii="Arial" w:hAnsi="Arial" w:cs="Arial"/>
+          <w:b/>
+          <w:bCs/>
+          <w:color w:val="EE0000"/>
+          <w:sz w:val="28"/>
+          <w:szCs w:val="28"/>
+        </w:rPr>
+        <w:t>4</w:t>
+      </w:r>
+      <w:r>
+        <w:rPr>
+          <w:rFonts w:ascii="Arial" w:hAnsi="Arial" w:cs="Arial"/>
+          <w:b/>
+          <w:bCs/>
+          <w:color w:val="EE0000"/>
+          <w:sz w:val="28"/>
+          <w:szCs w:val="28"/>
+        </w:rPr>
+        <w:t>. Problem statement</w:t>
+      </w:r>
+      <w:bookmarkEnd w:id="6"/>
+    </w:p>
+    <w:p>
+      <w:pPr>
+        <w:spacing w:line="360" w:lineRule="auto"/>
+        <w:ind w:left="567"/>
+        <w:jc w:val="both"/>
+        <w:rPr>
+          <w:rFonts w:ascii="Arial" w:hAnsi="Arial" w:cs="Arial"/>
+        </w:rPr>
+      </w:pPr>
+      <w:r>
+        <w:rPr>
+          <w:rFonts w:ascii="Arial" w:hAnsi="Arial" w:cs="Arial"/>
+        </w:rPr>
+        <w:t xml:space="preserve">The current enrolment process at Auckland University of Technology relies heavily on manual, paper-based procedures for managing student enrolment and course administration. This approach creates several operational challenges, including lost or misplaced enrolment forms, manual prerequisite checks prone to errors, delays in enrolment approval—especially during peak periods—and difficulty tracking student progress or course capacity. These inefficiencies result in slow processing </w:t>
+      </w:r>
+      <w:r>
+        <w:rPr>
+          <w:rFonts w:ascii="Arial" w:hAnsi="Arial" w:cs="Arial"/>
+        </w:rPr>
+        <w:lastRenderedPageBreak/>
+        <w:t>times, inconsistent data, limited accessibility, and poor coordination between departments.</w:t>
+      </w:r>
+    </w:p>
+    <w:p>
+      <w:pPr>
+        <w:spacing w:line="360" w:lineRule="auto"/>
+        <w:ind w:left="567"/>
+        <w:jc w:val="both"/>
+        <w:rPr>
+          <w:rFonts w:ascii="Arial" w:hAnsi="Arial" w:cs="Arial"/>
+        </w:rPr>
+      </w:pPr>
+      <w:r>
+        <w:rPr>
+          <w:rFonts w:ascii="Arial" w:hAnsi="Arial" w:cs="Arial"/>
+        </w:rPr>
+        <w:t xml:space="preserve">To address these issues, </w:t>
+      </w:r>
+      <w:r>
+        <w:rPr>
+          <w:rFonts w:ascii="Arial" w:hAnsi="Arial" w:cs="Arial"/>
+        </w:rPr>
+        <w:t>AUT</w:t>
+      </w:r>
+      <w:r>
+        <w:rPr>
+          <w:rFonts w:ascii="Arial" w:hAnsi="Arial" w:cs="Arial"/>
+        </w:rPr>
+        <w:t xml:space="preserve"> requires a Student Enrolment and Course Management System to manage course selection, enrolment, and related </w:t>
+      </w:r>
+      <w:r>
+        <w:rPr>
+          <w:rFonts w:ascii="Arial" w:hAnsi="Arial" w:cs="Arial"/>
+        </w:rPr>
+        <w:t xml:space="preserve">academic </w:t>
+      </w:r>
+      <w:r>
+        <w:rPr>
+          <w:rFonts w:ascii="Arial" w:hAnsi="Arial" w:cs="Arial"/>
+        </w:rPr>
+        <w:t xml:space="preserve">processes. </w:t>
+      </w:r>
+      <w:r>
+        <w:rPr>
+          <w:rFonts w:ascii="Arial" w:hAnsi="Arial" w:cs="Arial"/>
+        </w:rPr>
+        <w:t>The system must operate across multiple departments, including the Academic Department, Registry/Admissions Office, and Finance Department, each responsible for different aspects of the enrolment workflow.</w:t>
       </w:r>
       <w:r>
         <w:t xml:space="preserve"> </w:t>
@@ -1719,19 +3340,39 @@
         <w:rPr>
           <w:rFonts w:ascii="Arial" w:hAnsi="Arial" w:cs="Arial"/>
         </w:rPr>
-        <w:t>The presence of these distinct functional areas requires coordinated operations supported by integrated information systems.</w:t>
-      </w:r>
-      <w:r>
-        <w:rPr>
-          <w:rFonts w:ascii="Arial" w:hAnsi="Arial" w:cs="Arial"/>
-        </w:rPr>
-        <w:t xml:space="preserve"> Among these systems, t</w:t>
-      </w:r>
-      <w:r>
-        <w:rPr>
-          <w:rFonts w:ascii="Arial" w:hAnsi="Arial" w:cs="Arial"/>
-        </w:rPr>
-        <w:t>he Student Enrolment and Course Management System is selected as the focus of this project</w:t>
+        <w:t>The system must support both domestic and international students, who may have different enrolment requirements, fee structures, and approval processes.</w:t>
+      </w:r>
+    </w:p>
+    <w:p>
+      <w:pPr>
+        <w:spacing w:line="360" w:lineRule="auto"/>
+        <w:ind w:left="567"/>
+        <w:jc w:val="both"/>
+        <w:rPr>
+          <w:rFonts w:ascii="Arial" w:hAnsi="Arial" w:cs="Arial"/>
+        </w:rPr>
+      </w:pPr>
+      <w:r>
+        <w:rPr>
+          <w:rFonts w:ascii="Arial" w:hAnsi="Arial" w:cs="Arial"/>
+        </w:rPr>
+        <w:t>Students should be able to search for available courses, enrol in them, and view their enrolled courses through the system. The system must automatically enforce key business rules, such as checking prerequisites, validating course availability, and preventing timetable conflicts before confirming enrolment. When selecting courses, students will be able to view a timetable of the courses they have chosen, and the system will automatically detect any clashes and display them visually. Students can then adjust their selection based on these clashes to ensure a feasible schedule.</w:t>
+      </w:r>
+    </w:p>
+    <w:p>
+      <w:pPr>
+        <w:spacing w:line="360" w:lineRule="auto"/>
+        <w:ind w:left="567"/>
+        <w:jc w:val="both"/>
+        <w:rPr>
+          <w:rFonts w:ascii="Arial" w:hAnsi="Arial" w:cs="Arial"/>
+        </w:rPr>
+      </w:pPr>
+      <w:r>
+        <w:rPr>
+          <w:rFonts w:ascii="Arial" w:hAnsi="Arial" w:cs="Arial"/>
+        </w:rPr>
+        <w:t>Staff members will perform distinct tasks depending on their department. Academic Department staff are responsible for maintaining course information, including course descriptions, prerequisites, capacity limits, and timetable details. Registry/Admissions Office staff review and approve student enrolment requests, ensuring that all prerequisite, course availability, and timetable clash rules are satisfied. Finance Department staff process tuition and course-related payments and confirm enrolments only after successful payment verification. Since these responsibilities are distributed across departments, the system must ensure efficient coordination, secure data sharing, and real-time updates among all stakeholders</w:t>
       </w:r>
       <w:r>
         <w:rPr>
@@ -1743,7 +3384,251 @@
     <w:p>
       <w:pPr>
         <w:spacing w:line="360" w:lineRule="auto"/>
+        <w:ind w:left="567"/>
+        <w:jc w:val="both"/>
+        <w:rPr>
+          <w:rFonts w:ascii="Arial" w:hAnsi="Arial" w:cs="Arial"/>
+        </w:rPr>
+      </w:pPr>
+      <w:r>
+        <w:rPr>
+          <w:rFonts w:ascii="Arial" w:hAnsi="Arial" w:cs="Arial"/>
+        </w:rPr>
+        <w:t xml:space="preserve">The proposed system will be a web-based application accessible through a browser on any device. It must support multiple concurrent users while ensuring data accuracy, security, and real-time updates. By replacing the existing manual process, </w:t>
+      </w:r>
+      <w:r>
+        <w:rPr>
+          <w:rFonts w:ascii="Arial" w:hAnsi="Arial" w:cs="Arial"/>
+        </w:rPr>
+        <w:lastRenderedPageBreak/>
+        <w:t xml:space="preserve">the system aims to improve operational efficiency, reduce errors, and enhance the overall user experience for </w:t>
+      </w:r>
+      <w:r>
+        <w:rPr>
+          <w:rFonts w:ascii="Arial" w:hAnsi="Arial" w:cs="Arial"/>
+        </w:rPr>
+        <w:t>both domestic and international students, as well as staff</w:t>
+      </w:r>
+      <w:r>
+        <w:rPr>
+          <w:rFonts w:ascii="Arial" w:hAnsi="Arial" w:cs="Arial"/>
+        </w:rPr>
+        <w:t>.</w:t>
+      </w:r>
+    </w:p>
+    <w:p>
+      <w:pPr>
+        <w:pStyle w:val="Heading2"/>
+        <w:spacing w:before="0" w:line="360" w:lineRule="auto"/>
         <w:ind w:left="284"/>
+        <w:rPr>
+          <w:rFonts w:ascii="Arial" w:hAnsi="Arial" w:cs="Arial"/>
+          <w:b/>
+          <w:bCs/>
+          <w:color w:val="EE0000"/>
+          <w:sz w:val="28"/>
+          <w:szCs w:val="28"/>
+        </w:rPr>
+      </w:pPr>
+      <w:bookmarkStart w:id="7" w:name="_Toc226899727"/>
+      <w:r>
+        <w:rPr>
+          <w:rFonts w:ascii="Arial" w:hAnsi="Arial" w:cs="Arial"/>
+          <w:b/>
+          <w:bCs/>
+          <w:color w:val="EE0000"/>
+          <w:sz w:val="28"/>
+          <w:szCs w:val="28"/>
+        </w:rPr>
+        <w:t>2</w:t>
+      </w:r>
+      <w:r>
+        <w:rPr>
+          <w:rFonts w:ascii="Arial" w:hAnsi="Arial" w:cs="Arial"/>
+          <w:b/>
+          <w:bCs/>
+          <w:color w:val="EE0000"/>
+          <w:sz w:val="28"/>
+          <w:szCs w:val="28"/>
+        </w:rPr>
+        <w:t>.</w:t>
+      </w:r>
+      <w:r>
+        <w:rPr>
+          <w:rFonts w:ascii="Arial" w:hAnsi="Arial" w:cs="Arial"/>
+          <w:b/>
+          <w:bCs/>
+          <w:color w:val="EE0000"/>
+          <w:sz w:val="28"/>
+          <w:szCs w:val="28"/>
+        </w:rPr>
+        <w:t>5</w:t>
+      </w:r>
+      <w:r>
+        <w:rPr>
+          <w:rFonts w:ascii="Arial" w:hAnsi="Arial" w:cs="Arial"/>
+          <w:b/>
+          <w:bCs/>
+          <w:color w:val="EE0000"/>
+          <w:sz w:val="28"/>
+          <w:szCs w:val="28"/>
+        </w:rPr>
+        <w:t xml:space="preserve">. </w:t>
+      </w:r>
+      <w:r>
+        <w:rPr>
+          <w:rFonts w:ascii="Arial" w:hAnsi="Arial" w:cs="Arial"/>
+          <w:b/>
+          <w:bCs/>
+          <w:color w:val="EE0000"/>
+          <w:sz w:val="28"/>
+          <w:szCs w:val="28"/>
+        </w:rPr>
+        <w:t xml:space="preserve">System </w:t>
+      </w:r>
+      <w:r>
+        <w:rPr>
+          <w:rFonts w:ascii="Arial" w:hAnsi="Arial" w:cs="Arial"/>
+          <w:b/>
+          <w:bCs/>
+          <w:color w:val="EE0000"/>
+          <w:sz w:val="28"/>
+          <w:szCs w:val="28"/>
+        </w:rPr>
+        <w:t>s</w:t>
+      </w:r>
+      <w:r>
+        <w:rPr>
+          <w:rFonts w:ascii="Arial" w:hAnsi="Arial" w:cs="Arial"/>
+          <w:b/>
+          <w:bCs/>
+          <w:color w:val="EE0000"/>
+          <w:sz w:val="28"/>
+          <w:szCs w:val="28"/>
+        </w:rPr>
+        <w:t xml:space="preserve">cope, </w:t>
+      </w:r>
+      <w:r>
+        <w:rPr>
+          <w:rFonts w:ascii="Arial" w:hAnsi="Arial" w:cs="Arial"/>
+          <w:b/>
+          <w:bCs/>
+          <w:color w:val="EE0000"/>
+          <w:sz w:val="28"/>
+          <w:szCs w:val="28"/>
+        </w:rPr>
+        <w:t>b</w:t>
+      </w:r>
+      <w:r>
+        <w:rPr>
+          <w:rFonts w:ascii="Arial" w:hAnsi="Arial" w:cs="Arial"/>
+          <w:b/>
+          <w:bCs/>
+          <w:color w:val="EE0000"/>
+          <w:sz w:val="28"/>
+          <w:szCs w:val="28"/>
+        </w:rPr>
+        <w:t xml:space="preserve">oundaries, and </w:t>
+      </w:r>
+      <w:r>
+        <w:rPr>
+          <w:rFonts w:ascii="Arial" w:hAnsi="Arial" w:cs="Arial"/>
+          <w:b/>
+          <w:bCs/>
+          <w:color w:val="EE0000"/>
+          <w:sz w:val="28"/>
+          <w:szCs w:val="28"/>
+        </w:rPr>
+        <w:t>a</w:t>
+      </w:r>
+      <w:r>
+        <w:rPr>
+          <w:rFonts w:ascii="Arial" w:hAnsi="Arial" w:cs="Arial"/>
+          <w:b/>
+          <w:bCs/>
+          <w:color w:val="EE0000"/>
+          <w:sz w:val="28"/>
+          <w:szCs w:val="28"/>
+        </w:rPr>
+        <w:t>ssumptions</w:t>
+      </w:r>
+      <w:bookmarkEnd w:id="7"/>
+    </w:p>
+    <w:p>
+      <w:pPr>
+        <w:pStyle w:val="Heading3"/>
+        <w:ind w:left="567"/>
+        <w:rPr>
+          <w:rFonts w:ascii="Arial" w:hAnsi="Arial" w:cs="Arial"/>
+          <w:b/>
+          <w:bCs/>
+          <w:color w:val="EE0000"/>
+          <w:sz w:val="24"/>
+          <w:szCs w:val="24"/>
+        </w:rPr>
+      </w:pPr>
+      <w:bookmarkStart w:id="8" w:name="_Toc226899728"/>
+      <w:r>
+        <w:rPr>
+          <w:rFonts w:ascii="Arial" w:hAnsi="Arial" w:cs="Arial"/>
+          <w:b/>
+          <w:bCs/>
+          <w:color w:val="EE0000"/>
+          <w:sz w:val="24"/>
+          <w:szCs w:val="24"/>
+        </w:rPr>
+        <w:t>i.</w:t>
+      </w:r>
+      <w:r>
+        <w:rPr>
+          <w:rFonts w:ascii="Arial" w:hAnsi="Arial" w:cs="Arial"/>
+          <w:b/>
+          <w:bCs/>
+          <w:color w:val="EE0000"/>
+          <w:sz w:val="24"/>
+          <w:szCs w:val="24"/>
+        </w:rPr>
+        <w:t xml:space="preserve"> </w:t>
+      </w:r>
+      <w:r>
+        <w:rPr>
+          <w:rFonts w:ascii="Arial" w:hAnsi="Arial" w:cs="Arial"/>
+          <w:b/>
+          <w:bCs/>
+          <w:color w:val="EE0000"/>
+          <w:sz w:val="24"/>
+          <w:szCs w:val="24"/>
+        </w:rPr>
+        <w:t xml:space="preserve">System </w:t>
+      </w:r>
+      <w:r>
+        <w:rPr>
+          <w:rFonts w:ascii="Arial" w:hAnsi="Arial" w:cs="Arial"/>
+          <w:b/>
+          <w:bCs/>
+          <w:color w:val="EE0000"/>
+          <w:sz w:val="24"/>
+          <w:szCs w:val="24"/>
+        </w:rPr>
+        <w:t>s</w:t>
+      </w:r>
+      <w:r>
+        <w:rPr>
+          <w:rFonts w:ascii="Arial" w:hAnsi="Arial" w:cs="Arial"/>
+          <w:b/>
+          <w:bCs/>
+          <w:color w:val="EE0000"/>
+          <w:sz w:val="24"/>
+          <w:szCs w:val="24"/>
+        </w:rPr>
+        <w:t>cope</w:t>
+      </w:r>
+      <w:bookmarkEnd w:id="8"/>
+    </w:p>
+    <w:p>
+      <w:pPr>
+        <w:spacing w:line="360" w:lineRule="auto"/>
+        <w:ind w:left="851"/>
         <w:jc w:val="both"/>
         <w:rPr>
           <w:rFonts w:ascii="Arial" w:hAnsi="Arial" w:cs="Arial"/>
@@ -1753,13 +3638,29 @@
         <w:rPr>
           <w:rFonts w:ascii="Arial" w:hAnsi="Arial" w:cs="Arial"/>
         </w:rPr>
-        <w:t xml:space="preserve">The selected system involves several key stakeholders and user roles with distinct responsibilities. Students interact with the system to search for courses, submit enrolment requests, and view their enrolment status. Academic staff are responsible for managing course-related information and monitoring enrolled students. Administrative staff handle the review and approval of enrolment requests, while finance staff process payments required to confirm enrolments. In addition, IT staff support the technical operation of the system, and university management may rely on system data for planning and decision-making. These roles demonstrate the need for a system that supports multiple users with different responsibilities and access levels. </w:t>
-      </w:r>
-    </w:p>
-    <w:p>
-      <w:pPr>
-        <w:spacing w:line="360" w:lineRule="auto"/>
-        <w:ind w:left="284"/>
+        <w:t>The proposed</w:t>
+      </w:r>
+      <w:r>
+        <w:rPr>
+          <w:rFonts w:ascii="Arial" w:hAnsi="Arial" w:cs="Arial"/>
+        </w:rPr>
+        <w:t xml:space="preserve"> </w:t>
+      </w:r>
+      <w:r>
+        <w:rPr>
+          <w:rFonts w:ascii="Arial" w:hAnsi="Arial" w:cs="Arial"/>
+        </w:rPr>
+        <w:t>Student Enrolment and Course Management System will:</w:t>
+      </w:r>
+    </w:p>
+    <w:p>
+      <w:pPr>
+        <w:pStyle w:val="ListParagraph"/>
+        <w:numPr>
+          <w:ilvl w:val="0"/>
+          <w:numId w:val="10"/>
+        </w:numPr>
+        <w:spacing w:line="360" w:lineRule="auto"/>
         <w:jc w:val="both"/>
         <w:rPr>
           <w:rFonts w:ascii="Arial" w:hAnsi="Arial" w:cs="Arial"/>
@@ -1769,7 +3670,479 @@
         <w:rPr>
           <w:rFonts w:ascii="Arial" w:hAnsi="Arial" w:cs="Arial"/>
         </w:rPr>
-        <w:t xml:space="preserve">The selected system directly supports the university’s core function of delivering education by enabling students to enrol in courses and ensuring that institutional rules, such as prerequisites and course capacity limits, are enforced. The system also facilitates coordination between different parts of the organisation by supporting workflows such as enrolment submission, approval, and payment processing. </w:t>
+        <w:t>Support course search, selection, and enrolment</w:t>
+      </w:r>
+    </w:p>
+    <w:p>
+      <w:pPr>
+        <w:pStyle w:val="ListParagraph"/>
+        <w:numPr>
+          <w:ilvl w:val="0"/>
+          <w:numId w:val="10"/>
+        </w:numPr>
+        <w:spacing w:line="360" w:lineRule="auto"/>
+        <w:jc w:val="both"/>
+        <w:rPr>
+          <w:rFonts w:ascii="Arial" w:hAnsi="Arial" w:cs="Arial"/>
+        </w:rPr>
+      </w:pPr>
+      <w:r>
+        <w:rPr>
+          <w:rFonts w:ascii="Arial" w:hAnsi="Arial" w:cs="Arial"/>
+        </w:rPr>
+        <w:t>Enforce business rules such as prerequisites, course capacity, and timetable conflict detection</w:t>
+      </w:r>
+    </w:p>
+    <w:p>
+      <w:pPr>
+        <w:pStyle w:val="ListParagraph"/>
+        <w:numPr>
+          <w:ilvl w:val="0"/>
+          <w:numId w:val="10"/>
+        </w:numPr>
+        <w:spacing w:line="360" w:lineRule="auto"/>
+        <w:jc w:val="both"/>
+        <w:rPr>
+          <w:rFonts w:ascii="Arial" w:hAnsi="Arial" w:cs="Arial"/>
+        </w:rPr>
+      </w:pPr>
+      <w:r>
+        <w:rPr>
+          <w:rFonts w:ascii="Arial" w:hAnsi="Arial" w:cs="Arial"/>
+        </w:rPr>
+        <w:t>Enable enrolment approval workflows across departments</w:t>
+      </w:r>
+    </w:p>
+    <w:p>
+      <w:pPr>
+        <w:pStyle w:val="ListParagraph"/>
+        <w:numPr>
+          <w:ilvl w:val="0"/>
+          <w:numId w:val="10"/>
+        </w:numPr>
+        <w:spacing w:line="360" w:lineRule="auto"/>
+        <w:jc w:val="both"/>
+        <w:rPr>
+          <w:rFonts w:ascii="Arial" w:hAnsi="Arial" w:cs="Arial"/>
+        </w:rPr>
+      </w:pPr>
+      <w:r>
+        <w:rPr>
+          <w:rFonts w:ascii="Arial" w:hAnsi="Arial" w:cs="Arial"/>
+        </w:rPr>
+        <w:t>Integrate payment processing for enrolment confirmation</w:t>
+      </w:r>
+    </w:p>
+    <w:p>
+      <w:pPr>
+        <w:pStyle w:val="ListParagraph"/>
+        <w:numPr>
+          <w:ilvl w:val="0"/>
+          <w:numId w:val="10"/>
+        </w:numPr>
+        <w:spacing w:line="360" w:lineRule="auto"/>
+        <w:jc w:val="both"/>
+        <w:rPr>
+          <w:rFonts w:ascii="Arial" w:hAnsi="Arial" w:cs="Arial"/>
+        </w:rPr>
+      </w:pPr>
+      <w:r>
+        <w:rPr>
+          <w:rFonts w:ascii="Arial" w:hAnsi="Arial" w:cs="Arial"/>
+        </w:rPr>
+        <w:t>Provide timetable visualisation and real-time updates</w:t>
+      </w:r>
+    </w:p>
+    <w:p>
+      <w:pPr>
+        <w:spacing w:line="360" w:lineRule="auto"/>
+        <w:ind w:left="851"/>
+        <w:jc w:val="both"/>
+        <w:rPr>
+          <w:rFonts w:ascii="Arial" w:hAnsi="Arial" w:cs="Arial"/>
+        </w:rPr>
+      </w:pPr>
+      <w:r>
+        <w:rPr>
+          <w:rFonts w:ascii="Arial" w:hAnsi="Arial" w:cs="Arial"/>
+        </w:rPr>
+        <w:t>Th</w:t>
+      </w:r>
+      <w:r>
+        <w:rPr>
+          <w:rFonts w:ascii="Arial" w:hAnsi="Arial" w:cs="Arial"/>
+        </w:rPr>
+        <w:t>is</w:t>
+      </w:r>
+      <w:r>
+        <w:rPr>
+          <w:rFonts w:ascii="Arial" w:hAnsi="Arial" w:cs="Arial"/>
+        </w:rPr>
+        <w:t xml:space="preserve"> system will involve three departments</w:t>
+      </w:r>
+      <w:r>
+        <w:rPr>
+          <w:rFonts w:ascii="Arial" w:hAnsi="Arial" w:cs="Arial"/>
+        </w:rPr>
+        <w:t>:</w:t>
+      </w:r>
+      <w:r>
+        <w:rPr>
+          <w:rFonts w:ascii="Arial" w:hAnsi="Arial" w:cs="Arial"/>
+        </w:rPr>
+        <w:t xml:space="preserve"> Academic Departments, </w:t>
+      </w:r>
+      <w:r>
+        <w:rPr>
+          <w:rFonts w:ascii="Arial" w:hAnsi="Arial" w:cs="Arial"/>
+        </w:rPr>
+        <w:t>Academic Registry</w:t>
+      </w:r>
+      <w:r>
+        <w:rPr>
+          <w:rFonts w:ascii="Arial" w:hAnsi="Arial" w:cs="Arial"/>
+        </w:rPr>
+        <w:t xml:space="preserve"> </w:t>
+      </w:r>
+      <w:r>
+        <w:rPr>
+          <w:rFonts w:ascii="Arial" w:hAnsi="Arial" w:cs="Arial"/>
+        </w:rPr>
+        <w:t>Department</w:t>
+      </w:r>
+      <w:r>
+        <w:rPr>
+          <w:rFonts w:ascii="Arial" w:hAnsi="Arial" w:cs="Arial"/>
+        </w:rPr>
+        <w:t>, and Finance Department</w:t>
+      </w:r>
+      <w:r>
+        <w:rPr>
+          <w:rFonts w:ascii="Arial" w:hAnsi="Arial" w:cs="Arial"/>
+        </w:rPr>
+        <w:t>.</w:t>
+      </w:r>
+    </w:p>
+    <w:p>
+      <w:pPr>
+        <w:pStyle w:val="Heading3"/>
+        <w:ind w:left="567"/>
+        <w:rPr>
+          <w:rFonts w:ascii="Arial" w:hAnsi="Arial" w:cs="Arial"/>
+          <w:b/>
+          <w:bCs/>
+          <w:color w:val="EE0000"/>
+          <w:sz w:val="24"/>
+          <w:szCs w:val="24"/>
+        </w:rPr>
+      </w:pPr>
+      <w:bookmarkStart w:id="9" w:name="_Toc226899729"/>
+      <w:r>
+        <w:rPr>
+          <w:rFonts w:ascii="Arial" w:hAnsi="Arial" w:cs="Arial"/>
+          <w:b/>
+          <w:bCs/>
+          <w:color w:val="EE0000"/>
+          <w:sz w:val="24"/>
+          <w:szCs w:val="24"/>
+        </w:rPr>
+        <w:t>ii.</w:t>
+      </w:r>
+      <w:r>
+        <w:rPr>
+          <w:rFonts w:ascii="Arial" w:hAnsi="Arial" w:cs="Arial"/>
+          <w:b/>
+          <w:bCs/>
+          <w:color w:val="EE0000"/>
+          <w:sz w:val="24"/>
+          <w:szCs w:val="24"/>
+        </w:rPr>
+        <w:t xml:space="preserve"> </w:t>
+      </w:r>
+      <w:r>
+        <w:rPr>
+          <w:rFonts w:ascii="Arial" w:hAnsi="Arial" w:cs="Arial"/>
+          <w:b/>
+          <w:bCs/>
+          <w:color w:val="EE0000"/>
+          <w:sz w:val="24"/>
+          <w:szCs w:val="24"/>
+        </w:rPr>
+        <w:t xml:space="preserve">System </w:t>
+      </w:r>
+      <w:r>
+        <w:rPr>
+          <w:rFonts w:ascii="Arial" w:hAnsi="Arial" w:cs="Arial"/>
+          <w:b/>
+          <w:bCs/>
+          <w:color w:val="EE0000"/>
+          <w:sz w:val="24"/>
+          <w:szCs w:val="24"/>
+        </w:rPr>
+        <w:t>b</w:t>
+      </w:r>
+      <w:r>
+        <w:rPr>
+          <w:rFonts w:ascii="Arial" w:hAnsi="Arial" w:cs="Arial"/>
+          <w:b/>
+          <w:bCs/>
+          <w:color w:val="EE0000"/>
+          <w:sz w:val="24"/>
+          <w:szCs w:val="24"/>
+        </w:rPr>
+        <w:t>oundaries</w:t>
+      </w:r>
+      <w:bookmarkEnd w:id="9"/>
+    </w:p>
+    <w:p>
+      <w:pPr>
+        <w:spacing w:line="360" w:lineRule="auto"/>
+        <w:ind w:left="851"/>
+        <w:jc w:val="both"/>
+        <w:rPr>
+          <w:rFonts w:ascii="Arial" w:hAnsi="Arial" w:cs="Arial"/>
+        </w:rPr>
+      </w:pPr>
+      <w:r>
+        <w:rPr>
+          <w:rFonts w:ascii="Arial" w:hAnsi="Arial" w:cs="Arial"/>
+        </w:rPr>
+        <w:t>The system will not handle academic grading</w:t>
+      </w:r>
+      <w:r>
+        <w:rPr>
+          <w:rFonts w:ascii="Arial" w:hAnsi="Arial" w:cs="Arial"/>
+        </w:rPr>
+        <w:t>,</w:t>
+      </w:r>
+      <w:r>
+        <w:rPr>
+          <w:rFonts w:ascii="Arial" w:hAnsi="Arial" w:cs="Arial"/>
+        </w:rPr>
+        <w:t xml:space="preserve"> transcript generation, </w:t>
+      </w:r>
+      <w:r>
+        <w:rPr>
+          <w:rFonts w:ascii="Arial" w:hAnsi="Arial" w:cs="Arial"/>
+        </w:rPr>
+        <w:t>or</w:t>
+      </w:r>
+      <w:r>
+        <w:rPr>
+          <w:rFonts w:ascii="Arial" w:hAnsi="Arial" w:cs="Arial"/>
+        </w:rPr>
+        <w:t xml:space="preserve"> manage staff payroll functions. Additionally, it does not deliver teaching content, as its purpose is limited to administrative and operational coordination</w:t>
+      </w:r>
+      <w:r>
+        <w:rPr>
+          <w:rFonts w:ascii="Arial" w:hAnsi="Arial" w:cs="Arial"/>
+        </w:rPr>
+        <w:t>.</w:t>
+      </w:r>
+    </w:p>
+    <w:p>
+      <w:pPr>
+        <w:pStyle w:val="Heading3"/>
+        <w:ind w:left="567"/>
+        <w:rPr>
+          <w:rFonts w:ascii="Arial" w:hAnsi="Arial" w:cs="Arial"/>
+          <w:b/>
+          <w:bCs/>
+          <w:color w:val="EE0000"/>
+          <w:sz w:val="24"/>
+          <w:szCs w:val="24"/>
+        </w:rPr>
+      </w:pPr>
+      <w:bookmarkStart w:id="10" w:name="_Toc226899730"/>
+      <w:r>
+        <w:rPr>
+          <w:rFonts w:ascii="Arial" w:hAnsi="Arial" w:cs="Arial"/>
+          <w:b/>
+          <w:bCs/>
+          <w:color w:val="EE0000"/>
+          <w:sz w:val="24"/>
+          <w:szCs w:val="24"/>
+        </w:rPr>
+        <w:t>iii.</w:t>
+      </w:r>
+      <w:r>
+        <w:rPr>
+          <w:rFonts w:ascii="Arial" w:hAnsi="Arial" w:cs="Arial"/>
+          <w:b/>
+          <w:bCs/>
+          <w:color w:val="EE0000"/>
+          <w:sz w:val="24"/>
+          <w:szCs w:val="24"/>
+        </w:rPr>
+        <w:t xml:space="preserve"> </w:t>
+      </w:r>
+      <w:r>
+        <w:rPr>
+          <w:rFonts w:ascii="Arial" w:hAnsi="Arial" w:cs="Arial"/>
+          <w:b/>
+          <w:bCs/>
+          <w:color w:val="EE0000"/>
+          <w:sz w:val="24"/>
+          <w:szCs w:val="24"/>
+        </w:rPr>
+        <w:t>Assumptions</w:t>
+      </w:r>
+      <w:bookmarkEnd w:id="10"/>
+    </w:p>
+    <w:p>
+      <w:pPr>
+        <w:spacing w:line="360" w:lineRule="auto"/>
+        <w:ind w:left="851"/>
+        <w:jc w:val="both"/>
+        <w:rPr>
+          <w:rFonts w:ascii="Arial" w:hAnsi="Arial" w:cs="Arial"/>
+        </w:rPr>
+      </w:pPr>
+      <w:r>
+        <w:rPr>
+          <w:rFonts w:ascii="Arial" w:hAnsi="Arial" w:cs="Arial"/>
+        </w:rPr>
+        <w:t>The</w:t>
+      </w:r>
+      <w:r>
+        <w:rPr>
+          <w:rFonts w:ascii="Arial" w:hAnsi="Arial" w:cs="Arial"/>
+        </w:rPr>
+        <w:t xml:space="preserve"> following assumptions are made for </w:t>
+      </w:r>
+      <w:r>
+        <w:rPr>
+          <w:rFonts w:ascii="Arial" w:hAnsi="Arial" w:cs="Arial"/>
+        </w:rPr>
+        <w:t>the</w:t>
+      </w:r>
+      <w:r>
+        <w:rPr>
+          <w:rFonts w:ascii="Arial" w:hAnsi="Arial" w:cs="Arial"/>
+        </w:rPr>
+        <w:t xml:space="preserve"> system</w:t>
+      </w:r>
+      <w:r>
+        <w:rPr>
+          <w:rFonts w:ascii="Arial" w:hAnsi="Arial" w:cs="Arial"/>
+        </w:rPr>
+        <w:t>:</w:t>
+      </w:r>
+    </w:p>
+    <w:p>
+      <w:pPr>
+        <w:pStyle w:val="ListParagraph"/>
+        <w:numPr>
+          <w:ilvl w:val="0"/>
+          <w:numId w:val="9"/>
+        </w:numPr>
+        <w:spacing w:line="360" w:lineRule="auto"/>
+        <w:jc w:val="both"/>
+        <w:rPr>
+          <w:rFonts w:ascii="Arial" w:hAnsi="Arial" w:cs="Arial"/>
+        </w:rPr>
+      </w:pPr>
+      <w:r>
+        <w:rPr>
+          <w:rFonts w:ascii="Arial" w:hAnsi="Arial" w:cs="Arial"/>
+        </w:rPr>
+        <w:t>All users have access to a web browser and stable internet connection.</w:t>
+      </w:r>
+    </w:p>
+    <w:p>
+      <w:pPr>
+        <w:pStyle w:val="ListParagraph"/>
+        <w:numPr>
+          <w:ilvl w:val="0"/>
+          <w:numId w:val="9"/>
+        </w:numPr>
+        <w:spacing w:line="360" w:lineRule="auto"/>
+        <w:jc w:val="both"/>
+        <w:rPr>
+          <w:rFonts w:ascii="Arial" w:hAnsi="Arial" w:cs="Arial"/>
+        </w:rPr>
+      </w:pPr>
+      <w:r>
+        <w:rPr>
+          <w:rFonts w:ascii="Arial" w:hAnsi="Arial" w:cs="Arial"/>
+        </w:rPr>
+        <w:t>Users are pre-authenticated</w:t>
+      </w:r>
+      <w:r>
+        <w:rPr>
+          <w:rFonts w:ascii="Arial" w:hAnsi="Arial" w:cs="Arial"/>
+        </w:rPr>
+        <w:t xml:space="preserve"> by the university</w:t>
+      </w:r>
+      <w:r>
+        <w:rPr>
+          <w:rFonts w:ascii="Arial" w:hAnsi="Arial" w:cs="Arial"/>
+        </w:rPr>
+        <w:t xml:space="preserve"> before accessing </w:t>
+      </w:r>
+      <w:r>
+        <w:rPr>
+          <w:rFonts w:ascii="Arial" w:hAnsi="Arial" w:cs="Arial"/>
+        </w:rPr>
+        <w:t>the</w:t>
+      </w:r>
+      <w:r>
+        <w:rPr>
+          <w:rFonts w:ascii="Arial" w:hAnsi="Arial" w:cs="Arial"/>
+        </w:rPr>
+        <w:t xml:space="preserve"> system.</w:t>
+      </w:r>
+    </w:p>
+    <w:p>
+      <w:pPr>
+        <w:pStyle w:val="ListParagraph"/>
+        <w:numPr>
+          <w:ilvl w:val="0"/>
+          <w:numId w:val="9"/>
+        </w:numPr>
+        <w:spacing w:line="360" w:lineRule="auto"/>
+        <w:jc w:val="both"/>
+        <w:rPr>
+          <w:rFonts w:ascii="Arial" w:hAnsi="Arial" w:cs="Arial"/>
+        </w:rPr>
+      </w:pPr>
+      <w:r>
+        <w:rPr>
+          <w:rFonts w:ascii="Arial" w:hAnsi="Arial" w:cs="Arial"/>
+        </w:rPr>
+        <w:t>The system integrates with a third-party payment processor rather than storing sensitive payment information</w:t>
+      </w:r>
+      <w:r>
+        <w:rPr>
+          <w:rFonts w:ascii="Arial" w:hAnsi="Arial" w:cs="Arial"/>
+        </w:rPr>
+        <w:t>.</w:t>
+      </w:r>
+    </w:p>
+    <w:p>
+      <w:pPr>
+        <w:pStyle w:val="ListParagraph"/>
+        <w:numPr>
+          <w:ilvl w:val="0"/>
+          <w:numId w:val="9"/>
+        </w:numPr>
+        <w:spacing w:line="360" w:lineRule="auto"/>
+        <w:jc w:val="both"/>
+        <w:rPr>
+          <w:rFonts w:ascii="Arial" w:hAnsi="Arial" w:cs="Arial"/>
+        </w:rPr>
+      </w:pPr>
+      <w:r>
+        <w:rPr>
+          <w:rFonts w:ascii="Arial" w:hAnsi="Arial" w:cs="Arial"/>
+        </w:rPr>
+        <w:t>All departments follow standardised workflows supported by the system</w:t>
+      </w:r>
+      <w:r>
+        <w:rPr>
+          <w:rFonts w:ascii="Arial" w:hAnsi="Arial" w:cs="Arial"/>
+        </w:rPr>
+        <w:t>.</w:t>
       </w:r>
       <w:r>
         <w:rPr>
@@ -1796,7 +4169,7 @@
           <w:szCs w:val="32"/>
         </w:rPr>
       </w:pPr>
-      <w:bookmarkStart w:id="3" w:name="_Toc226030423"/>
+      <w:bookmarkStart w:id="11" w:name="_Toc226899731"/>
       <w:r>
         <w:rPr>
           <w:rFonts w:ascii="Arial" w:hAnsi="Arial" w:cs="Arial"/>
@@ -1809,7 +4182,7 @@
         <w:lastRenderedPageBreak/>
         <w:t>Requirements Engineering</w:t>
       </w:r>
-      <w:bookmarkEnd w:id="3"/>
+      <w:bookmarkEnd w:id="11"/>
     </w:p>
     <w:p>
       <w:pPr>
@@ -1825,7 +4198,7 @@
           <w:szCs w:val="28"/>
         </w:rPr>
       </w:pPr>
-      <w:bookmarkStart w:id="4" w:name="_Toc226030424"/>
+      <w:bookmarkStart w:id="12" w:name="_Toc226899732"/>
       <w:r>
         <w:rPr>
           <w:rFonts w:ascii="Arial" w:hAnsi="Arial" w:cs="Arial"/>
@@ -1846,159 +4219,9 @@
           <w:sz w:val="28"/>
           <w:szCs w:val="28"/>
         </w:rPr>
-        <w:t>.1. Problem statement</w:t>
-      </w:r>
-      <w:bookmarkEnd w:id="4"/>
-    </w:p>
-    <w:p>
-      <w:pPr>
-        <w:spacing w:line="360" w:lineRule="auto"/>
-        <w:ind w:left="851"/>
-        <w:jc w:val="both"/>
-        <w:rPr>
-          <w:rFonts w:ascii="Arial" w:hAnsi="Arial" w:cs="Arial"/>
-        </w:rPr>
-      </w:pPr>
-      <w:r>
-        <w:rPr>
-          <w:rFonts w:ascii="Arial" w:hAnsi="Arial" w:cs="Arial"/>
-        </w:rPr>
-        <w:t>The current enrolment process at Auckland University of Technology relies heavily on manual, paper-based procedures for managing student enrolment and course administration. This approach creates several operational challenges, including lost or misplaced enrolment forms, manual prerequisite checks prone to errors, delays in enrolment approval—especially during peak periods—and difficulty tracking student progress or course capacity. These inefficiencies result in slow processing times, inconsistent data, limited accessibility, and poor coordination between departments.</w:t>
-      </w:r>
-    </w:p>
-    <w:p>
-      <w:pPr>
-        <w:spacing w:line="360" w:lineRule="auto"/>
-        <w:ind w:left="851"/>
-        <w:jc w:val="both"/>
-        <w:rPr>
-          <w:rFonts w:ascii="Arial" w:hAnsi="Arial" w:cs="Arial"/>
-        </w:rPr>
-      </w:pPr>
-      <w:r>
-        <w:rPr>
-          <w:rFonts w:ascii="Arial" w:hAnsi="Arial" w:cs="Arial"/>
-        </w:rPr>
-        <w:t xml:space="preserve">To address these issues, </w:t>
-      </w:r>
-      <w:r>
-        <w:rPr>
-          <w:rFonts w:ascii="Arial" w:hAnsi="Arial" w:cs="Arial"/>
-        </w:rPr>
-        <w:t>AUT</w:t>
-      </w:r>
-      <w:r>
-        <w:rPr>
-          <w:rFonts w:ascii="Arial" w:hAnsi="Arial" w:cs="Arial"/>
-        </w:rPr>
-        <w:t xml:space="preserve"> requires a Student Enrolment and Course Management System to manage course selection, enrolment, and related </w:t>
-      </w:r>
-      <w:r>
-        <w:rPr>
-          <w:rFonts w:ascii="Arial" w:hAnsi="Arial" w:cs="Arial"/>
-        </w:rPr>
-        <w:t xml:space="preserve">academic </w:t>
-      </w:r>
-      <w:r>
-        <w:rPr>
-          <w:rFonts w:ascii="Arial" w:hAnsi="Arial" w:cs="Arial"/>
-        </w:rPr>
-        <w:t xml:space="preserve">processes. </w:t>
-      </w:r>
-      <w:r>
-        <w:rPr>
-          <w:rFonts w:ascii="Arial" w:hAnsi="Arial" w:cs="Arial"/>
-        </w:rPr>
-        <w:t>The system must operate across multiple departments, including the Academic Department, Registry/Admissions Office, and Finance Department, each responsible for different aspects of the enrolment workflow.</w:t>
-      </w:r>
-      <w:r>
-        <w:t xml:space="preserve"> </w:t>
-      </w:r>
-      <w:r>
-        <w:rPr>
-          <w:rFonts w:ascii="Arial" w:hAnsi="Arial" w:cs="Arial"/>
-        </w:rPr>
-        <w:t>The system must support both domestic and international students, who may have different enrolment requirements, fee structures, and approval processes.</w:t>
-      </w:r>
-    </w:p>
-    <w:p>
-      <w:pPr>
-        <w:spacing w:line="360" w:lineRule="auto"/>
-        <w:ind w:left="851"/>
-        <w:jc w:val="both"/>
-        <w:rPr>
-          <w:rFonts w:ascii="Arial" w:hAnsi="Arial" w:cs="Arial"/>
-        </w:rPr>
-      </w:pPr>
-      <w:r>
-        <w:rPr>
-          <w:rFonts w:ascii="Arial" w:hAnsi="Arial" w:cs="Arial"/>
-        </w:rPr>
-        <w:t>Students should be able to search for available courses, enrol in them, and view their enrolled courses through the system. The system must automatically enforce key business rules, such as checking prerequisites, validating course availability, and preventing timetable conflicts before confirming enrolment. When selecting courses, students will be able to view a timetable of the courses they have chosen, and the system will automatically detect any clashes and display them visually. Students can then adjust their selection based on these clashes to ensure a feasible schedule.</w:t>
-      </w:r>
-    </w:p>
-    <w:p>
-      <w:pPr>
-        <w:spacing w:line="360" w:lineRule="auto"/>
-        <w:ind w:left="851"/>
-        <w:jc w:val="both"/>
-        <w:rPr>
-          <w:rFonts w:ascii="Arial" w:hAnsi="Arial" w:cs="Arial"/>
-        </w:rPr>
-      </w:pPr>
-      <w:r>
-        <w:rPr>
-          <w:rFonts w:ascii="Arial" w:hAnsi="Arial" w:cs="Arial"/>
-        </w:rPr>
-        <w:t xml:space="preserve">Staff members will perform distinct tasks depending on their department. Academic Department staff are responsible for maintaining course information, including course descriptions, prerequisites, capacity limits, and timetable details. Registry/Admissions Office staff review and approve student enrolment requests, </w:t>
-      </w:r>
-      <w:r>
-        <w:rPr>
-          <w:rFonts w:ascii="Arial" w:hAnsi="Arial" w:cs="Arial"/>
-        </w:rPr>
-        <w:lastRenderedPageBreak/>
-        <w:t>ensuring that all prerequisite, course availability, and timetable clash rules are satisfied. Finance Department staff process tuition and course-related payments and confirm enrolments only after successful payment verification. Since these responsibilities are distributed across departments, the system must ensure efficient coordination, secure data sharing, and real-time updates among all stakeholders</w:t>
-      </w:r>
-      <w:r>
-        <w:rPr>
-          <w:rFonts w:ascii="Arial" w:hAnsi="Arial" w:cs="Arial"/>
-        </w:rPr>
         <w:t>.</w:t>
       </w:r>
-    </w:p>
-    <w:p>
-      <w:pPr>
-        <w:spacing w:line="360" w:lineRule="auto"/>
-        <w:ind w:left="851"/>
-        <w:jc w:val="both"/>
-        <w:rPr>
-          <w:rFonts w:ascii="Arial" w:hAnsi="Arial" w:cs="Arial"/>
-        </w:rPr>
-      </w:pPr>
-      <w:r>
-        <w:rPr>
-          <w:rFonts w:ascii="Arial" w:hAnsi="Arial" w:cs="Arial"/>
-        </w:rPr>
-        <w:t xml:space="preserve">The proposed system will be a web-based application accessible through a browser on any device. It must support multiple concurrent users while ensuring data accuracy, security, and real-time updates. By replacing the existing manual process, the system aims to improve operational efficiency, reduce errors, and enhance the overall user experience for </w:t>
-      </w:r>
-      <w:r>
-        <w:rPr>
-          <w:rFonts w:ascii="Arial" w:hAnsi="Arial" w:cs="Arial"/>
-        </w:rPr>
-        <w:t>both domestic and international students, as well as staff</w:t>
-      </w:r>
-      <w:r>
-        <w:rPr>
-          <w:rFonts w:ascii="Arial" w:hAnsi="Arial" w:cs="Arial"/>
-        </w:rPr>
-        <w:t>.</w:t>
-      </w:r>
-    </w:p>
-    <w:p>
-      <w:pPr>
-        <w:pStyle w:val="Heading2"/>
-        <w:spacing w:before="0" w:line="360" w:lineRule="auto"/>
-        <w:ind w:left="284"/>
+      <w:r>
         <w:rPr>
           <w:rFonts w:ascii="Arial" w:hAnsi="Arial" w:cs="Arial"/>
           <w:b/>
@@ -2007,8 +4230,8 @@
           <w:sz w:val="28"/>
           <w:szCs w:val="28"/>
         </w:rPr>
-      </w:pPr>
-      <w:bookmarkStart w:id="5" w:name="_Toc226030425"/>
+        <w:t>1</w:t>
+      </w:r>
       <w:r>
         <w:rPr>
           <w:rFonts w:ascii="Arial" w:hAnsi="Arial" w:cs="Arial"/>
@@ -2018,7 +4241,7 @@
           <w:sz w:val="28"/>
           <w:szCs w:val="28"/>
         </w:rPr>
-        <w:t>3</w:t>
+        <w:t xml:space="preserve">. </w:t>
       </w:r>
       <w:r>
         <w:rPr>
@@ -2029,42 +4252,9 @@
           <w:sz w:val="28"/>
           <w:szCs w:val="28"/>
         </w:rPr>
-        <w:t>.</w:t>
-      </w:r>
-      <w:r>
-        <w:rPr>
-          <w:rFonts w:ascii="Arial" w:hAnsi="Arial" w:cs="Arial"/>
-          <w:b/>
-          <w:bCs/>
-          <w:color w:val="EE0000"/>
-          <w:sz w:val="28"/>
-          <w:szCs w:val="28"/>
-        </w:rPr>
-        <w:t>2</w:t>
-      </w:r>
-      <w:r>
-        <w:rPr>
-          <w:rFonts w:ascii="Arial" w:hAnsi="Arial" w:cs="Arial"/>
-          <w:b/>
-          <w:bCs/>
-          <w:color w:val="EE0000"/>
-          <w:sz w:val="28"/>
-          <w:szCs w:val="28"/>
-        </w:rPr>
-        <w:t xml:space="preserve">. </w:t>
-      </w:r>
-      <w:r>
-        <w:rPr>
-          <w:rFonts w:ascii="Arial" w:hAnsi="Arial" w:cs="Arial"/>
-          <w:b/>
-          <w:bCs/>
-          <w:color w:val="EE0000"/>
-          <w:sz w:val="28"/>
-          <w:szCs w:val="28"/>
-        </w:rPr>
         <w:t>Requirement Analysis</w:t>
       </w:r>
-      <w:bookmarkEnd w:id="5"/>
+      <w:bookmarkEnd w:id="12"/>
     </w:p>
     <w:p>
       <w:pPr>
@@ -2079,7 +4269,7 @@
           <w:szCs w:val="24"/>
         </w:rPr>
       </w:pPr>
-      <w:bookmarkStart w:id="6" w:name="_Toc226030426"/>
+      <w:bookmarkStart w:id="13" w:name="_Toc226899733"/>
       <w:r>
         <w:rPr>
           <w:rFonts w:ascii="Arial" w:hAnsi="Arial" w:cs="Arial"/>
@@ -2102,7 +4292,7 @@
         </w:rPr>
         <w:t xml:space="preserve"> Stakeholders and Roles</w:t>
       </w:r>
-      <w:bookmarkEnd w:id="6"/>
+      <w:bookmarkEnd w:id="13"/>
     </w:p>
     <w:p>
       <w:pPr>
@@ -2278,7 +4468,7 @@
           <w:szCs w:val="24"/>
         </w:rPr>
       </w:pPr>
-      <w:bookmarkStart w:id="7" w:name="_Toc226030427"/>
+      <w:bookmarkStart w:id="14" w:name="_Toc226899734"/>
       <w:r>
         <w:rPr>
           <w:rFonts w:ascii="Arial" w:hAnsi="Arial" w:cs="Arial"/>
@@ -2288,7 +4478,6 @@
           <w:sz w:val="24"/>
           <w:szCs w:val="24"/>
         </w:rPr>
-        <w:lastRenderedPageBreak/>
         <w:t>ii.</w:t>
       </w:r>
       <w:r>
@@ -2313,7 +4502,7 @@
         </w:rPr>
         <w:t>s</w:t>
       </w:r>
-      <w:bookmarkEnd w:id="7"/>
+      <w:bookmarkEnd w:id="14"/>
     </w:p>
     <w:p>
       <w:pPr>
@@ -2497,6 +4686,7 @@
         <w:rPr>
           <w:rFonts w:ascii="Arial" w:hAnsi="Arial" w:cs="Arial"/>
         </w:rPr>
+        <w:lastRenderedPageBreak/>
         <w:t>The system shall automatically verify course availability before confirming enrolment.</w:t>
       </w:r>
     </w:p>
@@ -2735,7 +4925,6 @@
         <w:rPr>
           <w:rFonts w:ascii="Arial" w:hAnsi="Arial" w:cs="Arial"/>
         </w:rPr>
-        <w:lastRenderedPageBreak/>
         <w:t>The system shall allow Finance Department staff to process tuition and course-related payments.</w:t>
       </w:r>
     </w:p>
@@ -2882,6 +5071,7 @@
         <w:rPr>
           <w:rFonts w:ascii="Arial" w:hAnsi="Arial" w:cs="Arial"/>
         </w:rPr>
+        <w:lastRenderedPageBreak/>
         <w:t>User Access and Security</w:t>
       </w:r>
       <w:r>
@@ -3010,7 +5200,7 @@
           <w:szCs w:val="24"/>
         </w:rPr>
       </w:pPr>
-      <w:bookmarkStart w:id="8" w:name="_Toc226030428"/>
+      <w:bookmarkStart w:id="15" w:name="_Toc226899735"/>
       <w:r>
         <w:rPr>
           <w:rFonts w:ascii="Arial" w:hAnsi="Arial" w:cs="Arial"/>
@@ -3088,7 +5278,7 @@
         </w:rPr>
         <w:t>s</w:t>
       </w:r>
-      <w:bookmarkEnd w:id="8"/>
+      <w:bookmarkEnd w:id="15"/>
     </w:p>
     <w:p>
       <w:pPr>
@@ -3244,7 +5434,6 @@
         <w:rPr>
           <w:rFonts w:ascii="Arial" w:hAnsi="Arial" w:cs="Arial"/>
         </w:rPr>
-        <w:lastRenderedPageBreak/>
         <w:t xml:space="preserve">The system shall support at least </w:t>
       </w:r>
       <w:r>
@@ -3455,6 +5644,7 @@
         <w:rPr>
           <w:rFonts w:ascii="Arial" w:hAnsi="Arial" w:cs="Arial"/>
         </w:rPr>
+        <w:lastRenderedPageBreak/>
         <w:t>The system shall maintain at least 99.5% uptime during enrolment periods.</w:t>
       </w:r>
     </w:p>
@@ -3777,7 +5967,6 @@
         <w:rPr>
           <w:rFonts w:ascii="Arial" w:hAnsi="Arial" w:cs="Arial"/>
         </w:rPr>
-        <w:lastRenderedPageBreak/>
         <w:t>The system shall support integration with existing AUT systems (e.g., student database, finance system).</w:t>
       </w:r>
     </w:p>
@@ -3832,7 +6021,7 @@
           <w:szCs w:val="32"/>
         </w:rPr>
       </w:pPr>
-      <w:bookmarkStart w:id="9" w:name="_Toc226030429"/>
+      <w:bookmarkStart w:id="16" w:name="_Toc226899736"/>
       <w:r>
         <w:rPr>
           <w:rFonts w:ascii="Arial" w:hAnsi="Arial" w:cs="Arial"/>
@@ -3867,7 +6056,7 @@
         </w:rPr>
         <w:t>ase diagram</w:t>
       </w:r>
-      <w:bookmarkEnd w:id="9"/>
+      <w:bookmarkEnd w:id="16"/>
     </w:p>
     <w:p>
       <w:pPr>
@@ -3909,7 +6098,7 @@
           <w:szCs w:val="32"/>
         </w:rPr>
       </w:pPr>
-      <w:bookmarkStart w:id="10" w:name="_Toc226030430"/>
+      <w:bookmarkStart w:id="17" w:name="_Toc226899737"/>
       <w:r>
         <w:rPr>
           <w:rFonts w:ascii="Arial" w:hAnsi="Arial" w:cs="Arial"/>
@@ -3933,7 +6122,7 @@
         </w:rPr>
         <w:t xml:space="preserve"> diagram</w:t>
       </w:r>
-      <w:bookmarkEnd w:id="10"/>
+      <w:bookmarkEnd w:id="17"/>
     </w:p>
     <w:p>
       <w:pPr>
@@ -3975,7 +6164,7 @@
           <w:szCs w:val="32"/>
         </w:rPr>
       </w:pPr>
-      <w:bookmarkStart w:id="11" w:name="_Toc226030431"/>
+      <w:bookmarkStart w:id="18" w:name="_Toc226899738"/>
       <w:r>
         <w:rPr>
           <w:rFonts w:ascii="Arial" w:hAnsi="Arial" w:cs="Arial"/>
@@ -3988,7 +6177,7 @@
         <w:lastRenderedPageBreak/>
         <w:t>C# Implementation</w:t>
       </w:r>
-      <w:bookmarkEnd w:id="11"/>
+      <w:bookmarkEnd w:id="18"/>
     </w:p>
     <w:p>
       <w:pPr>
@@ -4039,7 +6228,7 @@
           <w:szCs w:val="32"/>
         </w:rPr>
       </w:pPr>
-      <w:bookmarkStart w:id="12" w:name="_Toc226030432"/>
+      <w:bookmarkStart w:id="19" w:name="_Toc226899739"/>
       <w:r>
         <w:rPr>
           <w:rFonts w:ascii="Arial" w:hAnsi="Arial" w:cs="Arial"/>
@@ -4063,7 +6252,7 @@
         </w:rPr>
         <w:t>onclusion</w:t>
       </w:r>
-      <w:bookmarkEnd w:id="12"/>
+      <w:bookmarkEnd w:id="19"/>
     </w:p>
     <w:p>
       <w:pPr>
@@ -4118,7 +6307,7 @@
           <w:szCs w:val="32"/>
         </w:rPr>
       </w:pPr>
-      <w:bookmarkStart w:id="13" w:name="_Toc226030433"/>
+      <w:bookmarkStart w:id="20" w:name="_Toc226899740"/>
       <w:r>
         <w:rPr>
           <w:rFonts w:ascii="Arial" w:hAnsi="Arial" w:cs="Arial"/>
@@ -4131,7 +6320,312 @@
         <w:lastRenderedPageBreak/>
         <w:t>References</w:t>
       </w:r>
-      <w:bookmarkEnd w:id="13"/>
+      <w:bookmarkEnd w:id="20"/>
+    </w:p>
+    <w:p>
+      <w:pPr>
+        <w:spacing w:line="360" w:lineRule="auto"/>
+        <w:ind w:left="567" w:hanging="567"/>
+        <w:rPr>
+          <w:rFonts w:ascii="Arial" w:hAnsi="Arial" w:cs="Arial"/>
+        </w:rPr>
+      </w:pPr>
+      <w:r>
+        <w:rPr>
+          <w:rFonts w:ascii="Arial" w:hAnsi="Arial" w:cs="Arial"/>
+        </w:rPr>
+        <w:t>AUT (n.d.</w:t>
+      </w:r>
+      <w:r>
+        <w:rPr>
+          <w:rFonts w:ascii="Arial" w:hAnsi="Arial" w:cs="Arial"/>
+        </w:rPr>
+        <w:t>-a</w:t>
+      </w:r>
+      <w:r>
+        <w:rPr>
+          <w:rFonts w:ascii="Arial" w:hAnsi="Arial" w:cs="Arial"/>
+        </w:rPr>
+        <w:t xml:space="preserve">). </w:t>
+      </w:r>
+      <w:r>
+        <w:rPr>
+          <w:rFonts w:ascii="Arial" w:hAnsi="Arial" w:cs="Arial"/>
+          <w:i/>
+          <w:iCs/>
+        </w:rPr>
+        <w:t>Facts and figures about AUT</w:t>
+      </w:r>
+      <w:r>
+        <w:rPr>
+          <w:rFonts w:ascii="Arial" w:hAnsi="Arial" w:cs="Arial"/>
+        </w:rPr>
+        <w:t xml:space="preserve">. </w:t>
+      </w:r>
+      <w:hyperlink r:id="rId9" w:history="1">
+        <w:r>
+          <w:rPr>
+            <w:rStyle w:val="Hyperlink"/>
+            <w:rFonts w:ascii="Arial" w:hAnsi="Arial" w:cs="Arial"/>
+          </w:rPr>
+          <w:t>https://www.aut.ac.nz/about/auts-leadership/fact-and-figures-about-aut</w:t>
+        </w:r>
+      </w:hyperlink>
+    </w:p>
+    <w:p>
+      <w:pPr>
+        <w:spacing w:line="360" w:lineRule="auto"/>
+        <w:ind w:left="567" w:hanging="567"/>
+        <w:rPr>
+          <w:rFonts w:ascii="Arial" w:hAnsi="Arial" w:cs="Arial"/>
+        </w:rPr>
+      </w:pPr>
+      <w:r>
+        <w:rPr>
+          <w:rFonts w:ascii="Arial" w:hAnsi="Arial" w:cs="Arial"/>
+        </w:rPr>
+        <w:t xml:space="preserve">AUT (n.d.-b). </w:t>
+      </w:r>
+      <w:r>
+        <w:rPr>
+          <w:rFonts w:ascii="Arial" w:hAnsi="Arial" w:cs="Arial"/>
+          <w:i/>
+          <w:iCs/>
+        </w:rPr>
+        <w:t>AUT faculties and schools</w:t>
+      </w:r>
+      <w:r>
+        <w:rPr>
+          <w:rFonts w:ascii="Arial" w:hAnsi="Arial" w:cs="Arial"/>
+        </w:rPr>
+        <w:t>.</w:t>
+      </w:r>
+      <w:r>
+        <w:t xml:space="preserve"> </w:t>
+      </w:r>
+      <w:hyperlink r:id="rId10" w:history="1">
+        <w:r>
+          <w:rPr>
+            <w:rStyle w:val="Hyperlink"/>
+            <w:rFonts w:ascii="Arial" w:hAnsi="Arial" w:cs="Arial"/>
+          </w:rPr>
+          <w:t>https://www.aut.ac.nz/about/faculties-and-schools</w:t>
+        </w:r>
+      </w:hyperlink>
+    </w:p>
+    <w:p>
+      <w:pPr>
+        <w:spacing w:line="360" w:lineRule="auto"/>
+        <w:ind w:left="567" w:hanging="567"/>
+        <w:rPr>
+          <w:rFonts w:ascii="Arial" w:hAnsi="Arial" w:cs="Arial"/>
+        </w:rPr>
+      </w:pPr>
+      <w:r>
+        <w:rPr>
+          <w:rFonts w:ascii="Arial" w:hAnsi="Arial" w:cs="Arial"/>
+        </w:rPr>
+        <w:t>AUT (n.d.-</w:t>
+      </w:r>
+      <w:r>
+        <w:rPr>
+          <w:rFonts w:ascii="Arial" w:hAnsi="Arial" w:cs="Arial"/>
+        </w:rPr>
+        <w:t>c</w:t>
+      </w:r>
+      <w:r>
+        <w:rPr>
+          <w:rFonts w:ascii="Arial" w:hAnsi="Arial" w:cs="Arial"/>
+        </w:rPr>
+        <w:t xml:space="preserve">). </w:t>
+      </w:r>
+      <w:r>
+        <w:rPr>
+          <w:rFonts w:ascii="Arial" w:hAnsi="Arial" w:cs="Arial"/>
+          <w:i/>
+          <w:iCs/>
+        </w:rPr>
+        <w:t>Student services online</w:t>
+      </w:r>
+      <w:r>
+        <w:rPr>
+          <w:rFonts w:ascii="Arial" w:hAnsi="Arial" w:cs="Arial"/>
+        </w:rPr>
+        <w:t xml:space="preserve">. </w:t>
+      </w:r>
+      <w:hyperlink r:id="rId11" w:history="1">
+        <w:r>
+          <w:rPr>
+            <w:rStyle w:val="Hyperlink"/>
+            <w:rFonts w:ascii="Arial" w:hAnsi="Arial" w:cs="Arial"/>
+          </w:rPr>
+          <w:t>https://www.aut.ac.nz/student-life/studying/student-services-online</w:t>
+        </w:r>
+      </w:hyperlink>
+    </w:p>
+    <w:p>
+      <w:pPr>
+        <w:spacing w:line="360" w:lineRule="auto"/>
+        <w:ind w:left="567" w:hanging="567"/>
+        <w:rPr>
+          <w:rFonts w:ascii="Arial" w:hAnsi="Arial" w:cs="Arial"/>
+          <w:i/>
+          <w:iCs/>
+        </w:rPr>
+      </w:pPr>
+      <w:r>
+        <w:rPr>
+          <w:rFonts w:ascii="Arial" w:hAnsi="Arial" w:cs="Arial"/>
+        </w:rPr>
+        <w:t>AUT (n.d.-</w:t>
+      </w:r>
+      <w:r>
+        <w:rPr>
+          <w:rFonts w:ascii="Arial" w:hAnsi="Arial" w:cs="Arial"/>
+        </w:rPr>
+        <w:t>d</w:t>
+      </w:r>
+      <w:r>
+        <w:rPr>
+          <w:rFonts w:ascii="Arial" w:hAnsi="Arial" w:cs="Arial"/>
+        </w:rPr>
+        <w:t xml:space="preserve">). </w:t>
+      </w:r>
+      <w:r>
+        <w:rPr>
+          <w:rFonts w:ascii="Arial" w:hAnsi="Arial" w:cs="Arial"/>
+          <w:i/>
+          <w:iCs/>
+        </w:rPr>
+        <w:t xml:space="preserve">Enrolling in courses and classes. </w:t>
+      </w:r>
+      <w:hyperlink r:id="rId12" w:history="1">
+        <w:r>
+          <w:rPr>
+            <w:rStyle w:val="Hyperlink"/>
+            <w:rFonts w:ascii="Arial" w:hAnsi="Arial" w:cs="Arial"/>
+          </w:rPr>
+          <w:t>https://www.aut.ac.nz/student-life/studying/enrolling-in-courses-and-classes</w:t>
+        </w:r>
+      </w:hyperlink>
+    </w:p>
+    <w:p>
+      <w:pPr>
+        <w:spacing w:line="360" w:lineRule="auto"/>
+        <w:ind w:left="567" w:hanging="567"/>
+        <w:rPr>
+          <w:rFonts w:ascii="Arial" w:hAnsi="Arial" w:cs="Arial"/>
+        </w:rPr>
+      </w:pPr>
+      <w:r>
+        <w:rPr>
+          <w:rFonts w:ascii="Arial" w:hAnsi="Arial" w:cs="Arial"/>
+        </w:rPr>
+        <w:t>AUT (n.d.-</w:t>
+      </w:r>
+      <w:r>
+        <w:rPr>
+          <w:rFonts w:ascii="Arial" w:hAnsi="Arial" w:cs="Arial"/>
+        </w:rPr>
+        <w:t>e</w:t>
+      </w:r>
+      <w:r>
+        <w:rPr>
+          <w:rFonts w:ascii="Arial" w:hAnsi="Arial" w:cs="Arial"/>
+        </w:rPr>
+        <w:t xml:space="preserve">). </w:t>
+      </w:r>
+      <w:r>
+        <w:rPr>
+          <w:rFonts w:ascii="Arial" w:hAnsi="Arial" w:cs="Arial"/>
+          <w:i/>
+          <w:iCs/>
+        </w:rPr>
+        <w:t>IT services</w:t>
+      </w:r>
+      <w:r>
+        <w:rPr>
+          <w:rFonts w:ascii="Arial" w:hAnsi="Arial" w:cs="Arial"/>
+        </w:rPr>
+        <w:t xml:space="preserve">. </w:t>
+      </w:r>
+      <w:hyperlink r:id="rId13" w:history="1">
+        <w:r>
+          <w:rPr>
+            <w:rStyle w:val="Hyperlink"/>
+            <w:rFonts w:ascii="Arial" w:hAnsi="Arial" w:cs="Arial"/>
+          </w:rPr>
+          <w:t>https://www.aut.ac.nz/student-life/studying/it-services</w:t>
+        </w:r>
+      </w:hyperlink>
+    </w:p>
+    <w:p>
+      <w:pPr>
+        <w:spacing w:line="360" w:lineRule="auto"/>
+        <w:ind w:left="567" w:hanging="567"/>
+        <w:rPr>
+          <w:rFonts w:ascii="Arial" w:hAnsi="Arial" w:cs="Arial"/>
+        </w:rPr>
+      </w:pPr>
+      <w:r>
+        <w:rPr>
+          <w:rFonts w:ascii="Arial" w:hAnsi="Arial" w:cs="Arial"/>
+        </w:rPr>
+        <w:t>AUT (n.d.-</w:t>
+      </w:r>
+      <w:r>
+        <w:rPr>
+          <w:rFonts w:ascii="Arial" w:hAnsi="Arial" w:cs="Arial"/>
+        </w:rPr>
+        <w:t>f</w:t>
+      </w:r>
+      <w:r>
+        <w:rPr>
+          <w:rFonts w:ascii="Arial" w:hAnsi="Arial" w:cs="Arial"/>
+        </w:rPr>
+        <w:t xml:space="preserve">). </w:t>
+      </w:r>
+      <w:r>
+        <w:rPr>
+          <w:rFonts w:ascii="Arial" w:hAnsi="Arial" w:cs="Arial"/>
+          <w:i/>
+          <w:iCs/>
+        </w:rPr>
+        <w:t>Financial services and support for students</w:t>
+      </w:r>
+      <w:r>
+        <w:rPr>
+          <w:rFonts w:ascii="Arial" w:hAnsi="Arial" w:cs="Arial"/>
+        </w:rPr>
+        <w:t xml:space="preserve">. </w:t>
+      </w:r>
+      <w:hyperlink r:id="rId14" w:history="1">
+        <w:r>
+          <w:rPr>
+            <w:rStyle w:val="Hyperlink"/>
+            <w:rFonts w:ascii="Arial" w:hAnsi="Arial" w:cs="Arial"/>
+          </w:rPr>
+          <w:t>https://www.aut.ac.nz/student-life/support-services/student-hub/financial-support</w:t>
+        </w:r>
+      </w:hyperlink>
+    </w:p>
+    <w:p>
+      <w:pPr>
+        <w:spacing w:line="360" w:lineRule="auto"/>
+        <w:ind w:left="567" w:hanging="567"/>
+        <w:rPr>
+          <w:rFonts w:ascii="Arial" w:hAnsi="Arial" w:cs="Arial"/>
+        </w:rPr>
+      </w:pPr>
+    </w:p>
+    <w:p>
+      <w:pPr>
+        <w:spacing w:line="360" w:lineRule="auto"/>
+        <w:ind w:left="567" w:hanging="567"/>
+        <w:rPr>
+          <w:rFonts w:ascii="Arial" w:hAnsi="Arial" w:cs="Arial"/>
+        </w:rPr>
+      </w:pPr>
     </w:p>
     <w:p>
       <w:pPr>
@@ -4160,17 +6654,8 @@
         </w:rPr>
       </w:pPr>
     </w:p>
-    <w:p>
-      <w:pPr>
-        <w:spacing w:line="360" w:lineRule="auto"/>
-        <w:ind w:left="284"/>
-        <w:rPr>
-          <w:rFonts w:ascii="Arial" w:hAnsi="Arial" w:cs="Arial"/>
-        </w:rPr>
-      </w:pPr>
-    </w:p>
     <w:sectPr>
-      <w:footerReference w:type="default" r:id="rId9"/>
+      <w:footerReference w:type="default" r:id="rId15"/>
       <w:pgSz w:w="12240" w:h="15840"/>
       <w:pgMar w:top="1440" w:right="1440" w:bottom="1440" w:left="1440" w:header="708" w:footer="708" w:gutter="0"/>
       <w:pgNumType w:start="1"/>
@@ -4321,6 +6806,119 @@
 <file path=word/numbering.xml><?xml version="1.0" encoding="utf-8"?>
 <w:numbering xmlns:wpc="http://schemas.microsoft.com/office/word/2010/wordprocessingCanvas" xmlns:cx="http://schemas.microsoft.com/office/drawing/2014/chartex" xmlns:cx1="http://schemas.microsoft.com/office/drawing/2015/9/8/chartex" xmlns:cx2="http://schemas.microsoft.com/office/drawing/2015/10/21/chartex" xmlns:cx3="http://schemas.microsoft.com/office/drawing/2016/5/9/chartex" xmlns:cx4="http://schemas.microsoft.com/office/drawing/2016/5/10/chartex" xmlns:cx5="http://schemas.microsoft.com/office/drawing/2016/5/11/chartex" xmlns:cx6="http://schemas.microsoft.com/office/drawing/2016/5/12/chartex" xmlns:cx7="http://schemas.microsoft.com/office/drawing/2016/5/13/chartex" xmlns:cx8="http://schemas.microsoft.com/office/drawing/2016/5/14/chartex" xmlns:mc="http://schemas.openxmlformats.org/markup-compatibility/2006" xmlns:aink="http://schemas.microsoft.com/office/drawing/2016/ink" xmlns:am3d="http://schemas.microsoft.com/office/drawing/2017/model3d" xmlns:o="urn:schemas-microsoft-com:office:office" xmlns:oel="http://schemas.microsoft.com/office/2019/extlst" xmlns:r="http://schemas.openxmlformats.org/officeDocument/2006/relationships" xmlns:m="http://schemas.openxmlformats.org/officeDocument/2006/math" xmlns:v="urn:schemas-microsoft-com:vml" xmlns:wp14="http://schemas.microsoft.com/office/word/2010/wordprocessingDrawing" xmlns:wp="http://schemas.openxmlformats.org/drawingml/2006/wordprocessingDrawing" xmlns:w10="urn:schemas-microsoft-com:office:word" xmlns:w="http://schemas.openxmlformats.org/wordprocessingml/2006/main" xmlns:w14="http://schemas.microsoft.com/office/word/2010/wordml" xmlns:w15="http://schemas.microsoft.com/office/word/2012/wordml" xmlns:w16cex="http://schemas.microsoft.com/office/word/2018/wordml/cex" xmlns:w16cid="http://schemas.microsoft.com/office/word/2016/wordml/cid" xmlns:w16="http://schemas.microsoft.com/office/word/2018/wordml" xmlns:w16du="http://schemas.microsoft.com/office/word/2023/wordml/word16du" xmlns:w16sdtdh="http://schemas.microsoft.com/office/word/2020/wordml/sdtdatahash" xmlns:w16sdtfl="http://schemas.microsoft.com/office/word/2024/wordml/sdtformatlock" xmlns:w16se="http://schemas.microsoft.com/office/word/2015/wordml/symex" xmlns:wpg="http://schemas.microsoft.com/office/word/2010/wordprocessingGroup" xmlns:wpi="http://schemas.microsoft.com/office/word/2010/wordprocessingInk" xmlns:wne="http://schemas.microsoft.com/office/word/2006/wordml" xmlns:wps="http://schemas.microsoft.com/office/word/2010/wordprocessingShape" mc:Ignorable="w14 w15 w16se w16cid w16 w16cex w16sdtdh w16sdtfl w16du wp14">
   <w:abstractNum w:abstractNumId="0" w15:restartNumberingAfterBreak="0">
+    <w:nsid w:val="00A147AC"/>
+    <w:multiLevelType w:val="hybridMultilevel"/>
+    <w:tmpl w:val="A27A89E8"/>
+    <w:lvl w:ilvl="0" w:tplc="04090001">
+      <w:start w:val="1"/>
+      <w:numFmt w:val="bullet"/>
+      <w:lvlText w:val=""/>
+      <w:lvlJc w:val="left"/>
+      <w:pPr>
+        <w:ind w:left="1287" w:hanging="360"/>
+      </w:pPr>
+      <w:rPr>
+        <w:rFonts w:ascii="Symbol" w:hAnsi="Symbol" w:hint="default"/>
+      </w:rPr>
+    </w:lvl>
+    <w:lvl w:ilvl="1" w:tplc="04090003" w:tentative="1">
+      <w:start w:val="1"/>
+      <w:numFmt w:val="bullet"/>
+      <w:lvlText w:val="o"/>
+      <w:lvlJc w:val="left"/>
+      <w:pPr>
+        <w:ind w:left="2007" w:hanging="360"/>
+      </w:pPr>
+      <w:rPr>
+        <w:rFonts w:ascii="Courier New" w:hAnsi="Courier New" w:cs="Courier New" w:hint="default"/>
+      </w:rPr>
+    </w:lvl>
+    <w:lvl w:ilvl="2" w:tplc="04090005" w:tentative="1">
+      <w:start w:val="1"/>
+      <w:numFmt w:val="bullet"/>
+      <w:lvlText w:val=""/>
+      <w:lvlJc w:val="left"/>
+      <w:pPr>
+        <w:ind w:left="2727" w:hanging="360"/>
+      </w:pPr>
+      <w:rPr>
+        <w:rFonts w:ascii="Wingdings" w:hAnsi="Wingdings" w:hint="default"/>
+      </w:rPr>
+    </w:lvl>
+    <w:lvl w:ilvl="3" w:tplc="04090001" w:tentative="1">
+      <w:start w:val="1"/>
+      <w:numFmt w:val="bullet"/>
+      <w:lvlText w:val=""/>
+      <w:lvlJc w:val="left"/>
+      <w:pPr>
+        <w:ind w:left="3447" w:hanging="360"/>
+      </w:pPr>
+      <w:rPr>
+        <w:rFonts w:ascii="Symbol" w:hAnsi="Symbol" w:hint="default"/>
+      </w:rPr>
+    </w:lvl>
+    <w:lvl w:ilvl="4" w:tplc="04090003" w:tentative="1">
+      <w:start w:val="1"/>
+      <w:numFmt w:val="bullet"/>
+      <w:lvlText w:val="o"/>
+      <w:lvlJc w:val="left"/>
+      <w:pPr>
+        <w:ind w:left="4167" w:hanging="360"/>
+      </w:pPr>
+      <w:rPr>
+        <w:rFonts w:ascii="Courier New" w:hAnsi="Courier New" w:cs="Courier New" w:hint="default"/>
+      </w:rPr>
+    </w:lvl>
+    <w:lvl w:ilvl="5" w:tplc="04090005" w:tentative="1">
+      <w:start w:val="1"/>
+      <w:numFmt w:val="bullet"/>
+      <w:lvlText w:val=""/>
+      <w:lvlJc w:val="left"/>
+      <w:pPr>
+        <w:ind w:left="4887" w:hanging="360"/>
+      </w:pPr>
+      <w:rPr>
+        <w:rFonts w:ascii="Wingdings" w:hAnsi="Wingdings" w:hint="default"/>
+      </w:rPr>
+    </w:lvl>
+    <w:lvl w:ilvl="6" w:tplc="04090001" w:tentative="1">
+      <w:start w:val="1"/>
+      <w:numFmt w:val="bullet"/>
+      <w:lvlText w:val=""/>
+      <w:lvlJc w:val="left"/>
+      <w:pPr>
+        <w:ind w:left="5607" w:hanging="360"/>
+      </w:pPr>
+      <w:rPr>
+        <w:rFonts w:ascii="Symbol" w:hAnsi="Symbol" w:hint="default"/>
+      </w:rPr>
+    </w:lvl>
+    <w:lvl w:ilvl="7" w:tplc="04090003" w:tentative="1">
+      <w:start w:val="1"/>
+      <w:numFmt w:val="bullet"/>
+      <w:lvlText w:val="o"/>
+      <w:lvlJc w:val="left"/>
+      <w:pPr>
+        <w:ind w:left="6327" w:hanging="360"/>
+      </w:pPr>
+      <w:rPr>
+        <w:rFonts w:ascii="Courier New" w:hAnsi="Courier New" w:cs="Courier New" w:hint="default"/>
+      </w:rPr>
+    </w:lvl>
+    <w:lvl w:ilvl="8" w:tplc="04090005" w:tentative="1">
+      <w:start w:val="1"/>
+      <w:numFmt w:val="bullet"/>
+      <w:lvlText w:val=""/>
+      <w:lvlJc w:val="left"/>
+      <w:pPr>
+        <w:ind w:left="7047" w:hanging="360"/>
+      </w:pPr>
+      <w:rPr>
+        <w:rFonts w:ascii="Wingdings" w:hAnsi="Wingdings" w:hint="default"/>
+      </w:rPr>
+    </w:lvl>
+  </w:abstractNum>
+  <w:abstractNum w:abstractNumId="1" w15:restartNumberingAfterBreak="0">
     <w:nsid w:val="0B0D1D50"/>
     <w:multiLevelType w:val="hybridMultilevel"/>
     <w:tmpl w:val="751C5454"/>
@@ -4409,7 +7007,7 @@
       </w:pPr>
     </w:lvl>
   </w:abstractNum>
-  <w:abstractNum w:abstractNumId="1" w15:restartNumberingAfterBreak="0">
+  <w:abstractNum w:abstractNumId="2" w15:restartNumberingAfterBreak="0">
     <w:nsid w:val="2EC15A1A"/>
     <w:multiLevelType w:val="hybridMultilevel"/>
     <w:tmpl w:val="C5665E78"/>
@@ -4495,7 +7093,7 @@
       </w:pPr>
     </w:lvl>
   </w:abstractNum>
-  <w:abstractNum w:abstractNumId="2" w15:restartNumberingAfterBreak="0">
+  <w:abstractNum w:abstractNumId="3" w15:restartNumberingAfterBreak="0">
     <w:nsid w:val="443143D4"/>
     <w:multiLevelType w:val="hybridMultilevel"/>
     <w:tmpl w:val="BC7C5D7E"/>
@@ -4608,7 +7206,7 @@
       </w:rPr>
     </w:lvl>
   </w:abstractNum>
-  <w:abstractNum w:abstractNumId="3" w15:restartNumberingAfterBreak="0">
+  <w:abstractNum w:abstractNumId="4" w15:restartNumberingAfterBreak="0">
     <w:nsid w:val="4E9208C8"/>
     <w:multiLevelType w:val="hybridMultilevel"/>
     <w:tmpl w:val="054A6BDE"/>
@@ -4721,7 +7319,7 @@
       </w:rPr>
     </w:lvl>
   </w:abstractNum>
-  <w:abstractNum w:abstractNumId="4" w15:restartNumberingAfterBreak="0">
+  <w:abstractNum w:abstractNumId="5" w15:restartNumberingAfterBreak="0">
     <w:nsid w:val="50B90995"/>
     <w:multiLevelType w:val="hybridMultilevel"/>
     <w:tmpl w:val="F4EC91BE"/>
@@ -4810,7 +7408,120 @@
       </w:pPr>
     </w:lvl>
   </w:abstractNum>
-  <w:abstractNum w:abstractNumId="5" w15:restartNumberingAfterBreak="0">
+  <w:abstractNum w:abstractNumId="6" w15:restartNumberingAfterBreak="0">
+    <w:nsid w:val="5729116B"/>
+    <w:multiLevelType w:val="hybridMultilevel"/>
+    <w:tmpl w:val="BB74E996"/>
+    <w:lvl w:ilvl="0" w:tplc="04090001">
+      <w:start w:val="1"/>
+      <w:numFmt w:val="bullet"/>
+      <w:lvlText w:val=""/>
+      <w:lvlJc w:val="left"/>
+      <w:pPr>
+        <w:ind w:left="1287" w:hanging="360"/>
+      </w:pPr>
+      <w:rPr>
+        <w:rFonts w:ascii="Symbol" w:hAnsi="Symbol" w:hint="default"/>
+      </w:rPr>
+    </w:lvl>
+    <w:lvl w:ilvl="1" w:tplc="04090003" w:tentative="1">
+      <w:start w:val="1"/>
+      <w:numFmt w:val="bullet"/>
+      <w:lvlText w:val="o"/>
+      <w:lvlJc w:val="left"/>
+      <w:pPr>
+        <w:ind w:left="2007" w:hanging="360"/>
+      </w:pPr>
+      <w:rPr>
+        <w:rFonts w:ascii="Courier New" w:hAnsi="Courier New" w:cs="Courier New" w:hint="default"/>
+      </w:rPr>
+    </w:lvl>
+    <w:lvl w:ilvl="2" w:tplc="04090005" w:tentative="1">
+      <w:start w:val="1"/>
+      <w:numFmt w:val="bullet"/>
+      <w:lvlText w:val=""/>
+      <w:lvlJc w:val="left"/>
+      <w:pPr>
+        <w:ind w:left="2727" w:hanging="360"/>
+      </w:pPr>
+      <w:rPr>
+        <w:rFonts w:ascii="Wingdings" w:hAnsi="Wingdings" w:hint="default"/>
+      </w:rPr>
+    </w:lvl>
+    <w:lvl w:ilvl="3" w:tplc="04090001" w:tentative="1">
+      <w:start w:val="1"/>
+      <w:numFmt w:val="bullet"/>
+      <w:lvlText w:val=""/>
+      <w:lvlJc w:val="left"/>
+      <w:pPr>
+        <w:ind w:left="3447" w:hanging="360"/>
+      </w:pPr>
+      <w:rPr>
+        <w:rFonts w:ascii="Symbol" w:hAnsi="Symbol" w:hint="default"/>
+      </w:rPr>
+    </w:lvl>
+    <w:lvl w:ilvl="4" w:tplc="04090003" w:tentative="1">
+      <w:start w:val="1"/>
+      <w:numFmt w:val="bullet"/>
+      <w:lvlText w:val="o"/>
+      <w:lvlJc w:val="left"/>
+      <w:pPr>
+        <w:ind w:left="4167" w:hanging="360"/>
+      </w:pPr>
+      <w:rPr>
+        <w:rFonts w:ascii="Courier New" w:hAnsi="Courier New" w:cs="Courier New" w:hint="default"/>
+      </w:rPr>
+    </w:lvl>
+    <w:lvl w:ilvl="5" w:tplc="04090005" w:tentative="1">
+      <w:start w:val="1"/>
+      <w:numFmt w:val="bullet"/>
+      <w:lvlText w:val=""/>
+      <w:lvlJc w:val="left"/>
+      <w:pPr>
+        <w:ind w:left="4887" w:hanging="360"/>
+      </w:pPr>
+      <w:rPr>
+        <w:rFonts w:ascii="Wingdings" w:hAnsi="Wingdings" w:hint="default"/>
+      </w:rPr>
+    </w:lvl>
+    <w:lvl w:ilvl="6" w:tplc="04090001" w:tentative="1">
+      <w:start w:val="1"/>
+      <w:numFmt w:val="bullet"/>
+      <w:lvlText w:val=""/>
+      <w:lvlJc w:val="left"/>
+      <w:pPr>
+        <w:ind w:left="5607" w:hanging="360"/>
+      </w:pPr>
+      <w:rPr>
+        <w:rFonts w:ascii="Symbol" w:hAnsi="Symbol" w:hint="default"/>
+      </w:rPr>
+    </w:lvl>
+    <w:lvl w:ilvl="7" w:tplc="04090003" w:tentative="1">
+      <w:start w:val="1"/>
+      <w:numFmt w:val="bullet"/>
+      <w:lvlText w:val="o"/>
+      <w:lvlJc w:val="left"/>
+      <w:pPr>
+        <w:ind w:left="6327" w:hanging="360"/>
+      </w:pPr>
+      <w:rPr>
+        <w:rFonts w:ascii="Courier New" w:hAnsi="Courier New" w:cs="Courier New" w:hint="default"/>
+      </w:rPr>
+    </w:lvl>
+    <w:lvl w:ilvl="8" w:tplc="04090005" w:tentative="1">
+      <w:start w:val="1"/>
+      <w:numFmt w:val="bullet"/>
+      <w:lvlText w:val=""/>
+      <w:lvlJc w:val="left"/>
+      <w:pPr>
+        <w:ind w:left="7047" w:hanging="360"/>
+      </w:pPr>
+      <w:rPr>
+        <w:rFonts w:ascii="Wingdings" w:hAnsi="Wingdings" w:hint="default"/>
+      </w:rPr>
+    </w:lvl>
+  </w:abstractNum>
+  <w:abstractNum w:abstractNumId="7" w15:restartNumberingAfterBreak="0">
     <w:nsid w:val="584223CC"/>
     <w:multiLevelType w:val="hybridMultilevel"/>
     <w:tmpl w:val="15AE2CB0"/>
@@ -4923,23 +7634,261 @@
       </w:rPr>
     </w:lvl>
   </w:abstractNum>
+  <w:abstractNum w:abstractNumId="8" w15:restartNumberingAfterBreak="0">
+    <w:nsid w:val="5A3C6B9D"/>
+    <w:multiLevelType w:val="hybridMultilevel"/>
+    <w:tmpl w:val="8A963DA4"/>
+    <w:lvl w:ilvl="0" w:tplc="04090001">
+      <w:start w:val="1"/>
+      <w:numFmt w:val="bullet"/>
+      <w:lvlText w:val=""/>
+      <w:lvlJc w:val="left"/>
+      <w:pPr>
+        <w:ind w:left="1571" w:hanging="360"/>
+      </w:pPr>
+      <w:rPr>
+        <w:rFonts w:ascii="Symbol" w:hAnsi="Symbol" w:hint="default"/>
+      </w:rPr>
+    </w:lvl>
+    <w:lvl w:ilvl="1" w:tplc="04090003" w:tentative="1">
+      <w:start w:val="1"/>
+      <w:numFmt w:val="bullet"/>
+      <w:lvlText w:val="o"/>
+      <w:lvlJc w:val="left"/>
+      <w:pPr>
+        <w:ind w:left="2291" w:hanging="360"/>
+      </w:pPr>
+      <w:rPr>
+        <w:rFonts w:ascii="Courier New" w:hAnsi="Courier New" w:cs="Courier New" w:hint="default"/>
+      </w:rPr>
+    </w:lvl>
+    <w:lvl w:ilvl="2" w:tplc="04090005" w:tentative="1">
+      <w:start w:val="1"/>
+      <w:numFmt w:val="bullet"/>
+      <w:lvlText w:val=""/>
+      <w:lvlJc w:val="left"/>
+      <w:pPr>
+        <w:ind w:left="3011" w:hanging="360"/>
+      </w:pPr>
+      <w:rPr>
+        <w:rFonts w:ascii="Wingdings" w:hAnsi="Wingdings" w:hint="default"/>
+      </w:rPr>
+    </w:lvl>
+    <w:lvl w:ilvl="3" w:tplc="04090001" w:tentative="1">
+      <w:start w:val="1"/>
+      <w:numFmt w:val="bullet"/>
+      <w:lvlText w:val=""/>
+      <w:lvlJc w:val="left"/>
+      <w:pPr>
+        <w:ind w:left="3731" w:hanging="360"/>
+      </w:pPr>
+      <w:rPr>
+        <w:rFonts w:ascii="Symbol" w:hAnsi="Symbol" w:hint="default"/>
+      </w:rPr>
+    </w:lvl>
+    <w:lvl w:ilvl="4" w:tplc="04090003" w:tentative="1">
+      <w:start w:val="1"/>
+      <w:numFmt w:val="bullet"/>
+      <w:lvlText w:val="o"/>
+      <w:lvlJc w:val="left"/>
+      <w:pPr>
+        <w:ind w:left="4451" w:hanging="360"/>
+      </w:pPr>
+      <w:rPr>
+        <w:rFonts w:ascii="Courier New" w:hAnsi="Courier New" w:cs="Courier New" w:hint="default"/>
+      </w:rPr>
+    </w:lvl>
+    <w:lvl w:ilvl="5" w:tplc="04090005" w:tentative="1">
+      <w:start w:val="1"/>
+      <w:numFmt w:val="bullet"/>
+      <w:lvlText w:val=""/>
+      <w:lvlJc w:val="left"/>
+      <w:pPr>
+        <w:ind w:left="5171" w:hanging="360"/>
+      </w:pPr>
+      <w:rPr>
+        <w:rFonts w:ascii="Wingdings" w:hAnsi="Wingdings" w:hint="default"/>
+      </w:rPr>
+    </w:lvl>
+    <w:lvl w:ilvl="6" w:tplc="04090001" w:tentative="1">
+      <w:start w:val="1"/>
+      <w:numFmt w:val="bullet"/>
+      <w:lvlText w:val=""/>
+      <w:lvlJc w:val="left"/>
+      <w:pPr>
+        <w:ind w:left="5891" w:hanging="360"/>
+      </w:pPr>
+      <w:rPr>
+        <w:rFonts w:ascii="Symbol" w:hAnsi="Symbol" w:hint="default"/>
+      </w:rPr>
+    </w:lvl>
+    <w:lvl w:ilvl="7" w:tplc="04090003" w:tentative="1">
+      <w:start w:val="1"/>
+      <w:numFmt w:val="bullet"/>
+      <w:lvlText w:val="o"/>
+      <w:lvlJc w:val="left"/>
+      <w:pPr>
+        <w:ind w:left="6611" w:hanging="360"/>
+      </w:pPr>
+      <w:rPr>
+        <w:rFonts w:ascii="Courier New" w:hAnsi="Courier New" w:cs="Courier New" w:hint="default"/>
+      </w:rPr>
+    </w:lvl>
+    <w:lvl w:ilvl="8" w:tplc="04090005" w:tentative="1">
+      <w:start w:val="1"/>
+      <w:numFmt w:val="bullet"/>
+      <w:lvlText w:val=""/>
+      <w:lvlJc w:val="left"/>
+      <w:pPr>
+        <w:ind w:left="7331" w:hanging="360"/>
+      </w:pPr>
+      <w:rPr>
+        <w:rFonts w:ascii="Wingdings" w:hAnsi="Wingdings" w:hint="default"/>
+      </w:rPr>
+    </w:lvl>
+  </w:abstractNum>
+  <w:abstractNum w:abstractNumId="9" w15:restartNumberingAfterBreak="0">
+    <w:nsid w:val="7C2F5FFD"/>
+    <w:multiLevelType w:val="hybridMultilevel"/>
+    <w:tmpl w:val="7C0C3FE6"/>
+    <w:lvl w:ilvl="0" w:tplc="04090001">
+      <w:start w:val="1"/>
+      <w:numFmt w:val="bullet"/>
+      <w:lvlText w:val=""/>
+      <w:lvlJc w:val="left"/>
+      <w:pPr>
+        <w:ind w:left="1571" w:hanging="360"/>
+      </w:pPr>
+      <w:rPr>
+        <w:rFonts w:ascii="Symbol" w:hAnsi="Symbol" w:hint="default"/>
+      </w:rPr>
+    </w:lvl>
+    <w:lvl w:ilvl="1" w:tplc="04090003" w:tentative="1">
+      <w:start w:val="1"/>
+      <w:numFmt w:val="bullet"/>
+      <w:lvlText w:val="o"/>
+      <w:lvlJc w:val="left"/>
+      <w:pPr>
+        <w:ind w:left="2291" w:hanging="360"/>
+      </w:pPr>
+      <w:rPr>
+        <w:rFonts w:ascii="Courier New" w:hAnsi="Courier New" w:cs="Courier New" w:hint="default"/>
+      </w:rPr>
+    </w:lvl>
+    <w:lvl w:ilvl="2" w:tplc="04090005" w:tentative="1">
+      <w:start w:val="1"/>
+      <w:numFmt w:val="bullet"/>
+      <w:lvlText w:val=""/>
+      <w:lvlJc w:val="left"/>
+      <w:pPr>
+        <w:ind w:left="3011" w:hanging="360"/>
+      </w:pPr>
+      <w:rPr>
+        <w:rFonts w:ascii="Wingdings" w:hAnsi="Wingdings" w:hint="default"/>
+      </w:rPr>
+    </w:lvl>
+    <w:lvl w:ilvl="3" w:tplc="04090001" w:tentative="1">
+      <w:start w:val="1"/>
+      <w:numFmt w:val="bullet"/>
+      <w:lvlText w:val=""/>
+      <w:lvlJc w:val="left"/>
+      <w:pPr>
+        <w:ind w:left="3731" w:hanging="360"/>
+      </w:pPr>
+      <w:rPr>
+        <w:rFonts w:ascii="Symbol" w:hAnsi="Symbol" w:hint="default"/>
+      </w:rPr>
+    </w:lvl>
+    <w:lvl w:ilvl="4" w:tplc="04090003" w:tentative="1">
+      <w:start w:val="1"/>
+      <w:numFmt w:val="bullet"/>
+      <w:lvlText w:val="o"/>
+      <w:lvlJc w:val="left"/>
+      <w:pPr>
+        <w:ind w:left="4451" w:hanging="360"/>
+      </w:pPr>
+      <w:rPr>
+        <w:rFonts w:ascii="Courier New" w:hAnsi="Courier New" w:cs="Courier New" w:hint="default"/>
+      </w:rPr>
+    </w:lvl>
+    <w:lvl w:ilvl="5" w:tplc="04090005" w:tentative="1">
+      <w:start w:val="1"/>
+      <w:numFmt w:val="bullet"/>
+      <w:lvlText w:val=""/>
+      <w:lvlJc w:val="left"/>
+      <w:pPr>
+        <w:ind w:left="5171" w:hanging="360"/>
+      </w:pPr>
+      <w:rPr>
+        <w:rFonts w:ascii="Wingdings" w:hAnsi="Wingdings" w:hint="default"/>
+      </w:rPr>
+    </w:lvl>
+    <w:lvl w:ilvl="6" w:tplc="04090001" w:tentative="1">
+      <w:start w:val="1"/>
+      <w:numFmt w:val="bullet"/>
+      <w:lvlText w:val=""/>
+      <w:lvlJc w:val="left"/>
+      <w:pPr>
+        <w:ind w:left="5891" w:hanging="360"/>
+      </w:pPr>
+      <w:rPr>
+        <w:rFonts w:ascii="Symbol" w:hAnsi="Symbol" w:hint="default"/>
+      </w:rPr>
+    </w:lvl>
+    <w:lvl w:ilvl="7" w:tplc="04090003" w:tentative="1">
+      <w:start w:val="1"/>
+      <w:numFmt w:val="bullet"/>
+      <w:lvlText w:val="o"/>
+      <w:lvlJc w:val="left"/>
+      <w:pPr>
+        <w:ind w:left="6611" w:hanging="360"/>
+      </w:pPr>
+      <w:rPr>
+        <w:rFonts w:ascii="Courier New" w:hAnsi="Courier New" w:cs="Courier New" w:hint="default"/>
+      </w:rPr>
+    </w:lvl>
+    <w:lvl w:ilvl="8" w:tplc="04090005" w:tentative="1">
+      <w:start w:val="1"/>
+      <w:numFmt w:val="bullet"/>
+      <w:lvlText w:val=""/>
+      <w:lvlJc w:val="left"/>
+      <w:pPr>
+        <w:ind w:left="7331" w:hanging="360"/>
+      </w:pPr>
+      <w:rPr>
+        <w:rFonts w:ascii="Wingdings" w:hAnsi="Wingdings" w:hint="default"/>
+      </w:rPr>
+    </w:lvl>
+  </w:abstractNum>
   <w:num w:numId="1" w16cid:durableId="1045522712">
+    <w:abstractNumId w:val="5"/>
+  </w:num>
+  <w:num w:numId="2" w16cid:durableId="1914701475">
+    <w:abstractNumId w:val="1"/>
+  </w:num>
+  <w:num w:numId="3" w16cid:durableId="1264529151">
+    <w:abstractNumId w:val="2"/>
+  </w:num>
+  <w:num w:numId="4" w16cid:durableId="1411461418">
     <w:abstractNumId w:val="4"/>
   </w:num>
-  <w:num w:numId="2" w16cid:durableId="1914701475">
+  <w:num w:numId="5" w16cid:durableId="185103095">
+    <w:abstractNumId w:val="3"/>
+  </w:num>
+  <w:num w:numId="6" w16cid:durableId="1852379492">
+    <w:abstractNumId w:val="7"/>
+  </w:num>
+  <w:num w:numId="7" w16cid:durableId="1846623942">
     <w:abstractNumId w:val="0"/>
   </w:num>
-  <w:num w:numId="3" w16cid:durableId="1264529151">
-    <w:abstractNumId w:val="1"/>
+  <w:num w:numId="8" w16cid:durableId="385762116">
+    <w:abstractNumId w:val="6"/>
   </w:num>
-  <w:num w:numId="4" w16cid:durableId="1411461418">
-    <w:abstractNumId w:val="3"/>
+  <w:num w:numId="9" w16cid:durableId="1558129866">
+    <w:abstractNumId w:val="9"/>
   </w:num>
-  <w:num w:numId="5" w16cid:durableId="185103095">
-    <w:abstractNumId w:val="2"/>
-  </w:num>
-  <w:num w:numId="6" w16cid:durableId="1852379492">
-    <w:abstractNumId w:val="5"/>
+  <w:num w:numId="10" w16cid:durableId="1390153760">
+    <w:abstractNumId w:val="8"/>
   </w:num>
 </w:numbering>
 </file>
@@ -5550,6 +8499,7 @@
   <w:style w:type="character" w:default="1" w:styleId="DefaultParagraphFont">
     <w:name w:val="Default Paragraph Font"/>
     <w:uiPriority w:val="1"/>
+    <w:semiHidden/>
     <w:unhideWhenUsed/>
   </w:style>
   <w:style w:type="table" w:default="1" w:styleId="TableNormal">
@@ -6001,6 +8951,30 @@
       <w:lang w:val="en-NZ" w:eastAsia="zh-CN"/>
     </w:rPr>
   </w:style>
+  <w:style w:type="character" w:styleId="UnresolvedMention">
+    <w:name w:val="Unresolved Mention"/>
+    <w:basedOn w:val="DefaultParagraphFont"/>
+    <w:uiPriority w:val="99"/>
+    <w:semiHidden/>
+    <w:unhideWhenUsed/>
+    <w:rsid w:val="00D9337E"/>
+    <w:rPr>
+      <w:color w:val="605E5C"/>
+      <w:shd w:val="clear" w:color="auto" w:fill="E1DFDD"/>
+    </w:rPr>
+  </w:style>
+  <w:style w:type="character" w:styleId="FollowedHyperlink">
+    <w:name w:val="FollowedHyperlink"/>
+    <w:basedOn w:val="DefaultParagraphFont"/>
+    <w:uiPriority w:val="99"/>
+    <w:semiHidden/>
+    <w:unhideWhenUsed/>
+    <w:rsid w:val="004E3290"/>
+    <w:rPr>
+      <w:color w:val="96607D" w:themeColor="followedHyperlink"/>
+      <w:u w:val="single"/>
+    </w:rPr>
+  </w:style>
 </w:styles>
 </file>
 

</xml_diff>

<commit_message>
Fix and update part 2. Organisational and System Analysis and 3. Requirements Engineering
</commit_message>
<xml_diff>
--- a/Project Progress Report/Assignment_Phase_1-Thanh_Tran-24247169.docx
+++ b/Project Progress Report/Assignment_Phase_1-Thanh_Tran-24247169.docx
@@ -2067,7 +2067,19 @@
         <w:rPr>
           <w:rFonts w:ascii="Arial" w:hAnsi="Arial" w:cs="Arial"/>
         </w:rPr>
-        <w:t>Modern medium to large organisations depend on advanced software systems to manage operations, coordinate between departments, and support decision-making. However, these systems are often developed over time without proper design practices, leading to maintenance challenges, scalability issues, and increased long-term risks.</w:t>
+        <w:t xml:space="preserve">Modern medium to large organisations </w:t>
+      </w:r>
+      <w:r>
+        <w:rPr>
+          <w:rFonts w:ascii="Arial" w:hAnsi="Arial" w:cs="Arial"/>
+        </w:rPr>
+        <w:t>reply</w:t>
+      </w:r>
+      <w:r>
+        <w:rPr>
+          <w:rFonts w:ascii="Arial" w:hAnsi="Arial" w:cs="Arial"/>
+        </w:rPr>
+        <w:t xml:space="preserve"> on advanced software systems to manage operations, coordinate between departments, and support decision-making. However, these systems are often developed over time without proper design practices, leading to maintenance challenges, scalability issues, and increased long-term risks.</w:t>
       </w:r>
     </w:p>
     <w:p>
@@ -2346,6 +2358,189 @@
     </w:p>
     <w:p>
       <w:pPr>
+        <w:keepNext/>
+        <w:spacing w:line="360" w:lineRule="auto"/>
+        <w:ind w:left="567"/>
+        <w:jc w:val="both"/>
+      </w:pPr>
+      <w:r>
+        <w:rPr>
+          <w:noProof/>
+        </w:rPr>
+        <w:drawing>
+          <wp:inline distT="0" distB="0" distL="0" distR="0" wp14:anchorId="3D976CD4" wp14:editId="2402AFA2">
+            <wp:extent cx="5582056" cy="3725545"/>
+            <wp:effectExtent l="0" t="0" r="0" b="8255"/>
+            <wp:docPr id="419774353" name="Picture 1" descr="wz-building"/>
+            <wp:cNvGraphicFramePr>
+              <a:graphicFrameLocks xmlns:a="http://schemas.openxmlformats.org/drawingml/2006/main" noChangeAspect="1"/>
+            </wp:cNvGraphicFramePr>
+            <a:graphic xmlns:a="http://schemas.openxmlformats.org/drawingml/2006/main">
+              <a:graphicData uri="http://schemas.openxmlformats.org/drawingml/2006/picture">
+                <pic:pic xmlns:pic="http://schemas.openxmlformats.org/drawingml/2006/picture">
+                  <pic:nvPicPr>
+                    <pic:cNvPr id="0" name="Picture 1" descr="wz-building"/>
+                    <pic:cNvPicPr>
+                      <a:picLocks noChangeAspect="1" noChangeArrowheads="1"/>
+                    </pic:cNvPicPr>
+                  </pic:nvPicPr>
+                  <pic:blipFill>
+                    <a:blip r:embed="rId9">
+                      <a:extLst>
+                        <a:ext uri="{28A0092B-C50C-407E-A947-70E740481C1C}">
+                          <a14:useLocalDpi xmlns:a14="http://schemas.microsoft.com/office/drawing/2010/main" val="0"/>
+                        </a:ext>
+                      </a:extLst>
+                    </a:blip>
+                    <a:srcRect/>
+                    <a:stretch>
+                      <a:fillRect/>
+                    </a:stretch>
+                  </pic:blipFill>
+                  <pic:spPr bwMode="auto">
+                    <a:xfrm>
+                      <a:off x="0" y="0"/>
+                      <a:ext cx="5585519" cy="3727856"/>
+                    </a:xfrm>
+                    <a:prstGeom prst="rect">
+                      <a:avLst/>
+                    </a:prstGeom>
+                    <a:noFill/>
+                    <a:ln>
+                      <a:noFill/>
+                    </a:ln>
+                  </pic:spPr>
+                </pic:pic>
+              </a:graphicData>
+            </a:graphic>
+          </wp:inline>
+        </w:drawing>
+      </w:r>
+    </w:p>
+    <w:p>
+      <w:pPr>
+        <w:pStyle w:val="Caption"/>
+        <w:ind w:left="567"/>
+        <w:jc w:val="both"/>
+        <w:rPr>
+          <w:rFonts w:ascii="Arial" w:hAnsi="Arial" w:cs="Arial"/>
+          <w:b/>
+          <w:bCs/>
+          <w:i w:val="0"/>
+          <w:iCs w:val="0"/>
+          <w:color w:val="215E99" w:themeColor="text2" w:themeTint="BF"/>
+          <w:sz w:val="24"/>
+          <w:szCs w:val="24"/>
+        </w:rPr>
+      </w:pPr>
+      <w:r>
+        <w:rPr>
+          <w:rFonts w:ascii="Arial" w:hAnsi="Arial" w:cs="Arial"/>
+          <w:b/>
+          <w:bCs/>
+          <w:i w:val="0"/>
+          <w:iCs w:val="0"/>
+          <w:color w:val="215E99" w:themeColor="text2" w:themeTint="BF"/>
+          <w:sz w:val="24"/>
+          <w:szCs w:val="24"/>
+        </w:rPr>
+        <w:t xml:space="preserve">Figure </w:t>
+      </w:r>
+      <w:r>
+        <w:rPr>
+          <w:rFonts w:ascii="Arial" w:hAnsi="Arial" w:cs="Arial"/>
+          <w:b/>
+          <w:bCs/>
+          <w:i w:val="0"/>
+          <w:iCs w:val="0"/>
+          <w:color w:val="215E99" w:themeColor="text2" w:themeTint="BF"/>
+          <w:sz w:val="24"/>
+          <w:szCs w:val="24"/>
+        </w:rPr>
+        <w:fldChar w:fldCharType="begin"/>
+      </w:r>
+      <w:r>
+        <w:rPr>
+          <w:rFonts w:ascii="Arial" w:hAnsi="Arial" w:cs="Arial"/>
+          <w:b/>
+          <w:bCs/>
+          <w:i w:val="0"/>
+          <w:iCs w:val="0"/>
+          <w:color w:val="215E99" w:themeColor="text2" w:themeTint="BF"/>
+          <w:sz w:val="24"/>
+          <w:szCs w:val="24"/>
+        </w:rPr>
+        <w:instrText xml:space="preserve"> SEQ Figure \* ARABIC </w:instrText>
+      </w:r>
+      <w:r>
+        <w:rPr>
+          <w:rFonts w:ascii="Arial" w:hAnsi="Arial" w:cs="Arial"/>
+          <w:b/>
+          <w:bCs/>
+          <w:i w:val="0"/>
+          <w:iCs w:val="0"/>
+          <w:color w:val="215E99" w:themeColor="text2" w:themeTint="BF"/>
+          <w:sz w:val="24"/>
+          <w:szCs w:val="24"/>
+        </w:rPr>
+        <w:fldChar w:fldCharType="separate"/>
+      </w:r>
+      <w:r>
+        <w:rPr>
+          <w:rFonts w:ascii="Arial" w:hAnsi="Arial" w:cs="Arial"/>
+          <w:b/>
+          <w:bCs/>
+          <w:i w:val="0"/>
+          <w:iCs w:val="0"/>
+          <w:noProof/>
+          <w:color w:val="215E99" w:themeColor="text2" w:themeTint="BF"/>
+          <w:sz w:val="24"/>
+          <w:szCs w:val="24"/>
+        </w:rPr>
+        <w:t>1</w:t>
+      </w:r>
+      <w:r>
+        <w:rPr>
+          <w:rFonts w:ascii="Arial" w:hAnsi="Arial" w:cs="Arial"/>
+          <w:b/>
+          <w:bCs/>
+          <w:i w:val="0"/>
+          <w:iCs w:val="0"/>
+          <w:color w:val="215E99" w:themeColor="text2" w:themeTint="BF"/>
+          <w:sz w:val="24"/>
+          <w:szCs w:val="24"/>
+        </w:rPr>
+        <w:fldChar w:fldCharType="end"/>
+      </w:r>
+      <w:r>
+        <w:rPr>
+          <w:rFonts w:ascii="Arial" w:hAnsi="Arial" w:cs="Arial"/>
+          <w:b/>
+          <w:bCs/>
+          <w:i w:val="0"/>
+          <w:iCs w:val="0"/>
+          <w:color w:val="215E99" w:themeColor="text2" w:themeTint="BF"/>
+          <w:sz w:val="24"/>
+          <w:szCs w:val="24"/>
+        </w:rPr>
+        <w:t>: AUT's building</w:t>
+      </w:r>
+      <w:r>
+        <w:rPr>
+          <w:rFonts w:ascii="Arial" w:hAnsi="Arial" w:cs="Arial"/>
+          <w:b/>
+          <w:bCs/>
+          <w:i w:val="0"/>
+          <w:iCs w:val="0"/>
+          <w:color w:val="215E99" w:themeColor="text2" w:themeTint="BF"/>
+          <w:sz w:val="24"/>
+          <w:szCs w:val="24"/>
+        </w:rPr>
+        <w:t xml:space="preserve"> (AUT, 2018)</w:t>
+      </w:r>
+    </w:p>
+    <w:p>
+      <w:pPr>
         <w:pStyle w:val="Heading2"/>
         <w:spacing w:before="0" w:line="360" w:lineRule="auto"/>
         <w:ind w:left="284"/>
@@ -2418,7 +2613,7 @@
     </w:p>
     <w:p>
       <w:pPr>
-        <w:spacing w:line="360" w:lineRule="auto"/>
+        <w:spacing w:after="0" w:line="360" w:lineRule="auto"/>
         <w:ind w:left="567"/>
         <w:jc w:val="both"/>
         <w:rPr>
@@ -2460,23 +2655,40 @@
       <w:r>
         <w:rPr>
           <w:rFonts w:ascii="Arial" w:hAnsi="Arial" w:cs="Arial"/>
-        </w:rPr>
+          <w:b/>
+          <w:bCs/>
+        </w:rPr>
+        <w:lastRenderedPageBreak/>
         <w:t>Academic Departments</w:t>
       </w:r>
       <w:r>
+        <w:rPr>
+          <w:b/>
+          <w:bCs/>
+        </w:rPr>
         <w:t xml:space="preserve"> </w:t>
       </w:r>
       <w:r>
         <w:rPr>
           <w:rFonts w:ascii="Arial" w:hAnsi="Arial" w:cs="Arial"/>
+          <w:b/>
+          <w:bCs/>
         </w:rPr>
         <w:t>(Faculties)</w:t>
       </w:r>
       <w:r>
         <w:rPr>
           <w:rFonts w:ascii="Arial" w:hAnsi="Arial" w:cs="Arial"/>
-        </w:rPr>
-        <w:t>: Responsible for course delivery, curriculum design, research activities, and maintaining academic standards</w:t>
+          <w:b/>
+          <w:bCs/>
+        </w:rPr>
+        <w:t>:</w:t>
+      </w:r>
+      <w:r>
+        <w:rPr>
+          <w:rFonts w:ascii="Arial" w:hAnsi="Arial" w:cs="Arial"/>
+        </w:rPr>
+        <w:t xml:space="preserve"> Responsible for course delivery, curriculum design, research activities, and maintaining academic standards</w:t>
       </w:r>
       <w:r>
         <w:rPr>
@@ -2549,26 +2761,32 @@
       <w:r>
         <w:rPr>
           <w:rFonts w:ascii="Arial" w:hAnsi="Arial" w:cs="Arial"/>
+          <w:b/>
+          <w:bCs/>
         </w:rPr>
         <w:t>Student Services</w:t>
       </w:r>
       <w:r>
         <w:rPr>
           <w:rFonts w:ascii="Arial" w:hAnsi="Arial" w:cs="Arial"/>
-        </w:rPr>
-        <w:t xml:space="preserve"> </w:t>
-      </w:r>
-      <w:r>
-        <w:rPr>
-          <w:rFonts w:ascii="Arial" w:hAnsi="Arial" w:cs="Arial"/>
-        </w:rPr>
-        <w:t>Department</w:t>
-      </w:r>
-      <w:r>
-        <w:rPr>
-          <w:rFonts w:ascii="Arial" w:hAnsi="Arial" w:cs="Arial"/>
-        </w:rPr>
-        <w:t xml:space="preserve">: Provides student support including enrolment assistance, </w:t>
+          <w:b/>
+          <w:bCs/>
+        </w:rPr>
+        <w:t xml:space="preserve"> Department</w:t>
+      </w:r>
+      <w:r>
+        <w:rPr>
+          <w:rFonts w:ascii="Arial" w:hAnsi="Arial" w:cs="Arial"/>
+          <w:b/>
+          <w:bCs/>
+        </w:rPr>
+        <w:t>:</w:t>
+      </w:r>
+      <w:r>
+        <w:rPr>
+          <w:rFonts w:ascii="Arial" w:hAnsi="Arial" w:cs="Arial"/>
+        </w:rPr>
+        <w:t xml:space="preserve"> Provides student support including enrolment assistance, </w:t>
       </w:r>
       <w:r>
         <w:rPr>
@@ -2629,26 +2847,32 @@
       <w:r>
         <w:rPr>
           <w:rFonts w:ascii="Arial" w:hAnsi="Arial" w:cs="Arial"/>
+          <w:b/>
+          <w:bCs/>
         </w:rPr>
         <w:t>Academic Registry</w:t>
       </w:r>
       <w:r>
         <w:rPr>
           <w:rFonts w:ascii="Arial" w:hAnsi="Arial" w:cs="Arial"/>
-        </w:rPr>
-        <w:t xml:space="preserve"> </w:t>
-      </w:r>
-      <w:r>
-        <w:rPr>
-          <w:rFonts w:ascii="Arial" w:hAnsi="Arial" w:cs="Arial"/>
-        </w:rPr>
-        <w:t>Department</w:t>
-      </w:r>
-      <w:r>
-        <w:rPr>
-          <w:rFonts w:ascii="Arial" w:hAnsi="Arial" w:cs="Arial"/>
-        </w:rPr>
-        <w:t>: Manages</w:t>
+          <w:b/>
+          <w:bCs/>
+        </w:rPr>
+        <w:t xml:space="preserve"> Department</w:t>
+      </w:r>
+      <w:r>
+        <w:rPr>
+          <w:rFonts w:ascii="Arial" w:hAnsi="Arial" w:cs="Arial"/>
+          <w:b/>
+          <w:bCs/>
+        </w:rPr>
+        <w:t>:</w:t>
+      </w:r>
+      <w:r>
+        <w:rPr>
+          <w:rFonts w:ascii="Arial" w:hAnsi="Arial" w:cs="Arial"/>
+        </w:rPr>
+        <w:t xml:space="preserve"> Manages</w:t>
       </w:r>
       <w:r>
         <w:rPr>
@@ -2709,26 +2933,40 @@
       <w:r>
         <w:rPr>
           <w:rFonts w:ascii="Arial" w:hAnsi="Arial" w:cs="Arial"/>
+          <w:b/>
+          <w:bCs/>
         </w:rPr>
         <w:t>IT</w:t>
       </w:r>
       <w:r>
         <w:rPr>
           <w:rFonts w:ascii="Arial" w:hAnsi="Arial" w:cs="Arial"/>
+          <w:b/>
+          <w:bCs/>
         </w:rPr>
         <w:t xml:space="preserve"> </w:t>
       </w:r>
       <w:r>
         <w:rPr>
           <w:rFonts w:ascii="Arial" w:hAnsi="Arial" w:cs="Arial"/>
+          <w:b/>
+          <w:bCs/>
         </w:rPr>
         <w:t>Department</w:t>
       </w:r>
       <w:r>
         <w:rPr>
           <w:rFonts w:ascii="Arial" w:hAnsi="Arial" w:cs="Arial"/>
-        </w:rPr>
-        <w:t xml:space="preserve">: </w:t>
+          <w:b/>
+          <w:bCs/>
+        </w:rPr>
+        <w:t>:</w:t>
+      </w:r>
+      <w:r>
+        <w:rPr>
+          <w:rFonts w:ascii="Arial" w:hAnsi="Arial" w:cs="Arial"/>
+        </w:rPr>
+        <w:t xml:space="preserve"> </w:t>
       </w:r>
       <w:r>
         <w:rPr>
@@ -2777,8 +3015,16 @@
       <w:r>
         <w:rPr>
           <w:rFonts w:ascii="Arial" w:hAnsi="Arial" w:cs="Arial"/>
-        </w:rPr>
-        <w:t xml:space="preserve">Finance Department: </w:t>
+          <w:b/>
+          <w:bCs/>
+        </w:rPr>
+        <w:t>Finance Department:</w:t>
+      </w:r>
+      <w:r>
+        <w:rPr>
+          <w:rFonts w:ascii="Arial" w:hAnsi="Arial" w:cs="Arial"/>
+        </w:rPr>
+        <w:t xml:space="preserve"> </w:t>
       </w:r>
       <w:r>
         <w:rPr>
@@ -2836,14 +3082,7 @@
         <w:rPr>
           <w:rFonts w:ascii="Arial" w:hAnsi="Arial" w:cs="Arial"/>
         </w:rPr>
-        <w:t xml:space="preserve">Student Enrolment and </w:t>
-      </w:r>
-      <w:r>
-        <w:rPr>
-          <w:rFonts w:ascii="Arial" w:hAnsi="Arial" w:cs="Arial"/>
-        </w:rPr>
-        <w:lastRenderedPageBreak/>
-        <w:t>Course Management System</w:t>
+        <w:t>Student Enrolment and Course Management System</w:t>
       </w:r>
       <w:r>
         <w:rPr>
@@ -2868,6 +3107,30 @@
           <w:rFonts w:ascii="Arial" w:hAnsi="Arial" w:cs="Arial"/>
         </w:rPr>
         <w:t>Library Management System</w:t>
+      </w:r>
+      <w:r>
+        <w:rPr>
+          <w:rFonts w:ascii="Arial" w:hAnsi="Arial" w:cs="Arial"/>
+        </w:rPr>
+        <w:t>.</w:t>
+      </w:r>
+      <w:r>
+        <w:rPr>
+          <w:rFonts w:ascii="Arial" w:hAnsi="Arial" w:cs="Arial"/>
+        </w:rPr>
+        <w:t xml:space="preserve"> </w:t>
+      </w:r>
+      <w:r>
+        <w:rPr>
+          <w:rFonts w:ascii="Arial" w:hAnsi="Arial" w:cs="Arial"/>
+        </w:rPr>
+        <w:t>Among these systems, t</w:t>
+      </w:r>
+      <w:r>
+        <w:rPr>
+          <w:rFonts w:ascii="Arial" w:hAnsi="Arial" w:cs="Arial"/>
+        </w:rPr>
+        <w:t>he Student Enrolment and Course Management System is selected as the focus of this project</w:t>
       </w:r>
       <w:r>
         <w:rPr>
@@ -2890,7 +3153,7 @@
           <w:szCs w:val="28"/>
         </w:rPr>
       </w:pPr>
-      <w:bookmarkStart w:id="5" w:name="_Toc226899725"/>
+      <w:bookmarkStart w:id="5" w:name="_Toc226899726"/>
       <w:r>
         <w:rPr>
           <w:rFonts w:ascii="Arial" w:hAnsi="Arial" w:cs="Arial"/>
@@ -2933,9 +3196,268 @@
           <w:sz w:val="28"/>
           <w:szCs w:val="28"/>
         </w:rPr>
-        <w:t xml:space="preserve">. </w:t>
-      </w:r>
-      <w:r>
+        <w:t>. Problem statement</w:t>
+      </w:r>
+      <w:bookmarkEnd w:id="5"/>
+    </w:p>
+    <w:p>
+      <w:pPr>
+        <w:spacing w:line="360" w:lineRule="auto"/>
+        <w:ind w:left="567"/>
+        <w:jc w:val="both"/>
+        <w:rPr>
+          <w:rFonts w:ascii="Arial" w:hAnsi="Arial" w:cs="Arial"/>
+        </w:rPr>
+      </w:pPr>
+      <w:r>
+        <w:rPr>
+          <w:rFonts w:ascii="Arial" w:hAnsi="Arial" w:cs="Arial"/>
+        </w:rPr>
+        <w:t>The current enrolment process at Auckland University of Technology relies heavily on manual, paper-based procedures for managing student enrolment and course administration. This approach creates several operational challenges, including lost or misplaced enrolment forms, manual prerequisite checks prone to errors, delays in enrolment approval—especially during peak periods—and difficulty tracking student progress or course capacity. These inefficiencies result in slow processing times, inconsistent data, limited accessibility, and poor coordination between departments.</w:t>
+      </w:r>
+    </w:p>
+    <w:p>
+      <w:pPr>
+        <w:spacing w:line="360" w:lineRule="auto"/>
+        <w:ind w:left="567"/>
+        <w:jc w:val="both"/>
+        <w:rPr>
+          <w:rFonts w:ascii="Arial" w:hAnsi="Arial" w:cs="Arial"/>
+        </w:rPr>
+      </w:pPr>
+      <w:r>
+        <w:rPr>
+          <w:rFonts w:ascii="Arial" w:hAnsi="Arial" w:cs="Arial"/>
+        </w:rPr>
+        <w:lastRenderedPageBreak/>
+        <w:t xml:space="preserve">To address these issues, </w:t>
+      </w:r>
+      <w:r>
+        <w:rPr>
+          <w:rFonts w:ascii="Arial" w:hAnsi="Arial" w:cs="Arial"/>
+        </w:rPr>
+        <w:t>AUT</w:t>
+      </w:r>
+      <w:r>
+        <w:rPr>
+          <w:rFonts w:ascii="Arial" w:hAnsi="Arial" w:cs="Arial"/>
+        </w:rPr>
+        <w:t xml:space="preserve"> requires a Student Enrolment and Course Management System to manage course selection, enrolment, and related </w:t>
+      </w:r>
+      <w:r>
+        <w:rPr>
+          <w:rFonts w:ascii="Arial" w:hAnsi="Arial" w:cs="Arial"/>
+        </w:rPr>
+        <w:t xml:space="preserve">academic </w:t>
+      </w:r>
+      <w:r>
+        <w:rPr>
+          <w:rFonts w:ascii="Arial" w:hAnsi="Arial" w:cs="Arial"/>
+        </w:rPr>
+        <w:t xml:space="preserve">processes. </w:t>
+      </w:r>
+      <w:r>
+        <w:rPr>
+          <w:rFonts w:ascii="Arial" w:hAnsi="Arial" w:cs="Arial"/>
+        </w:rPr>
+        <w:t>The system must operate across multiple departments, including the Academic Department</w:t>
+      </w:r>
+      <w:r>
+        <w:rPr>
+          <w:rFonts w:ascii="Arial" w:hAnsi="Arial" w:cs="Arial"/>
+        </w:rPr>
+        <w:t>s</w:t>
+      </w:r>
+      <w:r>
+        <w:rPr>
+          <w:rFonts w:ascii="Arial" w:hAnsi="Arial" w:cs="Arial"/>
+        </w:rPr>
+        <w:t xml:space="preserve">, </w:t>
+      </w:r>
+      <w:r>
+        <w:rPr>
+          <w:rFonts w:ascii="Arial" w:hAnsi="Arial" w:cs="Arial"/>
+        </w:rPr>
+        <w:t xml:space="preserve">Academic </w:t>
+      </w:r>
+      <w:r>
+        <w:rPr>
+          <w:rFonts w:ascii="Arial" w:hAnsi="Arial" w:cs="Arial"/>
+        </w:rPr>
+        <w:t>Registry</w:t>
+      </w:r>
+      <w:r>
+        <w:rPr>
+          <w:rFonts w:ascii="Arial" w:hAnsi="Arial" w:cs="Arial"/>
+        </w:rPr>
+        <w:t xml:space="preserve"> </w:t>
+      </w:r>
+      <w:r>
+        <w:rPr>
+          <w:rFonts w:ascii="Arial" w:hAnsi="Arial" w:cs="Arial"/>
+        </w:rPr>
+        <w:t>Department</w:t>
+      </w:r>
+      <w:r>
+        <w:rPr>
+          <w:rFonts w:ascii="Arial" w:hAnsi="Arial" w:cs="Arial"/>
+        </w:rPr>
+        <w:t>, and Finance Department, each responsible for different aspects of the enrolment workflow.</w:t>
+      </w:r>
+      <w:r>
+        <w:t xml:space="preserve"> </w:t>
+      </w:r>
+      <w:r>
+        <w:rPr>
+          <w:rFonts w:ascii="Arial" w:hAnsi="Arial" w:cs="Arial"/>
+        </w:rPr>
+        <w:t>The system must support both domestic and international students, who may have different enrolment requirements, fee structures, and approval processes.</w:t>
+      </w:r>
+    </w:p>
+    <w:p>
+      <w:pPr>
+        <w:spacing w:line="360" w:lineRule="auto"/>
+        <w:ind w:left="567"/>
+        <w:jc w:val="both"/>
+        <w:rPr>
+          <w:rFonts w:ascii="Arial" w:hAnsi="Arial" w:cs="Arial"/>
+        </w:rPr>
+      </w:pPr>
+      <w:r>
+        <w:rPr>
+          <w:rFonts w:ascii="Arial" w:hAnsi="Arial" w:cs="Arial"/>
+        </w:rPr>
+        <w:t>Students should be able to search for available courses, enrol in them, and view their enrolled courses through the system. The system must enforce key business rules, such as checking prerequisites, validating course availability, and preventing timetable conflicts before confirming enrolment. When selecting courses, students will be able to view a timetable of the courses they have chosen, and the system will automatically detect any clashes and display them visually. Students can then adjust their selection based on these clashes to ensure a feasible schedule.</w:t>
+      </w:r>
+    </w:p>
+    <w:p>
+      <w:pPr>
+        <w:spacing w:line="360" w:lineRule="auto"/>
+        <w:ind w:left="567"/>
+        <w:jc w:val="both"/>
+        <w:rPr>
+          <w:rFonts w:ascii="Arial" w:hAnsi="Arial" w:cs="Arial"/>
+        </w:rPr>
+      </w:pPr>
+      <w:r>
+        <w:rPr>
+          <w:rFonts w:ascii="Arial" w:hAnsi="Arial" w:cs="Arial"/>
+        </w:rPr>
+        <w:t>Academic Department</w:t>
+      </w:r>
+      <w:r>
+        <w:rPr>
+          <w:rFonts w:ascii="Arial" w:hAnsi="Arial" w:cs="Arial"/>
+        </w:rPr>
+        <w:t>s</w:t>
+      </w:r>
+      <w:r>
+        <w:rPr>
+          <w:rFonts w:ascii="Arial" w:hAnsi="Arial" w:cs="Arial"/>
+        </w:rPr>
+        <w:t xml:space="preserve"> staff should be able to manage course information, including course descriptions, prerequisites, capacity limits, and timetable details. They ensure that all course-related data is accurate, up to date, and accessible to students during the enrolment process.</w:t>
+      </w:r>
+    </w:p>
+    <w:p>
+      <w:pPr>
+        <w:spacing w:line="360" w:lineRule="auto"/>
+        <w:ind w:left="567"/>
+        <w:jc w:val="both"/>
+        <w:rPr>
+          <w:rFonts w:ascii="Arial" w:hAnsi="Arial" w:cs="Arial"/>
+        </w:rPr>
+      </w:pPr>
+      <w:r>
+        <w:rPr>
+          <w:rFonts w:ascii="Arial" w:hAnsi="Arial" w:cs="Arial"/>
+        </w:rPr>
+        <w:t xml:space="preserve">Academic </w:t>
+      </w:r>
+      <w:r>
+        <w:rPr>
+          <w:rFonts w:ascii="Arial" w:hAnsi="Arial" w:cs="Arial"/>
+        </w:rPr>
+        <w:t>Registry staff should be able to review and approve student enrolment requests in accordance with academic and administrative rules. They verify that prerequisite requirements are satisfied, course capacity is available, and no timetable conflicts exist before confirming enrolment decisions.</w:t>
+      </w:r>
+    </w:p>
+    <w:p>
+      <w:pPr>
+        <w:spacing w:line="360" w:lineRule="auto"/>
+        <w:ind w:left="567"/>
+        <w:jc w:val="both"/>
+        <w:rPr>
+          <w:rFonts w:ascii="Arial" w:hAnsi="Arial" w:cs="Arial"/>
+        </w:rPr>
+      </w:pPr>
+      <w:r>
+        <w:rPr>
+          <w:rFonts w:ascii="Arial" w:hAnsi="Arial" w:cs="Arial"/>
+        </w:rPr>
+        <w:t>Finance staff should be able to process tuition and course-related payments and confirm enrolments only after successful payment verification. They ensure that all financial transactions are completed accurately and that students meet payment requirements before their enrolment is finalised.</w:t>
+      </w:r>
+    </w:p>
+    <w:p>
+      <w:pPr>
+        <w:spacing w:line="360" w:lineRule="auto"/>
+        <w:ind w:left="567"/>
+        <w:jc w:val="both"/>
+        <w:rPr>
+          <w:rFonts w:ascii="Arial" w:hAnsi="Arial" w:cs="Arial"/>
+        </w:rPr>
+      </w:pPr>
+      <w:r>
+        <w:rPr>
+          <w:rFonts w:ascii="Arial" w:hAnsi="Arial" w:cs="Arial"/>
+        </w:rPr>
+        <w:t>The system must support seamless integration of these functions to ensure a consistent data flow between departments</w:t>
+      </w:r>
+      <w:r>
+        <w:rPr>
+          <w:rFonts w:ascii="Arial" w:hAnsi="Arial" w:cs="Arial"/>
+        </w:rPr>
+        <w:t>, as well as</w:t>
+      </w:r>
+      <w:r>
+        <w:rPr>
+          <w:rFonts w:ascii="Arial" w:hAnsi="Arial" w:cs="Arial"/>
+        </w:rPr>
+        <w:t xml:space="preserve"> secure and real-time data sharing among all stakeholders.</w:t>
+      </w:r>
+    </w:p>
+    <w:p>
+      <w:pPr>
+        <w:spacing w:line="360" w:lineRule="auto"/>
+        <w:ind w:left="567"/>
+        <w:jc w:val="both"/>
+        <w:rPr>
+          <w:rFonts w:ascii="Arial" w:hAnsi="Arial" w:cs="Arial"/>
+        </w:rPr>
+      </w:pPr>
+      <w:r>
+        <w:rPr>
+          <w:rFonts w:ascii="Arial" w:hAnsi="Arial" w:cs="Arial"/>
+        </w:rPr>
+        <w:lastRenderedPageBreak/>
+        <w:t xml:space="preserve">The proposed system will be a web-based application accessible through a browser on any device. It must support multiple concurrent users while ensuring data accuracy, security, and real-time updates. By replacing the existing manual process, the system aims to improve operational efficiency, reduce errors, and enhance the overall user experience for </w:t>
+      </w:r>
+      <w:r>
+        <w:rPr>
+          <w:rFonts w:ascii="Arial" w:hAnsi="Arial" w:cs="Arial"/>
+        </w:rPr>
+        <w:t>both domestic and international students, as well as staff</w:t>
+      </w:r>
+      <w:r>
+        <w:rPr>
+          <w:rFonts w:ascii="Arial" w:hAnsi="Arial" w:cs="Arial"/>
+        </w:rPr>
+        <w:t>.</w:t>
+      </w:r>
+    </w:p>
+    <w:p>
+      <w:pPr>
+        <w:pStyle w:val="Heading2"/>
+        <w:spacing w:before="0" w:line="360" w:lineRule="auto"/>
+        <w:ind w:left="284"/>
         <w:rPr>
           <w:rFonts w:ascii="Arial" w:hAnsi="Arial" w:cs="Arial"/>
           <w:b/>
@@ -2944,8 +3466,9 @@
           <w:sz w:val="28"/>
           <w:szCs w:val="28"/>
         </w:rPr>
-        <w:t xml:space="preserve">Stakeholders and </w:t>
-      </w:r>
+      </w:pPr>
+      <w:bookmarkStart w:id="6" w:name="_Toc226899727"/>
+      <w:bookmarkStart w:id="7" w:name="_Toc226899725"/>
       <w:r>
         <w:rPr>
           <w:rFonts w:ascii="Arial" w:hAnsi="Arial" w:cs="Arial"/>
@@ -2955,7 +3478,7 @@
           <w:sz w:val="28"/>
           <w:szCs w:val="28"/>
         </w:rPr>
-        <w:t>u</w:t>
+        <w:t>2</w:t>
       </w:r>
       <w:r>
         <w:rPr>
@@ -2966,7 +3489,7 @@
           <w:sz w:val="28"/>
           <w:szCs w:val="28"/>
         </w:rPr>
-        <w:t xml:space="preserve">ser </w:t>
+        <w:t>.</w:t>
       </w:r>
       <w:r>
         <w:rPr>
@@ -2977,7 +3500,7 @@
           <w:sz w:val="28"/>
           <w:szCs w:val="28"/>
         </w:rPr>
-        <w:t>r</w:t>
+        <w:t>4</w:t>
       </w:r>
       <w:r>
         <w:rPr>
@@ -2988,60 +3511,194 @@
           <w:sz w:val="28"/>
           <w:szCs w:val="28"/>
         </w:rPr>
+        <w:t xml:space="preserve">. </w:t>
+      </w:r>
+      <w:r>
+        <w:rPr>
+          <w:rFonts w:ascii="Arial" w:hAnsi="Arial" w:cs="Arial"/>
+          <w:b/>
+          <w:bCs/>
+          <w:color w:val="EE0000"/>
+          <w:sz w:val="28"/>
+          <w:szCs w:val="28"/>
+        </w:rPr>
+        <w:t xml:space="preserve">Stakeholders and </w:t>
+      </w:r>
+      <w:r>
+        <w:rPr>
+          <w:rFonts w:ascii="Arial" w:hAnsi="Arial" w:cs="Arial"/>
+          <w:b/>
+          <w:bCs/>
+          <w:color w:val="EE0000"/>
+          <w:sz w:val="28"/>
+          <w:szCs w:val="28"/>
+        </w:rPr>
+        <w:t>u</w:t>
+      </w:r>
+      <w:r>
+        <w:rPr>
+          <w:rFonts w:ascii="Arial" w:hAnsi="Arial" w:cs="Arial"/>
+          <w:b/>
+          <w:bCs/>
+          <w:color w:val="EE0000"/>
+          <w:sz w:val="28"/>
+          <w:szCs w:val="28"/>
+        </w:rPr>
+        <w:t xml:space="preserve">ser </w:t>
+      </w:r>
+      <w:r>
+        <w:rPr>
+          <w:rFonts w:ascii="Arial" w:hAnsi="Arial" w:cs="Arial"/>
+          <w:b/>
+          <w:bCs/>
+          <w:color w:val="EE0000"/>
+          <w:sz w:val="28"/>
+          <w:szCs w:val="28"/>
+        </w:rPr>
+        <w:t>r</w:t>
+      </w:r>
+      <w:r>
+        <w:rPr>
+          <w:rFonts w:ascii="Arial" w:hAnsi="Arial" w:cs="Arial"/>
+          <w:b/>
+          <w:bCs/>
+          <w:color w:val="EE0000"/>
+          <w:sz w:val="28"/>
+          <w:szCs w:val="28"/>
+        </w:rPr>
         <w:t>oles</w:t>
       </w:r>
-      <w:bookmarkEnd w:id="5"/>
-    </w:p>
-    <w:p>
-      <w:pPr>
-        <w:spacing w:line="360" w:lineRule="auto"/>
+      <w:bookmarkEnd w:id="7"/>
+    </w:p>
+    <w:p>
+      <w:pPr>
+        <w:spacing w:after="0" w:line="360" w:lineRule="auto"/>
         <w:ind w:left="567"/>
-        <w:jc w:val="both"/>
-        <w:rPr>
-          <w:rFonts w:ascii="Arial" w:hAnsi="Arial" w:cs="Arial"/>
-        </w:rPr>
-      </w:pPr>
-      <w:r>
-        <w:rPr>
-          <w:rFonts w:ascii="Arial" w:hAnsi="Arial" w:cs="Arial"/>
-        </w:rPr>
-        <w:t>The</w:t>
-      </w:r>
-      <w:r>
-        <w:rPr>
-          <w:rFonts w:ascii="Arial" w:hAnsi="Arial" w:cs="Arial"/>
-        </w:rPr>
-        <w:t>se</w:t>
-      </w:r>
-      <w:r>
-        <w:rPr>
-          <w:rFonts w:ascii="Arial" w:hAnsi="Arial" w:cs="Arial"/>
-        </w:rPr>
-        <w:t xml:space="preserve"> system</w:t>
-      </w:r>
-      <w:r>
-        <w:rPr>
-          <w:rFonts w:ascii="Arial" w:hAnsi="Arial" w:cs="Arial"/>
+        <w:rPr>
+          <w:rFonts w:ascii="Arial" w:hAnsi="Arial" w:cs="Arial"/>
+        </w:rPr>
+      </w:pPr>
+      <w:r>
+        <w:rPr>
+          <w:rFonts w:ascii="Arial" w:hAnsi="Arial" w:cs="Arial"/>
+        </w:rPr>
+        <w:t>Based on the problem statement, the key stakeholders and their respective roles are identified as follows</w:t>
+      </w:r>
+      <w:r>
+        <w:rPr>
+          <w:rFonts w:ascii="Arial" w:hAnsi="Arial" w:cs="Arial"/>
+        </w:rPr>
+        <w:t xml:space="preserve">: </w:t>
+      </w:r>
+    </w:p>
+    <w:p>
+      <w:pPr>
+        <w:pStyle w:val="ListParagraph"/>
+        <w:numPr>
+          <w:ilvl w:val="0"/>
+          <w:numId w:val="11"/>
+        </w:numPr>
+        <w:spacing w:line="360" w:lineRule="auto"/>
+        <w:rPr>
+          <w:rFonts w:ascii="Arial" w:hAnsi="Arial" w:cs="Arial"/>
+        </w:rPr>
+      </w:pPr>
+      <w:r>
+        <w:rPr>
+          <w:rFonts w:ascii="Arial" w:hAnsi="Arial" w:cs="Arial"/>
+          <w:b/>
+          <w:bCs/>
+        </w:rPr>
+        <w:t>Student (Domestic / International):</w:t>
+      </w:r>
+      <w:r>
+        <w:rPr>
+          <w:rFonts w:ascii="Arial" w:hAnsi="Arial" w:cs="Arial"/>
+        </w:rPr>
+        <w:t xml:space="preserve"> </w:t>
+      </w:r>
+      <w:r>
+        <w:rPr>
+          <w:rFonts w:ascii="Arial" w:hAnsi="Arial" w:cs="Arial"/>
+        </w:rPr>
+        <w:t>S</w:t>
+      </w:r>
+      <w:r>
+        <w:rPr>
+          <w:rFonts w:ascii="Arial" w:hAnsi="Arial" w:cs="Arial"/>
+        </w:rPr>
+        <w:t>earch for courses, view timetables and detect clashes, enrol in courses, and manage enrolment requests</w:t>
+      </w:r>
+    </w:p>
+    <w:p>
+      <w:pPr>
+        <w:pStyle w:val="ListParagraph"/>
+        <w:numPr>
+          <w:ilvl w:val="0"/>
+          <w:numId w:val="11"/>
+        </w:numPr>
+        <w:spacing w:line="360" w:lineRule="auto"/>
+        <w:rPr>
+          <w:rFonts w:ascii="Arial" w:hAnsi="Arial" w:cs="Arial"/>
+        </w:rPr>
+      </w:pPr>
+      <w:r>
+        <w:rPr>
+          <w:rFonts w:ascii="Arial" w:hAnsi="Arial" w:cs="Arial"/>
+          <w:b/>
+          <w:bCs/>
+        </w:rPr>
+        <w:t>Academic Department</w:t>
+      </w:r>
+      <w:r>
+        <w:rPr>
+          <w:rFonts w:ascii="Arial" w:hAnsi="Arial" w:cs="Arial"/>
+          <w:b/>
+          <w:bCs/>
         </w:rPr>
         <w:t>s</w:t>
       </w:r>
       <w:r>
         <w:rPr>
           <w:rFonts w:ascii="Arial" w:hAnsi="Arial" w:cs="Arial"/>
-        </w:rPr>
-        <w:t xml:space="preserve"> involve multiple stakeholders with distinct roles and responsibilities</w:t>
-      </w:r>
-      <w:r>
-        <w:rPr>
-          <w:rFonts w:ascii="Arial" w:hAnsi="Arial" w:cs="Arial"/>
-        </w:rPr>
-        <w:t xml:space="preserve"> such as</w:t>
-      </w:r>
-      <w:r>
-        <w:rPr>
-          <w:rFonts w:ascii="Arial" w:hAnsi="Arial" w:cs="Arial"/>
-        </w:rPr>
-        <w:t>:</w:t>
+          <w:b/>
+          <w:bCs/>
+        </w:rPr>
+        <w:t xml:space="preserve"> </w:t>
+      </w:r>
+      <w:r>
+        <w:rPr>
+          <w:rFonts w:ascii="Arial" w:hAnsi="Arial" w:cs="Arial"/>
+          <w:b/>
+          <w:bCs/>
+        </w:rPr>
+        <w:t>s</w:t>
+      </w:r>
+      <w:r>
+        <w:rPr>
+          <w:rFonts w:ascii="Arial" w:hAnsi="Arial" w:cs="Arial"/>
+          <w:b/>
+          <w:bCs/>
+        </w:rPr>
+        <w:t>taff:</w:t>
+      </w:r>
+      <w:r>
+        <w:rPr>
+          <w:rFonts w:ascii="Arial" w:hAnsi="Arial" w:cs="Arial"/>
+        </w:rPr>
+        <w:t xml:space="preserve"> </w:t>
+      </w:r>
+      <w:r>
+        <w:rPr>
+          <w:rFonts w:ascii="Arial" w:hAnsi="Arial" w:cs="Arial"/>
+        </w:rPr>
+        <w:t xml:space="preserve">Manage </w:t>
+      </w:r>
+      <w:r>
+        <w:rPr>
+          <w:rFonts w:ascii="Arial" w:hAnsi="Arial" w:cs="Arial"/>
+        </w:rPr>
+        <w:t>course information, prerequisites, capacity, timetable details</w:t>
       </w:r>
     </w:p>
     <w:p>
@@ -3060,8 +3717,113 @@
       <w:r>
         <w:rPr>
           <w:rFonts w:ascii="Arial" w:hAnsi="Arial" w:cs="Arial"/>
-        </w:rPr>
-        <w:t>Students: Search for courses, submit enrolment requests, and view enrolment status and timetables.</w:t>
+          <w:b/>
+          <w:bCs/>
+        </w:rPr>
+        <w:t xml:space="preserve">Academic </w:t>
+      </w:r>
+      <w:r>
+        <w:rPr>
+          <w:rFonts w:ascii="Arial" w:hAnsi="Arial" w:cs="Arial"/>
+          <w:b/>
+          <w:bCs/>
+        </w:rPr>
+        <w:t xml:space="preserve">Registry </w:t>
+      </w:r>
+      <w:r>
+        <w:rPr>
+          <w:rFonts w:ascii="Arial" w:hAnsi="Arial" w:cs="Arial"/>
+          <w:b/>
+          <w:bCs/>
+        </w:rPr>
+        <w:t>s</w:t>
+      </w:r>
+      <w:r>
+        <w:rPr>
+          <w:rFonts w:ascii="Arial" w:hAnsi="Arial" w:cs="Arial"/>
+          <w:b/>
+          <w:bCs/>
+        </w:rPr>
+        <w:t>taff:</w:t>
+      </w:r>
+      <w:r>
+        <w:rPr>
+          <w:rFonts w:ascii="Arial" w:hAnsi="Arial" w:cs="Arial"/>
+        </w:rPr>
+        <w:t xml:space="preserve"> Review and approve enrolment requests</w:t>
+      </w:r>
+      <w:r>
+        <w:rPr>
+          <w:rFonts w:ascii="Arial" w:hAnsi="Arial" w:cs="Arial"/>
+        </w:rPr>
+        <w:t xml:space="preserve"> </w:t>
+      </w:r>
+      <w:r>
+        <w:rPr>
+          <w:rFonts w:ascii="Arial" w:hAnsi="Arial" w:cs="Arial"/>
+        </w:rPr>
+        <w:t>in accordance with academic and administrative rules</w:t>
+      </w:r>
+    </w:p>
+    <w:p>
+      <w:pPr>
+        <w:pStyle w:val="ListParagraph"/>
+        <w:numPr>
+          <w:ilvl w:val="0"/>
+          <w:numId w:val="11"/>
+        </w:numPr>
+        <w:spacing w:line="360" w:lineRule="auto"/>
+        <w:rPr>
+          <w:rFonts w:ascii="Arial" w:hAnsi="Arial" w:cs="Arial"/>
+        </w:rPr>
+      </w:pPr>
+      <w:r>
+        <w:rPr>
+          <w:rFonts w:ascii="Arial" w:hAnsi="Arial" w:cs="Arial"/>
+          <w:b/>
+          <w:bCs/>
+        </w:rPr>
+        <w:t xml:space="preserve">Finance </w:t>
+      </w:r>
+      <w:r>
+        <w:rPr>
+          <w:rFonts w:ascii="Arial" w:hAnsi="Arial" w:cs="Arial"/>
+          <w:b/>
+          <w:bCs/>
+        </w:rPr>
+        <w:t>s</w:t>
+      </w:r>
+      <w:r>
+        <w:rPr>
+          <w:rFonts w:ascii="Arial" w:hAnsi="Arial" w:cs="Arial"/>
+          <w:b/>
+          <w:bCs/>
+        </w:rPr>
+        <w:t>taff:</w:t>
+      </w:r>
+      <w:r>
+        <w:rPr>
+          <w:rFonts w:ascii="Arial" w:hAnsi="Arial" w:cs="Arial"/>
+        </w:rPr>
+        <w:t xml:space="preserve"> Process tuition/course payments, confirm enrolment upon</w:t>
+      </w:r>
+      <w:r>
+        <w:rPr>
+          <w:rFonts w:ascii="Arial" w:hAnsi="Arial" w:cs="Arial"/>
+        </w:rPr>
+        <w:t xml:space="preserve"> </w:t>
+      </w:r>
+      <w:r>
+        <w:rPr>
+          <w:rFonts w:ascii="Arial" w:hAnsi="Arial" w:cs="Arial"/>
+        </w:rPr>
+        <w:t>successful</w:t>
+      </w:r>
+      <w:r>
+        <w:rPr>
+          <w:rFonts w:ascii="Arial" w:hAnsi="Arial" w:cs="Arial"/>
+        </w:rPr>
+        <w:t xml:space="preserve"> payment verification</w:t>
       </w:r>
     </w:p>
     <w:p>
@@ -3080,8 +3842,32 @@
       <w:r>
         <w:rPr>
           <w:rFonts w:ascii="Arial" w:hAnsi="Arial" w:cs="Arial"/>
-        </w:rPr>
-        <w:t>Academic Staff: Manage course information, including prerequisites, schedules, and capacity limits.</w:t>
+          <w:b/>
+          <w:bCs/>
+        </w:rPr>
+        <w:t xml:space="preserve">IT </w:t>
+      </w:r>
+      <w:r>
+        <w:rPr>
+          <w:rFonts w:ascii="Arial" w:hAnsi="Arial" w:cs="Arial"/>
+          <w:b/>
+          <w:bCs/>
+        </w:rPr>
+        <w:t>s</w:t>
+      </w:r>
+      <w:r>
+        <w:rPr>
+          <w:rFonts w:ascii="Arial" w:hAnsi="Arial" w:cs="Arial"/>
+          <w:b/>
+          <w:bCs/>
+        </w:rPr>
+        <w:t>taff:</w:t>
+      </w:r>
+      <w:r>
+        <w:rPr>
+          <w:rFonts w:ascii="Arial" w:hAnsi="Arial" w:cs="Arial"/>
+        </w:rPr>
+        <w:t xml:space="preserve"> Maintain system infrastructure, ensure availability, and provide technical support</w:t>
       </w:r>
     </w:p>
     <w:p>
@@ -3092,82 +3878,23 @@
           <w:numId w:val="8"/>
         </w:numPr>
         <w:spacing w:line="360" w:lineRule="auto"/>
-        <w:jc w:val="both"/>
-        <w:rPr>
-          <w:rFonts w:ascii="Arial" w:hAnsi="Arial" w:cs="Arial"/>
-        </w:rPr>
-      </w:pPr>
-      <w:r>
-        <w:rPr>
-          <w:rFonts w:ascii="Arial" w:hAnsi="Arial" w:cs="Arial"/>
-        </w:rPr>
-        <w:t>Registry Staff: Review and approve enrolment requests in accordance with academic and administrative rules.</w:t>
-      </w:r>
-    </w:p>
-    <w:p>
-      <w:pPr>
-        <w:pStyle w:val="ListParagraph"/>
-        <w:numPr>
-          <w:ilvl w:val="0"/>
-          <w:numId w:val="8"/>
-        </w:numPr>
-        <w:spacing w:line="360" w:lineRule="auto"/>
-        <w:jc w:val="both"/>
-        <w:rPr>
-          <w:rFonts w:ascii="Arial" w:hAnsi="Arial" w:cs="Arial"/>
-        </w:rPr>
-      </w:pPr>
-      <w:r>
-        <w:rPr>
-          <w:rFonts w:ascii="Arial" w:hAnsi="Arial" w:cs="Arial"/>
-        </w:rPr>
-        <w:t>Finance Staff: Process payments and confirm enrolments upon successful payment verification.</w:t>
-      </w:r>
-    </w:p>
-    <w:p>
-      <w:pPr>
-        <w:pStyle w:val="ListParagraph"/>
-        <w:numPr>
-          <w:ilvl w:val="0"/>
-          <w:numId w:val="8"/>
-        </w:numPr>
-        <w:spacing w:line="360" w:lineRule="auto"/>
-        <w:jc w:val="both"/>
-        <w:rPr>
-          <w:rFonts w:ascii="Arial" w:hAnsi="Arial" w:cs="Arial"/>
-        </w:rPr>
-      </w:pPr>
-      <w:r>
-        <w:rPr>
-          <w:rFonts w:ascii="Arial" w:hAnsi="Arial" w:cs="Arial"/>
-        </w:rPr>
-        <w:t>IT Staff: Maintain system infrastructure, ensure availability, and provide technical support.</w:t>
-      </w:r>
-    </w:p>
-    <w:p>
-      <w:pPr>
-        <w:pStyle w:val="ListParagraph"/>
-        <w:numPr>
-          <w:ilvl w:val="0"/>
-          <w:numId w:val="8"/>
-        </w:numPr>
-        <w:spacing w:line="360" w:lineRule="auto"/>
-        <w:jc w:val="both"/>
-        <w:rPr>
-          <w:rFonts w:ascii="Arial" w:hAnsi="Arial" w:cs="Arial"/>
-        </w:rPr>
-      </w:pPr>
-      <w:r>
-        <w:rPr>
-          <w:rFonts w:ascii="Arial" w:hAnsi="Arial" w:cs="Arial"/>
-        </w:rPr>
-        <w:t>University Management: Access system data for reporting, strategic planning, and decision-making</w:t>
-      </w:r>
-      <w:r>
-        <w:rPr>
-          <w:rFonts w:ascii="Arial" w:hAnsi="Arial" w:cs="Arial"/>
-        </w:rPr>
-        <w:t>.</w:t>
+        <w:rPr>
+          <w:rFonts w:ascii="Arial" w:hAnsi="Arial" w:cs="Arial"/>
+        </w:rPr>
+      </w:pPr>
+      <w:r>
+        <w:rPr>
+          <w:rFonts w:ascii="Arial" w:hAnsi="Arial" w:cs="Arial"/>
+          <w:b/>
+          <w:bCs/>
+        </w:rPr>
+        <w:t>System Administrator:</w:t>
+      </w:r>
+      <w:r>
+        <w:rPr>
+          <w:rFonts w:ascii="Arial" w:hAnsi="Arial" w:cs="Arial"/>
+        </w:rPr>
+        <w:t xml:space="preserve"> Manage user accounts, access control, ensure system uptime and security</w:t>
       </w:r>
     </w:p>
     <w:p>
@@ -3183,25 +3910,25 @@
         <w:rPr>
           <w:rFonts w:ascii="Arial" w:hAnsi="Arial" w:cs="Arial"/>
         </w:rPr>
-        <w:t>The diversity of stakeholders highlights the need for a system that supports multiple user roles with controlled access and responsibilities.</w:t>
-      </w:r>
-      <w:r>
-        <w:rPr>
-          <w:rFonts w:ascii="Arial" w:hAnsi="Arial" w:cs="Arial"/>
-        </w:rPr>
-        <w:t xml:space="preserve"> Among these systems, t</w:t>
-      </w:r>
-      <w:r>
-        <w:rPr>
-          <w:rFonts w:ascii="Arial" w:hAnsi="Arial" w:cs="Arial"/>
-        </w:rPr>
-        <w:t>he Student Enrolment and Course Management System is selected as the focus of this project</w:t>
-      </w:r>
-      <w:r>
-        <w:rPr>
-          <w:rFonts w:ascii="Arial" w:hAnsi="Arial" w:cs="Arial"/>
-        </w:rPr>
-        <w:t>.</w:t>
+        <w:t>Th</w:t>
+      </w:r>
+      <w:r>
+        <w:rPr>
+          <w:rFonts w:ascii="Arial" w:hAnsi="Arial" w:cs="Arial"/>
+        </w:rPr>
+        <w:t>is</w:t>
+      </w:r>
+      <w:r>
+        <w:rPr>
+          <w:rFonts w:ascii="Arial" w:hAnsi="Arial" w:cs="Arial"/>
+        </w:rPr>
+        <w:t xml:space="preserve"> diversity of stakeholders highlights the need for a system that supports multiple user roles with controlled access and responsibilities.</w:t>
+      </w:r>
+      <w:r>
+        <w:rPr>
+          <w:rFonts w:ascii="Arial" w:hAnsi="Arial" w:cs="Arial"/>
+        </w:rPr>
+        <w:t xml:space="preserve"> </w:t>
       </w:r>
     </w:p>
     <w:p>
@@ -3218,7 +3945,6 @@
           <w:szCs w:val="28"/>
         </w:rPr>
       </w:pPr>
-      <w:bookmarkStart w:id="6" w:name="_Toc226899726"/>
       <w:r>
         <w:rPr>
           <w:rFonts w:ascii="Arial" w:hAnsi="Arial" w:cs="Arial"/>
@@ -3250,7 +3976,7 @@
           <w:sz w:val="28"/>
           <w:szCs w:val="28"/>
         </w:rPr>
-        <w:t>4</w:t>
+        <w:t>5</w:t>
       </w:r>
       <w:r>
         <w:rPr>
@@ -3261,166 +3987,9 @@
           <w:sz w:val="28"/>
           <w:szCs w:val="28"/>
         </w:rPr>
-        <w:t>. Problem statement</w:t>
-      </w:r>
-      <w:bookmarkEnd w:id="6"/>
-    </w:p>
-    <w:p>
-      <w:pPr>
-        <w:spacing w:line="360" w:lineRule="auto"/>
-        <w:ind w:left="567"/>
-        <w:jc w:val="both"/>
-        <w:rPr>
-          <w:rFonts w:ascii="Arial" w:hAnsi="Arial" w:cs="Arial"/>
-        </w:rPr>
-      </w:pPr>
-      <w:r>
-        <w:rPr>
-          <w:rFonts w:ascii="Arial" w:hAnsi="Arial" w:cs="Arial"/>
-        </w:rPr>
-        <w:t xml:space="preserve">The current enrolment process at Auckland University of Technology relies heavily on manual, paper-based procedures for managing student enrolment and course administration. This approach creates several operational challenges, including lost or misplaced enrolment forms, manual prerequisite checks prone to errors, delays in enrolment approval—especially during peak periods—and difficulty tracking student progress or course capacity. These inefficiencies result in slow processing </w:t>
-      </w:r>
-      <w:r>
-        <w:rPr>
-          <w:rFonts w:ascii="Arial" w:hAnsi="Arial" w:cs="Arial"/>
-        </w:rPr>
-        <w:lastRenderedPageBreak/>
-        <w:t>times, inconsistent data, limited accessibility, and poor coordination between departments.</w:t>
-      </w:r>
-    </w:p>
-    <w:p>
-      <w:pPr>
-        <w:spacing w:line="360" w:lineRule="auto"/>
-        <w:ind w:left="567"/>
-        <w:jc w:val="both"/>
-        <w:rPr>
-          <w:rFonts w:ascii="Arial" w:hAnsi="Arial" w:cs="Arial"/>
-        </w:rPr>
-      </w:pPr>
-      <w:r>
-        <w:rPr>
-          <w:rFonts w:ascii="Arial" w:hAnsi="Arial" w:cs="Arial"/>
-        </w:rPr>
-        <w:t xml:space="preserve">To address these issues, </w:t>
-      </w:r>
-      <w:r>
-        <w:rPr>
-          <w:rFonts w:ascii="Arial" w:hAnsi="Arial" w:cs="Arial"/>
-        </w:rPr>
-        <w:t>AUT</w:t>
-      </w:r>
-      <w:r>
-        <w:rPr>
-          <w:rFonts w:ascii="Arial" w:hAnsi="Arial" w:cs="Arial"/>
-        </w:rPr>
-        <w:t xml:space="preserve"> requires a Student Enrolment and Course Management System to manage course selection, enrolment, and related </w:t>
-      </w:r>
-      <w:r>
-        <w:rPr>
-          <w:rFonts w:ascii="Arial" w:hAnsi="Arial" w:cs="Arial"/>
-        </w:rPr>
-        <w:t xml:space="preserve">academic </w:t>
-      </w:r>
-      <w:r>
-        <w:rPr>
-          <w:rFonts w:ascii="Arial" w:hAnsi="Arial" w:cs="Arial"/>
-        </w:rPr>
-        <w:t xml:space="preserve">processes. </w:t>
-      </w:r>
-      <w:r>
-        <w:rPr>
-          <w:rFonts w:ascii="Arial" w:hAnsi="Arial" w:cs="Arial"/>
-        </w:rPr>
-        <w:t>The system must operate across multiple departments, including the Academic Department, Registry/Admissions Office, and Finance Department, each responsible for different aspects of the enrolment workflow.</w:t>
-      </w:r>
-      <w:r>
-        <w:t xml:space="preserve"> </w:t>
-      </w:r>
-      <w:r>
-        <w:rPr>
-          <w:rFonts w:ascii="Arial" w:hAnsi="Arial" w:cs="Arial"/>
-        </w:rPr>
-        <w:t>The system must support both domestic and international students, who may have different enrolment requirements, fee structures, and approval processes.</w:t>
-      </w:r>
-    </w:p>
-    <w:p>
-      <w:pPr>
-        <w:spacing w:line="360" w:lineRule="auto"/>
-        <w:ind w:left="567"/>
-        <w:jc w:val="both"/>
-        <w:rPr>
-          <w:rFonts w:ascii="Arial" w:hAnsi="Arial" w:cs="Arial"/>
-        </w:rPr>
-      </w:pPr>
-      <w:r>
-        <w:rPr>
-          <w:rFonts w:ascii="Arial" w:hAnsi="Arial" w:cs="Arial"/>
-        </w:rPr>
-        <w:t>Students should be able to search for available courses, enrol in them, and view their enrolled courses through the system. The system must automatically enforce key business rules, such as checking prerequisites, validating course availability, and preventing timetable conflicts before confirming enrolment. When selecting courses, students will be able to view a timetable of the courses they have chosen, and the system will automatically detect any clashes and display them visually. Students can then adjust their selection based on these clashes to ensure a feasible schedule.</w:t>
-      </w:r>
-    </w:p>
-    <w:p>
-      <w:pPr>
-        <w:spacing w:line="360" w:lineRule="auto"/>
-        <w:ind w:left="567"/>
-        <w:jc w:val="both"/>
-        <w:rPr>
-          <w:rFonts w:ascii="Arial" w:hAnsi="Arial" w:cs="Arial"/>
-        </w:rPr>
-      </w:pPr>
-      <w:r>
-        <w:rPr>
-          <w:rFonts w:ascii="Arial" w:hAnsi="Arial" w:cs="Arial"/>
-        </w:rPr>
-        <w:t>Staff members will perform distinct tasks depending on their department. Academic Department staff are responsible for maintaining course information, including course descriptions, prerequisites, capacity limits, and timetable details. Registry/Admissions Office staff review and approve student enrolment requests, ensuring that all prerequisite, course availability, and timetable clash rules are satisfied. Finance Department staff process tuition and course-related payments and confirm enrolments only after successful payment verification. Since these responsibilities are distributed across departments, the system must ensure efficient coordination, secure data sharing, and real-time updates among all stakeholders</w:t>
-      </w:r>
-      <w:r>
-        <w:rPr>
-          <w:rFonts w:ascii="Arial" w:hAnsi="Arial" w:cs="Arial"/>
-        </w:rPr>
-        <w:t>.</w:t>
-      </w:r>
-    </w:p>
-    <w:p>
-      <w:pPr>
-        <w:spacing w:line="360" w:lineRule="auto"/>
-        <w:ind w:left="567"/>
-        <w:jc w:val="both"/>
-        <w:rPr>
-          <w:rFonts w:ascii="Arial" w:hAnsi="Arial" w:cs="Arial"/>
-        </w:rPr>
-      </w:pPr>
-      <w:r>
-        <w:rPr>
-          <w:rFonts w:ascii="Arial" w:hAnsi="Arial" w:cs="Arial"/>
-        </w:rPr>
-        <w:t xml:space="preserve">The proposed system will be a web-based application accessible through a browser on any device. It must support multiple concurrent users while ensuring data accuracy, security, and real-time updates. By replacing the existing manual process, </w:t>
-      </w:r>
-      <w:r>
-        <w:rPr>
-          <w:rFonts w:ascii="Arial" w:hAnsi="Arial" w:cs="Arial"/>
-        </w:rPr>
-        <w:lastRenderedPageBreak/>
-        <w:t xml:space="preserve">the system aims to improve operational efficiency, reduce errors, and enhance the overall user experience for </w:t>
-      </w:r>
-      <w:r>
-        <w:rPr>
-          <w:rFonts w:ascii="Arial" w:hAnsi="Arial" w:cs="Arial"/>
-        </w:rPr>
-        <w:t>both domestic and international students, as well as staff</w:t>
-      </w:r>
-      <w:r>
-        <w:rPr>
-          <w:rFonts w:ascii="Arial" w:hAnsi="Arial" w:cs="Arial"/>
-        </w:rPr>
-        <w:t>.</w:t>
-      </w:r>
-    </w:p>
-    <w:p>
-      <w:pPr>
-        <w:pStyle w:val="Heading2"/>
-        <w:spacing w:before="0" w:line="360" w:lineRule="auto"/>
-        <w:ind w:left="284"/>
+        <w:t xml:space="preserve">. </w:t>
+      </w:r>
+      <w:r>
         <w:rPr>
           <w:rFonts w:ascii="Arial" w:hAnsi="Arial" w:cs="Arial"/>
           <w:b/>
@@ -3429,8 +3998,8 @@
           <w:sz w:val="28"/>
           <w:szCs w:val="28"/>
         </w:rPr>
-      </w:pPr>
-      <w:bookmarkStart w:id="7" w:name="_Toc226899727"/>
+        <w:t xml:space="preserve">System </w:t>
+      </w:r>
       <w:r>
         <w:rPr>
           <w:rFonts w:ascii="Arial" w:hAnsi="Arial" w:cs="Arial"/>
@@ -3440,7 +4009,7 @@
           <w:sz w:val="28"/>
           <w:szCs w:val="28"/>
         </w:rPr>
-        <w:t>2</w:t>
+        <w:t>s</w:t>
       </w:r>
       <w:r>
         <w:rPr>
@@ -3451,7 +4020,7 @@
           <w:sz w:val="28"/>
           <w:szCs w:val="28"/>
         </w:rPr>
-        <w:t>.</w:t>
+        <w:t xml:space="preserve">cope, </w:t>
       </w:r>
       <w:r>
         <w:rPr>
@@ -3462,7 +4031,7 @@
           <w:sz w:val="28"/>
           <w:szCs w:val="28"/>
         </w:rPr>
-        <w:t>5</w:t>
+        <w:t>b</w:t>
       </w:r>
       <w:r>
         <w:rPr>
@@ -3473,7 +4042,7 @@
           <w:sz w:val="28"/>
           <w:szCs w:val="28"/>
         </w:rPr>
-        <w:t xml:space="preserve">. </w:t>
+        <w:t xml:space="preserve">oundaries, and </w:t>
       </w:r>
       <w:r>
         <w:rPr>
@@ -3484,7 +4053,7 @@
           <w:sz w:val="28"/>
           <w:szCs w:val="28"/>
         </w:rPr>
-        <w:t xml:space="preserve">System </w:t>
+        <w:t>a</w:t>
       </w:r>
       <w:r>
         <w:rPr>
@@ -3495,64 +4064,9 @@
           <w:sz w:val="28"/>
           <w:szCs w:val="28"/>
         </w:rPr>
-        <w:t>s</w:t>
-      </w:r>
-      <w:r>
-        <w:rPr>
-          <w:rFonts w:ascii="Arial" w:hAnsi="Arial" w:cs="Arial"/>
-          <w:b/>
-          <w:bCs/>
-          <w:color w:val="EE0000"/>
-          <w:sz w:val="28"/>
-          <w:szCs w:val="28"/>
-        </w:rPr>
-        <w:t xml:space="preserve">cope, </w:t>
-      </w:r>
-      <w:r>
-        <w:rPr>
-          <w:rFonts w:ascii="Arial" w:hAnsi="Arial" w:cs="Arial"/>
-          <w:b/>
-          <w:bCs/>
-          <w:color w:val="EE0000"/>
-          <w:sz w:val="28"/>
-          <w:szCs w:val="28"/>
-        </w:rPr>
-        <w:t>b</w:t>
-      </w:r>
-      <w:r>
-        <w:rPr>
-          <w:rFonts w:ascii="Arial" w:hAnsi="Arial" w:cs="Arial"/>
-          <w:b/>
-          <w:bCs/>
-          <w:color w:val="EE0000"/>
-          <w:sz w:val="28"/>
-          <w:szCs w:val="28"/>
-        </w:rPr>
-        <w:t xml:space="preserve">oundaries, and </w:t>
-      </w:r>
-      <w:r>
-        <w:rPr>
-          <w:rFonts w:ascii="Arial" w:hAnsi="Arial" w:cs="Arial"/>
-          <w:b/>
-          <w:bCs/>
-          <w:color w:val="EE0000"/>
-          <w:sz w:val="28"/>
-          <w:szCs w:val="28"/>
-        </w:rPr>
-        <w:t>a</w:t>
-      </w:r>
-      <w:r>
-        <w:rPr>
-          <w:rFonts w:ascii="Arial" w:hAnsi="Arial" w:cs="Arial"/>
-          <w:b/>
-          <w:bCs/>
-          <w:color w:val="EE0000"/>
-          <w:sz w:val="28"/>
-          <w:szCs w:val="28"/>
-        </w:rPr>
         <w:t>ssumptions</w:t>
       </w:r>
-      <w:bookmarkEnd w:id="7"/>
+      <w:bookmarkEnd w:id="6"/>
     </w:p>
     <w:p>
       <w:pPr>
@@ -3627,7 +4141,7 @@
     </w:p>
     <w:p>
       <w:pPr>
-        <w:spacing w:line="360" w:lineRule="auto"/>
+        <w:spacing w:after="0" w:line="360" w:lineRule="auto"/>
         <w:ind w:left="851"/>
         <w:jc w:val="both"/>
         <w:rPr>
@@ -3730,6 +4244,7 @@
         <w:rPr>
           <w:rFonts w:ascii="Arial" w:hAnsi="Arial" w:cs="Arial"/>
         </w:rPr>
+        <w:lastRenderedPageBreak/>
         <w:t>Integrate payment processing for enrolment confirmation</w:t>
       </w:r>
     </w:p>
@@ -3778,7 +4293,19 @@
         <w:rPr>
           <w:rFonts w:ascii="Arial" w:hAnsi="Arial" w:cs="Arial"/>
         </w:rPr>
-        <w:t xml:space="preserve"> system will involve three departments</w:t>
+        <w:t xml:space="preserve"> system will involve </w:t>
+      </w:r>
+      <w:r>
+        <w:rPr>
+          <w:rFonts w:ascii="Arial" w:hAnsi="Arial" w:cs="Arial"/>
+        </w:rPr>
+        <w:t>three</w:t>
+      </w:r>
+      <w:r>
+        <w:rPr>
+          <w:rFonts w:ascii="Arial" w:hAnsi="Arial" w:cs="Arial"/>
+        </w:rPr>
+        <w:t xml:space="preserve"> departments</w:t>
       </w:r>
       <w:r>
         <w:rPr>
@@ -3814,7 +4341,19 @@
         <w:rPr>
           <w:rFonts w:ascii="Arial" w:hAnsi="Arial" w:cs="Arial"/>
         </w:rPr>
-        <w:t>, and Finance Department</w:t>
+        <w:t xml:space="preserve">, </w:t>
+      </w:r>
+      <w:r>
+        <w:rPr>
+          <w:rFonts w:ascii="Arial" w:hAnsi="Arial" w:cs="Arial"/>
+        </w:rPr>
+        <w:t xml:space="preserve">and </w:t>
+      </w:r>
+      <w:r>
+        <w:rPr>
+          <w:rFonts w:ascii="Arial" w:hAnsi="Arial" w:cs="Arial"/>
+        </w:rPr>
+        <w:t>Finance Department</w:t>
       </w:r>
       <w:r>
         <w:rPr>
@@ -3991,7 +4530,7 @@
     </w:p>
     <w:p>
       <w:pPr>
-        <w:spacing w:line="360" w:lineRule="auto"/>
+        <w:spacing w:after="0" w:line="360" w:lineRule="auto"/>
         <w:ind w:left="851"/>
         <w:jc w:val="both"/>
         <w:rPr>
@@ -4243,6 +4782,7 @@
         </w:rPr>
         <w:t xml:space="preserve">. </w:t>
       </w:r>
+      <w:bookmarkEnd w:id="12"/>
       <w:r>
         <w:rPr>
           <w:rFonts w:ascii="Arial" w:hAnsi="Arial" w:cs="Arial"/>
@@ -4252,61 +4792,34 @@
           <w:sz w:val="28"/>
           <w:szCs w:val="28"/>
         </w:rPr>
-        <w:t>Requirement Analysis</w:t>
-      </w:r>
-      <w:bookmarkEnd w:id="12"/>
-    </w:p>
-    <w:p>
-      <w:pPr>
-        <w:pStyle w:val="Heading3"/>
-        <w:ind w:left="851"/>
-        <w:rPr>
-          <w:rFonts w:ascii="Arial" w:hAnsi="Arial" w:cs="Arial"/>
-          <w:b/>
-          <w:bCs/>
-          <w:color w:val="EE0000"/>
-          <w:sz w:val="24"/>
-          <w:szCs w:val="24"/>
-        </w:rPr>
-      </w:pPr>
-      <w:bookmarkStart w:id="13" w:name="_Toc226899733"/>
-      <w:r>
-        <w:rPr>
-          <w:rFonts w:ascii="Arial" w:hAnsi="Arial" w:cs="Arial"/>
-          <w:b/>
-          <w:bCs/>
-          <w:color w:val="EE0000"/>
-          <w:sz w:val="24"/>
-          <w:szCs w:val="24"/>
-        </w:rPr>
-        <w:t>i.</w:t>
-      </w:r>
-      <w:r>
-        <w:rPr>
-          <w:rFonts w:ascii="Arial" w:hAnsi="Arial" w:cs="Arial"/>
-          <w:b/>
-          <w:bCs/>
-          <w:color w:val="EE0000"/>
-          <w:sz w:val="24"/>
-          <w:szCs w:val="24"/>
-        </w:rPr>
-        <w:t xml:space="preserve"> Stakeholders and Roles</w:t>
-      </w:r>
-      <w:bookmarkEnd w:id="13"/>
-    </w:p>
-    <w:p>
-      <w:pPr>
-        <w:spacing w:line="360" w:lineRule="auto"/>
-        <w:ind w:left="1134"/>
-        <w:rPr>
-          <w:rFonts w:ascii="Arial" w:hAnsi="Arial" w:cs="Arial"/>
-        </w:rPr>
-      </w:pPr>
-      <w:r>
-        <w:rPr>
-          <w:rFonts w:ascii="Arial" w:hAnsi="Arial" w:cs="Arial"/>
-        </w:rPr>
-        <w:t>Based on the problem statement, the key stakeholders and their respective roles are identified as follows</w:t>
+        <w:t>Functional Requirements</w:t>
+      </w:r>
+    </w:p>
+    <w:p>
+      <w:pPr>
+        <w:spacing w:line="360" w:lineRule="auto"/>
+        <w:ind w:left="567"/>
+        <w:rPr>
+          <w:rFonts w:ascii="Arial" w:hAnsi="Arial" w:cs="Arial"/>
+        </w:rPr>
+      </w:pPr>
+      <w:r>
+        <w:rPr>
+          <w:rFonts w:ascii="Arial" w:hAnsi="Arial" w:cs="Arial"/>
+        </w:rPr>
+        <w:t>Based on the problem statement, the system’s key functional requirements</w:t>
+      </w:r>
+      <w:r>
+        <w:rPr>
+          <w:rFonts w:ascii="Arial" w:hAnsi="Arial" w:cs="Arial"/>
+        </w:rPr>
+        <w:t xml:space="preserve"> </w:t>
+      </w:r>
+      <w:r>
+        <w:rPr>
+          <w:rFonts w:ascii="Arial" w:hAnsi="Arial" w:cs="Arial"/>
+        </w:rPr>
+        <w:t>are identified as follows</w:t>
       </w:r>
       <w:r>
         <w:rPr>
@@ -4320,27 +4833,58 @@
         <w:pStyle w:val="ListParagraph"/>
         <w:numPr>
           <w:ilvl w:val="0"/>
-          <w:numId w:val="4"/>
+          <w:numId w:val="12"/>
         </w:numPr>
         <w:spacing w:line="360" w:lineRule="auto"/>
-        <w:ind w:left="1560"/>
-        <w:rPr>
-          <w:rFonts w:ascii="Arial" w:hAnsi="Arial" w:cs="Arial"/>
-        </w:rPr>
-      </w:pPr>
-      <w:r>
-        <w:rPr>
-          <w:rFonts w:ascii="Arial" w:hAnsi="Arial" w:cs="Arial"/>
-          <w:b/>
-          <w:bCs/>
-        </w:rPr>
-        <w:t>Student (Domestic / International):</w:t>
-      </w:r>
-      <w:r>
-        <w:rPr>
-          <w:rFonts w:ascii="Arial" w:hAnsi="Arial" w:cs="Arial"/>
-        </w:rPr>
-        <w:t xml:space="preserve"> Search courses, enrol, view enrolled courses, check timetable and clashes, manage enrolment requests</w:t>
+        <w:rPr>
+          <w:rFonts w:ascii="Arial" w:hAnsi="Arial" w:cs="Arial"/>
+        </w:rPr>
+      </w:pPr>
+      <w:r>
+        <w:rPr>
+          <w:rFonts w:ascii="Arial" w:hAnsi="Arial" w:cs="Arial"/>
+        </w:rPr>
+        <w:t>Course Search and Viewing:</w:t>
+      </w:r>
+    </w:p>
+    <w:p>
+      <w:pPr>
+        <w:pStyle w:val="ListParagraph"/>
+        <w:numPr>
+          <w:ilvl w:val="1"/>
+          <w:numId w:val="12"/>
+        </w:numPr>
+        <w:spacing w:line="360" w:lineRule="auto"/>
+        <w:ind w:left="1843"/>
+        <w:rPr>
+          <w:rFonts w:ascii="Arial" w:hAnsi="Arial" w:cs="Arial"/>
+        </w:rPr>
+      </w:pPr>
+      <w:r>
+        <w:rPr>
+          <w:rFonts w:ascii="Arial" w:hAnsi="Arial" w:cs="Arial"/>
+        </w:rPr>
+        <w:t>The system shall allow students to search for available courses by course code, course name, or department.</w:t>
+      </w:r>
+    </w:p>
+    <w:p>
+      <w:pPr>
+        <w:pStyle w:val="ListParagraph"/>
+        <w:numPr>
+          <w:ilvl w:val="1"/>
+          <w:numId w:val="12"/>
+        </w:numPr>
+        <w:spacing w:line="360" w:lineRule="auto"/>
+        <w:ind w:left="1843"/>
+        <w:rPr>
+          <w:rFonts w:ascii="Arial" w:hAnsi="Arial" w:cs="Arial"/>
+        </w:rPr>
+      </w:pPr>
+      <w:r>
+        <w:rPr>
+          <w:rFonts w:ascii="Arial" w:hAnsi="Arial" w:cs="Arial"/>
+        </w:rPr>
+        <w:t>The system shall display detailed course information, including course description, prerequisites, capacity, and timetable.</w:t>
       </w:r>
     </w:p>
     <w:p>
@@ -4348,219 +4892,18 @@
         <w:pStyle w:val="ListParagraph"/>
         <w:numPr>
           <w:ilvl w:val="0"/>
-          <w:numId w:val="4"/>
+          <w:numId w:val="12"/>
         </w:numPr>
         <w:spacing w:line="360" w:lineRule="auto"/>
-        <w:ind w:left="1560"/>
-        <w:rPr>
-          <w:rFonts w:ascii="Arial" w:hAnsi="Arial" w:cs="Arial"/>
-        </w:rPr>
-      </w:pPr>
-      <w:r>
-        <w:rPr>
-          <w:rFonts w:ascii="Arial" w:hAnsi="Arial" w:cs="Arial"/>
-          <w:b/>
-          <w:bCs/>
-        </w:rPr>
-        <w:t>Academic Department Staff:</w:t>
-      </w:r>
-      <w:r>
-        <w:rPr>
-          <w:rFonts w:ascii="Arial" w:hAnsi="Arial" w:cs="Arial"/>
-        </w:rPr>
-        <w:t xml:space="preserve"> Maintain course information, prerequisites, capacity, timetable details</w:t>
-      </w:r>
-    </w:p>
-    <w:p>
-      <w:pPr>
-        <w:pStyle w:val="ListParagraph"/>
-        <w:numPr>
-          <w:ilvl w:val="0"/>
-          <w:numId w:val="4"/>
-        </w:numPr>
-        <w:spacing w:line="360" w:lineRule="auto"/>
-        <w:ind w:left="1560"/>
-        <w:rPr>
-          <w:rFonts w:ascii="Arial" w:hAnsi="Arial" w:cs="Arial"/>
-        </w:rPr>
-      </w:pPr>
-      <w:r>
-        <w:rPr>
-          <w:rFonts w:ascii="Arial" w:hAnsi="Arial" w:cs="Arial"/>
-          <w:b/>
-          <w:bCs/>
-        </w:rPr>
-        <w:t>Registry / Admissions Staff:</w:t>
-      </w:r>
-      <w:r>
-        <w:rPr>
-          <w:rFonts w:ascii="Arial" w:hAnsi="Arial" w:cs="Arial"/>
-        </w:rPr>
-        <w:t xml:space="preserve"> Review and approve enrolment requests, enforce enrolment rules (prerequisites, timetable conflicts)</w:t>
-      </w:r>
-    </w:p>
-    <w:p>
-      <w:pPr>
-        <w:pStyle w:val="ListParagraph"/>
-        <w:numPr>
-          <w:ilvl w:val="0"/>
-          <w:numId w:val="4"/>
-        </w:numPr>
-        <w:spacing w:line="360" w:lineRule="auto"/>
-        <w:ind w:left="1560"/>
-        <w:rPr>
-          <w:rFonts w:ascii="Arial" w:hAnsi="Arial" w:cs="Arial"/>
-        </w:rPr>
-      </w:pPr>
-      <w:r>
-        <w:rPr>
-          <w:rFonts w:ascii="Arial" w:hAnsi="Arial" w:cs="Arial"/>
-          <w:b/>
-          <w:bCs/>
-        </w:rPr>
-        <w:t>Finance Department Staff:</w:t>
-      </w:r>
-      <w:r>
-        <w:rPr>
-          <w:rFonts w:ascii="Arial" w:hAnsi="Arial" w:cs="Arial"/>
-        </w:rPr>
-        <w:t xml:space="preserve"> Process tuition/course payments, confirm enrolment upon payment verification</w:t>
-      </w:r>
-    </w:p>
-    <w:p>
-      <w:pPr>
-        <w:pStyle w:val="ListParagraph"/>
-        <w:numPr>
-          <w:ilvl w:val="0"/>
-          <w:numId w:val="4"/>
-        </w:numPr>
-        <w:spacing w:line="360" w:lineRule="auto"/>
-        <w:ind w:left="1560"/>
-        <w:rPr>
-          <w:rFonts w:ascii="Arial" w:hAnsi="Arial" w:cs="Arial"/>
-        </w:rPr>
-      </w:pPr>
-      <w:r>
-        <w:rPr>
-          <w:rFonts w:ascii="Arial" w:hAnsi="Arial" w:cs="Arial"/>
-          <w:b/>
-          <w:bCs/>
-        </w:rPr>
-        <w:t>System Administrator:</w:t>
-      </w:r>
-      <w:r>
-        <w:rPr>
-          <w:rFonts w:ascii="Arial" w:hAnsi="Arial" w:cs="Arial"/>
-        </w:rPr>
-        <w:t xml:space="preserve"> Manage user accounts, access control, ensure system uptime and security</w:t>
-      </w:r>
-    </w:p>
-    <w:p>
-      <w:pPr>
-        <w:pStyle w:val="Heading3"/>
-        <w:ind w:left="851"/>
-        <w:rPr>
-          <w:rFonts w:ascii="Arial" w:hAnsi="Arial" w:cs="Arial"/>
-          <w:b/>
-          <w:bCs/>
-          <w:color w:val="EE0000"/>
-          <w:sz w:val="24"/>
-          <w:szCs w:val="24"/>
-        </w:rPr>
-      </w:pPr>
-      <w:bookmarkStart w:id="14" w:name="_Toc226899734"/>
-      <w:r>
-        <w:rPr>
-          <w:rFonts w:ascii="Arial" w:hAnsi="Arial" w:cs="Arial"/>
-          <w:b/>
-          <w:bCs/>
-          <w:color w:val="EE0000"/>
-          <w:sz w:val="24"/>
-          <w:szCs w:val="24"/>
-        </w:rPr>
-        <w:t>ii.</w:t>
-      </w:r>
-      <w:r>
-        <w:rPr>
-          <w:rFonts w:ascii="Arial" w:hAnsi="Arial" w:cs="Arial"/>
-          <w:b/>
-          <w:bCs/>
-          <w:color w:val="EE0000"/>
-          <w:sz w:val="24"/>
-          <w:szCs w:val="24"/>
-        </w:rPr>
-        <w:t xml:space="preserve"> Functional Requirement</w:t>
-      </w:r>
-      <w:r>
-        <w:rPr>
-          <w:rFonts w:ascii="Arial" w:hAnsi="Arial" w:cs="Arial"/>
-          <w:b/>
-          <w:bCs/>
-          <w:color w:val="EE0000"/>
-          <w:sz w:val="24"/>
-          <w:szCs w:val="24"/>
-        </w:rPr>
-        <w:t>s</w:t>
-      </w:r>
-      <w:bookmarkEnd w:id="14"/>
-    </w:p>
-    <w:p>
-      <w:pPr>
-        <w:spacing w:line="360" w:lineRule="auto"/>
-        <w:ind w:left="1134"/>
-        <w:rPr>
-          <w:rFonts w:ascii="Arial" w:hAnsi="Arial" w:cs="Arial"/>
-        </w:rPr>
-      </w:pPr>
-      <w:r>
-        <w:rPr>
-          <w:rFonts w:ascii="Arial" w:hAnsi="Arial" w:cs="Arial"/>
-        </w:rPr>
-        <w:t>Based on the problem statement, the system’s key functional requirements</w:t>
-      </w:r>
-      <w:r>
-        <w:rPr>
-          <w:rFonts w:ascii="Arial" w:hAnsi="Arial" w:cs="Arial"/>
-        </w:rPr>
-        <w:t xml:space="preserve"> </w:t>
-      </w:r>
-      <w:r>
-        <w:rPr>
-          <w:rFonts w:ascii="Arial" w:hAnsi="Arial" w:cs="Arial"/>
-        </w:rPr>
-        <w:t>are identified as follows</w:t>
-      </w:r>
-      <w:r>
-        <w:rPr>
-          <w:rFonts w:ascii="Arial" w:hAnsi="Arial" w:cs="Arial"/>
-        </w:rPr>
-        <w:t xml:space="preserve">: </w:t>
-      </w:r>
-    </w:p>
-    <w:p>
-      <w:pPr>
-        <w:pStyle w:val="ListParagraph"/>
-        <w:numPr>
-          <w:ilvl w:val="0"/>
-          <w:numId w:val="5"/>
-        </w:numPr>
-        <w:spacing w:line="360" w:lineRule="auto"/>
-        <w:ind w:left="1560"/>
-        <w:rPr>
-          <w:rFonts w:ascii="Arial" w:hAnsi="Arial" w:cs="Arial"/>
-        </w:rPr>
-      </w:pPr>
-      <w:r>
-        <w:rPr>
-          <w:rFonts w:ascii="Arial" w:hAnsi="Arial" w:cs="Arial"/>
-        </w:rPr>
-        <w:t>Course Search and Viewing</w:t>
-      </w:r>
-      <w:r>
-        <w:rPr>
-          <w:rFonts w:ascii="Arial" w:hAnsi="Arial" w:cs="Arial"/>
-        </w:rPr>
-        <w:t>:</w:t>
+        <w:rPr>
+          <w:rFonts w:ascii="Arial" w:hAnsi="Arial" w:cs="Arial"/>
+        </w:rPr>
+      </w:pPr>
+      <w:r>
+        <w:rPr>
+          <w:rFonts w:ascii="Arial" w:hAnsi="Arial" w:cs="Arial"/>
+        </w:rPr>
+        <w:t>Course Enrolment:</w:t>
       </w:r>
     </w:p>
     <w:p>
@@ -4580,7 +4923,7 @@
         <w:rPr>
           <w:rFonts w:ascii="Arial" w:hAnsi="Arial" w:cs="Arial"/>
         </w:rPr>
-        <w:t>The system shall allow students to search for available courses by course code, course name, or department.</w:t>
+        <w:t>The system shall allow students to enrol in selected courses.</w:t>
       </w:r>
     </w:p>
     <w:p>
@@ -4600,33 +4943,7 @@
         <w:rPr>
           <w:rFonts w:ascii="Arial" w:hAnsi="Arial" w:cs="Arial"/>
         </w:rPr>
-        <w:t>The system shall display detailed course information, including course description, prerequisites, capacity, and timetable.</w:t>
-      </w:r>
-    </w:p>
-    <w:p>
-      <w:pPr>
-        <w:pStyle w:val="ListParagraph"/>
-        <w:numPr>
-          <w:ilvl w:val="0"/>
-          <w:numId w:val="5"/>
-        </w:numPr>
-        <w:spacing w:line="360" w:lineRule="auto"/>
-        <w:ind w:left="1560"/>
-        <w:rPr>
-          <w:rFonts w:ascii="Arial" w:hAnsi="Arial" w:cs="Arial"/>
-        </w:rPr>
-      </w:pPr>
-      <w:r>
-        <w:rPr>
-          <w:rFonts w:ascii="Arial" w:hAnsi="Arial" w:cs="Arial"/>
-        </w:rPr>
-        <w:t>Course Enrolment</w:t>
-      </w:r>
-      <w:r>
-        <w:rPr>
-          <w:rFonts w:ascii="Arial" w:hAnsi="Arial" w:cs="Arial"/>
-        </w:rPr>
-        <w:t>:</w:t>
+        <w:t>The system shall automatically check prerequisites before allowing enrolment.</w:t>
       </w:r>
     </w:p>
     <w:p>
@@ -4646,7 +4963,7 @@
         <w:rPr>
           <w:rFonts w:ascii="Arial" w:hAnsi="Arial" w:cs="Arial"/>
         </w:rPr>
-        <w:t>The system shall allow students to enrol in selected courses.</w:t>
+        <w:t>The system shall automatically verify course availability before confirming enrolment.</w:t>
       </w:r>
     </w:p>
     <w:p>
@@ -4666,7 +4983,7 @@
         <w:rPr>
           <w:rFonts w:ascii="Arial" w:hAnsi="Arial" w:cs="Arial"/>
         </w:rPr>
-        <w:t>The system shall automatically check prerequisites before allowing enrolment.</w:t>
+        <w:t>The system shall detect timetable clashes and notify students before enrolment confirmation.</w:t>
       </w:r>
     </w:p>
     <w:p>
@@ -4686,8 +5003,26 @@
         <w:rPr>
           <w:rFonts w:ascii="Arial" w:hAnsi="Arial" w:cs="Arial"/>
         </w:rPr>
-        <w:lastRenderedPageBreak/>
-        <w:t>The system shall automatically verify course availability before confirming enrolment.</w:t>
+        <w:t>The system shall allow students to adjust their course selection if timetable conflicts are detected.</w:t>
+      </w:r>
+    </w:p>
+    <w:p>
+      <w:pPr>
+        <w:pStyle w:val="ListParagraph"/>
+        <w:numPr>
+          <w:ilvl w:val="0"/>
+          <w:numId w:val="12"/>
+        </w:numPr>
+        <w:spacing w:line="360" w:lineRule="auto"/>
+        <w:rPr>
+          <w:rFonts w:ascii="Arial" w:hAnsi="Arial" w:cs="Arial"/>
+        </w:rPr>
+      </w:pPr>
+      <w:r>
+        <w:rPr>
+          <w:rFonts w:ascii="Arial" w:hAnsi="Arial" w:cs="Arial"/>
+        </w:rPr>
+        <w:t>Timetable Management (Enrolment View):</w:t>
       </w:r>
     </w:p>
     <w:p>
@@ -4707,7 +5042,7 @@
         <w:rPr>
           <w:rFonts w:ascii="Arial" w:hAnsi="Arial" w:cs="Arial"/>
         </w:rPr>
-        <w:t>The system shall detect timetable clashes and notify students before enrolment confirmation.</w:t>
+        <w:t>The system shall display a timetable of the student’s enrolled courses.</w:t>
       </w:r>
     </w:p>
     <w:p>
@@ -4727,7 +5062,7 @@
         <w:rPr>
           <w:rFonts w:ascii="Arial" w:hAnsi="Arial" w:cs="Arial"/>
         </w:rPr>
-        <w:t>The system shall allow students to adjust their course selection if timetable conflicts are detected.</w:t>
+        <w:t>The system shall visually highlight any timetable clashes between selected courses.</w:t>
       </w:r>
     </w:p>
     <w:p>
@@ -4735,25 +5070,18 @@
         <w:pStyle w:val="ListParagraph"/>
         <w:numPr>
           <w:ilvl w:val="0"/>
-          <w:numId w:val="5"/>
+          <w:numId w:val="12"/>
         </w:numPr>
         <w:spacing w:line="360" w:lineRule="auto"/>
-        <w:ind w:left="1560"/>
-        <w:rPr>
-          <w:rFonts w:ascii="Arial" w:hAnsi="Arial" w:cs="Arial"/>
-        </w:rPr>
-      </w:pPr>
-      <w:r>
-        <w:rPr>
-          <w:rFonts w:ascii="Arial" w:hAnsi="Arial" w:cs="Arial"/>
-        </w:rPr>
-        <w:t>Timetable Management (Enrolment View)</w:t>
-      </w:r>
-      <w:r>
-        <w:rPr>
-          <w:rFonts w:ascii="Arial" w:hAnsi="Arial" w:cs="Arial"/>
-        </w:rPr>
-        <w:t>:</w:t>
+        <w:rPr>
+          <w:rFonts w:ascii="Arial" w:hAnsi="Arial" w:cs="Arial"/>
+        </w:rPr>
+      </w:pPr>
+      <w:r>
+        <w:rPr>
+          <w:rFonts w:ascii="Arial" w:hAnsi="Arial" w:cs="Arial"/>
+        </w:rPr>
+        <w:t>Staff Course Management:</w:t>
       </w:r>
     </w:p>
     <w:p>
@@ -4773,7 +5101,19 @@
         <w:rPr>
           <w:rFonts w:ascii="Arial" w:hAnsi="Arial" w:cs="Arial"/>
         </w:rPr>
-        <w:t>The system shall display a timetable of the student’s enrolled courses.</w:t>
+        <w:t>The system shall allow Academic Department</w:t>
+      </w:r>
+      <w:r>
+        <w:rPr>
+          <w:rFonts w:ascii="Arial" w:hAnsi="Arial" w:cs="Arial"/>
+        </w:rPr>
+        <w:t>s</w:t>
+      </w:r>
+      <w:r>
+        <w:rPr>
+          <w:rFonts w:ascii="Arial" w:hAnsi="Arial" w:cs="Arial"/>
+        </w:rPr>
+        <w:t xml:space="preserve"> staff to add, update, and remove course information, including descriptions, prerequisites, capacity, and timetable details.</w:t>
       </w:r>
     </w:p>
     <w:p>
@@ -4793,33 +5133,7 @@
         <w:rPr>
           <w:rFonts w:ascii="Arial" w:hAnsi="Arial" w:cs="Arial"/>
         </w:rPr>
-        <w:t>The system shall visually highlight any timetable clashes between selected courses.</w:t>
-      </w:r>
-    </w:p>
-    <w:p>
-      <w:pPr>
-        <w:pStyle w:val="ListParagraph"/>
-        <w:numPr>
-          <w:ilvl w:val="0"/>
-          <w:numId w:val="5"/>
-        </w:numPr>
-        <w:spacing w:line="360" w:lineRule="auto"/>
-        <w:ind w:left="1560"/>
-        <w:rPr>
-          <w:rFonts w:ascii="Arial" w:hAnsi="Arial" w:cs="Arial"/>
-        </w:rPr>
-      </w:pPr>
-      <w:r>
-        <w:rPr>
-          <w:rFonts w:ascii="Arial" w:hAnsi="Arial" w:cs="Arial"/>
-        </w:rPr>
-        <w:t>Staff Course Management</w:t>
-      </w:r>
-      <w:r>
-        <w:rPr>
-          <w:rFonts w:ascii="Arial" w:hAnsi="Arial" w:cs="Arial"/>
-        </w:rPr>
-        <w:t>:</w:t>
+        <w:t>The system shall allow Registry/Admissions staff to review and approve student enrolment requests.</w:t>
       </w:r>
     </w:p>
     <w:p>
@@ -4839,7 +5153,27 @@
         <w:rPr>
           <w:rFonts w:ascii="Arial" w:hAnsi="Arial" w:cs="Arial"/>
         </w:rPr>
-        <w:t>The system shall allow Academic Department staff to add, update, and remove course information, including descriptions, prerequisites, capacity, and timetable details.</w:t>
+        <w:lastRenderedPageBreak/>
+        <w:t>The system shall enforce prerequisite, course capacity, and timetable clash rules during approval.</w:t>
+      </w:r>
+    </w:p>
+    <w:p>
+      <w:pPr>
+        <w:pStyle w:val="ListParagraph"/>
+        <w:numPr>
+          <w:ilvl w:val="0"/>
+          <w:numId w:val="12"/>
+        </w:numPr>
+        <w:spacing w:line="360" w:lineRule="auto"/>
+        <w:rPr>
+          <w:rFonts w:ascii="Arial" w:hAnsi="Arial" w:cs="Arial"/>
+        </w:rPr>
+      </w:pPr>
+      <w:r>
+        <w:rPr>
+          <w:rFonts w:ascii="Arial" w:hAnsi="Arial" w:cs="Arial"/>
+        </w:rPr>
+        <w:t>Payment Processing and Enrolment Confirmation:</w:t>
       </w:r>
     </w:p>
     <w:p>
@@ -4859,7 +5193,7 @@
         <w:rPr>
           <w:rFonts w:ascii="Arial" w:hAnsi="Arial" w:cs="Arial"/>
         </w:rPr>
-        <w:t>The system shall allow Registry/Admissions staff to review and approve student enrolment requests.</w:t>
+        <w:t>The system shall allow Finance Department staff to process tuition and course-related payments.</w:t>
       </w:r>
     </w:p>
     <w:p>
@@ -4879,33 +5213,7 @@
         <w:rPr>
           <w:rFonts w:ascii="Arial" w:hAnsi="Arial" w:cs="Arial"/>
         </w:rPr>
-        <w:t>The system shall enforce prerequisite, course capacity, and timetable clash rules during approval.</w:t>
-      </w:r>
-    </w:p>
-    <w:p>
-      <w:pPr>
-        <w:pStyle w:val="ListParagraph"/>
-        <w:numPr>
-          <w:ilvl w:val="0"/>
-          <w:numId w:val="5"/>
-        </w:numPr>
-        <w:spacing w:line="360" w:lineRule="auto"/>
-        <w:ind w:left="1560"/>
-        <w:rPr>
-          <w:rFonts w:ascii="Arial" w:hAnsi="Arial" w:cs="Arial"/>
-        </w:rPr>
-      </w:pPr>
-      <w:r>
-        <w:rPr>
-          <w:rFonts w:ascii="Arial" w:hAnsi="Arial" w:cs="Arial"/>
-        </w:rPr>
-        <w:t>Payment Processing and Enrolment Confirmation</w:t>
-      </w:r>
-      <w:r>
-        <w:rPr>
-          <w:rFonts w:ascii="Arial" w:hAnsi="Arial" w:cs="Arial"/>
-        </w:rPr>
-        <w:t>:</w:t>
+        <w:t>The system shall confirm student enrolment only after successful payment verification.</w:t>
       </w:r>
     </w:p>
     <w:p>
@@ -4925,7 +5233,26 @@
         <w:rPr>
           <w:rFonts w:ascii="Arial" w:hAnsi="Arial" w:cs="Arial"/>
         </w:rPr>
-        <w:t>The system shall allow Finance Department staff to process tuition and course-related payments.</w:t>
+        <w:t>The system shall automatically update enrolment status after payment confirmation.</w:t>
+      </w:r>
+    </w:p>
+    <w:p>
+      <w:pPr>
+        <w:pStyle w:val="ListParagraph"/>
+        <w:numPr>
+          <w:ilvl w:val="0"/>
+          <w:numId w:val="12"/>
+        </w:numPr>
+        <w:spacing w:line="360" w:lineRule="auto"/>
+        <w:rPr>
+          <w:rFonts w:ascii="Arial" w:hAnsi="Arial" w:cs="Arial"/>
+        </w:rPr>
+      </w:pPr>
+      <w:r>
+        <w:rPr>
+          <w:rFonts w:ascii="Arial" w:hAnsi="Arial" w:cs="Arial"/>
+        </w:rPr>
+        <w:t>Notifications:</w:t>
       </w:r>
     </w:p>
     <w:p>
@@ -4945,7 +5272,7 @@
         <w:rPr>
           <w:rFonts w:ascii="Arial" w:hAnsi="Arial" w:cs="Arial"/>
         </w:rPr>
-        <w:t>The system shall confirm student enrolment only after successful payment verification.</w:t>
+        <w:t>The system shall notify students of successful enrolment confirmation.</w:t>
       </w:r>
     </w:p>
     <w:p>
@@ -4965,33 +5292,7 @@
         <w:rPr>
           <w:rFonts w:ascii="Arial" w:hAnsi="Arial" w:cs="Arial"/>
         </w:rPr>
-        <w:t>The system shall automatically update enrolment status after payment confirmation.</w:t>
-      </w:r>
-    </w:p>
-    <w:p>
-      <w:pPr>
-        <w:pStyle w:val="ListParagraph"/>
-        <w:numPr>
-          <w:ilvl w:val="0"/>
-          <w:numId w:val="5"/>
-        </w:numPr>
-        <w:spacing w:line="360" w:lineRule="auto"/>
-        <w:ind w:left="1560"/>
-        <w:rPr>
-          <w:rFonts w:ascii="Arial" w:hAnsi="Arial" w:cs="Arial"/>
-        </w:rPr>
-      </w:pPr>
-      <w:r>
-        <w:rPr>
-          <w:rFonts w:ascii="Arial" w:hAnsi="Arial" w:cs="Arial"/>
-        </w:rPr>
-        <w:t>Notifications</w:t>
-      </w:r>
-      <w:r>
-        <w:rPr>
-          <w:rFonts w:ascii="Arial" w:hAnsi="Arial" w:cs="Arial"/>
-        </w:rPr>
-        <w:t>:</w:t>
+        <w:t>The system shall notify students of any enrolment issues, including timetable clashes or prerequisite violations.</w:t>
       </w:r>
     </w:p>
     <w:p>
@@ -5011,7 +5312,26 @@
         <w:rPr>
           <w:rFonts w:ascii="Arial" w:hAnsi="Arial" w:cs="Arial"/>
         </w:rPr>
-        <w:t>The system shall notify students of successful enrolment confirmation.</w:t>
+        <w:t>The system shall notify staff of pending enrolment requests requiring approval.</w:t>
+      </w:r>
+    </w:p>
+    <w:p>
+      <w:pPr>
+        <w:pStyle w:val="ListParagraph"/>
+        <w:numPr>
+          <w:ilvl w:val="0"/>
+          <w:numId w:val="12"/>
+        </w:numPr>
+        <w:spacing w:line="360" w:lineRule="auto"/>
+        <w:rPr>
+          <w:rFonts w:ascii="Arial" w:hAnsi="Arial" w:cs="Arial"/>
+        </w:rPr>
+      </w:pPr>
+      <w:r>
+        <w:rPr>
+          <w:rFonts w:ascii="Arial" w:hAnsi="Arial" w:cs="Arial"/>
+        </w:rPr>
+        <w:t>User Access and Security:</w:t>
       </w:r>
     </w:p>
     <w:p>
@@ -5031,7 +5351,7 @@
         <w:rPr>
           <w:rFonts w:ascii="Arial" w:hAnsi="Arial" w:cs="Arial"/>
         </w:rPr>
-        <w:t>The system shall notify students of any enrolment issues, including timetable clashes or prerequisite violations.</w:t>
+        <w:t>The system shall restrict access to features based on user roles (Student, Academic Staff, Registry Staff, Finance Staff).</w:t>
       </w:r>
     </w:p>
     <w:p>
@@ -5051,7 +5371,7 @@
         <w:rPr>
           <w:rFonts w:ascii="Arial" w:hAnsi="Arial" w:cs="Arial"/>
         </w:rPr>
-        <w:t>The system shall notify staff of pending enrolment requests requiring approval.</w:t>
+        <w:t>The system shall require authentication before allowing access to any student or staff data.</w:t>
       </w:r>
     </w:p>
     <w:p>
@@ -5059,26 +5379,18 @@
         <w:pStyle w:val="ListParagraph"/>
         <w:numPr>
           <w:ilvl w:val="0"/>
-          <w:numId w:val="5"/>
+          <w:numId w:val="12"/>
         </w:numPr>
         <w:spacing w:line="360" w:lineRule="auto"/>
-        <w:ind w:left="1560"/>
-        <w:rPr>
-          <w:rFonts w:ascii="Arial" w:hAnsi="Arial" w:cs="Arial"/>
-        </w:rPr>
-      </w:pPr>
-      <w:r>
-        <w:rPr>
-          <w:rFonts w:ascii="Arial" w:hAnsi="Arial" w:cs="Arial"/>
-        </w:rPr>
-        <w:lastRenderedPageBreak/>
-        <w:t>User Access and Security</w:t>
-      </w:r>
-      <w:r>
-        <w:rPr>
-          <w:rFonts w:ascii="Arial" w:hAnsi="Arial" w:cs="Arial"/>
-        </w:rPr>
-        <w:t>:</w:t>
+        <w:rPr>
+          <w:rFonts w:ascii="Arial" w:hAnsi="Arial" w:cs="Arial"/>
+        </w:rPr>
+      </w:pPr>
+      <w:r>
+        <w:rPr>
+          <w:rFonts w:ascii="Arial" w:hAnsi="Arial" w:cs="Arial"/>
+        </w:rPr>
+        <w:t>Reporting and Audit:</w:t>
       </w:r>
     </w:p>
     <w:p>
@@ -5098,7 +5410,7 @@
         <w:rPr>
           <w:rFonts w:ascii="Arial" w:hAnsi="Arial" w:cs="Arial"/>
         </w:rPr>
-        <w:t>The system shall restrict access to features based on user roles (Student, Academic Staff, Registry Staff, Finance Staff).</w:t>
+        <w:t>The system shall generate enrolment reports for students, courses, and departments.</w:t>
       </w:r>
     </w:p>
     <w:p>
@@ -5118,7 +5430,133 @@
         <w:rPr>
           <w:rFonts w:ascii="Arial" w:hAnsi="Arial" w:cs="Arial"/>
         </w:rPr>
-        <w:t>The system shall require authentication before allowing access to any student or staff data.</w:t>
+        <w:t>The system shall maintain an audit trail of all enrolment, approval, and payment transactions.</w:t>
+      </w:r>
+    </w:p>
+    <w:p>
+      <w:pPr>
+        <w:pStyle w:val="Heading2"/>
+        <w:spacing w:before="0" w:line="360" w:lineRule="auto"/>
+        <w:ind w:left="284"/>
+        <w:rPr>
+          <w:rFonts w:ascii="Arial" w:hAnsi="Arial" w:cs="Arial"/>
+          <w:b/>
+          <w:bCs/>
+          <w:color w:val="EE0000"/>
+          <w:sz w:val="28"/>
+          <w:szCs w:val="28"/>
+        </w:rPr>
+      </w:pPr>
+      <w:r>
+        <w:rPr>
+          <w:rFonts w:ascii="Arial" w:hAnsi="Arial" w:cs="Arial"/>
+          <w:b/>
+          <w:bCs/>
+          <w:color w:val="EE0000"/>
+          <w:sz w:val="28"/>
+          <w:szCs w:val="28"/>
+        </w:rPr>
+        <w:t>3</w:t>
+      </w:r>
+      <w:r>
+        <w:rPr>
+          <w:rFonts w:ascii="Arial" w:hAnsi="Arial" w:cs="Arial"/>
+          <w:b/>
+          <w:bCs/>
+          <w:color w:val="EE0000"/>
+          <w:sz w:val="28"/>
+          <w:szCs w:val="28"/>
+        </w:rPr>
+        <w:t>.</w:t>
+      </w:r>
+      <w:r>
+        <w:rPr>
+          <w:rFonts w:ascii="Arial" w:hAnsi="Arial" w:cs="Arial"/>
+          <w:b/>
+          <w:bCs/>
+          <w:color w:val="EE0000"/>
+          <w:sz w:val="28"/>
+          <w:szCs w:val="28"/>
+        </w:rPr>
+        <w:t>2</w:t>
+      </w:r>
+      <w:r>
+        <w:rPr>
+          <w:rFonts w:ascii="Arial" w:hAnsi="Arial" w:cs="Arial"/>
+          <w:b/>
+          <w:bCs/>
+          <w:color w:val="EE0000"/>
+          <w:sz w:val="28"/>
+          <w:szCs w:val="28"/>
+        </w:rPr>
+        <w:t xml:space="preserve">. </w:t>
+      </w:r>
+      <w:r>
+        <w:rPr>
+          <w:rFonts w:ascii="Arial" w:hAnsi="Arial" w:cs="Arial"/>
+          <w:b/>
+          <w:bCs/>
+          <w:color w:val="EE0000"/>
+          <w:sz w:val="28"/>
+          <w:szCs w:val="28"/>
+        </w:rPr>
+        <w:t>Non-</w:t>
+      </w:r>
+      <w:r>
+        <w:rPr>
+          <w:rFonts w:ascii="Arial" w:hAnsi="Arial" w:cs="Arial"/>
+          <w:b/>
+          <w:bCs/>
+          <w:color w:val="EE0000"/>
+          <w:sz w:val="28"/>
+          <w:szCs w:val="28"/>
+        </w:rPr>
+        <w:t>Functional Requirements</w:t>
+      </w:r>
+    </w:p>
+    <w:p>
+      <w:pPr>
+        <w:spacing w:line="360" w:lineRule="auto"/>
+        <w:ind w:left="567"/>
+        <w:rPr>
+          <w:rFonts w:ascii="Arial" w:hAnsi="Arial" w:cs="Arial"/>
+        </w:rPr>
+      </w:pPr>
+      <w:r>
+        <w:rPr>
+          <w:rFonts w:ascii="Arial" w:hAnsi="Arial" w:cs="Arial"/>
+        </w:rPr>
+        <w:t xml:space="preserve">Based on the problem statement, the system’s key </w:t>
+      </w:r>
+      <w:r>
+        <w:rPr>
+          <w:rFonts w:ascii="Arial" w:hAnsi="Arial" w:cs="Arial"/>
+        </w:rPr>
+        <w:t>non-</w:t>
+      </w:r>
+      <w:r>
+        <w:rPr>
+          <w:rFonts w:ascii="Arial" w:hAnsi="Arial" w:cs="Arial"/>
+        </w:rPr>
+        <w:t>functional requirements</w:t>
+      </w:r>
+      <w:r>
+        <w:rPr>
+          <w:rFonts w:ascii="Arial" w:hAnsi="Arial" w:cs="Arial"/>
+        </w:rPr>
+        <w:t xml:space="preserve"> </w:t>
+      </w:r>
+      <w:r>
+        <w:rPr>
+          <w:rFonts w:ascii="Arial" w:hAnsi="Arial" w:cs="Arial"/>
+        </w:rPr>
+        <w:t>are identified as follows</w:t>
+      </w:r>
+      <w:r>
+        <w:rPr>
+          <w:rFonts w:ascii="Arial" w:hAnsi="Arial" w:cs="Arial"/>
+        </w:rPr>
+        <w:t xml:space="preserve">: </w:t>
       </w:r>
     </w:p>
     <w:p>
@@ -5126,214 +5564,9 @@
         <w:pStyle w:val="ListParagraph"/>
         <w:numPr>
           <w:ilvl w:val="0"/>
-          <w:numId w:val="5"/>
+          <w:numId w:val="14"/>
         </w:numPr>
         <w:spacing w:line="360" w:lineRule="auto"/>
-        <w:ind w:left="1560"/>
-        <w:rPr>
-          <w:rFonts w:ascii="Arial" w:hAnsi="Arial" w:cs="Arial"/>
-        </w:rPr>
-      </w:pPr>
-      <w:r>
-        <w:rPr>
-          <w:rFonts w:ascii="Arial" w:hAnsi="Arial" w:cs="Arial"/>
-        </w:rPr>
-        <w:t>Reporting and Audit</w:t>
-      </w:r>
-      <w:r>
-        <w:rPr>
-          <w:rFonts w:ascii="Arial" w:hAnsi="Arial" w:cs="Arial"/>
-        </w:rPr>
-        <w:t>:</w:t>
-      </w:r>
-    </w:p>
-    <w:p>
-      <w:pPr>
-        <w:pStyle w:val="ListParagraph"/>
-        <w:numPr>
-          <w:ilvl w:val="1"/>
-          <w:numId w:val="5"/>
-        </w:numPr>
-        <w:spacing w:line="360" w:lineRule="auto"/>
-        <w:ind w:left="1843"/>
-        <w:rPr>
-          <w:rFonts w:ascii="Arial" w:hAnsi="Arial" w:cs="Arial"/>
-        </w:rPr>
-      </w:pPr>
-      <w:r>
-        <w:rPr>
-          <w:rFonts w:ascii="Arial" w:hAnsi="Arial" w:cs="Arial"/>
-        </w:rPr>
-        <w:t>The system shall generate enrolment reports for students, courses, and departments.</w:t>
-      </w:r>
-    </w:p>
-    <w:p>
-      <w:pPr>
-        <w:pStyle w:val="ListParagraph"/>
-        <w:numPr>
-          <w:ilvl w:val="1"/>
-          <w:numId w:val="5"/>
-        </w:numPr>
-        <w:spacing w:line="360" w:lineRule="auto"/>
-        <w:ind w:left="1843"/>
-        <w:rPr>
-          <w:rFonts w:ascii="Arial" w:hAnsi="Arial" w:cs="Arial"/>
-        </w:rPr>
-      </w:pPr>
-      <w:r>
-        <w:rPr>
-          <w:rFonts w:ascii="Arial" w:hAnsi="Arial" w:cs="Arial"/>
-        </w:rPr>
-        <w:t>The system shall maintain an audit trail of all enrolment, approval, and payment transactions.</w:t>
-      </w:r>
-    </w:p>
-    <w:p>
-      <w:pPr>
-        <w:pStyle w:val="Heading3"/>
-        <w:ind w:left="851"/>
-        <w:rPr>
-          <w:rFonts w:ascii="Arial" w:hAnsi="Arial" w:cs="Arial"/>
-          <w:b/>
-          <w:bCs/>
-          <w:color w:val="EE0000"/>
-          <w:sz w:val="24"/>
-          <w:szCs w:val="24"/>
-        </w:rPr>
-      </w:pPr>
-      <w:bookmarkStart w:id="15" w:name="_Toc226899735"/>
-      <w:r>
-        <w:rPr>
-          <w:rFonts w:ascii="Arial" w:hAnsi="Arial" w:cs="Arial"/>
-          <w:b/>
-          <w:bCs/>
-          <w:color w:val="EE0000"/>
-          <w:sz w:val="24"/>
-          <w:szCs w:val="24"/>
-        </w:rPr>
-        <w:t>i</w:t>
-      </w:r>
-      <w:r>
-        <w:rPr>
-          <w:rFonts w:ascii="Arial" w:hAnsi="Arial" w:cs="Arial"/>
-          <w:b/>
-          <w:bCs/>
-          <w:color w:val="EE0000"/>
-          <w:sz w:val="24"/>
-          <w:szCs w:val="24"/>
-        </w:rPr>
-        <w:t>i</w:t>
-      </w:r>
-      <w:r>
-        <w:rPr>
-          <w:rFonts w:ascii="Arial" w:hAnsi="Arial" w:cs="Arial"/>
-          <w:b/>
-          <w:bCs/>
-          <w:color w:val="EE0000"/>
-          <w:sz w:val="24"/>
-          <w:szCs w:val="24"/>
-        </w:rPr>
-        <w:t>i.</w:t>
-      </w:r>
-      <w:r>
-        <w:rPr>
-          <w:rFonts w:ascii="Arial" w:hAnsi="Arial" w:cs="Arial"/>
-          <w:b/>
-          <w:bCs/>
-          <w:color w:val="EE0000"/>
-          <w:sz w:val="24"/>
-          <w:szCs w:val="24"/>
-        </w:rPr>
-        <w:t xml:space="preserve"> </w:t>
-      </w:r>
-      <w:r>
-        <w:rPr>
-          <w:rFonts w:ascii="Arial" w:hAnsi="Arial" w:cs="Arial"/>
-          <w:b/>
-          <w:bCs/>
-          <w:color w:val="EE0000"/>
-          <w:sz w:val="24"/>
-          <w:szCs w:val="24"/>
-        </w:rPr>
-        <w:t>Non-</w:t>
-      </w:r>
-      <w:r>
-        <w:rPr>
-          <w:rFonts w:ascii="Arial" w:hAnsi="Arial" w:cs="Arial"/>
-          <w:b/>
-          <w:bCs/>
-          <w:color w:val="EE0000"/>
-          <w:sz w:val="24"/>
-          <w:szCs w:val="24"/>
-        </w:rPr>
-        <w:t>Functional Requirement</w:t>
-      </w:r>
-      <w:r>
-        <w:rPr>
-          <w:rFonts w:ascii="Arial" w:hAnsi="Arial" w:cs="Arial"/>
-          <w:b/>
-          <w:bCs/>
-          <w:color w:val="EE0000"/>
-          <w:sz w:val="24"/>
-          <w:szCs w:val="24"/>
-        </w:rPr>
-        <w:t>s</w:t>
-      </w:r>
-      <w:bookmarkEnd w:id="15"/>
-    </w:p>
-    <w:p>
-      <w:pPr>
-        <w:spacing w:line="360" w:lineRule="auto"/>
-        <w:ind w:left="1134"/>
-        <w:rPr>
-          <w:rFonts w:ascii="Arial" w:hAnsi="Arial" w:cs="Arial"/>
-        </w:rPr>
-      </w:pPr>
-      <w:r>
-        <w:rPr>
-          <w:rFonts w:ascii="Arial" w:hAnsi="Arial" w:cs="Arial"/>
-        </w:rPr>
-        <w:t xml:space="preserve">Based on the problem statement, the system’s key </w:t>
-      </w:r>
-      <w:r>
-        <w:rPr>
-          <w:rFonts w:ascii="Arial" w:hAnsi="Arial" w:cs="Arial"/>
-        </w:rPr>
-        <w:t>non-</w:t>
-      </w:r>
-      <w:r>
-        <w:rPr>
-          <w:rFonts w:ascii="Arial" w:hAnsi="Arial" w:cs="Arial"/>
-        </w:rPr>
-        <w:t>functional requirements</w:t>
-      </w:r>
-      <w:r>
-        <w:rPr>
-          <w:rFonts w:ascii="Arial" w:hAnsi="Arial" w:cs="Arial"/>
-        </w:rPr>
-        <w:t xml:space="preserve"> </w:t>
-      </w:r>
-      <w:r>
-        <w:rPr>
-          <w:rFonts w:ascii="Arial" w:hAnsi="Arial" w:cs="Arial"/>
-        </w:rPr>
-        <w:t>are identified as follows</w:t>
-      </w:r>
-      <w:r>
-        <w:rPr>
-          <w:rFonts w:ascii="Arial" w:hAnsi="Arial" w:cs="Arial"/>
-        </w:rPr>
-        <w:t xml:space="preserve">: </w:t>
-      </w:r>
-    </w:p>
-    <w:p>
-      <w:pPr>
-        <w:pStyle w:val="ListParagraph"/>
-        <w:numPr>
-          <w:ilvl w:val="0"/>
-          <w:numId w:val="6"/>
-        </w:numPr>
-        <w:spacing w:line="360" w:lineRule="auto"/>
-        <w:ind w:left="1560"/>
         <w:rPr>
           <w:rFonts w:ascii="Arial" w:hAnsi="Arial" w:cs="Arial"/>
         </w:rPr>
@@ -5368,6 +5601,7 @@
         <w:rPr>
           <w:rFonts w:ascii="Arial" w:hAnsi="Arial" w:cs="Arial"/>
         </w:rPr>
+        <w:lastRenderedPageBreak/>
         <w:t>The system shall respond to course search, enrolment, or timetable requests within 2 seconds under normal load conditions.</w:t>
       </w:r>
     </w:p>
@@ -5396,10 +5630,9 @@
         <w:pStyle w:val="ListParagraph"/>
         <w:numPr>
           <w:ilvl w:val="0"/>
-          <w:numId w:val="6"/>
+          <w:numId w:val="14"/>
         </w:numPr>
         <w:spacing w:line="360" w:lineRule="auto"/>
-        <w:ind w:left="1560"/>
         <w:rPr>
           <w:rFonts w:ascii="Arial" w:hAnsi="Arial" w:cs="Arial"/>
         </w:rPr>
@@ -5474,10 +5707,9 @@
         <w:pStyle w:val="ListParagraph"/>
         <w:numPr>
           <w:ilvl w:val="0"/>
-          <w:numId w:val="6"/>
+          <w:numId w:val="14"/>
         </w:numPr>
         <w:spacing w:line="360" w:lineRule="auto"/>
-        <w:ind w:left="1560"/>
         <w:rPr>
           <w:rFonts w:ascii="Arial" w:hAnsi="Arial" w:cs="Arial"/>
         </w:rPr>
@@ -5540,10 +5772,9 @@
         <w:pStyle w:val="ListParagraph"/>
         <w:numPr>
           <w:ilvl w:val="0"/>
-          <w:numId w:val="6"/>
+          <w:numId w:val="14"/>
         </w:numPr>
         <w:spacing w:line="360" w:lineRule="auto"/>
-        <w:ind w:left="1560"/>
         <w:rPr>
           <w:rFonts w:ascii="Arial" w:hAnsi="Arial" w:cs="Arial"/>
         </w:rPr>
@@ -5606,10 +5837,9 @@
         <w:pStyle w:val="ListParagraph"/>
         <w:numPr>
           <w:ilvl w:val="0"/>
-          <w:numId w:val="6"/>
+          <w:numId w:val="14"/>
         </w:numPr>
         <w:spacing w:line="360" w:lineRule="auto"/>
-        <w:ind w:left="1560"/>
         <w:rPr>
           <w:rFonts w:ascii="Arial" w:hAnsi="Arial" w:cs="Arial"/>
         </w:rPr>
@@ -5644,7 +5874,6 @@
         <w:rPr>
           <w:rFonts w:ascii="Arial" w:hAnsi="Arial" w:cs="Arial"/>
         </w:rPr>
-        <w:lastRenderedPageBreak/>
         <w:t>The system shall maintain at least 99.5% uptime during enrolment periods.</w:t>
       </w:r>
     </w:p>
@@ -5673,10 +5902,9 @@
         <w:pStyle w:val="ListParagraph"/>
         <w:numPr>
           <w:ilvl w:val="0"/>
-          <w:numId w:val="6"/>
+          <w:numId w:val="14"/>
         </w:numPr>
         <w:spacing w:line="360" w:lineRule="auto"/>
-        <w:ind w:left="1560"/>
         <w:rPr>
           <w:rFonts w:ascii="Arial" w:hAnsi="Arial" w:cs="Arial"/>
         </w:rPr>
@@ -5739,10 +5967,9 @@
         <w:pStyle w:val="ListParagraph"/>
         <w:numPr>
           <w:ilvl w:val="0"/>
-          <w:numId w:val="6"/>
+          <w:numId w:val="14"/>
         </w:numPr>
         <w:spacing w:line="360" w:lineRule="auto"/>
-        <w:ind w:left="1560"/>
         <w:rPr>
           <w:rFonts w:ascii="Arial" w:hAnsi="Arial" w:cs="Arial"/>
         </w:rPr>
@@ -5805,10 +6032,9 @@
         <w:pStyle w:val="ListParagraph"/>
         <w:numPr>
           <w:ilvl w:val="0"/>
-          <w:numId w:val="6"/>
+          <w:numId w:val="14"/>
         </w:numPr>
         <w:spacing w:line="360" w:lineRule="auto"/>
-        <w:ind w:left="1560"/>
         <w:rPr>
           <w:rFonts w:ascii="Arial" w:hAnsi="Arial" w:cs="Arial"/>
         </w:rPr>
@@ -5871,18 +6097,18 @@
         <w:pStyle w:val="ListParagraph"/>
         <w:numPr>
           <w:ilvl w:val="0"/>
-          <w:numId w:val="6"/>
+          <w:numId w:val="14"/>
         </w:numPr>
         <w:spacing w:line="360" w:lineRule="auto"/>
-        <w:ind w:left="1560"/>
-        <w:rPr>
-          <w:rFonts w:ascii="Arial" w:hAnsi="Arial" w:cs="Arial"/>
-        </w:rPr>
-      </w:pPr>
-      <w:r>
-        <w:rPr>
-          <w:rFonts w:ascii="Arial" w:hAnsi="Arial" w:cs="Arial"/>
-        </w:rPr>
+        <w:rPr>
+          <w:rFonts w:ascii="Arial" w:hAnsi="Arial" w:cs="Arial"/>
+        </w:rPr>
+      </w:pPr>
+      <w:r>
+        <w:rPr>
+          <w:rFonts w:ascii="Arial" w:hAnsi="Arial" w:cs="Arial"/>
+        </w:rPr>
+        <w:lastRenderedPageBreak/>
         <w:t>Auditability</w:t>
       </w:r>
       <w:r>
@@ -5900,6 +6126,7 @@
           <w:numId w:val="6"/>
         </w:numPr>
         <w:spacing w:line="360" w:lineRule="auto"/>
+        <w:ind w:left="1843"/>
         <w:rPr>
           <w:rFonts w:ascii="Arial" w:hAnsi="Arial" w:cs="Arial"/>
         </w:rPr>
@@ -5919,6 +6146,7 @@
           <w:numId w:val="6"/>
         </w:numPr>
         <w:spacing w:line="360" w:lineRule="auto"/>
+        <w:ind w:left="1843"/>
         <w:rPr>
           <w:rFonts w:ascii="Arial" w:hAnsi="Arial" w:cs="Arial"/>
         </w:rPr>
@@ -5935,10 +6163,9 @@
         <w:pStyle w:val="ListParagraph"/>
         <w:numPr>
           <w:ilvl w:val="0"/>
-          <w:numId w:val="6"/>
+          <w:numId w:val="14"/>
         </w:numPr>
         <w:spacing w:line="360" w:lineRule="auto"/>
-        <w:ind w:left="1560"/>
         <w:rPr>
           <w:rFonts w:ascii="Arial" w:hAnsi="Arial" w:cs="Arial"/>
         </w:rPr>
@@ -6021,7 +6248,7 @@
           <w:szCs w:val="32"/>
         </w:rPr>
       </w:pPr>
-      <w:bookmarkStart w:id="16" w:name="_Toc226899736"/>
+      <w:bookmarkStart w:id="13" w:name="_Toc226899736"/>
       <w:r>
         <w:rPr>
           <w:rFonts w:ascii="Arial" w:hAnsi="Arial" w:cs="Arial"/>
@@ -6056,7 +6283,7 @@
         </w:rPr>
         <w:t>ase diagram</w:t>
       </w:r>
-      <w:bookmarkEnd w:id="16"/>
+      <w:bookmarkEnd w:id="13"/>
     </w:p>
     <w:p>
       <w:pPr>
@@ -6098,7 +6325,7 @@
           <w:szCs w:val="32"/>
         </w:rPr>
       </w:pPr>
-      <w:bookmarkStart w:id="17" w:name="_Toc226899737"/>
+      <w:bookmarkStart w:id="14" w:name="_Toc226899737"/>
       <w:r>
         <w:rPr>
           <w:rFonts w:ascii="Arial" w:hAnsi="Arial" w:cs="Arial"/>
@@ -6122,7 +6349,7 @@
         </w:rPr>
         <w:t xml:space="preserve"> diagram</w:t>
       </w:r>
-      <w:bookmarkEnd w:id="17"/>
+      <w:bookmarkEnd w:id="14"/>
     </w:p>
     <w:p>
       <w:pPr>
@@ -6164,7 +6391,7 @@
           <w:szCs w:val="32"/>
         </w:rPr>
       </w:pPr>
-      <w:bookmarkStart w:id="18" w:name="_Toc226899738"/>
+      <w:bookmarkStart w:id="15" w:name="_Toc226899738"/>
       <w:r>
         <w:rPr>
           <w:rFonts w:ascii="Arial" w:hAnsi="Arial" w:cs="Arial"/>
@@ -6177,7 +6404,7 @@
         <w:lastRenderedPageBreak/>
         <w:t>C# Implementation</w:t>
       </w:r>
-      <w:bookmarkEnd w:id="18"/>
+      <w:bookmarkEnd w:id="15"/>
     </w:p>
     <w:p>
       <w:pPr>
@@ -6228,7 +6455,7 @@
           <w:szCs w:val="32"/>
         </w:rPr>
       </w:pPr>
-      <w:bookmarkStart w:id="19" w:name="_Toc226899739"/>
+      <w:bookmarkStart w:id="16" w:name="_Toc226899739"/>
       <w:r>
         <w:rPr>
           <w:rFonts w:ascii="Arial" w:hAnsi="Arial" w:cs="Arial"/>
@@ -6252,7 +6479,7 @@
         </w:rPr>
         <w:t>onclusion</w:t>
       </w:r>
-      <w:bookmarkEnd w:id="19"/>
+      <w:bookmarkEnd w:id="16"/>
     </w:p>
     <w:p>
       <w:pPr>
@@ -6307,7 +6534,7 @@
           <w:szCs w:val="32"/>
         </w:rPr>
       </w:pPr>
-      <w:bookmarkStart w:id="20" w:name="_Toc226899740"/>
+      <w:bookmarkStart w:id="17" w:name="_Toc226899740"/>
       <w:r>
         <w:rPr>
           <w:rFonts w:ascii="Arial" w:hAnsi="Arial" w:cs="Arial"/>
@@ -6320,7 +6547,31 @@
         <w:lastRenderedPageBreak/>
         <w:t>References</w:t>
       </w:r>
-      <w:bookmarkEnd w:id="20"/>
+      <w:bookmarkEnd w:id="17"/>
+    </w:p>
+    <w:p>
+      <w:pPr>
+        <w:spacing w:line="360" w:lineRule="auto"/>
+        <w:ind w:left="567" w:hanging="567"/>
+        <w:rPr>
+          <w:rFonts w:ascii="Arial" w:hAnsi="Arial" w:cs="Arial"/>
+        </w:rPr>
+      </w:pPr>
+      <w:r>
+        <w:rPr>
+          <w:rFonts w:ascii="Arial" w:hAnsi="Arial" w:cs="Arial"/>
+        </w:rPr>
+        <w:t xml:space="preserve">AUT (2018). City Campus’ newest building now open. </w:t>
+      </w:r>
+      <w:hyperlink r:id="rId10" w:history="1">
+        <w:r>
+          <w:rPr>
+            <w:rStyle w:val="Hyperlink"/>
+            <w:rFonts w:ascii="Arial" w:hAnsi="Arial" w:cs="Arial"/>
+          </w:rPr>
+          <w:t>https://www.aut.ac.nz/news/stories/city-campus-newest-building-now-open</w:t>
+        </w:r>
+      </w:hyperlink>
     </w:p>
     <w:p>
       <w:pPr>
@@ -6362,7 +6613,7 @@
         </w:rPr>
         <w:t xml:space="preserve">. </w:t>
       </w:r>
-      <w:hyperlink r:id="rId9" w:history="1">
+      <w:hyperlink r:id="rId11" w:history="1">
         <w:r>
           <w:rPr>
             <w:rStyle w:val="Hyperlink"/>
@@ -6403,7 +6654,7 @@
       <w:r>
         <w:t xml:space="preserve"> </w:t>
       </w:r>
-      <w:hyperlink r:id="rId10" w:history="1">
+      <w:hyperlink r:id="rId12" w:history="1">
         <w:r>
           <w:rPr>
             <w:rStyle w:val="Hyperlink"/>
@@ -6453,7 +6704,7 @@
         </w:rPr>
         <w:t xml:space="preserve">. </w:t>
       </w:r>
-      <w:hyperlink r:id="rId11" w:history="1">
+      <w:hyperlink r:id="rId13" w:history="1">
         <w:r>
           <w:rPr>
             <w:rStyle w:val="Hyperlink"/>
@@ -6499,7 +6750,7 @@
         </w:rPr>
         <w:t xml:space="preserve">Enrolling in courses and classes. </w:t>
       </w:r>
-      <w:hyperlink r:id="rId12" w:history="1">
+      <w:hyperlink r:id="rId14" w:history="1">
         <w:r>
           <w:rPr>
             <w:rStyle w:val="Hyperlink"/>
@@ -6549,7 +6800,7 @@
         </w:rPr>
         <w:t xml:space="preserve">. </w:t>
       </w:r>
-      <w:hyperlink r:id="rId13" w:history="1">
+      <w:hyperlink r:id="rId15" w:history="1">
         <w:r>
           <w:rPr>
             <w:rStyle w:val="Hyperlink"/>
@@ -6599,7 +6850,7 @@
         </w:rPr>
         <w:t xml:space="preserve">. </w:t>
       </w:r>
-      <w:hyperlink r:id="rId14" w:history="1">
+      <w:hyperlink r:id="rId16" w:history="1">
         <w:r>
           <w:rPr>
             <w:rStyle w:val="Hyperlink"/>
@@ -6655,7 +6906,7 @@
       </w:pPr>
     </w:p>
     <w:sectPr>
-      <w:footerReference w:type="default" r:id="rId15"/>
+      <w:footerReference w:type="default" r:id="rId17"/>
       <w:pgSz w:w="12240" w:h="15840"/>
       <w:pgMar w:top="1440" w:right="1440" w:bottom="1440" w:left="1440" w:header="708" w:footer="708" w:gutter="0"/>
       <w:pgNumType w:start="1"/>
@@ -7008,6 +7259,119 @@
     </w:lvl>
   </w:abstractNum>
   <w:abstractNum w:abstractNumId="2" w15:restartNumberingAfterBreak="0">
+    <w:nsid w:val="208A1330"/>
+    <w:multiLevelType w:val="hybridMultilevel"/>
+    <w:tmpl w:val="0972A492"/>
+    <w:lvl w:ilvl="0" w:tplc="04090001">
+      <w:start w:val="1"/>
+      <w:numFmt w:val="bullet"/>
+      <w:lvlText w:val=""/>
+      <w:lvlJc w:val="left"/>
+      <w:pPr>
+        <w:ind w:left="1287" w:hanging="360"/>
+      </w:pPr>
+      <w:rPr>
+        <w:rFonts w:ascii="Symbol" w:hAnsi="Symbol" w:hint="default"/>
+      </w:rPr>
+    </w:lvl>
+    <w:lvl w:ilvl="1" w:tplc="04090003">
+      <w:start w:val="1"/>
+      <w:numFmt w:val="bullet"/>
+      <w:lvlText w:val="o"/>
+      <w:lvlJc w:val="left"/>
+      <w:pPr>
+        <w:ind w:left="2007" w:hanging="360"/>
+      </w:pPr>
+      <w:rPr>
+        <w:rFonts w:ascii="Courier New" w:hAnsi="Courier New" w:cs="Courier New" w:hint="default"/>
+      </w:rPr>
+    </w:lvl>
+    <w:lvl w:ilvl="2" w:tplc="04090005">
+      <w:start w:val="1"/>
+      <w:numFmt w:val="bullet"/>
+      <w:lvlText w:val=""/>
+      <w:lvlJc w:val="left"/>
+      <w:pPr>
+        <w:ind w:left="2727" w:hanging="360"/>
+      </w:pPr>
+      <w:rPr>
+        <w:rFonts w:ascii="Wingdings" w:hAnsi="Wingdings" w:hint="default"/>
+      </w:rPr>
+    </w:lvl>
+    <w:lvl w:ilvl="3" w:tplc="04090001">
+      <w:start w:val="1"/>
+      <w:numFmt w:val="bullet"/>
+      <w:lvlText w:val=""/>
+      <w:lvlJc w:val="left"/>
+      <w:pPr>
+        <w:ind w:left="3447" w:hanging="360"/>
+      </w:pPr>
+      <w:rPr>
+        <w:rFonts w:ascii="Symbol" w:hAnsi="Symbol" w:hint="default"/>
+      </w:rPr>
+    </w:lvl>
+    <w:lvl w:ilvl="4" w:tplc="04090003">
+      <w:start w:val="1"/>
+      <w:numFmt w:val="bullet"/>
+      <w:lvlText w:val="o"/>
+      <w:lvlJc w:val="left"/>
+      <w:pPr>
+        <w:ind w:left="4167" w:hanging="360"/>
+      </w:pPr>
+      <w:rPr>
+        <w:rFonts w:ascii="Courier New" w:hAnsi="Courier New" w:cs="Courier New" w:hint="default"/>
+      </w:rPr>
+    </w:lvl>
+    <w:lvl w:ilvl="5" w:tplc="04090005">
+      <w:start w:val="1"/>
+      <w:numFmt w:val="bullet"/>
+      <w:lvlText w:val=""/>
+      <w:lvlJc w:val="left"/>
+      <w:pPr>
+        <w:ind w:left="4887" w:hanging="360"/>
+      </w:pPr>
+      <w:rPr>
+        <w:rFonts w:ascii="Wingdings" w:hAnsi="Wingdings" w:hint="default"/>
+      </w:rPr>
+    </w:lvl>
+    <w:lvl w:ilvl="6" w:tplc="04090001" w:tentative="1">
+      <w:start w:val="1"/>
+      <w:numFmt w:val="bullet"/>
+      <w:lvlText w:val=""/>
+      <w:lvlJc w:val="left"/>
+      <w:pPr>
+        <w:ind w:left="5607" w:hanging="360"/>
+      </w:pPr>
+      <w:rPr>
+        <w:rFonts w:ascii="Symbol" w:hAnsi="Symbol" w:hint="default"/>
+      </w:rPr>
+    </w:lvl>
+    <w:lvl w:ilvl="7" w:tplc="04090003" w:tentative="1">
+      <w:start w:val="1"/>
+      <w:numFmt w:val="bullet"/>
+      <w:lvlText w:val="o"/>
+      <w:lvlJc w:val="left"/>
+      <w:pPr>
+        <w:ind w:left="6327" w:hanging="360"/>
+      </w:pPr>
+      <w:rPr>
+        <w:rFonts w:ascii="Courier New" w:hAnsi="Courier New" w:cs="Courier New" w:hint="default"/>
+      </w:rPr>
+    </w:lvl>
+    <w:lvl w:ilvl="8" w:tplc="04090005" w:tentative="1">
+      <w:start w:val="1"/>
+      <w:numFmt w:val="bullet"/>
+      <w:lvlText w:val=""/>
+      <w:lvlJc w:val="left"/>
+      <w:pPr>
+        <w:ind w:left="7047" w:hanging="360"/>
+      </w:pPr>
+      <w:rPr>
+        <w:rFonts w:ascii="Wingdings" w:hAnsi="Wingdings" w:hint="default"/>
+      </w:rPr>
+    </w:lvl>
+  </w:abstractNum>
+  <w:abstractNum w:abstractNumId="3" w15:restartNumberingAfterBreak="0">
     <w:nsid w:val="2EC15A1A"/>
     <w:multiLevelType w:val="hybridMultilevel"/>
     <w:tmpl w:val="C5665E78"/>
@@ -7093,7 +7457,120 @@
       </w:pPr>
     </w:lvl>
   </w:abstractNum>
-  <w:abstractNum w:abstractNumId="3" w15:restartNumberingAfterBreak="0">
+  <w:abstractNum w:abstractNumId="4" w15:restartNumberingAfterBreak="0">
+    <w:nsid w:val="3725559B"/>
+    <w:multiLevelType w:val="hybridMultilevel"/>
+    <w:tmpl w:val="BDCA7D84"/>
+    <w:lvl w:ilvl="0" w:tplc="04090003">
+      <w:start w:val="1"/>
+      <w:numFmt w:val="bullet"/>
+      <w:lvlText w:val="o"/>
+      <w:lvlJc w:val="left"/>
+      <w:pPr>
+        <w:ind w:left="1287" w:hanging="360"/>
+      </w:pPr>
+      <w:rPr>
+        <w:rFonts w:ascii="Courier New" w:hAnsi="Courier New" w:cs="Courier New" w:hint="default"/>
+      </w:rPr>
+    </w:lvl>
+    <w:lvl w:ilvl="1" w:tplc="04090003">
+      <w:start w:val="1"/>
+      <w:numFmt w:val="bullet"/>
+      <w:lvlText w:val="o"/>
+      <w:lvlJc w:val="left"/>
+      <w:pPr>
+        <w:ind w:left="2007" w:hanging="360"/>
+      </w:pPr>
+      <w:rPr>
+        <w:rFonts w:ascii="Courier New" w:hAnsi="Courier New" w:cs="Courier New" w:hint="default"/>
+      </w:rPr>
+    </w:lvl>
+    <w:lvl w:ilvl="2" w:tplc="04090005" w:tentative="1">
+      <w:start w:val="1"/>
+      <w:numFmt w:val="bullet"/>
+      <w:lvlText w:val=""/>
+      <w:lvlJc w:val="left"/>
+      <w:pPr>
+        <w:ind w:left="2727" w:hanging="360"/>
+      </w:pPr>
+      <w:rPr>
+        <w:rFonts w:ascii="Wingdings" w:hAnsi="Wingdings" w:hint="default"/>
+      </w:rPr>
+    </w:lvl>
+    <w:lvl w:ilvl="3" w:tplc="04090001" w:tentative="1">
+      <w:start w:val="1"/>
+      <w:numFmt w:val="bullet"/>
+      <w:lvlText w:val=""/>
+      <w:lvlJc w:val="left"/>
+      <w:pPr>
+        <w:ind w:left="3447" w:hanging="360"/>
+      </w:pPr>
+      <w:rPr>
+        <w:rFonts w:ascii="Symbol" w:hAnsi="Symbol" w:hint="default"/>
+      </w:rPr>
+    </w:lvl>
+    <w:lvl w:ilvl="4" w:tplc="04090003" w:tentative="1">
+      <w:start w:val="1"/>
+      <w:numFmt w:val="bullet"/>
+      <w:lvlText w:val="o"/>
+      <w:lvlJc w:val="left"/>
+      <w:pPr>
+        <w:ind w:left="4167" w:hanging="360"/>
+      </w:pPr>
+      <w:rPr>
+        <w:rFonts w:ascii="Courier New" w:hAnsi="Courier New" w:cs="Courier New" w:hint="default"/>
+      </w:rPr>
+    </w:lvl>
+    <w:lvl w:ilvl="5" w:tplc="04090005" w:tentative="1">
+      <w:start w:val="1"/>
+      <w:numFmt w:val="bullet"/>
+      <w:lvlText w:val=""/>
+      <w:lvlJc w:val="left"/>
+      <w:pPr>
+        <w:ind w:left="4887" w:hanging="360"/>
+      </w:pPr>
+      <w:rPr>
+        <w:rFonts w:ascii="Wingdings" w:hAnsi="Wingdings" w:hint="default"/>
+      </w:rPr>
+    </w:lvl>
+    <w:lvl w:ilvl="6" w:tplc="04090001" w:tentative="1">
+      <w:start w:val="1"/>
+      <w:numFmt w:val="bullet"/>
+      <w:lvlText w:val=""/>
+      <w:lvlJc w:val="left"/>
+      <w:pPr>
+        <w:ind w:left="5607" w:hanging="360"/>
+      </w:pPr>
+      <w:rPr>
+        <w:rFonts w:ascii="Symbol" w:hAnsi="Symbol" w:hint="default"/>
+      </w:rPr>
+    </w:lvl>
+    <w:lvl w:ilvl="7" w:tplc="04090003" w:tentative="1">
+      <w:start w:val="1"/>
+      <w:numFmt w:val="bullet"/>
+      <w:lvlText w:val="o"/>
+      <w:lvlJc w:val="left"/>
+      <w:pPr>
+        <w:ind w:left="6327" w:hanging="360"/>
+      </w:pPr>
+      <w:rPr>
+        <w:rFonts w:ascii="Courier New" w:hAnsi="Courier New" w:cs="Courier New" w:hint="default"/>
+      </w:rPr>
+    </w:lvl>
+    <w:lvl w:ilvl="8" w:tplc="04090005" w:tentative="1">
+      <w:start w:val="1"/>
+      <w:numFmt w:val="bullet"/>
+      <w:lvlText w:val=""/>
+      <w:lvlJc w:val="left"/>
+      <w:pPr>
+        <w:ind w:left="7047" w:hanging="360"/>
+      </w:pPr>
+      <w:rPr>
+        <w:rFonts w:ascii="Wingdings" w:hAnsi="Wingdings" w:hint="default"/>
+      </w:rPr>
+    </w:lvl>
+  </w:abstractNum>
+  <w:abstractNum w:abstractNumId="5" w15:restartNumberingAfterBreak="0">
     <w:nsid w:val="443143D4"/>
     <w:multiLevelType w:val="hybridMultilevel"/>
     <w:tmpl w:val="BC7C5D7E"/>
@@ -7121,7 +7598,7 @@
         <w:rFonts w:ascii="Courier New" w:hAnsi="Courier New" w:cs="Courier New" w:hint="default"/>
       </w:rPr>
     </w:lvl>
-    <w:lvl w:ilvl="2" w:tplc="04090005" w:tentative="1">
+    <w:lvl w:ilvl="2" w:tplc="04090005">
       <w:start w:val="1"/>
       <w:numFmt w:val="bullet"/>
       <w:lvlText w:val=""/>
@@ -7133,7 +7610,7 @@
         <w:rFonts w:ascii="Wingdings" w:hAnsi="Wingdings" w:hint="default"/>
       </w:rPr>
     </w:lvl>
-    <w:lvl w:ilvl="3" w:tplc="04090001" w:tentative="1">
+    <w:lvl w:ilvl="3" w:tplc="04090001">
       <w:start w:val="1"/>
       <w:numFmt w:val="bullet"/>
       <w:lvlText w:val=""/>
@@ -7145,7 +7622,7 @@
         <w:rFonts w:ascii="Symbol" w:hAnsi="Symbol" w:hint="default"/>
       </w:rPr>
     </w:lvl>
-    <w:lvl w:ilvl="4" w:tplc="04090003" w:tentative="1">
+    <w:lvl w:ilvl="4" w:tplc="04090003">
       <w:start w:val="1"/>
       <w:numFmt w:val="bullet"/>
       <w:lvlText w:val="o"/>
@@ -7157,7 +7634,7 @@
         <w:rFonts w:ascii="Courier New" w:hAnsi="Courier New" w:cs="Courier New" w:hint="default"/>
       </w:rPr>
     </w:lvl>
-    <w:lvl w:ilvl="5" w:tplc="04090005" w:tentative="1">
+    <w:lvl w:ilvl="5" w:tplc="04090005">
       <w:start w:val="1"/>
       <w:numFmt w:val="bullet"/>
       <w:lvlText w:val=""/>
@@ -7169,7 +7646,7 @@
         <w:rFonts w:ascii="Wingdings" w:hAnsi="Wingdings" w:hint="default"/>
       </w:rPr>
     </w:lvl>
-    <w:lvl w:ilvl="6" w:tplc="04090001" w:tentative="1">
+    <w:lvl w:ilvl="6" w:tplc="04090001">
       <w:start w:val="1"/>
       <w:numFmt w:val="bullet"/>
       <w:lvlText w:val=""/>
@@ -7181,7 +7658,7 @@
         <w:rFonts w:ascii="Symbol" w:hAnsi="Symbol" w:hint="default"/>
       </w:rPr>
     </w:lvl>
-    <w:lvl w:ilvl="7" w:tplc="04090003" w:tentative="1">
+    <w:lvl w:ilvl="7" w:tplc="04090003">
       <w:start w:val="1"/>
       <w:numFmt w:val="bullet"/>
       <w:lvlText w:val="o"/>
@@ -7193,7 +7670,7 @@
         <w:rFonts w:ascii="Courier New" w:hAnsi="Courier New" w:cs="Courier New" w:hint="default"/>
       </w:rPr>
     </w:lvl>
-    <w:lvl w:ilvl="8" w:tplc="04090005" w:tentative="1">
+    <w:lvl w:ilvl="8" w:tplc="04090005">
       <w:start w:val="1"/>
       <w:numFmt w:val="bullet"/>
       <w:lvlText w:val=""/>
@@ -7206,7 +7683,7 @@
       </w:rPr>
     </w:lvl>
   </w:abstractNum>
-  <w:abstractNum w:abstractNumId="4" w15:restartNumberingAfterBreak="0">
+  <w:abstractNum w:abstractNumId="6" w15:restartNumberingAfterBreak="0">
     <w:nsid w:val="4E9208C8"/>
     <w:multiLevelType w:val="hybridMultilevel"/>
     <w:tmpl w:val="054A6BDE"/>
@@ -7319,7 +7796,7 @@
       </w:rPr>
     </w:lvl>
   </w:abstractNum>
-  <w:abstractNum w:abstractNumId="5" w15:restartNumberingAfterBreak="0">
+  <w:abstractNum w:abstractNumId="7" w15:restartNumberingAfterBreak="0">
     <w:nsid w:val="50B90995"/>
     <w:multiLevelType w:val="hybridMultilevel"/>
     <w:tmpl w:val="F4EC91BE"/>
@@ -7408,7 +7885,233 @@
       </w:pPr>
     </w:lvl>
   </w:abstractNum>
-  <w:abstractNum w:abstractNumId="6" w15:restartNumberingAfterBreak="0">
+  <w:abstractNum w:abstractNumId="8" w15:restartNumberingAfterBreak="0">
+    <w:nsid w:val="515E5162"/>
+    <w:multiLevelType w:val="hybridMultilevel"/>
+    <w:tmpl w:val="B216AA34"/>
+    <w:lvl w:ilvl="0" w:tplc="04090001">
+      <w:start w:val="1"/>
+      <w:numFmt w:val="bullet"/>
+      <w:lvlText w:val=""/>
+      <w:lvlJc w:val="left"/>
+      <w:pPr>
+        <w:ind w:left="1287" w:hanging="360"/>
+      </w:pPr>
+      <w:rPr>
+        <w:rFonts w:ascii="Symbol" w:hAnsi="Symbol" w:hint="default"/>
+      </w:rPr>
+    </w:lvl>
+    <w:lvl w:ilvl="1" w:tplc="04090003" w:tentative="1">
+      <w:start w:val="1"/>
+      <w:numFmt w:val="bullet"/>
+      <w:lvlText w:val="o"/>
+      <w:lvlJc w:val="left"/>
+      <w:pPr>
+        <w:ind w:left="2007" w:hanging="360"/>
+      </w:pPr>
+      <w:rPr>
+        <w:rFonts w:ascii="Courier New" w:hAnsi="Courier New" w:cs="Courier New" w:hint="default"/>
+      </w:rPr>
+    </w:lvl>
+    <w:lvl w:ilvl="2" w:tplc="04090005" w:tentative="1">
+      <w:start w:val="1"/>
+      <w:numFmt w:val="bullet"/>
+      <w:lvlText w:val=""/>
+      <w:lvlJc w:val="left"/>
+      <w:pPr>
+        <w:ind w:left="2727" w:hanging="360"/>
+      </w:pPr>
+      <w:rPr>
+        <w:rFonts w:ascii="Wingdings" w:hAnsi="Wingdings" w:hint="default"/>
+      </w:rPr>
+    </w:lvl>
+    <w:lvl w:ilvl="3" w:tplc="04090001" w:tentative="1">
+      <w:start w:val="1"/>
+      <w:numFmt w:val="bullet"/>
+      <w:lvlText w:val=""/>
+      <w:lvlJc w:val="left"/>
+      <w:pPr>
+        <w:ind w:left="3447" w:hanging="360"/>
+      </w:pPr>
+      <w:rPr>
+        <w:rFonts w:ascii="Symbol" w:hAnsi="Symbol" w:hint="default"/>
+      </w:rPr>
+    </w:lvl>
+    <w:lvl w:ilvl="4" w:tplc="04090003" w:tentative="1">
+      <w:start w:val="1"/>
+      <w:numFmt w:val="bullet"/>
+      <w:lvlText w:val="o"/>
+      <w:lvlJc w:val="left"/>
+      <w:pPr>
+        <w:ind w:left="4167" w:hanging="360"/>
+      </w:pPr>
+      <w:rPr>
+        <w:rFonts w:ascii="Courier New" w:hAnsi="Courier New" w:cs="Courier New" w:hint="default"/>
+      </w:rPr>
+    </w:lvl>
+    <w:lvl w:ilvl="5" w:tplc="04090005" w:tentative="1">
+      <w:start w:val="1"/>
+      <w:numFmt w:val="bullet"/>
+      <w:lvlText w:val=""/>
+      <w:lvlJc w:val="left"/>
+      <w:pPr>
+        <w:ind w:left="4887" w:hanging="360"/>
+      </w:pPr>
+      <w:rPr>
+        <w:rFonts w:ascii="Wingdings" w:hAnsi="Wingdings" w:hint="default"/>
+      </w:rPr>
+    </w:lvl>
+    <w:lvl w:ilvl="6" w:tplc="04090001" w:tentative="1">
+      <w:start w:val="1"/>
+      <w:numFmt w:val="bullet"/>
+      <w:lvlText w:val=""/>
+      <w:lvlJc w:val="left"/>
+      <w:pPr>
+        <w:ind w:left="5607" w:hanging="360"/>
+      </w:pPr>
+      <w:rPr>
+        <w:rFonts w:ascii="Symbol" w:hAnsi="Symbol" w:hint="default"/>
+      </w:rPr>
+    </w:lvl>
+    <w:lvl w:ilvl="7" w:tplc="04090003" w:tentative="1">
+      <w:start w:val="1"/>
+      <w:numFmt w:val="bullet"/>
+      <w:lvlText w:val="o"/>
+      <w:lvlJc w:val="left"/>
+      <w:pPr>
+        <w:ind w:left="6327" w:hanging="360"/>
+      </w:pPr>
+      <w:rPr>
+        <w:rFonts w:ascii="Courier New" w:hAnsi="Courier New" w:cs="Courier New" w:hint="default"/>
+      </w:rPr>
+    </w:lvl>
+    <w:lvl w:ilvl="8" w:tplc="04090005" w:tentative="1">
+      <w:start w:val="1"/>
+      <w:numFmt w:val="bullet"/>
+      <w:lvlText w:val=""/>
+      <w:lvlJc w:val="left"/>
+      <w:pPr>
+        <w:ind w:left="7047" w:hanging="360"/>
+      </w:pPr>
+      <w:rPr>
+        <w:rFonts w:ascii="Wingdings" w:hAnsi="Wingdings" w:hint="default"/>
+      </w:rPr>
+    </w:lvl>
+  </w:abstractNum>
+  <w:abstractNum w:abstractNumId="9" w15:restartNumberingAfterBreak="0">
+    <w:nsid w:val="533430E6"/>
+    <w:multiLevelType w:val="hybridMultilevel"/>
+    <w:tmpl w:val="05DE65C6"/>
+    <w:lvl w:ilvl="0" w:tplc="04090001">
+      <w:start w:val="1"/>
+      <w:numFmt w:val="bullet"/>
+      <w:lvlText w:val=""/>
+      <w:lvlJc w:val="left"/>
+      <w:pPr>
+        <w:ind w:left="1287" w:hanging="360"/>
+      </w:pPr>
+      <w:rPr>
+        <w:rFonts w:ascii="Symbol" w:hAnsi="Symbol" w:hint="default"/>
+      </w:rPr>
+    </w:lvl>
+    <w:lvl w:ilvl="1" w:tplc="FFFFFFFF">
+      <w:start w:val="1"/>
+      <w:numFmt w:val="bullet"/>
+      <w:lvlText w:val="o"/>
+      <w:lvlJc w:val="left"/>
+      <w:pPr>
+        <w:ind w:left="2007" w:hanging="360"/>
+      </w:pPr>
+      <w:rPr>
+        <w:rFonts w:ascii="Courier New" w:hAnsi="Courier New" w:cs="Courier New" w:hint="default"/>
+      </w:rPr>
+    </w:lvl>
+    <w:lvl w:ilvl="2" w:tplc="FFFFFFFF" w:tentative="1">
+      <w:start w:val="1"/>
+      <w:numFmt w:val="bullet"/>
+      <w:lvlText w:val=""/>
+      <w:lvlJc w:val="left"/>
+      <w:pPr>
+        <w:ind w:left="2727" w:hanging="360"/>
+      </w:pPr>
+      <w:rPr>
+        <w:rFonts w:ascii="Wingdings" w:hAnsi="Wingdings" w:hint="default"/>
+      </w:rPr>
+    </w:lvl>
+    <w:lvl w:ilvl="3" w:tplc="FFFFFFFF" w:tentative="1">
+      <w:start w:val="1"/>
+      <w:numFmt w:val="bullet"/>
+      <w:lvlText w:val=""/>
+      <w:lvlJc w:val="left"/>
+      <w:pPr>
+        <w:ind w:left="3447" w:hanging="360"/>
+      </w:pPr>
+      <w:rPr>
+        <w:rFonts w:ascii="Symbol" w:hAnsi="Symbol" w:hint="default"/>
+      </w:rPr>
+    </w:lvl>
+    <w:lvl w:ilvl="4" w:tplc="FFFFFFFF" w:tentative="1">
+      <w:start w:val="1"/>
+      <w:numFmt w:val="bullet"/>
+      <w:lvlText w:val="o"/>
+      <w:lvlJc w:val="left"/>
+      <w:pPr>
+        <w:ind w:left="4167" w:hanging="360"/>
+      </w:pPr>
+      <w:rPr>
+        <w:rFonts w:ascii="Courier New" w:hAnsi="Courier New" w:cs="Courier New" w:hint="default"/>
+      </w:rPr>
+    </w:lvl>
+    <w:lvl w:ilvl="5" w:tplc="FFFFFFFF" w:tentative="1">
+      <w:start w:val="1"/>
+      <w:numFmt w:val="bullet"/>
+      <w:lvlText w:val=""/>
+      <w:lvlJc w:val="left"/>
+      <w:pPr>
+        <w:ind w:left="4887" w:hanging="360"/>
+      </w:pPr>
+      <w:rPr>
+        <w:rFonts w:ascii="Wingdings" w:hAnsi="Wingdings" w:hint="default"/>
+      </w:rPr>
+    </w:lvl>
+    <w:lvl w:ilvl="6" w:tplc="FFFFFFFF" w:tentative="1">
+      <w:start w:val="1"/>
+      <w:numFmt w:val="bullet"/>
+      <w:lvlText w:val=""/>
+      <w:lvlJc w:val="left"/>
+      <w:pPr>
+        <w:ind w:left="5607" w:hanging="360"/>
+      </w:pPr>
+      <w:rPr>
+        <w:rFonts w:ascii="Symbol" w:hAnsi="Symbol" w:hint="default"/>
+      </w:rPr>
+    </w:lvl>
+    <w:lvl w:ilvl="7" w:tplc="FFFFFFFF" w:tentative="1">
+      <w:start w:val="1"/>
+      <w:numFmt w:val="bullet"/>
+      <w:lvlText w:val="o"/>
+      <w:lvlJc w:val="left"/>
+      <w:pPr>
+        <w:ind w:left="6327" w:hanging="360"/>
+      </w:pPr>
+      <w:rPr>
+        <w:rFonts w:ascii="Courier New" w:hAnsi="Courier New" w:cs="Courier New" w:hint="default"/>
+      </w:rPr>
+    </w:lvl>
+    <w:lvl w:ilvl="8" w:tplc="FFFFFFFF" w:tentative="1">
+      <w:start w:val="1"/>
+      <w:numFmt w:val="bullet"/>
+      <w:lvlText w:val=""/>
+      <w:lvlJc w:val="left"/>
+      <w:pPr>
+        <w:ind w:left="7047" w:hanging="360"/>
+      </w:pPr>
+      <w:rPr>
+        <w:rFonts w:ascii="Wingdings" w:hAnsi="Wingdings" w:hint="default"/>
+      </w:rPr>
+    </w:lvl>
+  </w:abstractNum>
+  <w:abstractNum w:abstractNumId="10" w15:restartNumberingAfterBreak="0">
     <w:nsid w:val="5729116B"/>
     <w:multiLevelType w:val="hybridMultilevel"/>
     <w:tmpl w:val="BB74E996"/>
@@ -7521,7 +8224,7 @@
       </w:rPr>
     </w:lvl>
   </w:abstractNum>
-  <w:abstractNum w:abstractNumId="7" w15:restartNumberingAfterBreak="0">
+  <w:abstractNum w:abstractNumId="11" w15:restartNumberingAfterBreak="0">
     <w:nsid w:val="584223CC"/>
     <w:multiLevelType w:val="hybridMultilevel"/>
     <w:tmpl w:val="15AE2CB0"/>
@@ -7634,7 +8337,7 @@
       </w:rPr>
     </w:lvl>
   </w:abstractNum>
-  <w:abstractNum w:abstractNumId="8" w15:restartNumberingAfterBreak="0">
+  <w:abstractNum w:abstractNumId="12" w15:restartNumberingAfterBreak="0">
     <w:nsid w:val="5A3C6B9D"/>
     <w:multiLevelType w:val="hybridMultilevel"/>
     <w:tmpl w:val="8A963DA4"/>
@@ -7747,7 +8450,7 @@
       </w:rPr>
     </w:lvl>
   </w:abstractNum>
-  <w:abstractNum w:abstractNumId="9" w15:restartNumberingAfterBreak="0">
+  <w:abstractNum w:abstractNumId="13" w15:restartNumberingAfterBreak="0">
     <w:nsid w:val="7C2F5FFD"/>
     <w:multiLevelType w:val="hybridMultilevel"/>
     <w:tmpl w:val="7C0C3FE6"/>
@@ -7861,34 +8564,46 @@
     </w:lvl>
   </w:abstractNum>
   <w:num w:numId="1" w16cid:durableId="1045522712">
-    <w:abstractNumId w:val="5"/>
+    <w:abstractNumId w:val="7"/>
   </w:num>
   <w:num w:numId="2" w16cid:durableId="1914701475">
     <w:abstractNumId w:val="1"/>
   </w:num>
   <w:num w:numId="3" w16cid:durableId="1264529151">
-    <w:abstractNumId w:val="2"/>
+    <w:abstractNumId w:val="3"/>
   </w:num>
   <w:num w:numId="4" w16cid:durableId="1411461418">
-    <w:abstractNumId w:val="4"/>
+    <w:abstractNumId w:val="6"/>
   </w:num>
   <w:num w:numId="5" w16cid:durableId="185103095">
-    <w:abstractNumId w:val="3"/>
+    <w:abstractNumId w:val="5"/>
   </w:num>
   <w:num w:numId="6" w16cid:durableId="1852379492">
-    <w:abstractNumId w:val="7"/>
+    <w:abstractNumId w:val="11"/>
   </w:num>
   <w:num w:numId="7" w16cid:durableId="1846623942">
     <w:abstractNumId w:val="0"/>
   </w:num>
   <w:num w:numId="8" w16cid:durableId="385762116">
-    <w:abstractNumId w:val="6"/>
+    <w:abstractNumId w:val="10"/>
   </w:num>
   <w:num w:numId="9" w16cid:durableId="1558129866">
-    <w:abstractNumId w:val="9"/>
+    <w:abstractNumId w:val="13"/>
   </w:num>
   <w:num w:numId="10" w16cid:durableId="1390153760">
+    <w:abstractNumId w:val="12"/>
+  </w:num>
+  <w:num w:numId="11" w16cid:durableId="94328686">
     <w:abstractNumId w:val="8"/>
+  </w:num>
+  <w:num w:numId="12" w16cid:durableId="1291398037">
+    <w:abstractNumId w:val="2"/>
+  </w:num>
+  <w:num w:numId="13" w16cid:durableId="1274365881">
+    <w:abstractNumId w:val="4"/>
+  </w:num>
+  <w:num w:numId="14" w16cid:durableId="569733674">
+    <w:abstractNumId w:val="9"/>
   </w:num>
 </w:numbering>
 </file>
@@ -8975,6 +9690,25 @@
       <w:u w:val="single"/>
     </w:rPr>
   </w:style>
+  <w:style w:type="paragraph" w:styleId="Caption">
+    <w:name w:val="caption"/>
+    <w:basedOn w:val="Normal"/>
+    <w:next w:val="Normal"/>
+    <w:uiPriority w:val="35"/>
+    <w:unhideWhenUsed/>
+    <w:qFormat/>
+    <w:rsid w:val="008A130F"/>
+    <w:pPr>
+      <w:spacing w:after="200" w:line="240" w:lineRule="auto"/>
+    </w:pPr>
+    <w:rPr>
+      <w:i/>
+      <w:iCs/>
+      <w:color w:val="0E2841" w:themeColor="text2"/>
+      <w:sz w:val="18"/>
+      <w:szCs w:val="18"/>
+    </w:rPr>
+  </w:style>
 </w:styles>
 </file>
 

</xml_diff>

<commit_message>
Update 3. Requirements engineering
Update 3.2. User requirements → 3.2. User and system requirements
</commit_message>
<xml_diff>
--- a/Project Progress Report/Assignment_Phase_1-Thanh_Tran-24247169.docx
+++ b/Project Progress Report/Assignment_Phase_1-Thanh_Tran-24247169.docx
@@ -442,7 +442,7 @@
           <w:r>
             <w:fldChar w:fldCharType="separate"/>
           </w:r>
-          <w:hyperlink w:anchor="_Toc227105541" w:history="1">
+          <w:hyperlink w:anchor="_Toc227153811" w:history="1">
             <w:r>
               <w:rPr>
                 <w:rStyle w:val="Hyperlink"/>
@@ -489,7 +489,7 @@
                 <w:noProof/>
                 <w:webHidden/>
               </w:rPr>
-              <w:instrText xml:space="preserve"> PAGEREF _Toc227105541 \h </w:instrText>
+              <w:instrText xml:space="preserve"> PAGEREF _Toc227153811 \h </w:instrText>
             </w:r>
             <w:r>
               <w:rPr>
@@ -532,7 +532,7 @@
               <w:lang w:val="en-US" w:eastAsia="en-US"/>
             </w:rPr>
           </w:pPr>
-          <w:hyperlink w:anchor="_Toc227105542" w:history="1">
+          <w:hyperlink w:anchor="_Toc227153812" w:history="1">
             <w:r>
               <w:rPr>
                 <w:rStyle w:val="Hyperlink"/>
@@ -579,7 +579,7 @@
                 <w:noProof/>
                 <w:webHidden/>
               </w:rPr>
-              <w:instrText xml:space="preserve"> PAGEREF _Toc227105542 \h </w:instrText>
+              <w:instrText xml:space="preserve"> PAGEREF _Toc227153812 \h </w:instrText>
             </w:r>
             <w:r>
               <w:rPr>
@@ -621,7 +621,7 @@
               <w:lang w:val="en-US" w:eastAsia="en-US"/>
             </w:rPr>
           </w:pPr>
-          <w:hyperlink w:anchor="_Toc227105543" w:history="1">
+          <w:hyperlink w:anchor="_Toc227153813" w:history="1">
             <w:r>
               <w:rPr>
                 <w:rStyle w:val="Hyperlink"/>
@@ -651,7 +651,7 @@
                 <w:noProof/>
                 <w:webHidden/>
               </w:rPr>
-              <w:instrText xml:space="preserve"> PAGEREF _Toc227105543 \h </w:instrText>
+              <w:instrText xml:space="preserve"> PAGEREF _Toc227153813 \h </w:instrText>
             </w:r>
             <w:r>
               <w:rPr>
@@ -693,7 +693,7 @@
               <w:lang w:val="en-US" w:eastAsia="en-US"/>
             </w:rPr>
           </w:pPr>
-          <w:hyperlink w:anchor="_Toc227105544" w:history="1">
+          <w:hyperlink w:anchor="_Toc227153814" w:history="1">
             <w:r>
               <w:rPr>
                 <w:rStyle w:val="Hyperlink"/>
@@ -723,7 +723,7 @@
                 <w:noProof/>
                 <w:webHidden/>
               </w:rPr>
-              <w:instrText xml:space="preserve"> PAGEREF _Toc227105544 \h </w:instrText>
+              <w:instrText xml:space="preserve"> PAGEREF _Toc227153814 \h </w:instrText>
             </w:r>
             <w:r>
               <w:rPr>
@@ -765,7 +765,7 @@
               <w:lang w:val="en-US" w:eastAsia="en-US"/>
             </w:rPr>
           </w:pPr>
-          <w:hyperlink w:anchor="_Toc227105545" w:history="1">
+          <w:hyperlink w:anchor="_Toc227153815" w:history="1">
             <w:r>
               <w:rPr>
                 <w:rStyle w:val="Hyperlink"/>
@@ -795,7 +795,7 @@
                 <w:noProof/>
                 <w:webHidden/>
               </w:rPr>
-              <w:instrText xml:space="preserve"> PAGEREF _Toc227105545 \h </w:instrText>
+              <w:instrText xml:space="preserve"> PAGEREF _Toc227153815 \h </w:instrText>
             </w:r>
             <w:r>
               <w:rPr>
@@ -837,7 +837,7 @@
               <w:lang w:val="en-US" w:eastAsia="en-US"/>
             </w:rPr>
           </w:pPr>
-          <w:hyperlink w:anchor="_Toc227105546" w:history="1">
+          <w:hyperlink w:anchor="_Toc227153816" w:history="1">
             <w:r>
               <w:rPr>
                 <w:rStyle w:val="Hyperlink"/>
@@ -867,7 +867,7 @@
                 <w:noProof/>
                 <w:webHidden/>
               </w:rPr>
-              <w:instrText xml:space="preserve"> PAGEREF _Toc227105546 \h </w:instrText>
+              <w:instrText xml:space="preserve"> PAGEREF _Toc227153816 \h </w:instrText>
             </w:r>
             <w:r>
               <w:rPr>
@@ -909,7 +909,7 @@
               <w:lang w:val="en-US" w:eastAsia="en-US"/>
             </w:rPr>
           </w:pPr>
-          <w:hyperlink w:anchor="_Toc227105547" w:history="1">
+          <w:hyperlink w:anchor="_Toc227153817" w:history="1">
             <w:r>
               <w:rPr>
                 <w:rStyle w:val="Hyperlink"/>
@@ -939,7 +939,7 @@
                 <w:noProof/>
                 <w:webHidden/>
               </w:rPr>
-              <w:instrText xml:space="preserve"> PAGEREF _Toc227105547 \h </w:instrText>
+              <w:instrText xml:space="preserve"> PAGEREF _Toc227153817 \h </w:instrText>
             </w:r>
             <w:r>
               <w:rPr>
@@ -981,7 +981,7 @@
               <w:lang w:val="en-US" w:eastAsia="en-US"/>
             </w:rPr>
           </w:pPr>
-          <w:hyperlink w:anchor="_Toc227105548" w:history="1">
+          <w:hyperlink w:anchor="_Toc227153818" w:history="1">
             <w:r>
               <w:rPr>
                 <w:rStyle w:val="Hyperlink"/>
@@ -1011,7 +1011,7 @@
                 <w:noProof/>
                 <w:webHidden/>
               </w:rPr>
-              <w:instrText xml:space="preserve"> PAGEREF _Toc227105548 \h </w:instrText>
+              <w:instrText xml:space="preserve"> PAGEREF _Toc227153818 \h </w:instrText>
             </w:r>
             <w:r>
               <w:rPr>
@@ -1053,7 +1053,7 @@
               <w:lang w:val="en-US" w:eastAsia="en-US"/>
             </w:rPr>
           </w:pPr>
-          <w:hyperlink w:anchor="_Toc227105549" w:history="1">
+          <w:hyperlink w:anchor="_Toc227153819" w:history="1">
             <w:r>
               <w:rPr>
                 <w:rStyle w:val="Hyperlink"/>
@@ -1083,7 +1083,7 @@
                 <w:noProof/>
                 <w:webHidden/>
               </w:rPr>
-              <w:instrText xml:space="preserve"> PAGEREF _Toc227105549 \h </w:instrText>
+              <w:instrText xml:space="preserve"> PAGEREF _Toc227153819 \h </w:instrText>
             </w:r>
             <w:r>
               <w:rPr>
@@ -1125,7 +1125,7 @@
               <w:lang w:val="en-US" w:eastAsia="en-US"/>
             </w:rPr>
           </w:pPr>
-          <w:hyperlink w:anchor="_Toc227105550" w:history="1">
+          <w:hyperlink w:anchor="_Toc227153820" w:history="1">
             <w:r>
               <w:rPr>
                 <w:rStyle w:val="Hyperlink"/>
@@ -1155,7 +1155,7 @@
                 <w:noProof/>
                 <w:webHidden/>
               </w:rPr>
-              <w:instrText xml:space="preserve"> PAGEREF _Toc227105550 \h </w:instrText>
+              <w:instrText xml:space="preserve"> PAGEREF _Toc227153820 \h </w:instrText>
             </w:r>
             <w:r>
               <w:rPr>
@@ -1198,7 +1198,7 @@
               <w:lang w:val="en-US" w:eastAsia="en-US"/>
             </w:rPr>
           </w:pPr>
-          <w:hyperlink w:anchor="_Toc227105551" w:history="1">
+          <w:hyperlink w:anchor="_Toc227153821" w:history="1">
             <w:r>
               <w:rPr>
                 <w:rStyle w:val="Hyperlink"/>
@@ -1245,7 +1245,7 @@
                 <w:noProof/>
                 <w:webHidden/>
               </w:rPr>
-              <w:instrText xml:space="preserve"> PAGEREF _Toc227105551 \h </w:instrText>
+              <w:instrText xml:space="preserve"> PAGEREF _Toc227153821 \h </w:instrText>
             </w:r>
             <w:r>
               <w:rPr>
@@ -1287,7 +1287,7 @@
               <w:lang w:val="en-US" w:eastAsia="en-US"/>
             </w:rPr>
           </w:pPr>
-          <w:hyperlink w:anchor="_Toc227105552" w:history="1">
+          <w:hyperlink w:anchor="_Toc227153822" w:history="1">
             <w:r>
               <w:rPr>
                 <w:rStyle w:val="Hyperlink"/>
@@ -1317,7 +1317,7 @@
                 <w:noProof/>
                 <w:webHidden/>
               </w:rPr>
-              <w:instrText xml:space="preserve"> PAGEREF _Toc227105552 \h </w:instrText>
+              <w:instrText xml:space="preserve"> PAGEREF _Toc227153822 \h </w:instrText>
             </w:r>
             <w:r>
               <w:rPr>
@@ -1359,7 +1359,7 @@
               <w:lang w:val="en-US" w:eastAsia="en-US"/>
             </w:rPr>
           </w:pPr>
-          <w:hyperlink w:anchor="_Toc227105553" w:history="1">
+          <w:hyperlink w:anchor="_Toc227153823" w:history="1">
             <w:r>
               <w:rPr>
                 <w:rStyle w:val="Hyperlink"/>
@@ -1389,7 +1389,7 @@
                 <w:noProof/>
                 <w:webHidden/>
               </w:rPr>
-              <w:instrText xml:space="preserve"> PAGEREF _Toc227105553 \h </w:instrText>
+              <w:instrText xml:space="preserve"> PAGEREF _Toc227153823 \h </w:instrText>
             </w:r>
             <w:r>
               <w:rPr>
@@ -1431,7 +1431,7 @@
               <w:lang w:val="en-US" w:eastAsia="en-US"/>
             </w:rPr>
           </w:pPr>
-          <w:hyperlink w:anchor="_Toc227105554" w:history="1">
+          <w:hyperlink w:anchor="_Toc227153824" w:history="1">
             <w:r>
               <w:rPr>
                 <w:rStyle w:val="Hyperlink"/>
@@ -1461,7 +1461,7 @@
                 <w:noProof/>
                 <w:webHidden/>
               </w:rPr>
-              <w:instrText xml:space="preserve"> PAGEREF _Toc227105554 \h </w:instrText>
+              <w:instrText xml:space="preserve"> PAGEREF _Toc227153824 \h </w:instrText>
             </w:r>
             <w:r>
               <w:rPr>
@@ -1503,7 +1503,7 @@
               <w:lang w:val="en-US" w:eastAsia="en-US"/>
             </w:rPr>
           </w:pPr>
-          <w:hyperlink w:anchor="_Toc227105555" w:history="1">
+          <w:hyperlink w:anchor="_Toc227153825" w:history="1">
             <w:r>
               <w:rPr>
                 <w:rStyle w:val="Hyperlink"/>
@@ -1533,7 +1533,7 @@
                 <w:noProof/>
                 <w:webHidden/>
               </w:rPr>
-              <w:instrText xml:space="preserve"> PAGEREF _Toc227105555 \h </w:instrText>
+              <w:instrText xml:space="preserve"> PAGEREF _Toc227153825 \h </w:instrText>
             </w:r>
             <w:r>
               <w:rPr>
@@ -1554,6 +1554,78 @@
                 <w:webHidden/>
               </w:rPr>
               <w:t>10</w:t>
+            </w:r>
+            <w:r>
+              <w:rPr>
+                <w:noProof/>
+                <w:webHidden/>
+              </w:rPr>
+              <w:fldChar w:fldCharType="end"/>
+            </w:r>
+          </w:hyperlink>
+        </w:p>
+        <w:p>
+          <w:pPr>
+            <w:pStyle w:val="TOC3"/>
+            <w:tabs>
+              <w:tab w:val="right" w:leader="dot" w:pos="9350"/>
+            </w:tabs>
+            <w:rPr>
+              <w:noProof/>
+              <w:lang w:val="en-US" w:eastAsia="en-US"/>
+            </w:rPr>
+          </w:pPr>
+          <w:hyperlink w:anchor="_Toc227153826" w:history="1">
+            <w:r>
+              <w:rPr>
+                <w:rStyle w:val="Hyperlink"/>
+                <w:rFonts w:ascii="Arial" w:hAnsi="Arial" w:cs="Arial"/>
+                <w:b/>
+                <w:bCs/>
+                <w:noProof/>
+              </w:rPr>
+              <w:t>iv. Stakeholder interview</w:t>
+            </w:r>
+            <w:r>
+              <w:rPr>
+                <w:noProof/>
+                <w:webHidden/>
+              </w:rPr>
+              <w:tab/>
+            </w:r>
+            <w:r>
+              <w:rPr>
+                <w:noProof/>
+                <w:webHidden/>
+              </w:rPr>
+              <w:fldChar w:fldCharType="begin"/>
+            </w:r>
+            <w:r>
+              <w:rPr>
+                <w:noProof/>
+                <w:webHidden/>
+              </w:rPr>
+              <w:instrText xml:space="preserve"> PAGEREF _Toc227153826 \h </w:instrText>
+            </w:r>
+            <w:r>
+              <w:rPr>
+                <w:noProof/>
+                <w:webHidden/>
+              </w:rPr>
+            </w:r>
+            <w:r>
+              <w:rPr>
+                <w:noProof/>
+                <w:webHidden/>
+              </w:rPr>
+              <w:fldChar w:fldCharType="separate"/>
+            </w:r>
+            <w:r>
+              <w:rPr>
+                <w:noProof/>
+                <w:webHidden/>
+              </w:rPr>
+              <w:t>12</w:t>
             </w:r>
             <w:r>
               <w:rPr>
@@ -1575,7 +1647,7 @@
               <w:lang w:val="en-US" w:eastAsia="en-US"/>
             </w:rPr>
           </w:pPr>
-          <w:hyperlink w:anchor="_Toc227105556" w:history="1">
+          <w:hyperlink w:anchor="_Toc227153827" w:history="1">
             <w:r>
               <w:rPr>
                 <w:rStyle w:val="Hyperlink"/>
@@ -1584,7 +1656,7 @@
                 <w:bCs/>
                 <w:noProof/>
               </w:rPr>
-              <w:t>3.2. User requirements</w:t>
+              <w:t>3.2. User and system requirements</w:t>
             </w:r>
             <w:r>
               <w:rPr>
@@ -1605,7 +1677,7 @@
                 <w:noProof/>
                 <w:webHidden/>
               </w:rPr>
-              <w:instrText xml:space="preserve"> PAGEREF _Toc227105556 \h </w:instrText>
+              <w:instrText xml:space="preserve"> PAGEREF _Toc227153827 \h </w:instrText>
             </w:r>
             <w:r>
               <w:rPr>
@@ -1625,7 +1697,151 @@
                 <w:noProof/>
                 <w:webHidden/>
               </w:rPr>
-              <w:t>12</w:t>
+              <w:t>14</w:t>
+            </w:r>
+            <w:r>
+              <w:rPr>
+                <w:noProof/>
+                <w:webHidden/>
+              </w:rPr>
+              <w:fldChar w:fldCharType="end"/>
+            </w:r>
+          </w:hyperlink>
+        </w:p>
+        <w:p>
+          <w:pPr>
+            <w:pStyle w:val="TOC3"/>
+            <w:tabs>
+              <w:tab w:val="right" w:leader="dot" w:pos="9350"/>
+            </w:tabs>
+            <w:rPr>
+              <w:noProof/>
+              <w:lang w:val="en-US" w:eastAsia="en-US"/>
+            </w:rPr>
+          </w:pPr>
+          <w:hyperlink w:anchor="_Toc227153828" w:history="1">
+            <w:r>
+              <w:rPr>
+                <w:rStyle w:val="Hyperlink"/>
+                <w:rFonts w:ascii="Arial" w:hAnsi="Arial" w:cs="Arial"/>
+                <w:b/>
+                <w:bCs/>
+                <w:noProof/>
+              </w:rPr>
+              <w:t>i. User requirements</w:t>
+            </w:r>
+            <w:r>
+              <w:rPr>
+                <w:noProof/>
+                <w:webHidden/>
+              </w:rPr>
+              <w:tab/>
+            </w:r>
+            <w:r>
+              <w:rPr>
+                <w:noProof/>
+                <w:webHidden/>
+              </w:rPr>
+              <w:fldChar w:fldCharType="begin"/>
+            </w:r>
+            <w:r>
+              <w:rPr>
+                <w:noProof/>
+                <w:webHidden/>
+              </w:rPr>
+              <w:instrText xml:space="preserve"> PAGEREF _Toc227153828 \h </w:instrText>
+            </w:r>
+            <w:r>
+              <w:rPr>
+                <w:noProof/>
+                <w:webHidden/>
+              </w:rPr>
+            </w:r>
+            <w:r>
+              <w:rPr>
+                <w:noProof/>
+                <w:webHidden/>
+              </w:rPr>
+              <w:fldChar w:fldCharType="separate"/>
+            </w:r>
+            <w:r>
+              <w:rPr>
+                <w:noProof/>
+                <w:webHidden/>
+              </w:rPr>
+              <w:t>14</w:t>
+            </w:r>
+            <w:r>
+              <w:rPr>
+                <w:noProof/>
+                <w:webHidden/>
+              </w:rPr>
+              <w:fldChar w:fldCharType="end"/>
+            </w:r>
+          </w:hyperlink>
+        </w:p>
+        <w:p>
+          <w:pPr>
+            <w:pStyle w:val="TOC3"/>
+            <w:tabs>
+              <w:tab w:val="right" w:leader="dot" w:pos="9350"/>
+            </w:tabs>
+            <w:rPr>
+              <w:noProof/>
+              <w:lang w:val="en-US" w:eastAsia="en-US"/>
+            </w:rPr>
+          </w:pPr>
+          <w:hyperlink w:anchor="_Toc227153829" w:history="1">
+            <w:r>
+              <w:rPr>
+                <w:rStyle w:val="Hyperlink"/>
+                <w:rFonts w:ascii="Arial" w:hAnsi="Arial" w:cs="Arial"/>
+                <w:b/>
+                <w:bCs/>
+                <w:noProof/>
+              </w:rPr>
+              <w:t>ii. System requirements</w:t>
+            </w:r>
+            <w:r>
+              <w:rPr>
+                <w:noProof/>
+                <w:webHidden/>
+              </w:rPr>
+              <w:tab/>
+            </w:r>
+            <w:r>
+              <w:rPr>
+                <w:noProof/>
+                <w:webHidden/>
+              </w:rPr>
+              <w:fldChar w:fldCharType="begin"/>
+            </w:r>
+            <w:r>
+              <w:rPr>
+                <w:noProof/>
+                <w:webHidden/>
+              </w:rPr>
+              <w:instrText xml:space="preserve"> PAGEREF _Toc227153829 \h </w:instrText>
+            </w:r>
+            <w:r>
+              <w:rPr>
+                <w:noProof/>
+                <w:webHidden/>
+              </w:rPr>
+            </w:r>
+            <w:r>
+              <w:rPr>
+                <w:noProof/>
+                <w:webHidden/>
+              </w:rPr>
+              <w:fldChar w:fldCharType="separate"/>
+            </w:r>
+            <w:r>
+              <w:rPr>
+                <w:noProof/>
+                <w:webHidden/>
+              </w:rPr>
+              <w:t>16</w:t>
             </w:r>
             <w:r>
               <w:rPr>
@@ -1647,7 +1863,7 @@
               <w:lang w:val="en-US" w:eastAsia="en-US"/>
             </w:rPr>
           </w:pPr>
-          <w:hyperlink w:anchor="_Toc227105557" w:history="1">
+          <w:hyperlink w:anchor="_Toc227153830" w:history="1">
             <w:r>
               <w:rPr>
                 <w:rStyle w:val="Hyperlink"/>
@@ -1656,7 +1872,27 @@
                 <w:bCs/>
                 <w:noProof/>
               </w:rPr>
-              <w:t>3.3. Functional requirements</w:t>
+              <w:t>3.3. Functional r</w:t>
+            </w:r>
+            <w:r>
+              <w:rPr>
+                <w:rStyle w:val="Hyperlink"/>
+                <w:rFonts w:ascii="Arial" w:hAnsi="Arial" w:cs="Arial"/>
+                <w:b/>
+                <w:bCs/>
+                <w:noProof/>
+              </w:rPr>
+              <w:t>e</w:t>
+            </w:r>
+            <w:r>
+              <w:rPr>
+                <w:rStyle w:val="Hyperlink"/>
+                <w:rFonts w:ascii="Arial" w:hAnsi="Arial" w:cs="Arial"/>
+                <w:b/>
+                <w:bCs/>
+                <w:noProof/>
+              </w:rPr>
+              <w:t>quirements</w:t>
             </w:r>
             <w:r>
               <w:rPr>
@@ -1677,7 +1913,7 @@
                 <w:noProof/>
                 <w:webHidden/>
               </w:rPr>
-              <w:instrText xml:space="preserve"> PAGEREF _Toc227105557 \h </w:instrText>
+              <w:instrText xml:space="preserve"> PAGEREF _Toc227153830 \h </w:instrText>
             </w:r>
             <w:r>
               <w:rPr>
@@ -1697,7 +1933,7 @@
                 <w:noProof/>
                 <w:webHidden/>
               </w:rPr>
-              <w:t>13</w:t>
+              <w:t>16</w:t>
             </w:r>
             <w:r>
               <w:rPr>
@@ -1719,7 +1955,7 @@
               <w:lang w:val="en-US" w:eastAsia="en-US"/>
             </w:rPr>
           </w:pPr>
-          <w:hyperlink w:anchor="_Toc227105558" w:history="1">
+          <w:hyperlink w:anchor="_Toc227153831" w:history="1">
             <w:r>
               <w:rPr>
                 <w:rStyle w:val="Hyperlink"/>
@@ -1749,7 +1985,7 @@
                 <w:noProof/>
                 <w:webHidden/>
               </w:rPr>
-              <w:instrText xml:space="preserve"> PAGEREF _Toc227105558 \h </w:instrText>
+              <w:instrText xml:space="preserve"> PAGEREF _Toc227153831 \h </w:instrText>
             </w:r>
             <w:r>
               <w:rPr>
@@ -1769,7 +2005,7 @@
                 <w:noProof/>
                 <w:webHidden/>
               </w:rPr>
-              <w:t>15</w:t>
+              <w:t>18</w:t>
             </w:r>
             <w:r>
               <w:rPr>
@@ -1792,7 +2028,7 @@
               <w:lang w:val="en-US" w:eastAsia="en-US"/>
             </w:rPr>
           </w:pPr>
-          <w:hyperlink w:anchor="_Toc227105559" w:history="1">
+          <w:hyperlink w:anchor="_Toc227153832" w:history="1">
             <w:r>
               <w:rPr>
                 <w:rStyle w:val="Hyperlink"/>
@@ -1839,7 +2075,7 @@
                 <w:noProof/>
                 <w:webHidden/>
               </w:rPr>
-              <w:instrText xml:space="preserve"> PAGEREF _Toc227105559 \h </w:instrText>
+              <w:instrText xml:space="preserve"> PAGEREF _Toc227153832 \h </w:instrText>
             </w:r>
             <w:r>
               <w:rPr>
@@ -1859,7 +2095,7 @@
                 <w:noProof/>
                 <w:webHidden/>
               </w:rPr>
-              <w:t>17</w:t>
+              <w:t>20</w:t>
             </w:r>
             <w:r>
               <w:rPr>
@@ -1882,7 +2118,7 @@
               <w:lang w:val="en-US" w:eastAsia="en-US"/>
             </w:rPr>
           </w:pPr>
-          <w:hyperlink w:anchor="_Toc227105560" w:history="1">
+          <w:hyperlink w:anchor="_Toc227153833" w:history="1">
             <w:r>
               <w:rPr>
                 <w:rStyle w:val="Hyperlink"/>
@@ -1929,7 +2165,7 @@
                 <w:noProof/>
                 <w:webHidden/>
               </w:rPr>
-              <w:instrText xml:space="preserve"> PAGEREF _Toc227105560 \h </w:instrText>
+              <w:instrText xml:space="preserve"> PAGEREF _Toc227153833 \h </w:instrText>
             </w:r>
             <w:r>
               <w:rPr>
@@ -1949,7 +2185,7 @@
                 <w:noProof/>
                 <w:webHidden/>
               </w:rPr>
-              <w:t>18</w:t>
+              <w:t>21</w:t>
             </w:r>
             <w:r>
               <w:rPr>
@@ -1972,7 +2208,7 @@
               <w:lang w:val="en-US" w:eastAsia="en-US"/>
             </w:rPr>
           </w:pPr>
-          <w:hyperlink w:anchor="_Toc227105561" w:history="1">
+          <w:hyperlink w:anchor="_Toc227153834" w:history="1">
             <w:r>
               <w:rPr>
                 <w:rStyle w:val="Hyperlink"/>
@@ -2019,7 +2255,7 @@
                 <w:noProof/>
                 <w:webHidden/>
               </w:rPr>
-              <w:instrText xml:space="preserve"> PAGEREF _Toc227105561 \h </w:instrText>
+              <w:instrText xml:space="preserve"> PAGEREF _Toc227153834 \h </w:instrText>
             </w:r>
             <w:r>
               <w:rPr>
@@ -2039,7 +2275,7 @@
                 <w:noProof/>
                 <w:webHidden/>
               </w:rPr>
-              <w:t>19</w:t>
+              <w:t>22</w:t>
             </w:r>
             <w:r>
               <w:rPr>
@@ -2062,7 +2298,7 @@
               <w:lang w:val="en-US" w:eastAsia="en-US"/>
             </w:rPr>
           </w:pPr>
-          <w:hyperlink w:anchor="_Toc227105562" w:history="1">
+          <w:hyperlink w:anchor="_Toc227153835" w:history="1">
             <w:r>
               <w:rPr>
                 <w:rStyle w:val="Hyperlink"/>
@@ -2109,7 +2345,7 @@
                 <w:noProof/>
                 <w:webHidden/>
               </w:rPr>
-              <w:instrText xml:space="preserve"> PAGEREF _Toc227105562 \h </w:instrText>
+              <w:instrText xml:space="preserve"> PAGEREF _Toc227153835 \h </w:instrText>
             </w:r>
             <w:r>
               <w:rPr>
@@ -2129,7 +2365,7 @@
                 <w:noProof/>
                 <w:webHidden/>
               </w:rPr>
-              <w:t>20</w:t>
+              <w:t>23</w:t>
             </w:r>
             <w:r>
               <w:rPr>
@@ -2151,7 +2387,7 @@
               <w:lang w:val="en-US" w:eastAsia="en-US"/>
             </w:rPr>
           </w:pPr>
-          <w:hyperlink w:anchor="_Toc227105563" w:history="1">
+          <w:hyperlink w:anchor="_Toc227153836" w:history="1">
             <w:r>
               <w:rPr>
                 <w:rStyle w:val="Hyperlink"/>
@@ -2181,7 +2417,7 @@
                 <w:noProof/>
                 <w:webHidden/>
               </w:rPr>
-              <w:instrText xml:space="preserve"> PAGEREF _Toc227105563 \h </w:instrText>
+              <w:instrText xml:space="preserve"> PAGEREF _Toc227153836 \h </w:instrText>
             </w:r>
             <w:r>
               <w:rPr>
@@ -2201,7 +2437,7 @@
                 <w:noProof/>
                 <w:webHidden/>
               </w:rPr>
-              <w:t>21</w:t>
+              <w:t>24</w:t>
             </w:r>
             <w:r>
               <w:rPr>
@@ -2266,7 +2502,7 @@
           <w:szCs w:val="32"/>
         </w:rPr>
       </w:pPr>
-      <w:bookmarkStart w:id="1" w:name="_Toc227105541"/>
+      <w:bookmarkStart w:id="1" w:name="_Toc227153811"/>
       <w:r>
         <w:rPr>
           <w:rFonts w:ascii="Arial" w:hAnsi="Arial" w:cs="Arial"/>
@@ -2387,7 +2623,7 @@
           <w:szCs w:val="32"/>
         </w:rPr>
       </w:pPr>
-      <w:bookmarkStart w:id="2" w:name="_Toc227105542"/>
+      <w:bookmarkStart w:id="2" w:name="_Toc227153812"/>
       <w:r>
         <w:rPr>
           <w:rFonts w:ascii="Arial" w:hAnsi="Arial" w:cs="Arial"/>
@@ -2472,7 +2708,7 @@
           <w:szCs w:val="28"/>
         </w:rPr>
       </w:pPr>
-      <w:bookmarkStart w:id="3" w:name="_Toc227105543"/>
+      <w:bookmarkStart w:id="3" w:name="_Toc227153813"/>
       <w:r>
         <w:rPr>
           <w:rFonts w:ascii="Arial" w:hAnsi="Arial" w:cs="Arial"/>
@@ -2818,7 +3054,7 @@
           <w:szCs w:val="28"/>
         </w:rPr>
       </w:pPr>
-      <w:bookmarkStart w:id="4" w:name="_Toc227105544"/>
+      <w:bookmarkStart w:id="4" w:name="_Toc227153814"/>
       <w:r>
         <w:rPr>
           <w:rFonts w:ascii="Arial" w:hAnsi="Arial" w:cs="Arial"/>
@@ -3419,7 +3655,7 @@
           <w:szCs w:val="28"/>
         </w:rPr>
       </w:pPr>
-      <w:bookmarkStart w:id="5" w:name="_Toc227105545"/>
+      <w:bookmarkStart w:id="5" w:name="_Toc227153815"/>
       <w:r>
         <w:rPr>
           <w:rFonts w:ascii="Arial" w:hAnsi="Arial" w:cs="Arial"/>
@@ -3740,7 +3976,7 @@
           <w:szCs w:val="28"/>
         </w:rPr>
       </w:pPr>
-      <w:bookmarkStart w:id="6" w:name="_Toc227105546"/>
+      <w:bookmarkStart w:id="6" w:name="_Toc227153816"/>
       <w:r>
         <w:rPr>
           <w:rFonts w:ascii="Arial" w:hAnsi="Arial" w:cs="Arial"/>
@@ -4217,7 +4453,7 @@
           <w:szCs w:val="28"/>
         </w:rPr>
       </w:pPr>
-      <w:bookmarkStart w:id="7" w:name="_Toc227105547"/>
+      <w:bookmarkStart w:id="7" w:name="_Toc227153817"/>
       <w:r>
         <w:rPr>
           <w:rFonts w:ascii="Arial" w:hAnsi="Arial" w:cs="Arial"/>
@@ -4378,7 +4614,7 @@
           <w:szCs w:val="24"/>
         </w:rPr>
       </w:pPr>
-      <w:bookmarkStart w:id="8" w:name="_Toc227105548"/>
+      <w:bookmarkStart w:id="8" w:name="_Toc227153818"/>
       <w:r>
         <w:rPr>
           <w:rFonts w:ascii="Arial" w:hAnsi="Arial" w:cs="Arial"/>
@@ -4674,7 +4910,7 @@
           <w:szCs w:val="24"/>
         </w:rPr>
       </w:pPr>
-      <w:bookmarkStart w:id="9" w:name="_Toc227105549"/>
+      <w:bookmarkStart w:id="9" w:name="_Toc227153819"/>
       <w:r>
         <w:rPr>
           <w:rFonts w:ascii="Arial" w:hAnsi="Arial" w:cs="Arial"/>
@@ -4768,7 +5004,7 @@
           <w:szCs w:val="24"/>
         </w:rPr>
       </w:pPr>
-      <w:bookmarkStart w:id="10" w:name="_Toc227105550"/>
+      <w:bookmarkStart w:id="10" w:name="_Toc227153820"/>
       <w:r>
         <w:rPr>
           <w:rFonts w:ascii="Arial" w:hAnsi="Arial" w:cs="Arial"/>
@@ -5050,7 +5286,7 @@
           <w:szCs w:val="32"/>
         </w:rPr>
       </w:pPr>
-      <w:bookmarkStart w:id="11" w:name="_Toc227105551"/>
+      <w:bookmarkStart w:id="11" w:name="_Toc227153821"/>
       <w:r>
         <w:rPr>
           <w:rFonts w:ascii="Arial" w:hAnsi="Arial" w:cs="Arial"/>
@@ -5102,7 +5338,7 @@
           <w:szCs w:val="28"/>
         </w:rPr>
       </w:pPr>
-      <w:bookmarkStart w:id="12" w:name="_Toc227105552"/>
+      <w:bookmarkStart w:id="12" w:name="_Toc227153822"/>
       <w:r>
         <w:rPr>
           <w:rFonts w:ascii="Arial" w:hAnsi="Arial" w:cs="Arial"/>
@@ -5290,7 +5526,7 @@
           <w:szCs w:val="24"/>
         </w:rPr>
       </w:pPr>
-      <w:bookmarkStart w:id="13" w:name="_Toc227105553"/>
+      <w:bookmarkStart w:id="13" w:name="_Toc227153823"/>
       <w:r>
         <w:rPr>
           <w:rFonts w:ascii="Arial" w:hAnsi="Arial" w:cs="Arial"/>
@@ -5716,7 +5952,7 @@
           <w:szCs w:val="24"/>
         </w:rPr>
       </w:pPr>
-      <w:bookmarkStart w:id="14" w:name="_Toc227105554"/>
+      <w:bookmarkStart w:id="14" w:name="_Toc227153824"/>
       <w:r>
         <w:rPr>
           <w:rFonts w:ascii="Arial" w:hAnsi="Arial" w:cs="Arial"/>
@@ -6126,7 +6362,7 @@
           <w:szCs w:val="24"/>
         </w:rPr>
       </w:pPr>
-      <w:bookmarkStart w:id="15" w:name="_Toc227105555"/>
+      <w:bookmarkStart w:id="15" w:name="_Toc227153825"/>
       <w:r>
         <w:rPr>
           <w:rFonts w:ascii="Arial" w:hAnsi="Arial" w:cs="Arial"/>
@@ -6254,7 +6490,19 @@
         <w:rPr>
           <w:rFonts w:ascii="Arial" w:hAnsi="Arial" w:cs="Arial"/>
         </w:rPr>
-        <w:t xml:space="preserve">After enrolment is approved, the enrolment request is forwarded to the Finance Department. Students are required to make payments through another AUT system or external payment channel, and proof of payment is manually verified by finance staff before enrolment is confirmed. This process can be delayed due to missing payment records or processing time differences between systems. </w:t>
+        <w:t xml:space="preserve">After enrolment is approved, the enrolment request is forwarded to the Finance Department. Students are required to make payments through another AUT system or external payment channel, and proof of payment is manually verified by finance staff before enrolment is confirmed. This process can be delayed due to missing payment records or </w:t>
+      </w:r>
+      <w:r>
+        <w:rPr>
+          <w:rFonts w:ascii="Arial" w:hAnsi="Arial" w:cs="Arial"/>
+        </w:rPr>
+        <w:t>differences in processing time between systems</w:t>
+      </w:r>
+      <w:r>
+        <w:rPr>
+          <w:rFonts w:ascii="Arial" w:hAnsi="Arial" w:cs="Arial"/>
+        </w:rPr>
+        <w:t xml:space="preserve">. </w:t>
       </w:r>
     </w:p>
     <w:p>
@@ -6382,31 +6630,7 @@
         <w:rPr>
           <w:rFonts w:ascii="Arial" w:hAnsi="Arial" w:cs="Arial"/>
         </w:rPr>
-        <w:t>The separate handling of payments and manual verification indicates that the system shall integrate with a payment system and</w:t>
-      </w:r>
-      <w:r>
-        <w:rPr>
-          <w:rFonts w:ascii="Arial" w:hAnsi="Arial" w:cs="Arial"/>
-        </w:rPr>
-        <w:t xml:space="preserve"> </w:t>
-      </w:r>
-      <w:r>
-        <w:rPr>
-          <w:rFonts w:ascii="Arial" w:hAnsi="Arial" w:cs="Arial"/>
-        </w:rPr>
-        <w:t>automatically verify payment status after student</w:t>
-      </w:r>
-      <w:r>
-        <w:rPr>
-          <w:rFonts w:ascii="Arial" w:hAnsi="Arial" w:cs="Arial"/>
-        </w:rPr>
-        <w:t xml:space="preserve">s </w:t>
-      </w:r>
-      <w:r>
-        <w:rPr>
-          <w:rFonts w:ascii="Arial" w:hAnsi="Arial" w:cs="Arial"/>
-        </w:rPr>
-        <w:t>complete  payment through another AUT system or external payment channel.</w:t>
+        <w:t>The separate handling of payments and manual verification indicates that the system shall integrate with an external payment system and automatically verify payment status.</w:t>
       </w:r>
     </w:p>
     <w:p>
@@ -6426,7 +6650,13 @@
         <w:rPr>
           <w:rFonts w:ascii="Arial" w:hAnsi="Arial" w:cs="Arial"/>
         </w:rPr>
-        <w:t>The limited ability to track enrolment status in real time indicates that the system shall provide real-time tracking of enrolment status for students and staff.</w:t>
+        <w:t>The manual verification of payments and delays in enrolment  confirmation indicate that the system shall automatically confirm enrolment only after successful payment verification</w:t>
+      </w:r>
+      <w:r>
+        <w:rPr>
+          <w:rFonts w:ascii="Arial" w:hAnsi="Arial" w:cs="Arial"/>
+        </w:rPr>
+        <w:t>.</w:t>
       </w:r>
     </w:p>
     <w:p>
@@ -6446,7 +6676,7 @@
         <w:rPr>
           <w:rFonts w:ascii="Arial" w:hAnsi="Arial" w:cs="Arial"/>
         </w:rPr>
-        <w:t>The reliance on separate systems for eligibility checking indicates that the system shall integrate with existing university systems to retrieve student, course, and enrolment data.</w:t>
+        <w:t>The limited ability to track enrolment status in real time indicates that the system shall provide real-time tracking of enrolment status for students and staff.</w:t>
       </w:r>
     </w:p>
     <w:p>
@@ -6466,6 +6696,26 @@
         <w:rPr>
           <w:rFonts w:ascii="Arial" w:hAnsi="Arial" w:cs="Arial"/>
         </w:rPr>
+        <w:t>The reliance on separate systems for eligibility checking indicates that the system shall integrate with existing university systems to retrieve student, course, and enrolment data.</w:t>
+      </w:r>
+    </w:p>
+    <w:p>
+      <w:pPr>
+        <w:pStyle w:val="ListParagraph"/>
+        <w:numPr>
+          <w:ilvl w:val="0"/>
+          <w:numId w:val="10"/>
+        </w:numPr>
+        <w:spacing w:line="360" w:lineRule="auto"/>
+        <w:jc w:val="both"/>
+        <w:rPr>
+          <w:rFonts w:ascii="Arial" w:hAnsi="Arial" w:cs="Arial"/>
+        </w:rPr>
+      </w:pPr>
+      <w:r>
+        <w:rPr>
+          <w:rFonts w:ascii="Arial" w:hAnsi="Arial" w:cs="Arial"/>
+        </w:rPr>
         <w:lastRenderedPageBreak/>
         <w:t>The lack of a unified system across departments indicates that the system shall support integrated workflows and real-time data sharing between Academic Departments, Academic Registry, and Finance Department</w:t>
       </w:r>
@@ -6516,6 +6766,997 @@
           <w:rFonts w:ascii="Arial" w:hAnsi="Arial" w:cs="Arial"/>
         </w:rPr>
         <w:t>.</w:t>
+      </w:r>
+    </w:p>
+    <w:p>
+      <w:pPr>
+        <w:pStyle w:val="Heading3"/>
+        <w:ind w:left="567"/>
+        <w:jc w:val="both"/>
+        <w:rPr>
+          <w:rFonts w:ascii="Arial" w:hAnsi="Arial" w:cs="Arial"/>
+          <w:b/>
+          <w:bCs/>
+          <w:color w:val="EE0000"/>
+          <w:sz w:val="24"/>
+          <w:szCs w:val="24"/>
+        </w:rPr>
+      </w:pPr>
+      <w:bookmarkStart w:id="16" w:name="_Toc227153826"/>
+      <w:r>
+        <w:rPr>
+          <w:rFonts w:ascii="Arial" w:hAnsi="Arial" w:cs="Arial"/>
+          <w:b/>
+          <w:bCs/>
+          <w:color w:val="EE0000"/>
+          <w:sz w:val="24"/>
+          <w:szCs w:val="24"/>
+        </w:rPr>
+        <w:t>i</w:t>
+      </w:r>
+      <w:r>
+        <w:rPr>
+          <w:rFonts w:ascii="Arial" w:hAnsi="Arial" w:cs="Arial"/>
+          <w:b/>
+          <w:bCs/>
+          <w:color w:val="EE0000"/>
+          <w:sz w:val="24"/>
+          <w:szCs w:val="24"/>
+        </w:rPr>
+        <w:t>v</w:t>
+      </w:r>
+      <w:r>
+        <w:rPr>
+          <w:rFonts w:ascii="Arial" w:hAnsi="Arial" w:cs="Arial"/>
+          <w:b/>
+          <w:bCs/>
+          <w:color w:val="EE0000"/>
+          <w:sz w:val="24"/>
+          <w:szCs w:val="24"/>
+        </w:rPr>
+        <w:t>.</w:t>
+      </w:r>
+      <w:r>
+        <w:rPr>
+          <w:rFonts w:ascii="Arial" w:hAnsi="Arial" w:cs="Arial"/>
+          <w:b/>
+          <w:bCs/>
+          <w:color w:val="EE0000"/>
+          <w:sz w:val="24"/>
+          <w:szCs w:val="24"/>
+        </w:rPr>
+        <w:t xml:space="preserve"> </w:t>
+      </w:r>
+      <w:r>
+        <w:rPr>
+          <w:rFonts w:ascii="Arial" w:hAnsi="Arial" w:cs="Arial"/>
+          <w:b/>
+          <w:bCs/>
+          <w:color w:val="EE0000"/>
+          <w:sz w:val="24"/>
+          <w:szCs w:val="24"/>
+        </w:rPr>
+        <w:t xml:space="preserve">Stakeholder </w:t>
+      </w:r>
+      <w:r>
+        <w:rPr>
+          <w:rFonts w:ascii="Arial" w:hAnsi="Arial" w:cs="Arial"/>
+          <w:b/>
+          <w:bCs/>
+          <w:color w:val="EE0000"/>
+          <w:sz w:val="24"/>
+          <w:szCs w:val="24"/>
+        </w:rPr>
+        <w:t>i</w:t>
+      </w:r>
+      <w:r>
+        <w:rPr>
+          <w:rFonts w:ascii="Arial" w:hAnsi="Arial" w:cs="Arial"/>
+          <w:b/>
+          <w:bCs/>
+          <w:color w:val="EE0000"/>
+          <w:sz w:val="24"/>
+          <w:szCs w:val="24"/>
+        </w:rPr>
+        <w:t>nterview</w:t>
+      </w:r>
+      <w:bookmarkEnd w:id="16"/>
+    </w:p>
+    <w:p>
+      <w:pPr>
+        <w:spacing w:after="0" w:line="360" w:lineRule="auto"/>
+        <w:ind w:left="851"/>
+        <w:jc w:val="both"/>
+        <w:rPr>
+          <w:rFonts w:ascii="Arial" w:hAnsi="Arial" w:cs="Arial"/>
+        </w:rPr>
+      </w:pPr>
+      <w:r>
+        <w:rPr>
+          <w:rFonts w:ascii="Arial" w:hAnsi="Arial" w:cs="Arial"/>
+        </w:rPr>
+        <w:t>Besides the above requirements elicitation methods, stakeholder interviews (simulated) were considered to gather further insights into system administration, security, and technical requirements that are not clearly visible in the current enrolment workflow.</w:t>
+      </w:r>
+    </w:p>
+    <w:p>
+      <w:pPr>
+        <w:spacing w:after="0" w:line="360" w:lineRule="auto"/>
+        <w:ind w:left="851"/>
+        <w:jc w:val="both"/>
+        <w:rPr>
+          <w:rFonts w:ascii="Arial" w:hAnsi="Arial" w:cs="Arial"/>
+        </w:rPr>
+      </w:pPr>
+      <w:r>
+        <w:rPr>
+          <w:rFonts w:ascii="Arial" w:hAnsi="Arial" w:cs="Arial"/>
+        </w:rPr>
+        <w:t xml:space="preserve">The interview was conducted with </w:t>
+      </w:r>
+      <w:r>
+        <w:rPr>
+          <w:rFonts w:ascii="Arial" w:hAnsi="Arial" w:cs="Arial"/>
+        </w:rPr>
+        <w:t>a</w:t>
+      </w:r>
+      <w:r>
+        <w:rPr>
+          <w:rFonts w:ascii="Arial" w:hAnsi="Arial" w:cs="Arial"/>
+        </w:rPr>
+        <w:t xml:space="preserve">cademic </w:t>
+      </w:r>
+      <w:r>
+        <w:rPr>
+          <w:rFonts w:ascii="Arial" w:hAnsi="Arial" w:cs="Arial"/>
+        </w:rPr>
+        <w:t>r</w:t>
+      </w:r>
+      <w:r>
+        <w:rPr>
+          <w:rFonts w:ascii="Arial" w:hAnsi="Arial" w:cs="Arial"/>
+        </w:rPr>
+        <w:t>egistry staff, IT support staff, and system administration personnel involved in the operation of the proposed system.</w:t>
+      </w:r>
+    </w:p>
+    <w:p>
+      <w:pPr>
+        <w:spacing w:after="0" w:line="360" w:lineRule="auto"/>
+        <w:ind w:left="851"/>
+        <w:jc w:val="both"/>
+        <w:rPr>
+          <w:rFonts w:ascii="Arial" w:hAnsi="Arial" w:cs="Arial"/>
+        </w:rPr>
+      </w:pPr>
+      <w:r>
+        <w:rPr>
+          <w:rFonts w:ascii="Arial" w:hAnsi="Arial" w:cs="Arial"/>
+        </w:rPr>
+        <w:t>The following questions and answers were conducted during the interview</w:t>
+      </w:r>
+      <w:r>
+        <w:rPr>
+          <w:rFonts w:ascii="Arial" w:hAnsi="Arial" w:cs="Arial"/>
+        </w:rPr>
+        <w:t>:</w:t>
+      </w:r>
+    </w:p>
+    <w:p>
+      <w:pPr>
+        <w:pStyle w:val="ListParagraph"/>
+        <w:numPr>
+          <w:ilvl w:val="0"/>
+          <w:numId w:val="19"/>
+        </w:numPr>
+        <w:spacing w:after="0" w:line="360" w:lineRule="auto"/>
+        <w:jc w:val="both"/>
+        <w:rPr>
+          <w:rFonts w:ascii="Arial" w:hAnsi="Arial" w:cs="Arial"/>
+        </w:rPr>
+      </w:pPr>
+      <w:r>
+        <w:rPr>
+          <w:rFonts w:ascii="Arial" w:hAnsi="Arial" w:cs="Arial"/>
+          <w:b/>
+          <w:bCs/>
+        </w:rPr>
+        <w:t xml:space="preserve">Academic </w:t>
+      </w:r>
+      <w:r>
+        <w:rPr>
+          <w:rFonts w:ascii="Arial" w:hAnsi="Arial" w:cs="Arial"/>
+          <w:b/>
+          <w:bCs/>
+        </w:rPr>
+        <w:t>r</w:t>
+      </w:r>
+      <w:r>
+        <w:rPr>
+          <w:rFonts w:ascii="Arial" w:hAnsi="Arial" w:cs="Arial"/>
+          <w:b/>
+          <w:bCs/>
+        </w:rPr>
+        <w:t>egistry staff</w:t>
+      </w:r>
+      <w:r>
+        <w:rPr>
+          <w:rFonts w:ascii="Arial" w:hAnsi="Arial" w:cs="Arial"/>
+          <w:b/>
+          <w:bCs/>
+        </w:rPr>
+        <w:t xml:space="preserve"> </w:t>
+      </w:r>
+      <w:r>
+        <w:rPr>
+          <w:rFonts w:ascii="Arial" w:hAnsi="Arial" w:cs="Arial"/>
+          <w:b/>
+          <w:bCs/>
+        </w:rPr>
+        <w:t>interview</w:t>
+      </w:r>
+      <w:r>
+        <w:rPr>
+          <w:rFonts w:ascii="Arial" w:hAnsi="Arial" w:cs="Arial"/>
+          <w:b/>
+          <w:bCs/>
+        </w:rPr>
+        <w:t>:</w:t>
+      </w:r>
+    </w:p>
+    <w:p>
+      <w:pPr>
+        <w:pStyle w:val="ListParagraph"/>
+        <w:numPr>
+          <w:ilvl w:val="1"/>
+          <w:numId w:val="19"/>
+        </w:numPr>
+        <w:spacing w:after="0" w:line="360" w:lineRule="auto"/>
+        <w:jc w:val="both"/>
+        <w:rPr>
+          <w:rFonts w:ascii="Arial" w:hAnsi="Arial" w:cs="Arial"/>
+        </w:rPr>
+      </w:pPr>
+      <w:r>
+        <w:rPr>
+          <w:rFonts w:ascii="Arial" w:hAnsi="Arial" w:cs="Arial"/>
+          <w:b/>
+          <w:bCs/>
+        </w:rPr>
+        <w:t>Question:</w:t>
+      </w:r>
+      <w:r>
+        <w:rPr>
+          <w:rFonts w:ascii="Arial" w:hAnsi="Arial" w:cs="Arial"/>
+        </w:rPr>
+        <w:t xml:space="preserve"> </w:t>
+      </w:r>
+      <w:r>
+        <w:rPr>
+          <w:rFonts w:ascii="Arial" w:hAnsi="Arial" w:cs="Arial"/>
+        </w:rPr>
+        <w:t>How are exceptional enrolment cases handled when students do not meet standard prerequisites?</w:t>
+      </w:r>
+    </w:p>
+    <w:p>
+      <w:pPr>
+        <w:pStyle w:val="ListParagraph"/>
+        <w:spacing w:after="0" w:line="360" w:lineRule="auto"/>
+        <w:ind w:left="2291"/>
+        <w:jc w:val="both"/>
+        <w:rPr>
+          <w:rFonts w:ascii="Arial" w:hAnsi="Arial" w:cs="Arial"/>
+        </w:rPr>
+      </w:pPr>
+      <w:r>
+        <w:rPr>
+          <w:rFonts w:ascii="Arial" w:hAnsi="Arial" w:cs="Arial"/>
+          <w:b/>
+          <w:bCs/>
+        </w:rPr>
+        <w:t>Answer</w:t>
+      </w:r>
+      <w:r>
+        <w:rPr>
+          <w:rFonts w:ascii="Arial" w:hAnsi="Arial" w:cs="Arial"/>
+          <w:b/>
+          <w:bCs/>
+        </w:rPr>
+        <w:t>:</w:t>
+      </w:r>
+      <w:r>
+        <w:rPr>
+          <w:rFonts w:ascii="Arial" w:hAnsi="Arial" w:cs="Arial"/>
+        </w:rPr>
+        <w:t xml:space="preserve"> </w:t>
+      </w:r>
+      <w:r>
+        <w:rPr>
+          <w:rFonts w:ascii="Arial" w:hAnsi="Arial" w:cs="Arial"/>
+        </w:rPr>
+        <w:t>I need to review e</w:t>
+      </w:r>
+      <w:r>
+        <w:rPr>
+          <w:rFonts w:ascii="Arial" w:hAnsi="Arial" w:cs="Arial"/>
+        </w:rPr>
+        <w:t>xceptional enrolment cases. Students who do not meet standard prerequisites may be required to provide evidence of prior learning or equivalent courses. Based on academic judgement and programme requirements, prerequisite overrides or manual approvals may be granted in special circumstances.</w:t>
+      </w:r>
+    </w:p>
+    <w:p>
+      <w:pPr>
+        <w:pStyle w:val="ListParagraph"/>
+        <w:numPr>
+          <w:ilvl w:val="0"/>
+          <w:numId w:val="17"/>
+        </w:numPr>
+        <w:spacing w:after="0" w:line="360" w:lineRule="auto"/>
+        <w:jc w:val="both"/>
+        <w:rPr>
+          <w:rFonts w:ascii="Arial" w:hAnsi="Arial" w:cs="Arial"/>
+          <w:b/>
+          <w:bCs/>
+        </w:rPr>
+      </w:pPr>
+      <w:r>
+        <w:rPr>
+          <w:rFonts w:ascii="Arial" w:hAnsi="Arial" w:cs="Arial"/>
+          <w:b/>
+          <w:bCs/>
+        </w:rPr>
+        <w:t xml:space="preserve">System </w:t>
+      </w:r>
+      <w:r>
+        <w:rPr>
+          <w:rFonts w:ascii="Arial" w:hAnsi="Arial" w:cs="Arial"/>
+          <w:b/>
+          <w:bCs/>
+        </w:rPr>
+        <w:t>a</w:t>
+      </w:r>
+      <w:r>
+        <w:rPr>
+          <w:rFonts w:ascii="Arial" w:hAnsi="Arial" w:cs="Arial"/>
+          <w:b/>
+          <w:bCs/>
+        </w:rPr>
+        <w:t>dministrator</w:t>
+      </w:r>
+      <w:r>
+        <w:rPr>
+          <w:rFonts w:ascii="Arial" w:hAnsi="Arial" w:cs="Arial"/>
+          <w:b/>
+          <w:bCs/>
+        </w:rPr>
+        <w:t xml:space="preserve"> </w:t>
+      </w:r>
+      <w:r>
+        <w:rPr>
+          <w:rFonts w:ascii="Arial" w:hAnsi="Arial" w:cs="Arial"/>
+          <w:b/>
+          <w:bCs/>
+        </w:rPr>
+        <w:t>interview</w:t>
+      </w:r>
+      <w:r>
+        <w:rPr>
+          <w:rFonts w:ascii="Arial" w:hAnsi="Arial" w:cs="Arial"/>
+          <w:b/>
+          <w:bCs/>
+        </w:rPr>
+        <w:t>:</w:t>
+      </w:r>
+    </w:p>
+    <w:p>
+      <w:pPr>
+        <w:pStyle w:val="ListParagraph"/>
+        <w:numPr>
+          <w:ilvl w:val="1"/>
+          <w:numId w:val="17"/>
+        </w:numPr>
+        <w:spacing w:after="0" w:line="360" w:lineRule="auto"/>
+        <w:jc w:val="both"/>
+        <w:rPr>
+          <w:rFonts w:ascii="Arial" w:hAnsi="Arial" w:cs="Arial"/>
+        </w:rPr>
+      </w:pPr>
+      <w:r>
+        <w:rPr>
+          <w:rFonts w:ascii="Arial" w:hAnsi="Arial" w:cs="Arial"/>
+          <w:b/>
+          <w:bCs/>
+        </w:rPr>
+        <w:t>Question</w:t>
+      </w:r>
+      <w:r>
+        <w:rPr>
+          <w:rFonts w:ascii="Arial" w:hAnsi="Arial" w:cs="Arial"/>
+          <w:b/>
+          <w:bCs/>
+        </w:rPr>
+        <w:t>:</w:t>
+      </w:r>
+      <w:r>
+        <w:rPr>
+          <w:rFonts w:ascii="Arial" w:hAnsi="Arial" w:cs="Arial"/>
+        </w:rPr>
+        <w:t xml:space="preserve"> </w:t>
+      </w:r>
+      <w:r>
+        <w:rPr>
+          <w:rFonts w:ascii="Arial" w:hAnsi="Arial" w:cs="Arial"/>
+        </w:rPr>
+        <w:t>What level of control is required for managing user accounts and access permissions across different roles?</w:t>
+      </w:r>
+    </w:p>
+    <w:p>
+      <w:pPr>
+        <w:pStyle w:val="ListParagraph"/>
+        <w:spacing w:after="0" w:line="360" w:lineRule="auto"/>
+        <w:ind w:left="2291"/>
+        <w:jc w:val="both"/>
+        <w:rPr>
+          <w:rFonts w:ascii="Arial" w:hAnsi="Arial" w:cs="Arial"/>
+        </w:rPr>
+      </w:pPr>
+      <w:r>
+        <w:rPr>
+          <w:rFonts w:ascii="Arial" w:hAnsi="Arial" w:cs="Arial"/>
+          <w:b/>
+          <w:bCs/>
+        </w:rPr>
+        <w:lastRenderedPageBreak/>
+        <w:t>Answer:</w:t>
+      </w:r>
+      <w:r>
+        <w:rPr>
+          <w:rFonts w:ascii="Arial" w:hAnsi="Arial" w:cs="Arial"/>
+        </w:rPr>
+        <w:t xml:space="preserve"> User accounts must be managed using role-based access control. Each user type, such as students, </w:t>
+      </w:r>
+      <w:r>
+        <w:rPr>
+          <w:rFonts w:ascii="Arial" w:hAnsi="Arial" w:cs="Arial"/>
+        </w:rPr>
+        <w:t>a</w:t>
+      </w:r>
+      <w:r>
+        <w:rPr>
+          <w:rFonts w:ascii="Arial" w:hAnsi="Arial" w:cs="Arial"/>
+        </w:rPr>
+        <w:t xml:space="preserve">cademic </w:t>
+      </w:r>
+      <w:r>
+        <w:rPr>
+          <w:rFonts w:ascii="Arial" w:hAnsi="Arial" w:cs="Arial"/>
+        </w:rPr>
+        <w:t>r</w:t>
+      </w:r>
+      <w:r>
+        <w:rPr>
+          <w:rFonts w:ascii="Arial" w:hAnsi="Arial" w:cs="Arial"/>
+        </w:rPr>
+        <w:t xml:space="preserve">egistry staff, </w:t>
+      </w:r>
+      <w:r>
+        <w:rPr>
+          <w:rFonts w:ascii="Arial" w:hAnsi="Arial" w:cs="Arial"/>
+        </w:rPr>
+        <w:t>a</w:t>
+      </w:r>
+      <w:r>
+        <w:rPr>
+          <w:rFonts w:ascii="Arial" w:hAnsi="Arial" w:cs="Arial"/>
+        </w:rPr>
+        <w:t xml:space="preserve">cademic </w:t>
+      </w:r>
+      <w:r>
+        <w:rPr>
+          <w:rFonts w:ascii="Arial" w:hAnsi="Arial" w:cs="Arial"/>
+        </w:rPr>
+        <w:t>d</w:t>
+      </w:r>
+      <w:r>
+        <w:rPr>
+          <w:rFonts w:ascii="Arial" w:hAnsi="Arial" w:cs="Arial"/>
+        </w:rPr>
+        <w:t xml:space="preserve">epartment staff, </w:t>
+      </w:r>
+      <w:r>
+        <w:rPr>
+          <w:rFonts w:ascii="Arial" w:hAnsi="Arial" w:cs="Arial"/>
+        </w:rPr>
+        <w:t>f</w:t>
+      </w:r>
+      <w:r>
+        <w:rPr>
+          <w:rFonts w:ascii="Arial" w:hAnsi="Arial" w:cs="Arial"/>
+        </w:rPr>
+        <w:t>inance staff, IT staff, and system administrators, is assigned specific permissions based on their responsibilities. This ensures users can only access functions relevant to their role.</w:t>
+      </w:r>
+    </w:p>
+    <w:p>
+      <w:pPr>
+        <w:pStyle w:val="ListParagraph"/>
+        <w:numPr>
+          <w:ilvl w:val="1"/>
+          <w:numId w:val="17"/>
+        </w:numPr>
+        <w:spacing w:after="0" w:line="360" w:lineRule="auto"/>
+        <w:jc w:val="both"/>
+        <w:rPr>
+          <w:rFonts w:ascii="Arial" w:hAnsi="Arial" w:cs="Arial"/>
+        </w:rPr>
+      </w:pPr>
+      <w:r>
+        <w:rPr>
+          <w:rFonts w:ascii="Arial" w:hAnsi="Arial" w:cs="Arial"/>
+          <w:b/>
+          <w:bCs/>
+        </w:rPr>
+        <w:t>Question:</w:t>
+      </w:r>
+      <w:r>
+        <w:rPr>
+          <w:rFonts w:ascii="Arial" w:hAnsi="Arial" w:cs="Arial"/>
+        </w:rPr>
+        <w:t xml:space="preserve"> </w:t>
+      </w:r>
+      <w:r>
+        <w:rPr>
+          <w:rFonts w:ascii="Arial" w:hAnsi="Arial" w:cs="Arial"/>
+        </w:rPr>
+        <w:t>What security measures are required to ensure system activity can be tracked and audited?</w:t>
+      </w:r>
+    </w:p>
+    <w:p>
+      <w:pPr>
+        <w:pStyle w:val="ListParagraph"/>
+        <w:spacing w:after="0" w:line="360" w:lineRule="auto"/>
+        <w:ind w:left="2291"/>
+        <w:jc w:val="both"/>
+        <w:rPr>
+          <w:rFonts w:ascii="Arial" w:hAnsi="Arial" w:cs="Arial"/>
+        </w:rPr>
+      </w:pPr>
+      <w:r>
+        <w:rPr>
+          <w:rFonts w:ascii="Arial" w:hAnsi="Arial" w:cs="Arial"/>
+          <w:b/>
+          <w:bCs/>
+        </w:rPr>
+        <w:t>Answer:</w:t>
+      </w:r>
+      <w:r>
+        <w:rPr>
+          <w:rFonts w:ascii="Arial" w:hAnsi="Arial" w:cs="Arial"/>
+        </w:rPr>
+        <w:t xml:space="preserve"> The system should maintain audit logs that record all important user activities such as enrolment actions, approvals, course updates, and system configuration changes. These logs support security monitoring, accountability, and troubleshooting when required.</w:t>
+      </w:r>
+    </w:p>
+    <w:p>
+      <w:pPr>
+        <w:pStyle w:val="ListParagraph"/>
+        <w:numPr>
+          <w:ilvl w:val="1"/>
+          <w:numId w:val="17"/>
+        </w:numPr>
+        <w:spacing w:after="0" w:line="360" w:lineRule="auto"/>
+        <w:jc w:val="both"/>
+        <w:rPr>
+          <w:rFonts w:ascii="Arial" w:hAnsi="Arial" w:cs="Arial"/>
+        </w:rPr>
+      </w:pPr>
+      <w:r>
+        <w:rPr>
+          <w:rFonts w:ascii="Arial" w:hAnsi="Arial" w:cs="Arial"/>
+          <w:b/>
+          <w:bCs/>
+        </w:rPr>
+        <w:t>Question:</w:t>
+      </w:r>
+      <w:r>
+        <w:rPr>
+          <w:rFonts w:ascii="Arial" w:hAnsi="Arial" w:cs="Arial"/>
+        </w:rPr>
+        <w:t xml:space="preserve"> </w:t>
+      </w:r>
+      <w:r>
+        <w:rPr>
+          <w:rFonts w:ascii="Arial" w:hAnsi="Arial" w:cs="Arial"/>
+        </w:rPr>
+        <w:t>How should the system support configuration of academic rules such as enrolment periods and course limits?</w:t>
+      </w:r>
+    </w:p>
+    <w:p>
+      <w:pPr>
+        <w:pStyle w:val="ListParagraph"/>
+        <w:spacing w:after="0" w:line="360" w:lineRule="auto"/>
+        <w:ind w:left="2291"/>
+        <w:jc w:val="both"/>
+        <w:rPr>
+          <w:rFonts w:ascii="Arial" w:hAnsi="Arial" w:cs="Arial"/>
+        </w:rPr>
+      </w:pPr>
+      <w:r>
+        <w:rPr>
+          <w:rFonts w:ascii="Arial" w:hAnsi="Arial" w:cs="Arial"/>
+          <w:b/>
+          <w:bCs/>
+        </w:rPr>
+        <w:t>Answer:</w:t>
+      </w:r>
+      <w:r>
+        <w:rPr>
+          <w:rFonts w:ascii="Arial" w:hAnsi="Arial" w:cs="Arial"/>
+        </w:rPr>
+        <w:t xml:space="preserve"> The system should allow system administrators to configure academic rules such as enrolment periods, course capacity limits, prerequisite rules, and enrolment deadlines. These settings ensure the system can be adjusted for different academic terms without requiring major system changes.</w:t>
+      </w:r>
+    </w:p>
+    <w:p>
+      <w:pPr>
+        <w:pStyle w:val="ListParagraph"/>
+        <w:numPr>
+          <w:ilvl w:val="0"/>
+          <w:numId w:val="17"/>
+        </w:numPr>
+        <w:spacing w:after="0" w:line="360" w:lineRule="auto"/>
+        <w:jc w:val="both"/>
+        <w:rPr>
+          <w:rFonts w:ascii="Arial" w:hAnsi="Arial" w:cs="Arial"/>
+          <w:b/>
+          <w:bCs/>
+        </w:rPr>
+      </w:pPr>
+      <w:r>
+        <w:rPr>
+          <w:rFonts w:ascii="Arial" w:hAnsi="Arial" w:cs="Arial"/>
+          <w:b/>
+          <w:bCs/>
+        </w:rPr>
+        <w:t xml:space="preserve">IT </w:t>
+      </w:r>
+      <w:r>
+        <w:rPr>
+          <w:rFonts w:ascii="Arial" w:hAnsi="Arial" w:cs="Arial"/>
+          <w:b/>
+          <w:bCs/>
+        </w:rPr>
+        <w:t xml:space="preserve">staff </w:t>
+      </w:r>
+      <w:r>
+        <w:rPr>
+          <w:rFonts w:ascii="Arial" w:hAnsi="Arial" w:cs="Arial"/>
+          <w:b/>
+          <w:bCs/>
+        </w:rPr>
+        <w:t>interview:</w:t>
+      </w:r>
+    </w:p>
+    <w:p>
+      <w:pPr>
+        <w:pStyle w:val="ListParagraph"/>
+        <w:numPr>
+          <w:ilvl w:val="1"/>
+          <w:numId w:val="17"/>
+        </w:numPr>
+        <w:spacing w:after="0" w:line="360" w:lineRule="auto"/>
+        <w:jc w:val="both"/>
+        <w:rPr>
+          <w:rFonts w:ascii="Arial" w:hAnsi="Arial" w:cs="Arial"/>
+        </w:rPr>
+      </w:pPr>
+      <w:r>
+        <w:rPr>
+          <w:rFonts w:ascii="Arial" w:hAnsi="Arial" w:cs="Arial"/>
+          <w:b/>
+          <w:bCs/>
+        </w:rPr>
+        <w:t>Question:</w:t>
+      </w:r>
+      <w:r>
+        <w:rPr>
+          <w:rFonts w:ascii="Arial" w:hAnsi="Arial" w:cs="Arial"/>
+        </w:rPr>
+        <w:t xml:space="preserve"> </w:t>
+      </w:r>
+      <w:r>
+        <w:rPr>
+          <w:rFonts w:ascii="Arial" w:hAnsi="Arial" w:cs="Arial"/>
+        </w:rPr>
+        <w:t xml:space="preserve">What technical responsibilities are required from </w:t>
+      </w:r>
+      <w:r>
+        <w:rPr>
+          <w:rFonts w:ascii="Arial" w:hAnsi="Arial" w:cs="Arial"/>
+        </w:rPr>
+        <w:t>you</w:t>
+      </w:r>
+      <w:r>
+        <w:rPr>
+          <w:rFonts w:ascii="Arial" w:hAnsi="Arial" w:cs="Arial"/>
+        </w:rPr>
+        <w:t xml:space="preserve"> to maintain system availability and integration with external systems?</w:t>
+      </w:r>
+    </w:p>
+    <w:p>
+      <w:pPr>
+        <w:pStyle w:val="ListParagraph"/>
+        <w:spacing w:after="0" w:line="360" w:lineRule="auto"/>
+        <w:ind w:left="2291"/>
+        <w:jc w:val="both"/>
+        <w:rPr>
+          <w:rFonts w:ascii="Arial" w:hAnsi="Arial" w:cs="Arial"/>
+        </w:rPr>
+      </w:pPr>
+      <w:r>
+        <w:rPr>
+          <w:rFonts w:ascii="Arial" w:hAnsi="Arial" w:cs="Arial"/>
+          <w:b/>
+          <w:bCs/>
+        </w:rPr>
+        <w:t>Answer:</w:t>
+      </w:r>
+      <w:r>
+        <w:rPr>
+          <w:rFonts w:ascii="Arial" w:hAnsi="Arial" w:cs="Arial"/>
+        </w:rPr>
+        <w:t xml:space="preserve"> </w:t>
+      </w:r>
+      <w:r>
+        <w:rPr>
+          <w:rFonts w:ascii="Arial" w:hAnsi="Arial" w:cs="Arial"/>
+        </w:rPr>
+        <w:t>I am</w:t>
+      </w:r>
+      <w:r>
+        <w:rPr>
+          <w:rFonts w:ascii="Arial" w:hAnsi="Arial" w:cs="Arial"/>
+        </w:rPr>
+        <w:t xml:space="preserve"> responsible for maintaining system uptime, performance, and database integrity. </w:t>
+      </w:r>
+      <w:r>
+        <w:rPr>
+          <w:rFonts w:ascii="Arial" w:hAnsi="Arial" w:cs="Arial"/>
+        </w:rPr>
+        <w:t>I</w:t>
+      </w:r>
+      <w:r>
+        <w:rPr>
+          <w:rFonts w:ascii="Arial" w:hAnsi="Arial" w:cs="Arial"/>
+        </w:rPr>
+        <w:t xml:space="preserve"> also manage integration with the university’s central database and external systems to ensure accurate and consistent data exchange across enrolment, course management, and payment services.</w:t>
+      </w:r>
+    </w:p>
+    <w:p>
+      <w:pPr>
+        <w:spacing w:after="0" w:line="360" w:lineRule="auto"/>
+        <w:ind w:left="851"/>
+        <w:jc w:val="both"/>
+        <w:rPr>
+          <w:rFonts w:ascii="Arial" w:hAnsi="Arial" w:cs="Arial"/>
+        </w:rPr>
+      </w:pPr>
+      <w:r>
+        <w:rPr>
+          <w:rFonts w:ascii="Arial" w:hAnsi="Arial" w:cs="Arial"/>
+        </w:rPr>
+        <w:t>From the responses, several system requirements were identified</w:t>
+      </w:r>
+      <w:r>
+        <w:rPr>
+          <w:rFonts w:ascii="Arial" w:hAnsi="Arial" w:cs="Arial"/>
+        </w:rPr>
+        <w:t>:</w:t>
+      </w:r>
+    </w:p>
+    <w:p>
+      <w:pPr>
+        <w:pStyle w:val="ListParagraph"/>
+        <w:numPr>
+          <w:ilvl w:val="0"/>
+          <w:numId w:val="18"/>
+        </w:numPr>
+        <w:spacing w:after="0" w:line="360" w:lineRule="auto"/>
+        <w:jc w:val="both"/>
+        <w:rPr>
+          <w:rFonts w:ascii="Arial" w:hAnsi="Arial" w:cs="Arial"/>
+        </w:rPr>
+      </w:pPr>
+      <w:r>
+        <w:rPr>
+          <w:rFonts w:ascii="Arial" w:hAnsi="Arial" w:cs="Arial"/>
+        </w:rPr>
+        <w:t>The n</w:t>
+      </w:r>
+      <w:r>
+        <w:rPr>
+          <w:rFonts w:ascii="Arial" w:hAnsi="Arial" w:cs="Arial"/>
+        </w:rPr>
+        <w:t xml:space="preserve">eed to handle exceptional academic cases indicates that the system shall allow </w:t>
+      </w:r>
+      <w:r>
+        <w:rPr>
+          <w:rFonts w:ascii="Arial" w:hAnsi="Arial" w:cs="Arial"/>
+        </w:rPr>
+        <w:t>a</w:t>
+      </w:r>
+      <w:r>
+        <w:rPr>
+          <w:rFonts w:ascii="Arial" w:hAnsi="Arial" w:cs="Arial"/>
+        </w:rPr>
+        <w:t xml:space="preserve">cademic </w:t>
+      </w:r>
+      <w:r>
+        <w:rPr>
+          <w:rFonts w:ascii="Arial" w:hAnsi="Arial" w:cs="Arial"/>
+        </w:rPr>
+        <w:t>r</w:t>
+      </w:r>
+      <w:r>
+        <w:rPr>
+          <w:rFonts w:ascii="Arial" w:hAnsi="Arial" w:cs="Arial"/>
+        </w:rPr>
+        <w:t xml:space="preserve">egistry staff </w:t>
+      </w:r>
+      <w:r>
+        <w:rPr>
+          <w:rFonts w:ascii="Arial" w:hAnsi="Arial" w:cs="Arial"/>
+        </w:rPr>
+        <w:t xml:space="preserve">to grant prerequisite overrides or </w:t>
+      </w:r>
+      <w:r>
+        <w:rPr>
+          <w:rFonts w:ascii="Arial" w:hAnsi="Arial" w:cs="Arial"/>
+        </w:rPr>
+        <w:lastRenderedPageBreak/>
+        <w:t>approve enrolment requests for students with prior learning or special circumstances.</w:t>
+      </w:r>
+    </w:p>
+    <w:p>
+      <w:pPr>
+        <w:pStyle w:val="ListParagraph"/>
+        <w:numPr>
+          <w:ilvl w:val="0"/>
+          <w:numId w:val="18"/>
+        </w:numPr>
+        <w:spacing w:after="0" w:line="360" w:lineRule="auto"/>
+        <w:jc w:val="both"/>
+        <w:rPr>
+          <w:rFonts w:ascii="Arial" w:hAnsi="Arial" w:cs="Arial"/>
+        </w:rPr>
+      </w:pPr>
+      <w:r>
+        <w:rPr>
+          <w:rFonts w:ascii="Arial" w:hAnsi="Arial" w:cs="Arial"/>
+        </w:rPr>
+        <w:t xml:space="preserve">The requirement for secure access to system functions indicates that the system shall support role-based access control for different user types, including students, academic staff, </w:t>
+      </w:r>
+      <w:r>
+        <w:rPr>
+          <w:rFonts w:ascii="Arial" w:hAnsi="Arial" w:cs="Arial"/>
+        </w:rPr>
+        <w:t xml:space="preserve">academic </w:t>
+      </w:r>
+      <w:r>
+        <w:rPr>
+          <w:rFonts w:ascii="Arial" w:hAnsi="Arial" w:cs="Arial"/>
+        </w:rPr>
+        <w:t>r</w:t>
+      </w:r>
+      <w:r>
+        <w:rPr>
+          <w:rFonts w:ascii="Arial" w:hAnsi="Arial" w:cs="Arial"/>
+        </w:rPr>
+        <w:t>egistry staff</w:t>
+      </w:r>
+      <w:r>
+        <w:rPr>
+          <w:rFonts w:ascii="Arial" w:hAnsi="Arial" w:cs="Arial"/>
+        </w:rPr>
+        <w:t>,</w:t>
+      </w:r>
+      <w:r>
+        <w:rPr>
+          <w:rFonts w:ascii="Arial" w:hAnsi="Arial" w:cs="Arial"/>
+        </w:rPr>
+        <w:t xml:space="preserve"> </w:t>
+      </w:r>
+      <w:r>
+        <w:rPr>
+          <w:rFonts w:ascii="Arial" w:hAnsi="Arial" w:cs="Arial"/>
+        </w:rPr>
+        <w:t>finance staff, IT staff, and system administrators.</w:t>
+      </w:r>
+    </w:p>
+    <w:p>
+      <w:pPr>
+        <w:pStyle w:val="ListParagraph"/>
+        <w:numPr>
+          <w:ilvl w:val="0"/>
+          <w:numId w:val="18"/>
+        </w:numPr>
+        <w:spacing w:after="0" w:line="360" w:lineRule="auto"/>
+        <w:jc w:val="both"/>
+        <w:rPr>
+          <w:rFonts w:ascii="Arial" w:hAnsi="Arial" w:cs="Arial"/>
+        </w:rPr>
+      </w:pPr>
+      <w:r>
+        <w:rPr>
+          <w:rFonts w:ascii="Arial" w:hAnsi="Arial" w:cs="Arial"/>
+        </w:rPr>
+        <w:t>The need for security monitoring and accountability indicates that the system shall maintain audit logs of user activities for tracking system usage and supporting security compliance.</w:t>
+      </w:r>
+    </w:p>
+    <w:p>
+      <w:pPr>
+        <w:pStyle w:val="ListParagraph"/>
+        <w:numPr>
+          <w:ilvl w:val="0"/>
+          <w:numId w:val="18"/>
+        </w:numPr>
+        <w:spacing w:after="0" w:line="360" w:lineRule="auto"/>
+        <w:jc w:val="both"/>
+        <w:rPr>
+          <w:rFonts w:ascii="Arial" w:hAnsi="Arial" w:cs="Arial"/>
+        </w:rPr>
+      </w:pPr>
+      <w:r>
+        <w:rPr>
+          <w:rFonts w:ascii="Arial" w:hAnsi="Arial" w:cs="Arial"/>
+        </w:rPr>
+        <w:t>The requirement for system stability and operational support indicates that IT staff shall be able to monitor system performance, maintain system uptime, and resolve technical issues.</w:t>
+      </w:r>
+    </w:p>
+    <w:p>
+      <w:pPr>
+        <w:pStyle w:val="ListParagraph"/>
+        <w:numPr>
+          <w:ilvl w:val="0"/>
+          <w:numId w:val="18"/>
+        </w:numPr>
+        <w:spacing w:after="0" w:line="360" w:lineRule="auto"/>
+        <w:jc w:val="both"/>
+        <w:rPr>
+          <w:rFonts w:ascii="Arial" w:hAnsi="Arial" w:cs="Arial"/>
+        </w:rPr>
+      </w:pPr>
+      <w:r>
+        <w:rPr>
+          <w:rFonts w:ascii="Arial" w:hAnsi="Arial" w:cs="Arial"/>
+        </w:rPr>
+        <w:t>The need for flexible system configuration indicates that system administrators shall be able to configure system-wide settings such as enrolment periods, course capacity limits, and enrolment rules.</w:t>
+      </w:r>
+    </w:p>
+    <w:p>
+      <w:pPr>
+        <w:pStyle w:val="ListParagraph"/>
+        <w:numPr>
+          <w:ilvl w:val="0"/>
+          <w:numId w:val="18"/>
+        </w:numPr>
+        <w:spacing w:after="0" w:line="360" w:lineRule="auto"/>
+        <w:jc w:val="both"/>
+        <w:rPr>
+          <w:rFonts w:ascii="Arial" w:hAnsi="Arial" w:cs="Arial"/>
+        </w:rPr>
+      </w:pPr>
+      <w:r>
+        <w:rPr>
+          <w:rFonts w:ascii="Arial" w:hAnsi="Arial" w:cs="Arial"/>
+        </w:rPr>
+        <w:t xml:space="preserve">The requirement for integration management indicates that IT staff shall manage integration between the university’s central database and external systems, </w:t>
+      </w:r>
+      <w:r>
+        <w:rPr>
+          <w:rFonts w:ascii="Arial" w:hAnsi="Arial" w:cs="Arial"/>
+        </w:rPr>
+        <w:t>such as payment services and course information systems</w:t>
+      </w:r>
+      <w:r>
+        <w:rPr>
+          <w:rFonts w:ascii="Arial" w:hAnsi="Arial" w:cs="Arial"/>
+        </w:rPr>
+        <w:t>, to ensure accurate data exchange.</w:t>
       </w:r>
     </w:p>
     <w:p>
@@ -6533,7 +7774,7 @@
           <w:szCs w:val="28"/>
         </w:rPr>
       </w:pPr>
-      <w:bookmarkStart w:id="16" w:name="_Toc227105556"/>
+      <w:bookmarkStart w:id="17" w:name="_Toc227153827"/>
       <w:r>
         <w:rPr>
           <w:rFonts w:ascii="Arial" w:hAnsi="Arial" w:cs="Arial"/>
@@ -6587,7 +7828,7 @@
           <w:sz w:val="28"/>
           <w:szCs w:val="28"/>
         </w:rPr>
-        <w:t>User r</w:t>
+        <w:t xml:space="preserve">User </w:t>
       </w:r>
       <w:r>
         <w:rPr>
@@ -6598,24 +7839,114 @@
           <w:sz w:val="28"/>
           <w:szCs w:val="28"/>
         </w:rPr>
+        <w:t xml:space="preserve">and system </w:t>
+      </w:r>
+      <w:r>
+        <w:rPr>
+          <w:rFonts w:ascii="Arial" w:hAnsi="Arial" w:cs="Arial"/>
+          <w:b/>
+          <w:bCs/>
+          <w:color w:val="EE0000"/>
+          <w:sz w:val="28"/>
+          <w:szCs w:val="28"/>
+        </w:rPr>
+        <w:t>r</w:t>
+      </w:r>
+      <w:r>
+        <w:rPr>
+          <w:rFonts w:ascii="Arial" w:hAnsi="Arial" w:cs="Arial"/>
+          <w:b/>
+          <w:bCs/>
+          <w:color w:val="EE0000"/>
+          <w:sz w:val="28"/>
+          <w:szCs w:val="28"/>
+        </w:rPr>
         <w:t>equirements</w:t>
       </w:r>
-      <w:bookmarkEnd w:id="16"/>
-    </w:p>
-    <w:p>
-      <w:pPr>
-        <w:spacing w:line="360" w:lineRule="auto"/>
+      <w:bookmarkEnd w:id="17"/>
+    </w:p>
+    <w:p>
+      <w:pPr>
+        <w:pStyle w:val="Heading3"/>
         <w:ind w:left="567"/>
         <w:jc w:val="both"/>
         <w:rPr>
           <w:rFonts w:ascii="Arial" w:hAnsi="Arial" w:cs="Arial"/>
-        </w:rPr>
-      </w:pPr>
-      <w:r>
-        <w:rPr>
-          <w:rFonts w:ascii="Arial" w:hAnsi="Arial" w:cs="Arial"/>
-        </w:rPr>
-        <w:t>Based on the derived requirements from the problem statement analysis, existing document analysis, and observation of the existing system, the user requirements that describe what each user needs to do with the system are identified as follows</w:t>
+          <w:b/>
+          <w:bCs/>
+          <w:color w:val="EE0000"/>
+          <w:sz w:val="24"/>
+          <w:szCs w:val="24"/>
+        </w:rPr>
+      </w:pPr>
+      <w:bookmarkStart w:id="18" w:name="_Toc227153828"/>
+      <w:r>
+        <w:rPr>
+          <w:rFonts w:ascii="Arial" w:hAnsi="Arial" w:cs="Arial"/>
+          <w:b/>
+          <w:bCs/>
+          <w:color w:val="EE0000"/>
+          <w:sz w:val="24"/>
+          <w:szCs w:val="24"/>
+        </w:rPr>
+        <w:t>i.</w:t>
+      </w:r>
+      <w:r>
+        <w:rPr>
+          <w:rFonts w:ascii="Arial" w:hAnsi="Arial" w:cs="Arial"/>
+          <w:b/>
+          <w:bCs/>
+          <w:color w:val="EE0000"/>
+          <w:sz w:val="24"/>
+          <w:szCs w:val="24"/>
+        </w:rPr>
+        <w:t xml:space="preserve"> </w:t>
+      </w:r>
+      <w:r>
+        <w:rPr>
+          <w:rFonts w:ascii="Arial" w:hAnsi="Arial" w:cs="Arial"/>
+          <w:b/>
+          <w:bCs/>
+          <w:color w:val="EE0000"/>
+          <w:sz w:val="24"/>
+          <w:szCs w:val="24"/>
+        </w:rPr>
+        <w:t>User requirements</w:t>
+      </w:r>
+      <w:bookmarkEnd w:id="18"/>
+    </w:p>
+    <w:p>
+      <w:pPr>
+        <w:spacing w:line="360" w:lineRule="auto"/>
+        <w:ind w:left="851"/>
+        <w:jc w:val="both"/>
+        <w:rPr>
+          <w:rFonts w:ascii="Arial" w:hAnsi="Arial" w:cs="Arial"/>
+        </w:rPr>
+      </w:pPr>
+      <w:r>
+        <w:rPr>
+          <w:rFonts w:ascii="Arial" w:hAnsi="Arial" w:cs="Arial"/>
+        </w:rPr>
+        <w:t xml:space="preserve">Based on </w:t>
+      </w:r>
+      <w:r>
+        <w:rPr>
+          <w:rFonts w:ascii="Arial" w:hAnsi="Arial" w:cs="Arial"/>
+        </w:rPr>
+        <w:t>the above requirements elicitation methods</w:t>
+      </w:r>
+      <w:r>
+        <w:rPr>
+          <w:rFonts w:ascii="Arial" w:hAnsi="Arial" w:cs="Arial"/>
+        </w:rPr>
+        <w:t xml:space="preserve">, </w:t>
+      </w:r>
+      <w:r>
+        <w:rPr>
+          <w:rFonts w:ascii="Arial" w:hAnsi="Arial" w:cs="Arial"/>
+        </w:rPr>
+        <w:t>the user requirements that describe what each user needs to do with the system are identified as follows</w:t>
       </w:r>
       <w:r>
         <w:rPr>
@@ -6632,6 +7963,7 @@
           <w:numId w:val="16"/>
         </w:numPr>
         <w:spacing w:line="360" w:lineRule="auto"/>
+        <w:ind w:left="1560"/>
         <w:jc w:val="both"/>
         <w:rPr>
           <w:rFonts w:ascii="Arial" w:hAnsi="Arial" w:cs="Arial"/>
@@ -6652,6 +7984,7 @@
           <w:numId w:val="16"/>
         </w:numPr>
         <w:spacing w:line="360" w:lineRule="auto"/>
+        <w:ind w:left="2127"/>
         <w:jc w:val="both"/>
         <w:rPr>
           <w:rFonts w:ascii="Arial" w:hAnsi="Arial" w:cs="Arial"/>
@@ -6672,6 +8005,7 @@
           <w:numId w:val="16"/>
         </w:numPr>
         <w:spacing w:line="360" w:lineRule="auto"/>
+        <w:ind w:left="2127"/>
         <w:jc w:val="both"/>
         <w:rPr>
           <w:rFonts w:ascii="Arial" w:hAnsi="Arial" w:cs="Arial"/>
@@ -6692,6 +8026,7 @@
           <w:numId w:val="16"/>
         </w:numPr>
         <w:spacing w:line="360" w:lineRule="auto"/>
+        <w:ind w:left="2127"/>
         <w:jc w:val="both"/>
         <w:rPr>
           <w:rFonts w:ascii="Arial" w:hAnsi="Arial" w:cs="Arial"/>
@@ -6712,6 +8047,7 @@
           <w:numId w:val="16"/>
         </w:numPr>
         <w:spacing w:line="360" w:lineRule="auto"/>
+        <w:ind w:left="2127"/>
         <w:jc w:val="both"/>
         <w:rPr>
           <w:rFonts w:ascii="Arial" w:hAnsi="Arial" w:cs="Arial"/>
@@ -6732,15 +8068,17 @@
           <w:numId w:val="16"/>
         </w:numPr>
         <w:spacing w:line="360" w:lineRule="auto"/>
-        <w:jc w:val="both"/>
-        <w:rPr>
-          <w:rFonts w:ascii="Arial" w:hAnsi="Arial" w:cs="Arial"/>
-        </w:rPr>
-      </w:pPr>
-      <w:r>
-        <w:rPr>
-          <w:rFonts w:ascii="Arial" w:hAnsi="Arial" w:cs="Arial"/>
-        </w:rPr>
+        <w:ind w:left="2127"/>
+        <w:jc w:val="both"/>
+        <w:rPr>
+          <w:rFonts w:ascii="Arial" w:hAnsi="Arial" w:cs="Arial"/>
+        </w:rPr>
+      </w:pPr>
+      <w:r>
+        <w:rPr>
+          <w:rFonts w:ascii="Arial" w:hAnsi="Arial" w:cs="Arial"/>
+        </w:rPr>
+        <w:lastRenderedPageBreak/>
         <w:t>Receive notifications or feedback when enrolment issues occur, such as timetable clashes, missing prerequisites, or full courses.</w:t>
       </w:r>
     </w:p>
@@ -6752,6 +8090,7 @@
           <w:numId w:val="16"/>
         </w:numPr>
         <w:spacing w:line="360" w:lineRule="auto"/>
+        <w:ind w:left="2127"/>
         <w:jc w:val="both"/>
         <w:rPr>
           <w:rFonts w:ascii="Arial" w:hAnsi="Arial" w:cs="Arial"/>
@@ -6772,6 +8111,7 @@
           <w:numId w:val="16"/>
         </w:numPr>
         <w:spacing w:line="360" w:lineRule="auto"/>
+        <w:ind w:left="2127"/>
         <w:jc w:val="both"/>
         <w:rPr>
           <w:rFonts w:ascii="Arial" w:hAnsi="Arial" w:cs="Arial"/>
@@ -6782,6 +8122,39 @@
           <w:rFonts w:ascii="Arial" w:hAnsi="Arial" w:cs="Arial"/>
         </w:rPr>
         <w:t>Track the status of their enrolment in real time.</w:t>
+      </w:r>
+    </w:p>
+    <w:p>
+      <w:pPr>
+        <w:pStyle w:val="ListParagraph"/>
+        <w:numPr>
+          <w:ilvl w:val="0"/>
+          <w:numId w:val="16"/>
+        </w:numPr>
+        <w:spacing w:line="360" w:lineRule="auto"/>
+        <w:ind w:left="1560"/>
+        <w:jc w:val="both"/>
+        <w:rPr>
+          <w:rFonts w:ascii="Arial" w:hAnsi="Arial" w:cs="Arial"/>
+        </w:rPr>
+      </w:pPr>
+      <w:r>
+        <w:rPr>
+          <w:rFonts w:ascii="Arial" w:hAnsi="Arial" w:cs="Arial"/>
+        </w:rPr>
+        <w:t xml:space="preserve">Academic </w:t>
+      </w:r>
+      <w:r>
+        <w:rPr>
+          <w:rFonts w:ascii="Arial" w:hAnsi="Arial" w:cs="Arial"/>
+        </w:rPr>
+        <w:t>d</w:t>
+      </w:r>
+      <w:r>
+        <w:rPr>
+          <w:rFonts w:ascii="Arial" w:hAnsi="Arial" w:cs="Arial"/>
+        </w:rPr>
+        <w:t>epartment staff should be able to:</w:t>
       </w:r>
     </w:p>
     <w:p>
@@ -6792,16 +8165,56 @@
           <w:numId w:val="16"/>
         </w:numPr>
         <w:spacing w:line="360" w:lineRule="auto"/>
-        <w:jc w:val="both"/>
-        <w:rPr>
-          <w:rFonts w:ascii="Arial" w:hAnsi="Arial" w:cs="Arial"/>
-        </w:rPr>
-      </w:pPr>
-      <w:r>
-        <w:rPr>
-          <w:rFonts w:ascii="Arial" w:hAnsi="Arial" w:cs="Arial"/>
-        </w:rPr>
-        <w:t>Make payments through an external payment system and have their payment status reflected in the system.</w:t>
+        <w:ind w:left="2127"/>
+        <w:jc w:val="both"/>
+        <w:rPr>
+          <w:rFonts w:ascii="Arial" w:hAnsi="Arial" w:cs="Arial"/>
+        </w:rPr>
+      </w:pPr>
+      <w:r>
+        <w:rPr>
+          <w:rFonts w:ascii="Arial" w:hAnsi="Arial" w:cs="Arial"/>
+        </w:rPr>
+        <w:t xml:space="preserve">View and update course information, including course descriptions, prerequisites, </w:t>
+      </w:r>
+      <w:r>
+        <w:rPr>
+          <w:rFonts w:ascii="Arial" w:hAnsi="Arial" w:cs="Arial"/>
+        </w:rPr>
+        <w:t>co-requisites</w:t>
+      </w:r>
+      <w:r>
+        <w:rPr>
+          <w:rFonts w:ascii="Arial" w:hAnsi="Arial" w:cs="Arial"/>
+        </w:rPr>
+        <w:t xml:space="preserve">, </w:t>
+      </w:r>
+      <w:r>
+        <w:rPr>
+          <w:rFonts w:ascii="Arial" w:hAnsi="Arial" w:cs="Arial"/>
+        </w:rPr>
+        <w:t>capacity limits, and timetable details.</w:t>
+      </w:r>
+    </w:p>
+    <w:p>
+      <w:pPr>
+        <w:pStyle w:val="ListParagraph"/>
+        <w:numPr>
+          <w:ilvl w:val="1"/>
+          <w:numId w:val="16"/>
+        </w:numPr>
+        <w:spacing w:line="360" w:lineRule="auto"/>
+        <w:ind w:left="2127"/>
+        <w:jc w:val="both"/>
+        <w:rPr>
+          <w:rFonts w:ascii="Arial" w:hAnsi="Arial" w:cs="Arial"/>
+        </w:rPr>
+      </w:pPr>
+      <w:r>
+        <w:rPr>
+          <w:rFonts w:ascii="Arial" w:hAnsi="Arial" w:cs="Arial"/>
+        </w:rPr>
+        <w:t>Ensure course information is accurate and up to date through integration with existing systems.</w:t>
       </w:r>
     </w:p>
     <w:p>
@@ -6812,6 +8225,7 @@
           <w:numId w:val="16"/>
         </w:numPr>
         <w:spacing w:line="360" w:lineRule="auto"/>
+        <w:ind w:left="1560"/>
         <w:jc w:val="both"/>
         <w:rPr>
           <w:rFonts w:ascii="Arial" w:hAnsi="Arial" w:cs="Arial"/>
@@ -6827,13 +8241,13 @@
         <w:rPr>
           <w:rFonts w:ascii="Arial" w:hAnsi="Arial" w:cs="Arial"/>
         </w:rPr>
-        <w:t>d</w:t>
-      </w:r>
-      <w:r>
-        <w:rPr>
-          <w:rFonts w:ascii="Arial" w:hAnsi="Arial" w:cs="Arial"/>
-        </w:rPr>
-        <w:t>epartment staff should be able to:</w:t>
+        <w:t>r</w:t>
+      </w:r>
+      <w:r>
+        <w:rPr>
+          <w:rFonts w:ascii="Arial" w:hAnsi="Arial" w:cs="Arial"/>
+        </w:rPr>
+        <w:t>egistry staff should be able to:</w:t>
       </w:r>
     </w:p>
     <w:p>
@@ -6844,16 +8258,17 @@
           <w:numId w:val="16"/>
         </w:numPr>
         <w:spacing w:line="360" w:lineRule="auto"/>
-        <w:jc w:val="both"/>
-        <w:rPr>
-          <w:rFonts w:ascii="Arial" w:hAnsi="Arial" w:cs="Arial"/>
-        </w:rPr>
-      </w:pPr>
-      <w:r>
-        <w:rPr>
-          <w:rFonts w:ascii="Arial" w:hAnsi="Arial" w:cs="Arial"/>
-        </w:rPr>
-        <w:t>View and update course information, including course descriptions, prerequisites, capacity limits, and timetable details.</w:t>
+        <w:ind w:left="2127"/>
+        <w:jc w:val="both"/>
+        <w:rPr>
+          <w:rFonts w:ascii="Arial" w:hAnsi="Arial" w:cs="Arial"/>
+        </w:rPr>
+      </w:pPr>
+      <w:r>
+        <w:rPr>
+          <w:rFonts w:ascii="Arial" w:hAnsi="Arial" w:cs="Arial"/>
+        </w:rPr>
+        <w:t>Review and process student enrolment requests.</w:t>
       </w:r>
     </w:p>
     <w:p>
@@ -6864,17 +8279,80 @@
           <w:numId w:val="16"/>
         </w:numPr>
         <w:spacing w:line="360" w:lineRule="auto"/>
-        <w:jc w:val="both"/>
-        <w:rPr>
-          <w:rFonts w:ascii="Arial" w:hAnsi="Arial" w:cs="Arial"/>
-        </w:rPr>
-      </w:pPr>
-      <w:r>
-        <w:rPr>
-          <w:rFonts w:ascii="Arial" w:hAnsi="Arial" w:cs="Arial"/>
-        </w:rPr>
-        <w:lastRenderedPageBreak/>
-        <w:t>Ensure course information is accurate and up to date through integration with existing systems.</w:t>
+        <w:ind w:left="2127"/>
+        <w:jc w:val="both"/>
+        <w:rPr>
+          <w:rFonts w:ascii="Arial" w:hAnsi="Arial" w:cs="Arial"/>
+        </w:rPr>
+      </w:pPr>
+      <w:r>
+        <w:rPr>
+          <w:rFonts w:ascii="Arial" w:hAnsi="Arial" w:cs="Arial"/>
+        </w:rPr>
+        <w:t>Check student eligibility based on prerequisites, programme requirements, and course availability.</w:t>
+      </w:r>
+    </w:p>
+    <w:p>
+      <w:pPr>
+        <w:pStyle w:val="ListParagraph"/>
+        <w:numPr>
+          <w:ilvl w:val="1"/>
+          <w:numId w:val="16"/>
+        </w:numPr>
+        <w:spacing w:line="360" w:lineRule="auto"/>
+        <w:ind w:left="2127"/>
+        <w:jc w:val="both"/>
+        <w:rPr>
+          <w:rFonts w:ascii="Arial" w:hAnsi="Arial" w:cs="Arial"/>
+        </w:rPr>
+      </w:pPr>
+      <w:r>
+        <w:rPr>
+          <w:rFonts w:ascii="Arial" w:hAnsi="Arial" w:cs="Arial"/>
+        </w:rPr>
+        <w:t>Approve or reject enrolment requests based on academic and administrative rules.</w:t>
+      </w:r>
+    </w:p>
+    <w:p>
+      <w:pPr>
+        <w:pStyle w:val="ListParagraph"/>
+        <w:numPr>
+          <w:ilvl w:val="1"/>
+          <w:numId w:val="16"/>
+        </w:numPr>
+        <w:spacing w:line="360" w:lineRule="auto"/>
+        <w:ind w:left="2127"/>
+        <w:jc w:val="both"/>
+        <w:rPr>
+          <w:rFonts w:ascii="Arial" w:hAnsi="Arial" w:cs="Arial"/>
+        </w:rPr>
+      </w:pPr>
+      <w:r>
+        <w:rPr>
+          <w:rFonts w:ascii="Arial" w:hAnsi="Arial" w:cs="Arial"/>
+        </w:rPr>
+        <w:t>Grant prerequisite overrides or manual approvals for students with equivalent prior learning or special circumstances.</w:t>
+      </w:r>
+    </w:p>
+    <w:p>
+      <w:pPr>
+        <w:pStyle w:val="ListParagraph"/>
+        <w:numPr>
+          <w:ilvl w:val="1"/>
+          <w:numId w:val="16"/>
+        </w:numPr>
+        <w:spacing w:line="360" w:lineRule="auto"/>
+        <w:ind w:left="2127"/>
+        <w:jc w:val="both"/>
+        <w:rPr>
+          <w:rFonts w:ascii="Arial" w:hAnsi="Arial" w:cs="Arial"/>
+        </w:rPr>
+      </w:pPr>
+      <w:r>
+        <w:rPr>
+          <w:rFonts w:ascii="Arial" w:hAnsi="Arial" w:cs="Arial"/>
+        </w:rPr>
+        <w:t>Monitor enrolment status and ensure the enrolment process follows the required workflow.</w:t>
       </w:r>
     </w:p>
     <w:p>
@@ -6885,28 +8363,17 @@
           <w:numId w:val="16"/>
         </w:numPr>
         <w:spacing w:line="360" w:lineRule="auto"/>
-        <w:jc w:val="both"/>
-        <w:rPr>
-          <w:rFonts w:ascii="Arial" w:hAnsi="Arial" w:cs="Arial"/>
-        </w:rPr>
-      </w:pPr>
-      <w:r>
-        <w:rPr>
-          <w:rFonts w:ascii="Arial" w:hAnsi="Arial" w:cs="Arial"/>
-        </w:rPr>
-        <w:t xml:space="preserve">Academic </w:t>
-      </w:r>
-      <w:r>
-        <w:rPr>
-          <w:rFonts w:ascii="Arial" w:hAnsi="Arial" w:cs="Arial"/>
-        </w:rPr>
-        <w:t>r</w:t>
-      </w:r>
-      <w:r>
-        <w:rPr>
-          <w:rFonts w:ascii="Arial" w:hAnsi="Arial" w:cs="Arial"/>
-        </w:rPr>
-        <w:t>egistry staff should be able to:</w:t>
+        <w:ind w:left="1560"/>
+        <w:jc w:val="both"/>
+        <w:rPr>
+          <w:rFonts w:ascii="Arial" w:hAnsi="Arial" w:cs="Arial"/>
+        </w:rPr>
+      </w:pPr>
+      <w:r>
+        <w:rPr>
+          <w:rFonts w:ascii="Arial" w:hAnsi="Arial" w:cs="Arial"/>
+        </w:rPr>
+        <w:t>Finance staff should be able to:</w:t>
       </w:r>
     </w:p>
     <w:p>
@@ -6917,16 +8384,17 @@
           <w:numId w:val="16"/>
         </w:numPr>
         <w:spacing w:line="360" w:lineRule="auto"/>
-        <w:jc w:val="both"/>
-        <w:rPr>
-          <w:rFonts w:ascii="Arial" w:hAnsi="Arial" w:cs="Arial"/>
-        </w:rPr>
-      </w:pPr>
-      <w:r>
-        <w:rPr>
-          <w:rFonts w:ascii="Arial" w:hAnsi="Arial" w:cs="Arial"/>
-        </w:rPr>
-        <w:t>Review and process student enrolment requests.</w:t>
+        <w:ind w:left="2127"/>
+        <w:jc w:val="both"/>
+        <w:rPr>
+          <w:rFonts w:ascii="Arial" w:hAnsi="Arial" w:cs="Arial"/>
+        </w:rPr>
+      </w:pPr>
+      <w:r>
+        <w:rPr>
+          <w:rFonts w:ascii="Arial" w:hAnsi="Arial" w:cs="Arial"/>
+        </w:rPr>
+        <w:t>Monitor student payment transactions through the system.</w:t>
       </w:r>
     </w:p>
     <w:p>
@@ -6937,16 +8405,50 @@
           <w:numId w:val="16"/>
         </w:numPr>
         <w:spacing w:line="360" w:lineRule="auto"/>
-        <w:jc w:val="both"/>
-        <w:rPr>
-          <w:rFonts w:ascii="Arial" w:hAnsi="Arial" w:cs="Arial"/>
-        </w:rPr>
-      </w:pPr>
-      <w:r>
-        <w:rPr>
-          <w:rFonts w:ascii="Arial" w:hAnsi="Arial" w:cs="Arial"/>
-        </w:rPr>
-        <w:t>Check student eligibility based on prerequisites, programme requirements, and course availability.</w:t>
+        <w:ind w:left="2127"/>
+        <w:jc w:val="both"/>
+        <w:rPr>
+          <w:rFonts w:ascii="Arial" w:hAnsi="Arial" w:cs="Arial"/>
+        </w:rPr>
+      </w:pPr>
+      <w:r>
+        <w:rPr>
+          <w:rFonts w:ascii="Arial" w:hAnsi="Arial" w:cs="Arial"/>
+        </w:rPr>
+        <w:t>Handle exceptional cases such as missing, failed, or delayed payments.</w:t>
+      </w:r>
+    </w:p>
+    <w:p>
+      <w:pPr>
+        <w:pStyle w:val="ListParagraph"/>
+        <w:numPr>
+          <w:ilvl w:val="0"/>
+          <w:numId w:val="16"/>
+        </w:numPr>
+        <w:spacing w:line="360" w:lineRule="auto"/>
+        <w:ind w:left="1560"/>
+        <w:jc w:val="both"/>
+        <w:rPr>
+          <w:rFonts w:ascii="Arial" w:hAnsi="Arial" w:cs="Arial"/>
+        </w:rPr>
+      </w:pPr>
+      <w:r>
+        <w:rPr>
+          <w:rFonts w:ascii="Arial" w:hAnsi="Arial" w:cs="Arial"/>
+        </w:rPr>
+        <w:t xml:space="preserve">System </w:t>
+      </w:r>
+      <w:r>
+        <w:rPr>
+          <w:rFonts w:ascii="Arial" w:hAnsi="Arial" w:cs="Arial"/>
+        </w:rPr>
+        <w:t>a</w:t>
+      </w:r>
+      <w:r>
+        <w:rPr>
+          <w:rFonts w:ascii="Arial" w:hAnsi="Arial" w:cs="Arial"/>
+        </w:rPr>
+        <w:t>dministrators should be able to:</w:t>
       </w:r>
     </w:p>
     <w:p>
@@ -6957,16 +8459,17 @@
           <w:numId w:val="16"/>
         </w:numPr>
         <w:spacing w:line="360" w:lineRule="auto"/>
-        <w:jc w:val="both"/>
-        <w:rPr>
-          <w:rFonts w:ascii="Arial" w:hAnsi="Arial" w:cs="Arial"/>
-        </w:rPr>
-      </w:pPr>
-      <w:r>
-        <w:rPr>
-          <w:rFonts w:ascii="Arial" w:hAnsi="Arial" w:cs="Arial"/>
-        </w:rPr>
-        <w:t>Approve or reject enrolment requests based on academic and administrative rules.</w:t>
+        <w:ind w:left="2127"/>
+        <w:jc w:val="both"/>
+        <w:rPr>
+          <w:rFonts w:ascii="Arial" w:hAnsi="Arial" w:cs="Arial"/>
+        </w:rPr>
+      </w:pPr>
+      <w:r>
+        <w:rPr>
+          <w:rFonts w:ascii="Arial" w:hAnsi="Arial" w:cs="Arial"/>
+        </w:rPr>
+        <w:t>Manage User Roles and Access Control.</w:t>
       </w:r>
     </w:p>
     <w:p>
@@ -6977,16 +8480,38 @@
           <w:numId w:val="16"/>
         </w:numPr>
         <w:spacing w:line="360" w:lineRule="auto"/>
-        <w:jc w:val="both"/>
-        <w:rPr>
-          <w:rFonts w:ascii="Arial" w:hAnsi="Arial" w:cs="Arial"/>
-        </w:rPr>
-      </w:pPr>
-      <w:r>
-        <w:rPr>
-          <w:rFonts w:ascii="Arial" w:hAnsi="Arial" w:cs="Arial"/>
-        </w:rPr>
-        <w:t>Monitor enrolment status and ensure the enrolment process follows the required workflow.</w:t>
+        <w:ind w:left="2127"/>
+        <w:jc w:val="both"/>
+        <w:rPr>
+          <w:rFonts w:ascii="Arial" w:hAnsi="Arial" w:cs="Arial"/>
+        </w:rPr>
+      </w:pPr>
+      <w:r>
+        <w:rPr>
+          <w:rFonts w:ascii="Arial" w:hAnsi="Arial" w:cs="Arial"/>
+        </w:rPr>
+        <w:t>Configure system-wide settings such as enrolment periods, course limits, and system rules.</w:t>
+      </w:r>
+    </w:p>
+    <w:p>
+      <w:pPr>
+        <w:pStyle w:val="ListParagraph"/>
+        <w:numPr>
+          <w:ilvl w:val="1"/>
+          <w:numId w:val="16"/>
+        </w:numPr>
+        <w:spacing w:line="360" w:lineRule="auto"/>
+        <w:ind w:left="2127"/>
+        <w:jc w:val="both"/>
+        <w:rPr>
+          <w:rFonts w:ascii="Arial" w:hAnsi="Arial" w:cs="Arial"/>
+        </w:rPr>
+      </w:pPr>
+      <w:r>
+        <w:rPr>
+          <w:rFonts w:ascii="Arial" w:hAnsi="Arial" w:cs="Arial"/>
+        </w:rPr>
+        <w:t>Review system audit logs for security compliance.</w:t>
       </w:r>
     </w:p>
     <w:p>
@@ -6997,16 +8522,17 @@
           <w:numId w:val="16"/>
         </w:numPr>
         <w:spacing w:line="360" w:lineRule="auto"/>
-        <w:jc w:val="both"/>
-        <w:rPr>
-          <w:rFonts w:ascii="Arial" w:hAnsi="Arial" w:cs="Arial"/>
-        </w:rPr>
-      </w:pPr>
-      <w:r>
-        <w:rPr>
-          <w:rFonts w:ascii="Arial" w:hAnsi="Arial" w:cs="Arial"/>
-        </w:rPr>
-        <w:t>Finance staff should be able to:</w:t>
+        <w:ind w:left="1560"/>
+        <w:jc w:val="both"/>
+        <w:rPr>
+          <w:rFonts w:ascii="Arial" w:hAnsi="Arial" w:cs="Arial"/>
+        </w:rPr>
+      </w:pPr>
+      <w:r>
+        <w:rPr>
+          <w:rFonts w:ascii="Arial" w:hAnsi="Arial" w:cs="Arial"/>
+        </w:rPr>
+        <w:t>IT staff should be able to:</w:t>
       </w:r>
     </w:p>
     <w:p>
@@ -7017,16 +8543,17 @@
           <w:numId w:val="16"/>
         </w:numPr>
         <w:spacing w:line="360" w:lineRule="auto"/>
-        <w:jc w:val="both"/>
-        <w:rPr>
-          <w:rFonts w:ascii="Arial" w:hAnsi="Arial" w:cs="Arial"/>
-        </w:rPr>
-      </w:pPr>
-      <w:r>
-        <w:rPr>
-          <w:rFonts w:ascii="Arial" w:hAnsi="Arial" w:cs="Arial"/>
-        </w:rPr>
-        <w:t>Monitor student payment transactions through the system.</w:t>
+        <w:ind w:left="2127"/>
+        <w:jc w:val="both"/>
+        <w:rPr>
+          <w:rFonts w:ascii="Arial" w:hAnsi="Arial" w:cs="Arial"/>
+        </w:rPr>
+      </w:pPr>
+      <w:r>
+        <w:rPr>
+          <w:rFonts w:ascii="Arial" w:hAnsi="Arial" w:cs="Arial"/>
+        </w:rPr>
+        <w:t>Maintain system uptime and database integrity.</w:t>
       </w:r>
     </w:p>
     <w:p>
@@ -7037,16 +8564,24 @@
           <w:numId w:val="16"/>
         </w:numPr>
         <w:spacing w:line="360" w:lineRule="auto"/>
-        <w:jc w:val="both"/>
-        <w:rPr>
-          <w:rFonts w:ascii="Arial" w:hAnsi="Arial" w:cs="Arial"/>
-        </w:rPr>
-      </w:pPr>
-      <w:r>
-        <w:rPr>
-          <w:rFonts w:ascii="Arial" w:hAnsi="Arial" w:cs="Arial"/>
-        </w:rPr>
-        <w:t>Verify payment status received from external payment systems.</w:t>
+        <w:ind w:left="2127"/>
+        <w:jc w:val="both"/>
+        <w:rPr>
+          <w:rFonts w:ascii="Arial" w:hAnsi="Arial" w:cs="Arial"/>
+        </w:rPr>
+      </w:pPr>
+      <w:r>
+        <w:rPr>
+          <w:rFonts w:ascii="Arial" w:hAnsi="Arial" w:cs="Arial"/>
+        </w:rPr>
+        <w:lastRenderedPageBreak/>
+        <w:t>Manage integration with the university’s central database and external systems such as payment services and course information systems to support accurate and consistent data exchange</w:t>
+      </w:r>
+      <w:r>
+        <w:rPr>
+          <w:rFonts w:ascii="Arial" w:hAnsi="Arial" w:cs="Arial"/>
+        </w:rPr>
+        <w:t>.</w:t>
       </w:r>
     </w:p>
     <w:p>
@@ -7057,36 +8592,128 @@
           <w:numId w:val="16"/>
         </w:numPr>
         <w:spacing w:line="360" w:lineRule="auto"/>
-        <w:jc w:val="both"/>
-        <w:rPr>
-          <w:rFonts w:ascii="Arial" w:hAnsi="Arial" w:cs="Arial"/>
-        </w:rPr>
-      </w:pPr>
-      <w:r>
-        <w:rPr>
-          <w:rFonts w:ascii="Arial" w:hAnsi="Arial" w:cs="Arial"/>
-        </w:rPr>
-        <w:t>Handle exceptional cases such as missing, failed, or delayed payments.</w:t>
-      </w:r>
-    </w:p>
-    <w:p>
-      <w:pPr>
-        <w:pStyle w:val="ListParagraph"/>
-        <w:numPr>
-          <w:ilvl w:val="1"/>
-          <w:numId w:val="16"/>
-        </w:numPr>
-        <w:spacing w:line="360" w:lineRule="auto"/>
-        <w:jc w:val="both"/>
-        <w:rPr>
-          <w:rFonts w:ascii="Arial" w:hAnsi="Arial" w:cs="Arial"/>
-        </w:rPr>
-      </w:pPr>
-      <w:r>
-        <w:rPr>
-          <w:rFonts w:ascii="Arial" w:hAnsi="Arial" w:cs="Arial"/>
-        </w:rPr>
-        <w:t>Ensure enrolments are only confirmed after successful payment verification.</w:t>
+        <w:ind w:left="2127"/>
+        <w:jc w:val="both"/>
+        <w:rPr>
+          <w:rFonts w:ascii="Arial" w:hAnsi="Arial" w:cs="Arial"/>
+        </w:rPr>
+      </w:pPr>
+      <w:r>
+        <w:rPr>
+          <w:rFonts w:ascii="Arial" w:hAnsi="Arial" w:cs="Arial"/>
+        </w:rPr>
+        <w:t>Monitor system performance and resolve technical issues</w:t>
+      </w:r>
+      <w:r>
+        <w:rPr>
+          <w:rFonts w:ascii="Arial" w:hAnsi="Arial" w:cs="Arial"/>
+        </w:rPr>
+        <w:t>.</w:t>
+      </w:r>
+    </w:p>
+    <w:p>
+      <w:pPr>
+        <w:pStyle w:val="Heading3"/>
+        <w:ind w:left="567"/>
+        <w:jc w:val="both"/>
+        <w:rPr>
+          <w:rFonts w:ascii="Arial" w:hAnsi="Arial" w:cs="Arial"/>
+          <w:b/>
+          <w:bCs/>
+          <w:color w:val="EE0000"/>
+          <w:sz w:val="24"/>
+          <w:szCs w:val="24"/>
+        </w:rPr>
+      </w:pPr>
+      <w:bookmarkStart w:id="19" w:name="_Toc227153829"/>
+      <w:r>
+        <w:rPr>
+          <w:rFonts w:ascii="Arial" w:hAnsi="Arial" w:cs="Arial"/>
+          <w:b/>
+          <w:bCs/>
+          <w:color w:val="EE0000"/>
+          <w:sz w:val="24"/>
+          <w:szCs w:val="24"/>
+        </w:rPr>
+        <w:t>i</w:t>
+      </w:r>
+      <w:r>
+        <w:rPr>
+          <w:rFonts w:ascii="Arial" w:hAnsi="Arial" w:cs="Arial"/>
+          <w:b/>
+          <w:bCs/>
+          <w:color w:val="EE0000"/>
+          <w:sz w:val="24"/>
+          <w:szCs w:val="24"/>
+        </w:rPr>
+        <w:t>i</w:t>
+      </w:r>
+      <w:r>
+        <w:rPr>
+          <w:rFonts w:ascii="Arial" w:hAnsi="Arial" w:cs="Arial"/>
+          <w:b/>
+          <w:bCs/>
+          <w:color w:val="EE0000"/>
+          <w:sz w:val="24"/>
+          <w:szCs w:val="24"/>
+        </w:rPr>
+        <w:t>.</w:t>
+      </w:r>
+      <w:r>
+        <w:rPr>
+          <w:rFonts w:ascii="Arial" w:hAnsi="Arial" w:cs="Arial"/>
+          <w:b/>
+          <w:bCs/>
+          <w:color w:val="EE0000"/>
+          <w:sz w:val="24"/>
+          <w:szCs w:val="24"/>
+        </w:rPr>
+        <w:t xml:space="preserve"> </w:t>
+      </w:r>
+      <w:r>
+        <w:rPr>
+          <w:rFonts w:ascii="Arial" w:hAnsi="Arial" w:cs="Arial"/>
+          <w:b/>
+          <w:bCs/>
+          <w:color w:val="EE0000"/>
+          <w:sz w:val="24"/>
+          <w:szCs w:val="24"/>
+        </w:rPr>
+        <w:t>System</w:t>
+      </w:r>
+      <w:r>
+        <w:rPr>
+          <w:rFonts w:ascii="Arial" w:hAnsi="Arial" w:cs="Arial"/>
+          <w:b/>
+          <w:bCs/>
+          <w:color w:val="EE0000"/>
+          <w:sz w:val="24"/>
+          <w:szCs w:val="24"/>
+        </w:rPr>
+        <w:t xml:space="preserve"> requirements</w:t>
+      </w:r>
+      <w:bookmarkEnd w:id="19"/>
+    </w:p>
+    <w:p>
+      <w:pPr>
+        <w:spacing w:line="360" w:lineRule="auto"/>
+        <w:ind w:left="851"/>
+        <w:jc w:val="both"/>
+        <w:rPr>
+          <w:rFonts w:ascii="Arial" w:hAnsi="Arial" w:cs="Arial"/>
+        </w:rPr>
+      </w:pPr>
+      <w:r>
+        <w:rPr>
+          <w:rFonts w:ascii="Arial" w:hAnsi="Arial" w:cs="Arial"/>
+        </w:rPr>
+        <w:t>Based on the above requirements elicitation methods, the system requirements that describe what the system shall do are identified as follows</w:t>
+      </w:r>
+      <w:r>
+        <w:rPr>
+          <w:rFonts w:ascii="Arial" w:hAnsi="Arial" w:cs="Arial"/>
+        </w:rPr>
+        <w:t xml:space="preserve">: </w:t>
       </w:r>
     </w:p>
     <w:p>
@@ -7094,79 +8721,51 @@
         <w:pStyle w:val="ListParagraph"/>
         <w:numPr>
           <w:ilvl w:val="0"/>
-          <w:numId w:val="16"/>
-        </w:numPr>
-        <w:spacing w:line="360" w:lineRule="auto"/>
-        <w:jc w:val="both"/>
-        <w:rPr>
-          <w:rFonts w:ascii="Arial" w:hAnsi="Arial" w:cs="Arial"/>
-        </w:rPr>
-      </w:pPr>
-      <w:r>
-        <w:rPr>
-          <w:rFonts w:ascii="Arial" w:hAnsi="Arial" w:cs="Arial"/>
-        </w:rPr>
-        <w:t>System Administrators / IT staff should be able to:</w:t>
-      </w:r>
-    </w:p>
-    <w:p>
-      <w:pPr>
-        <w:pStyle w:val="ListParagraph"/>
-        <w:numPr>
-          <w:ilvl w:val="1"/>
-          <w:numId w:val="16"/>
-        </w:numPr>
-        <w:spacing w:line="360" w:lineRule="auto"/>
-        <w:jc w:val="both"/>
-        <w:rPr>
-          <w:rFonts w:ascii="Arial" w:hAnsi="Arial" w:cs="Arial"/>
-        </w:rPr>
-      </w:pPr>
-      <w:r>
-        <w:rPr>
-          <w:rFonts w:ascii="Arial" w:hAnsi="Arial" w:cs="Arial"/>
-        </w:rPr>
-        <w:t>Manage user access and roles within the system.</w:t>
-      </w:r>
-    </w:p>
-    <w:p>
-      <w:pPr>
-        <w:pStyle w:val="ListParagraph"/>
-        <w:numPr>
-          <w:ilvl w:val="1"/>
-          <w:numId w:val="16"/>
-        </w:numPr>
-        <w:spacing w:line="360" w:lineRule="auto"/>
-        <w:jc w:val="both"/>
-        <w:rPr>
-          <w:rFonts w:ascii="Arial" w:hAnsi="Arial" w:cs="Arial"/>
-        </w:rPr>
-      </w:pPr>
-      <w:r>
-        <w:rPr>
-          <w:rFonts w:ascii="Arial" w:hAnsi="Arial" w:cs="Arial"/>
-        </w:rPr>
-        <w:t>Maintain system availability and ensure smooth operation.</w:t>
-      </w:r>
-    </w:p>
-    <w:p>
-      <w:pPr>
-        <w:pStyle w:val="ListParagraph"/>
-        <w:numPr>
-          <w:ilvl w:val="1"/>
-          <w:numId w:val="16"/>
-        </w:numPr>
-        <w:spacing w:line="360" w:lineRule="auto"/>
-        <w:jc w:val="both"/>
-        <w:rPr>
-          <w:rFonts w:ascii="Arial" w:hAnsi="Arial" w:cs="Arial"/>
-        </w:rPr>
-      </w:pPr>
-      <w:r>
-        <w:rPr>
-          <w:rFonts w:ascii="Arial" w:hAnsi="Arial" w:cs="Arial"/>
-        </w:rPr>
-        <w:t>Support integration with external systems such as payment systems and university databases.</w:t>
+          <w:numId w:val="21"/>
+        </w:numPr>
+        <w:spacing w:line="360" w:lineRule="auto"/>
+        <w:jc w:val="both"/>
+        <w:rPr>
+          <w:rFonts w:ascii="Arial" w:hAnsi="Arial" w:cs="Arial"/>
+        </w:rPr>
+      </w:pPr>
+      <w:r>
+        <w:rPr>
+          <w:rFonts w:ascii="Arial" w:hAnsi="Arial" w:cs="Arial"/>
+        </w:rPr>
+        <w:t>The system shall automatically validate prerequisite requirements, check course capacity, and detect timetable clashes, and notify students of any issues before confirming enrolment</w:t>
+      </w:r>
+      <w:r>
+        <w:rPr>
+          <w:rFonts w:ascii="Arial" w:hAnsi="Arial" w:cs="Arial"/>
+        </w:rPr>
+        <w:t>.</w:t>
+      </w:r>
+    </w:p>
+    <w:p>
+      <w:pPr>
+        <w:pStyle w:val="ListParagraph"/>
+        <w:numPr>
+          <w:ilvl w:val="0"/>
+          <w:numId w:val="21"/>
+        </w:numPr>
+        <w:spacing w:line="360" w:lineRule="auto"/>
+        <w:jc w:val="both"/>
+        <w:rPr>
+          <w:rFonts w:ascii="Arial" w:hAnsi="Arial" w:cs="Arial"/>
+        </w:rPr>
+      </w:pPr>
+      <w:r>
+        <w:rPr>
+          <w:rFonts w:ascii="Arial" w:hAnsi="Arial" w:cs="Arial"/>
+        </w:rPr>
+        <w:t>The system shall automatically verify payment status through integration with an external payment system and confirm enrolment only after successful payment verification</w:t>
+      </w:r>
+      <w:r>
+        <w:rPr>
+          <w:rFonts w:ascii="Arial" w:hAnsi="Arial" w:cs="Arial"/>
+        </w:rPr>
+        <w:t>.</w:t>
       </w:r>
     </w:p>
     <w:p>
@@ -7184,7 +8783,7 @@
           <w:szCs w:val="28"/>
         </w:rPr>
       </w:pPr>
-      <w:bookmarkStart w:id="17" w:name="_Toc227105557"/>
+      <w:bookmarkStart w:id="20" w:name="_Toc227153830"/>
       <w:r>
         <w:rPr>
           <w:rFonts w:ascii="Arial" w:hAnsi="Arial" w:cs="Arial"/>
@@ -7262,7 +8861,7 @@
         </w:rPr>
         <w:t>equirements</w:t>
       </w:r>
-      <w:bookmarkEnd w:id="17"/>
+      <w:bookmarkEnd w:id="20"/>
     </w:p>
     <w:p>
       <w:pPr>
@@ -7377,7 +8976,6 @@
         <w:rPr>
           <w:rFonts w:ascii="Arial" w:hAnsi="Arial" w:cs="Arial"/>
         </w:rPr>
-        <w:lastRenderedPageBreak/>
         <w:t>Course Enrolment:</w:t>
       </w:r>
     </w:p>
@@ -7483,6 +9081,7 @@
         <w:rPr>
           <w:rFonts w:ascii="Arial" w:hAnsi="Arial" w:cs="Arial"/>
         </w:rPr>
+        <w:lastRenderedPageBreak/>
         <w:t>The system shall allow students to adjust their course selection if timetable conflicts are detected.</w:t>
       </w:r>
     </w:p>
@@ -7773,7 +9372,6 @@
         <w:rPr>
           <w:rFonts w:ascii="Arial" w:hAnsi="Arial" w:cs="Arial"/>
         </w:rPr>
-        <w:lastRenderedPageBreak/>
         <w:t>The system shall notify students of any enrolment issues, including timetable clashes or prerequisite violations.</w:t>
       </w:r>
     </w:p>
@@ -7857,6 +9455,7 @@
         <w:rPr>
           <w:rFonts w:ascii="Arial" w:hAnsi="Arial" w:cs="Arial"/>
         </w:rPr>
+        <w:lastRenderedPageBreak/>
         <w:t>The system shall require authentication before allowing access to any student or staff data.</w:t>
       </w:r>
     </w:p>
@@ -7937,7 +9536,7 @@
           <w:szCs w:val="28"/>
         </w:rPr>
       </w:pPr>
-      <w:bookmarkStart w:id="18" w:name="_Toc227105558"/>
+      <w:bookmarkStart w:id="21" w:name="_Toc227153831"/>
       <w:r>
         <w:rPr>
           <w:rFonts w:ascii="Arial" w:hAnsi="Arial" w:cs="Arial"/>
@@ -8037,7 +9636,7 @@
         </w:rPr>
         <w:t>equirements</w:t>
       </w:r>
-      <w:bookmarkEnd w:id="18"/>
+      <w:bookmarkEnd w:id="21"/>
     </w:p>
     <w:p>
       <w:pPr>
@@ -8318,7 +9917,6 @@
         <w:rPr>
           <w:rFonts w:ascii="Arial" w:hAnsi="Arial" w:cs="Arial"/>
         </w:rPr>
-        <w:lastRenderedPageBreak/>
         <w:t>Data Protection</w:t>
       </w:r>
       <w:r>
@@ -8455,6 +10053,7 @@
         <w:rPr>
           <w:rFonts w:ascii="Arial" w:hAnsi="Arial" w:cs="Arial"/>
         </w:rPr>
+        <w:lastRenderedPageBreak/>
         <w:t>Usability</w:t>
       </w:r>
       <w:r>
@@ -8805,7 +10404,7 @@
           <w:szCs w:val="32"/>
         </w:rPr>
       </w:pPr>
-      <w:bookmarkStart w:id="19" w:name="_Toc227105559"/>
+      <w:bookmarkStart w:id="22" w:name="_Toc227153832"/>
       <w:r>
         <w:rPr>
           <w:rFonts w:ascii="Arial" w:hAnsi="Arial" w:cs="Arial"/>
@@ -8840,7 +10439,7 @@
         </w:rPr>
         <w:t>ase diagram</w:t>
       </w:r>
-      <w:bookmarkEnd w:id="19"/>
+      <w:bookmarkEnd w:id="22"/>
     </w:p>
     <w:p>
       <w:pPr>
@@ -8885,7 +10484,7 @@
           <w:szCs w:val="32"/>
         </w:rPr>
       </w:pPr>
-      <w:bookmarkStart w:id="20" w:name="_Toc227105560"/>
+      <w:bookmarkStart w:id="23" w:name="_Toc227153833"/>
       <w:r>
         <w:rPr>
           <w:rFonts w:ascii="Arial" w:hAnsi="Arial" w:cs="Arial"/>
@@ -8909,7 +10508,7 @@
         </w:rPr>
         <w:t xml:space="preserve"> diagram</w:t>
       </w:r>
-      <w:bookmarkEnd w:id="20"/>
+      <w:bookmarkEnd w:id="23"/>
     </w:p>
     <w:p>
       <w:pPr>
@@ -8954,7 +10553,7 @@
           <w:szCs w:val="32"/>
         </w:rPr>
       </w:pPr>
-      <w:bookmarkStart w:id="21" w:name="_Toc227105561"/>
+      <w:bookmarkStart w:id="24" w:name="_Toc227153834"/>
       <w:r>
         <w:rPr>
           <w:rFonts w:ascii="Arial" w:hAnsi="Arial" w:cs="Arial"/>
@@ -8989,7 +10588,7 @@
         </w:rPr>
         <w:t>mplementation</w:t>
       </w:r>
-      <w:bookmarkEnd w:id="21"/>
+      <w:bookmarkEnd w:id="24"/>
     </w:p>
     <w:p>
       <w:pPr>
@@ -9044,7 +10643,7 @@
           <w:szCs w:val="32"/>
         </w:rPr>
       </w:pPr>
-      <w:bookmarkStart w:id="22" w:name="_Toc227105562"/>
+      <w:bookmarkStart w:id="25" w:name="_Toc227153835"/>
       <w:r>
         <w:rPr>
           <w:rFonts w:ascii="Arial" w:hAnsi="Arial" w:cs="Arial"/>
@@ -9068,7 +10667,7 @@
         </w:rPr>
         <w:t>onclusion</w:t>
       </w:r>
-      <w:bookmarkEnd w:id="22"/>
+      <w:bookmarkEnd w:id="25"/>
     </w:p>
     <w:p>
       <w:pPr>
@@ -9128,7 +10727,7 @@
           <w:szCs w:val="32"/>
         </w:rPr>
       </w:pPr>
-      <w:bookmarkStart w:id="23" w:name="_Toc227105563"/>
+      <w:bookmarkStart w:id="26" w:name="_Toc227153836"/>
       <w:r>
         <w:rPr>
           <w:rFonts w:ascii="Arial" w:hAnsi="Arial" w:cs="Arial"/>
@@ -9141,7 +10740,7 @@
         <w:lastRenderedPageBreak/>
         <w:t>References</w:t>
       </w:r>
-      <w:bookmarkEnd w:id="23"/>
+      <w:bookmarkEnd w:id="26"/>
     </w:p>
     <w:p>
       <w:pPr>
@@ -9769,6 +11368,119 @@
     </w:lvl>
   </w:abstractNum>
   <w:abstractNum w:abstractNumId="1" w15:restartNumberingAfterBreak="0">
+    <w:nsid w:val="02FB7377"/>
+    <w:multiLevelType w:val="hybridMultilevel"/>
+    <w:tmpl w:val="F68ABFD6"/>
+    <w:lvl w:ilvl="0" w:tplc="04090001">
+      <w:start w:val="1"/>
+      <w:numFmt w:val="bullet"/>
+      <w:lvlText w:val=""/>
+      <w:lvlJc w:val="left"/>
+      <w:pPr>
+        <w:ind w:left="1571" w:hanging="360"/>
+      </w:pPr>
+      <w:rPr>
+        <w:rFonts w:ascii="Symbol" w:hAnsi="Symbol" w:hint="default"/>
+      </w:rPr>
+    </w:lvl>
+    <w:lvl w:ilvl="1" w:tplc="04090003">
+      <w:start w:val="1"/>
+      <w:numFmt w:val="bullet"/>
+      <w:lvlText w:val="o"/>
+      <w:lvlJc w:val="left"/>
+      <w:pPr>
+        <w:ind w:left="2291" w:hanging="360"/>
+      </w:pPr>
+      <w:rPr>
+        <w:rFonts w:ascii="Courier New" w:hAnsi="Courier New" w:cs="Courier New" w:hint="default"/>
+      </w:rPr>
+    </w:lvl>
+    <w:lvl w:ilvl="2" w:tplc="04090005" w:tentative="1">
+      <w:start w:val="1"/>
+      <w:numFmt w:val="bullet"/>
+      <w:lvlText w:val=""/>
+      <w:lvlJc w:val="left"/>
+      <w:pPr>
+        <w:ind w:left="3011" w:hanging="360"/>
+      </w:pPr>
+      <w:rPr>
+        <w:rFonts w:ascii="Wingdings" w:hAnsi="Wingdings" w:hint="default"/>
+      </w:rPr>
+    </w:lvl>
+    <w:lvl w:ilvl="3" w:tplc="04090001" w:tentative="1">
+      <w:start w:val="1"/>
+      <w:numFmt w:val="bullet"/>
+      <w:lvlText w:val=""/>
+      <w:lvlJc w:val="left"/>
+      <w:pPr>
+        <w:ind w:left="3731" w:hanging="360"/>
+      </w:pPr>
+      <w:rPr>
+        <w:rFonts w:ascii="Symbol" w:hAnsi="Symbol" w:hint="default"/>
+      </w:rPr>
+    </w:lvl>
+    <w:lvl w:ilvl="4" w:tplc="04090003" w:tentative="1">
+      <w:start w:val="1"/>
+      <w:numFmt w:val="bullet"/>
+      <w:lvlText w:val="o"/>
+      <w:lvlJc w:val="left"/>
+      <w:pPr>
+        <w:ind w:left="4451" w:hanging="360"/>
+      </w:pPr>
+      <w:rPr>
+        <w:rFonts w:ascii="Courier New" w:hAnsi="Courier New" w:cs="Courier New" w:hint="default"/>
+      </w:rPr>
+    </w:lvl>
+    <w:lvl w:ilvl="5" w:tplc="04090005" w:tentative="1">
+      <w:start w:val="1"/>
+      <w:numFmt w:val="bullet"/>
+      <w:lvlText w:val=""/>
+      <w:lvlJc w:val="left"/>
+      <w:pPr>
+        <w:ind w:left="5171" w:hanging="360"/>
+      </w:pPr>
+      <w:rPr>
+        <w:rFonts w:ascii="Wingdings" w:hAnsi="Wingdings" w:hint="default"/>
+      </w:rPr>
+    </w:lvl>
+    <w:lvl w:ilvl="6" w:tplc="04090001" w:tentative="1">
+      <w:start w:val="1"/>
+      <w:numFmt w:val="bullet"/>
+      <w:lvlText w:val=""/>
+      <w:lvlJc w:val="left"/>
+      <w:pPr>
+        <w:ind w:left="5891" w:hanging="360"/>
+      </w:pPr>
+      <w:rPr>
+        <w:rFonts w:ascii="Symbol" w:hAnsi="Symbol" w:hint="default"/>
+      </w:rPr>
+    </w:lvl>
+    <w:lvl w:ilvl="7" w:tplc="04090003" w:tentative="1">
+      <w:start w:val="1"/>
+      <w:numFmt w:val="bullet"/>
+      <w:lvlText w:val="o"/>
+      <w:lvlJc w:val="left"/>
+      <w:pPr>
+        <w:ind w:left="6611" w:hanging="360"/>
+      </w:pPr>
+      <w:rPr>
+        <w:rFonts w:ascii="Courier New" w:hAnsi="Courier New" w:cs="Courier New" w:hint="default"/>
+      </w:rPr>
+    </w:lvl>
+    <w:lvl w:ilvl="8" w:tplc="04090005" w:tentative="1">
+      <w:start w:val="1"/>
+      <w:numFmt w:val="bullet"/>
+      <w:lvlText w:val=""/>
+      <w:lvlJc w:val="left"/>
+      <w:pPr>
+        <w:ind w:left="7331" w:hanging="360"/>
+      </w:pPr>
+      <w:rPr>
+        <w:rFonts w:ascii="Wingdings" w:hAnsi="Wingdings" w:hint="default"/>
+      </w:rPr>
+    </w:lvl>
+  </w:abstractNum>
+  <w:abstractNum w:abstractNumId="2" w15:restartNumberingAfterBreak="0">
     <w:nsid w:val="0B0D1D50"/>
     <w:multiLevelType w:val="hybridMultilevel"/>
     <w:tmpl w:val="751C5454"/>
@@ -9857,7 +11569,7 @@
       </w:pPr>
     </w:lvl>
   </w:abstractNum>
-  <w:abstractNum w:abstractNumId="2" w15:restartNumberingAfterBreak="0">
+  <w:abstractNum w:abstractNumId="3" w15:restartNumberingAfterBreak="0">
     <w:nsid w:val="0F3C10E5"/>
     <w:multiLevelType w:val="hybridMultilevel"/>
     <w:tmpl w:val="A3AA1926"/>
@@ -9970,7 +11682,120 @@
       </w:rPr>
     </w:lvl>
   </w:abstractNum>
-  <w:abstractNum w:abstractNumId="3" w15:restartNumberingAfterBreak="0">
+  <w:abstractNum w:abstractNumId="4" w15:restartNumberingAfterBreak="0">
+    <w:nsid w:val="1A8B6F57"/>
+    <w:multiLevelType w:val="hybridMultilevel"/>
+    <w:tmpl w:val="5C604B8C"/>
+    <w:lvl w:ilvl="0" w:tplc="04090001">
+      <w:start w:val="1"/>
+      <w:numFmt w:val="bullet"/>
+      <w:lvlText w:val=""/>
+      <w:lvlJc w:val="left"/>
+      <w:pPr>
+        <w:ind w:left="1287" w:hanging="360"/>
+      </w:pPr>
+      <w:rPr>
+        <w:rFonts w:ascii="Symbol" w:hAnsi="Symbol" w:hint="default"/>
+      </w:rPr>
+    </w:lvl>
+    <w:lvl w:ilvl="1" w:tplc="04090003" w:tentative="1">
+      <w:start w:val="1"/>
+      <w:numFmt w:val="bullet"/>
+      <w:lvlText w:val="o"/>
+      <w:lvlJc w:val="left"/>
+      <w:pPr>
+        <w:ind w:left="2007" w:hanging="360"/>
+      </w:pPr>
+      <w:rPr>
+        <w:rFonts w:ascii="Courier New" w:hAnsi="Courier New" w:cs="Courier New" w:hint="default"/>
+      </w:rPr>
+    </w:lvl>
+    <w:lvl w:ilvl="2" w:tplc="04090005" w:tentative="1">
+      <w:start w:val="1"/>
+      <w:numFmt w:val="bullet"/>
+      <w:lvlText w:val=""/>
+      <w:lvlJc w:val="left"/>
+      <w:pPr>
+        <w:ind w:left="2727" w:hanging="360"/>
+      </w:pPr>
+      <w:rPr>
+        <w:rFonts w:ascii="Wingdings" w:hAnsi="Wingdings" w:hint="default"/>
+      </w:rPr>
+    </w:lvl>
+    <w:lvl w:ilvl="3" w:tplc="04090001" w:tentative="1">
+      <w:start w:val="1"/>
+      <w:numFmt w:val="bullet"/>
+      <w:lvlText w:val=""/>
+      <w:lvlJc w:val="left"/>
+      <w:pPr>
+        <w:ind w:left="3447" w:hanging="360"/>
+      </w:pPr>
+      <w:rPr>
+        <w:rFonts w:ascii="Symbol" w:hAnsi="Symbol" w:hint="default"/>
+      </w:rPr>
+    </w:lvl>
+    <w:lvl w:ilvl="4" w:tplc="04090003" w:tentative="1">
+      <w:start w:val="1"/>
+      <w:numFmt w:val="bullet"/>
+      <w:lvlText w:val="o"/>
+      <w:lvlJc w:val="left"/>
+      <w:pPr>
+        <w:ind w:left="4167" w:hanging="360"/>
+      </w:pPr>
+      <w:rPr>
+        <w:rFonts w:ascii="Courier New" w:hAnsi="Courier New" w:cs="Courier New" w:hint="default"/>
+      </w:rPr>
+    </w:lvl>
+    <w:lvl w:ilvl="5" w:tplc="04090005" w:tentative="1">
+      <w:start w:val="1"/>
+      <w:numFmt w:val="bullet"/>
+      <w:lvlText w:val=""/>
+      <w:lvlJc w:val="left"/>
+      <w:pPr>
+        <w:ind w:left="4887" w:hanging="360"/>
+      </w:pPr>
+      <w:rPr>
+        <w:rFonts w:ascii="Wingdings" w:hAnsi="Wingdings" w:hint="default"/>
+      </w:rPr>
+    </w:lvl>
+    <w:lvl w:ilvl="6" w:tplc="04090001" w:tentative="1">
+      <w:start w:val="1"/>
+      <w:numFmt w:val="bullet"/>
+      <w:lvlText w:val=""/>
+      <w:lvlJc w:val="left"/>
+      <w:pPr>
+        <w:ind w:left="5607" w:hanging="360"/>
+      </w:pPr>
+      <w:rPr>
+        <w:rFonts w:ascii="Symbol" w:hAnsi="Symbol" w:hint="default"/>
+      </w:rPr>
+    </w:lvl>
+    <w:lvl w:ilvl="7" w:tplc="04090003" w:tentative="1">
+      <w:start w:val="1"/>
+      <w:numFmt w:val="bullet"/>
+      <w:lvlText w:val="o"/>
+      <w:lvlJc w:val="left"/>
+      <w:pPr>
+        <w:ind w:left="6327" w:hanging="360"/>
+      </w:pPr>
+      <w:rPr>
+        <w:rFonts w:ascii="Courier New" w:hAnsi="Courier New" w:cs="Courier New" w:hint="default"/>
+      </w:rPr>
+    </w:lvl>
+    <w:lvl w:ilvl="8" w:tplc="04090005" w:tentative="1">
+      <w:start w:val="1"/>
+      <w:numFmt w:val="bullet"/>
+      <w:lvlText w:val=""/>
+      <w:lvlJc w:val="left"/>
+      <w:pPr>
+        <w:ind w:left="7047" w:hanging="360"/>
+      </w:pPr>
+      <w:rPr>
+        <w:rFonts w:ascii="Wingdings" w:hAnsi="Wingdings" w:hint="default"/>
+      </w:rPr>
+    </w:lvl>
+  </w:abstractNum>
+  <w:abstractNum w:abstractNumId="5" w15:restartNumberingAfterBreak="0">
     <w:nsid w:val="208A1330"/>
     <w:multiLevelType w:val="hybridMultilevel"/>
     <w:tmpl w:val="0972A492"/>
@@ -10083,7 +11908,7 @@
       </w:rPr>
     </w:lvl>
   </w:abstractNum>
-  <w:abstractNum w:abstractNumId="4" w15:restartNumberingAfterBreak="0">
+  <w:abstractNum w:abstractNumId="6" w15:restartNumberingAfterBreak="0">
     <w:nsid w:val="2EC15A1A"/>
     <w:multiLevelType w:val="hybridMultilevel"/>
     <w:tmpl w:val="C5665E78"/>
@@ -10169,7 +11994,7 @@
       </w:pPr>
     </w:lvl>
   </w:abstractNum>
-  <w:abstractNum w:abstractNumId="5" w15:restartNumberingAfterBreak="0">
+  <w:abstractNum w:abstractNumId="7" w15:restartNumberingAfterBreak="0">
     <w:nsid w:val="3725559B"/>
     <w:multiLevelType w:val="hybridMultilevel"/>
     <w:tmpl w:val="BDCA7D84"/>
@@ -10282,7 +12107,7 @@
       </w:rPr>
     </w:lvl>
   </w:abstractNum>
-  <w:abstractNum w:abstractNumId="6" w15:restartNumberingAfterBreak="0">
+  <w:abstractNum w:abstractNumId="8" w15:restartNumberingAfterBreak="0">
     <w:nsid w:val="443143D4"/>
     <w:multiLevelType w:val="hybridMultilevel"/>
     <w:tmpl w:val="BC7C5D7E"/>
@@ -10395,7 +12220,120 @@
       </w:rPr>
     </w:lvl>
   </w:abstractNum>
-  <w:abstractNum w:abstractNumId="7" w15:restartNumberingAfterBreak="0">
+  <w:abstractNum w:abstractNumId="9" w15:restartNumberingAfterBreak="0">
+    <w:nsid w:val="46E171CB"/>
+    <w:multiLevelType w:val="hybridMultilevel"/>
+    <w:tmpl w:val="6E505BDA"/>
+    <w:lvl w:ilvl="0" w:tplc="04090001">
+      <w:start w:val="1"/>
+      <w:numFmt w:val="bullet"/>
+      <w:lvlText w:val=""/>
+      <w:lvlJc w:val="left"/>
+      <w:pPr>
+        <w:ind w:left="1640" w:hanging="360"/>
+      </w:pPr>
+      <w:rPr>
+        <w:rFonts w:ascii="Symbol" w:hAnsi="Symbol" w:hint="default"/>
+      </w:rPr>
+    </w:lvl>
+    <w:lvl w:ilvl="1" w:tplc="04090003" w:tentative="1">
+      <w:start w:val="1"/>
+      <w:numFmt w:val="bullet"/>
+      <w:lvlText w:val="o"/>
+      <w:lvlJc w:val="left"/>
+      <w:pPr>
+        <w:ind w:left="2360" w:hanging="360"/>
+      </w:pPr>
+      <w:rPr>
+        <w:rFonts w:ascii="Courier New" w:hAnsi="Courier New" w:cs="Courier New" w:hint="default"/>
+      </w:rPr>
+    </w:lvl>
+    <w:lvl w:ilvl="2" w:tplc="04090005" w:tentative="1">
+      <w:start w:val="1"/>
+      <w:numFmt w:val="bullet"/>
+      <w:lvlText w:val=""/>
+      <w:lvlJc w:val="left"/>
+      <w:pPr>
+        <w:ind w:left="3080" w:hanging="360"/>
+      </w:pPr>
+      <w:rPr>
+        <w:rFonts w:ascii="Wingdings" w:hAnsi="Wingdings" w:hint="default"/>
+      </w:rPr>
+    </w:lvl>
+    <w:lvl w:ilvl="3" w:tplc="04090001" w:tentative="1">
+      <w:start w:val="1"/>
+      <w:numFmt w:val="bullet"/>
+      <w:lvlText w:val=""/>
+      <w:lvlJc w:val="left"/>
+      <w:pPr>
+        <w:ind w:left="3800" w:hanging="360"/>
+      </w:pPr>
+      <w:rPr>
+        <w:rFonts w:ascii="Symbol" w:hAnsi="Symbol" w:hint="default"/>
+      </w:rPr>
+    </w:lvl>
+    <w:lvl w:ilvl="4" w:tplc="04090003" w:tentative="1">
+      <w:start w:val="1"/>
+      <w:numFmt w:val="bullet"/>
+      <w:lvlText w:val="o"/>
+      <w:lvlJc w:val="left"/>
+      <w:pPr>
+        <w:ind w:left="4520" w:hanging="360"/>
+      </w:pPr>
+      <w:rPr>
+        <w:rFonts w:ascii="Courier New" w:hAnsi="Courier New" w:cs="Courier New" w:hint="default"/>
+      </w:rPr>
+    </w:lvl>
+    <w:lvl w:ilvl="5" w:tplc="04090005" w:tentative="1">
+      <w:start w:val="1"/>
+      <w:numFmt w:val="bullet"/>
+      <w:lvlText w:val=""/>
+      <w:lvlJc w:val="left"/>
+      <w:pPr>
+        <w:ind w:left="5240" w:hanging="360"/>
+      </w:pPr>
+      <w:rPr>
+        <w:rFonts w:ascii="Wingdings" w:hAnsi="Wingdings" w:hint="default"/>
+      </w:rPr>
+    </w:lvl>
+    <w:lvl w:ilvl="6" w:tplc="04090001" w:tentative="1">
+      <w:start w:val="1"/>
+      <w:numFmt w:val="bullet"/>
+      <w:lvlText w:val=""/>
+      <w:lvlJc w:val="left"/>
+      <w:pPr>
+        <w:ind w:left="5960" w:hanging="360"/>
+      </w:pPr>
+      <w:rPr>
+        <w:rFonts w:ascii="Symbol" w:hAnsi="Symbol" w:hint="default"/>
+      </w:rPr>
+    </w:lvl>
+    <w:lvl w:ilvl="7" w:tplc="04090003" w:tentative="1">
+      <w:start w:val="1"/>
+      <w:numFmt w:val="bullet"/>
+      <w:lvlText w:val="o"/>
+      <w:lvlJc w:val="left"/>
+      <w:pPr>
+        <w:ind w:left="6680" w:hanging="360"/>
+      </w:pPr>
+      <w:rPr>
+        <w:rFonts w:ascii="Courier New" w:hAnsi="Courier New" w:cs="Courier New" w:hint="default"/>
+      </w:rPr>
+    </w:lvl>
+    <w:lvl w:ilvl="8" w:tplc="04090005" w:tentative="1">
+      <w:start w:val="1"/>
+      <w:numFmt w:val="bullet"/>
+      <w:lvlText w:val=""/>
+      <w:lvlJc w:val="left"/>
+      <w:pPr>
+        <w:ind w:left="7400" w:hanging="360"/>
+      </w:pPr>
+      <w:rPr>
+        <w:rFonts w:ascii="Wingdings" w:hAnsi="Wingdings" w:hint="default"/>
+      </w:rPr>
+    </w:lvl>
+  </w:abstractNum>
+  <w:abstractNum w:abstractNumId="10" w15:restartNumberingAfterBreak="0">
     <w:nsid w:val="4E9208C8"/>
     <w:multiLevelType w:val="hybridMultilevel"/>
     <w:tmpl w:val="054A6BDE"/>
@@ -10508,7 +12446,7 @@
       </w:rPr>
     </w:lvl>
   </w:abstractNum>
-  <w:abstractNum w:abstractNumId="8" w15:restartNumberingAfterBreak="0">
+  <w:abstractNum w:abstractNumId="11" w15:restartNumberingAfterBreak="0">
     <w:nsid w:val="50B90995"/>
     <w:multiLevelType w:val="hybridMultilevel"/>
     <w:tmpl w:val="F4EC91BE"/>
@@ -10597,7 +12535,7 @@
       </w:pPr>
     </w:lvl>
   </w:abstractNum>
-  <w:abstractNum w:abstractNumId="9" w15:restartNumberingAfterBreak="0">
+  <w:abstractNum w:abstractNumId="12" w15:restartNumberingAfterBreak="0">
     <w:nsid w:val="515E5162"/>
     <w:multiLevelType w:val="hybridMultilevel"/>
     <w:tmpl w:val="B216AA34"/>
@@ -10710,7 +12648,7 @@
       </w:rPr>
     </w:lvl>
   </w:abstractNum>
-  <w:abstractNum w:abstractNumId="10" w15:restartNumberingAfterBreak="0">
+  <w:abstractNum w:abstractNumId="13" w15:restartNumberingAfterBreak="0">
     <w:nsid w:val="533430E6"/>
     <w:multiLevelType w:val="hybridMultilevel"/>
     <w:tmpl w:val="05DE65C6"/>
@@ -10823,7 +12761,120 @@
       </w:rPr>
     </w:lvl>
   </w:abstractNum>
-  <w:abstractNum w:abstractNumId="11" w15:restartNumberingAfterBreak="0">
+  <w:abstractNum w:abstractNumId="14" w15:restartNumberingAfterBreak="0">
+    <w:nsid w:val="55BD7A99"/>
+    <w:multiLevelType w:val="hybridMultilevel"/>
+    <w:tmpl w:val="259C26B4"/>
+    <w:lvl w:ilvl="0" w:tplc="04090001">
+      <w:start w:val="1"/>
+      <w:numFmt w:val="bullet"/>
+      <w:lvlText w:val=""/>
+      <w:lvlJc w:val="left"/>
+      <w:pPr>
+        <w:ind w:left="1571" w:hanging="360"/>
+      </w:pPr>
+      <w:rPr>
+        <w:rFonts w:ascii="Symbol" w:hAnsi="Symbol" w:hint="default"/>
+      </w:rPr>
+    </w:lvl>
+    <w:lvl w:ilvl="1" w:tplc="04090003">
+      <w:start w:val="1"/>
+      <w:numFmt w:val="bullet"/>
+      <w:lvlText w:val="o"/>
+      <w:lvlJc w:val="left"/>
+      <w:pPr>
+        <w:ind w:left="2291" w:hanging="360"/>
+      </w:pPr>
+      <w:rPr>
+        <w:rFonts w:ascii="Courier New" w:hAnsi="Courier New" w:cs="Courier New" w:hint="default"/>
+      </w:rPr>
+    </w:lvl>
+    <w:lvl w:ilvl="2" w:tplc="04090005" w:tentative="1">
+      <w:start w:val="1"/>
+      <w:numFmt w:val="bullet"/>
+      <w:lvlText w:val=""/>
+      <w:lvlJc w:val="left"/>
+      <w:pPr>
+        <w:ind w:left="3011" w:hanging="360"/>
+      </w:pPr>
+      <w:rPr>
+        <w:rFonts w:ascii="Wingdings" w:hAnsi="Wingdings" w:hint="default"/>
+      </w:rPr>
+    </w:lvl>
+    <w:lvl w:ilvl="3" w:tplc="04090001" w:tentative="1">
+      <w:start w:val="1"/>
+      <w:numFmt w:val="bullet"/>
+      <w:lvlText w:val=""/>
+      <w:lvlJc w:val="left"/>
+      <w:pPr>
+        <w:ind w:left="3731" w:hanging="360"/>
+      </w:pPr>
+      <w:rPr>
+        <w:rFonts w:ascii="Symbol" w:hAnsi="Symbol" w:hint="default"/>
+      </w:rPr>
+    </w:lvl>
+    <w:lvl w:ilvl="4" w:tplc="04090003" w:tentative="1">
+      <w:start w:val="1"/>
+      <w:numFmt w:val="bullet"/>
+      <w:lvlText w:val="o"/>
+      <w:lvlJc w:val="left"/>
+      <w:pPr>
+        <w:ind w:left="4451" w:hanging="360"/>
+      </w:pPr>
+      <w:rPr>
+        <w:rFonts w:ascii="Courier New" w:hAnsi="Courier New" w:cs="Courier New" w:hint="default"/>
+      </w:rPr>
+    </w:lvl>
+    <w:lvl w:ilvl="5" w:tplc="04090005" w:tentative="1">
+      <w:start w:val="1"/>
+      <w:numFmt w:val="bullet"/>
+      <w:lvlText w:val=""/>
+      <w:lvlJc w:val="left"/>
+      <w:pPr>
+        <w:ind w:left="5171" w:hanging="360"/>
+      </w:pPr>
+      <w:rPr>
+        <w:rFonts w:ascii="Wingdings" w:hAnsi="Wingdings" w:hint="default"/>
+      </w:rPr>
+    </w:lvl>
+    <w:lvl w:ilvl="6" w:tplc="04090001" w:tentative="1">
+      <w:start w:val="1"/>
+      <w:numFmt w:val="bullet"/>
+      <w:lvlText w:val=""/>
+      <w:lvlJc w:val="left"/>
+      <w:pPr>
+        <w:ind w:left="5891" w:hanging="360"/>
+      </w:pPr>
+      <w:rPr>
+        <w:rFonts w:ascii="Symbol" w:hAnsi="Symbol" w:hint="default"/>
+      </w:rPr>
+    </w:lvl>
+    <w:lvl w:ilvl="7" w:tplc="04090003" w:tentative="1">
+      <w:start w:val="1"/>
+      <w:numFmt w:val="bullet"/>
+      <w:lvlText w:val="o"/>
+      <w:lvlJc w:val="left"/>
+      <w:pPr>
+        <w:ind w:left="6611" w:hanging="360"/>
+      </w:pPr>
+      <w:rPr>
+        <w:rFonts w:ascii="Courier New" w:hAnsi="Courier New" w:cs="Courier New" w:hint="default"/>
+      </w:rPr>
+    </w:lvl>
+    <w:lvl w:ilvl="8" w:tplc="04090005" w:tentative="1">
+      <w:start w:val="1"/>
+      <w:numFmt w:val="bullet"/>
+      <w:lvlText w:val=""/>
+      <w:lvlJc w:val="left"/>
+      <w:pPr>
+        <w:ind w:left="7331" w:hanging="360"/>
+      </w:pPr>
+      <w:rPr>
+        <w:rFonts w:ascii="Wingdings" w:hAnsi="Wingdings" w:hint="default"/>
+      </w:rPr>
+    </w:lvl>
+  </w:abstractNum>
+  <w:abstractNum w:abstractNumId="15" w15:restartNumberingAfterBreak="0">
     <w:nsid w:val="5729116B"/>
     <w:multiLevelType w:val="hybridMultilevel"/>
     <w:tmpl w:val="BB74E996"/>
@@ -10936,7 +12987,7 @@
       </w:rPr>
     </w:lvl>
   </w:abstractNum>
-  <w:abstractNum w:abstractNumId="12" w15:restartNumberingAfterBreak="0">
+  <w:abstractNum w:abstractNumId="16" w15:restartNumberingAfterBreak="0">
     <w:nsid w:val="584223CC"/>
     <w:multiLevelType w:val="hybridMultilevel"/>
     <w:tmpl w:val="15AE2CB0"/>
@@ -11049,7 +13100,7 @@
       </w:rPr>
     </w:lvl>
   </w:abstractNum>
-  <w:abstractNum w:abstractNumId="13" w15:restartNumberingAfterBreak="0">
+  <w:abstractNum w:abstractNumId="17" w15:restartNumberingAfterBreak="0">
     <w:nsid w:val="5A3C6B9D"/>
     <w:multiLevelType w:val="hybridMultilevel"/>
     <w:tmpl w:val="8A963DA4"/>
@@ -11162,7 +13213,7 @@
       </w:rPr>
     </w:lvl>
   </w:abstractNum>
-  <w:abstractNum w:abstractNumId="14" w15:restartNumberingAfterBreak="0">
+  <w:abstractNum w:abstractNumId="18" w15:restartNumberingAfterBreak="0">
     <w:nsid w:val="6C2F091E"/>
     <w:multiLevelType w:val="hybridMultilevel"/>
     <w:tmpl w:val="0E44B9C4"/>
@@ -11275,7 +13326,120 @@
       </w:rPr>
     </w:lvl>
   </w:abstractNum>
-  <w:abstractNum w:abstractNumId="15" w15:restartNumberingAfterBreak="0">
+  <w:abstractNum w:abstractNumId="19" w15:restartNumberingAfterBreak="0">
+    <w:nsid w:val="6E7A0604"/>
+    <w:multiLevelType w:val="hybridMultilevel"/>
+    <w:tmpl w:val="03EA74EE"/>
+    <w:lvl w:ilvl="0" w:tplc="04090001">
+      <w:start w:val="1"/>
+      <w:numFmt w:val="bullet"/>
+      <w:lvlText w:val=""/>
+      <w:lvlJc w:val="left"/>
+      <w:pPr>
+        <w:ind w:left="1571" w:hanging="360"/>
+      </w:pPr>
+      <w:rPr>
+        <w:rFonts w:ascii="Symbol" w:hAnsi="Symbol" w:hint="default"/>
+      </w:rPr>
+    </w:lvl>
+    <w:lvl w:ilvl="1" w:tplc="04090003">
+      <w:start w:val="1"/>
+      <w:numFmt w:val="bullet"/>
+      <w:lvlText w:val="o"/>
+      <w:lvlJc w:val="left"/>
+      <w:pPr>
+        <w:ind w:left="2291" w:hanging="360"/>
+      </w:pPr>
+      <w:rPr>
+        <w:rFonts w:ascii="Courier New" w:hAnsi="Courier New" w:cs="Courier New" w:hint="default"/>
+      </w:rPr>
+    </w:lvl>
+    <w:lvl w:ilvl="2" w:tplc="04090005" w:tentative="1">
+      <w:start w:val="1"/>
+      <w:numFmt w:val="bullet"/>
+      <w:lvlText w:val=""/>
+      <w:lvlJc w:val="left"/>
+      <w:pPr>
+        <w:ind w:left="3011" w:hanging="360"/>
+      </w:pPr>
+      <w:rPr>
+        <w:rFonts w:ascii="Wingdings" w:hAnsi="Wingdings" w:hint="default"/>
+      </w:rPr>
+    </w:lvl>
+    <w:lvl w:ilvl="3" w:tplc="04090001" w:tentative="1">
+      <w:start w:val="1"/>
+      <w:numFmt w:val="bullet"/>
+      <w:lvlText w:val=""/>
+      <w:lvlJc w:val="left"/>
+      <w:pPr>
+        <w:ind w:left="3731" w:hanging="360"/>
+      </w:pPr>
+      <w:rPr>
+        <w:rFonts w:ascii="Symbol" w:hAnsi="Symbol" w:hint="default"/>
+      </w:rPr>
+    </w:lvl>
+    <w:lvl w:ilvl="4" w:tplc="04090003" w:tentative="1">
+      <w:start w:val="1"/>
+      <w:numFmt w:val="bullet"/>
+      <w:lvlText w:val="o"/>
+      <w:lvlJc w:val="left"/>
+      <w:pPr>
+        <w:ind w:left="4451" w:hanging="360"/>
+      </w:pPr>
+      <w:rPr>
+        <w:rFonts w:ascii="Courier New" w:hAnsi="Courier New" w:cs="Courier New" w:hint="default"/>
+      </w:rPr>
+    </w:lvl>
+    <w:lvl w:ilvl="5" w:tplc="04090005" w:tentative="1">
+      <w:start w:val="1"/>
+      <w:numFmt w:val="bullet"/>
+      <w:lvlText w:val=""/>
+      <w:lvlJc w:val="left"/>
+      <w:pPr>
+        <w:ind w:left="5171" w:hanging="360"/>
+      </w:pPr>
+      <w:rPr>
+        <w:rFonts w:ascii="Wingdings" w:hAnsi="Wingdings" w:hint="default"/>
+      </w:rPr>
+    </w:lvl>
+    <w:lvl w:ilvl="6" w:tplc="04090001" w:tentative="1">
+      <w:start w:val="1"/>
+      <w:numFmt w:val="bullet"/>
+      <w:lvlText w:val=""/>
+      <w:lvlJc w:val="left"/>
+      <w:pPr>
+        <w:ind w:left="5891" w:hanging="360"/>
+      </w:pPr>
+      <w:rPr>
+        <w:rFonts w:ascii="Symbol" w:hAnsi="Symbol" w:hint="default"/>
+      </w:rPr>
+    </w:lvl>
+    <w:lvl w:ilvl="7" w:tplc="04090003" w:tentative="1">
+      <w:start w:val="1"/>
+      <w:numFmt w:val="bullet"/>
+      <w:lvlText w:val="o"/>
+      <w:lvlJc w:val="left"/>
+      <w:pPr>
+        <w:ind w:left="6611" w:hanging="360"/>
+      </w:pPr>
+      <w:rPr>
+        <w:rFonts w:ascii="Courier New" w:hAnsi="Courier New" w:cs="Courier New" w:hint="default"/>
+      </w:rPr>
+    </w:lvl>
+    <w:lvl w:ilvl="8" w:tplc="04090005" w:tentative="1">
+      <w:start w:val="1"/>
+      <w:numFmt w:val="bullet"/>
+      <w:lvlText w:val=""/>
+      <w:lvlJc w:val="left"/>
+      <w:pPr>
+        <w:ind w:left="7331" w:hanging="360"/>
+      </w:pPr>
+      <w:rPr>
+        <w:rFonts w:ascii="Wingdings" w:hAnsi="Wingdings" w:hint="default"/>
+      </w:rPr>
+    </w:lvl>
+  </w:abstractNum>
+  <w:abstractNum w:abstractNumId="20" w15:restartNumberingAfterBreak="0">
     <w:nsid w:val="7C2F5FFD"/>
     <w:multiLevelType w:val="hybridMultilevel"/>
     <w:tmpl w:val="7C0C3FE6"/>
@@ -11389,52 +13553,67 @@
     </w:lvl>
   </w:abstractNum>
   <w:num w:numId="1" w16cid:durableId="1045522712">
+    <w:abstractNumId w:val="11"/>
+  </w:num>
+  <w:num w:numId="2" w16cid:durableId="1914701475">
+    <w:abstractNumId w:val="2"/>
+  </w:num>
+  <w:num w:numId="3" w16cid:durableId="1264529151">
+    <w:abstractNumId w:val="6"/>
+  </w:num>
+  <w:num w:numId="4" w16cid:durableId="1411461418">
+    <w:abstractNumId w:val="10"/>
+  </w:num>
+  <w:num w:numId="5" w16cid:durableId="185103095">
     <w:abstractNumId w:val="8"/>
   </w:num>
-  <w:num w:numId="2" w16cid:durableId="1914701475">
-    <w:abstractNumId w:val="1"/>
-  </w:num>
-  <w:num w:numId="3" w16cid:durableId="1264529151">
-    <w:abstractNumId w:val="4"/>
-  </w:num>
-  <w:num w:numId="4" w16cid:durableId="1411461418">
-    <w:abstractNumId w:val="7"/>
-  </w:num>
-  <w:num w:numId="5" w16cid:durableId="185103095">
-    <w:abstractNumId w:val="6"/>
-  </w:num>
   <w:num w:numId="6" w16cid:durableId="1852379492">
-    <w:abstractNumId w:val="12"/>
+    <w:abstractNumId w:val="16"/>
   </w:num>
   <w:num w:numId="7" w16cid:durableId="1846623942">
     <w:abstractNumId w:val="0"/>
   </w:num>
   <w:num w:numId="8" w16cid:durableId="385762116">
-    <w:abstractNumId w:val="11"/>
+    <w:abstractNumId w:val="15"/>
   </w:num>
   <w:num w:numId="9" w16cid:durableId="1558129866">
-    <w:abstractNumId w:val="15"/>
+    <w:abstractNumId w:val="20"/>
   </w:num>
   <w:num w:numId="10" w16cid:durableId="1390153760">
+    <w:abstractNumId w:val="17"/>
+  </w:num>
+  <w:num w:numId="11" w16cid:durableId="94328686">
+    <w:abstractNumId w:val="12"/>
+  </w:num>
+  <w:num w:numId="12" w16cid:durableId="1291398037">
+    <w:abstractNumId w:val="5"/>
+  </w:num>
+  <w:num w:numId="13" w16cid:durableId="1274365881">
+    <w:abstractNumId w:val="7"/>
+  </w:num>
+  <w:num w:numId="14" w16cid:durableId="569733674">
     <w:abstractNumId w:val="13"/>
   </w:num>
-  <w:num w:numId="11" w16cid:durableId="94328686">
+  <w:num w:numId="15" w16cid:durableId="1075132196">
+    <w:abstractNumId w:val="3"/>
+  </w:num>
+  <w:num w:numId="16" w16cid:durableId="1985357084">
+    <w:abstractNumId w:val="18"/>
+  </w:num>
+  <w:num w:numId="17" w16cid:durableId="1594624175">
+    <w:abstractNumId w:val="14"/>
+  </w:num>
+  <w:num w:numId="18" w16cid:durableId="342826157">
     <w:abstractNumId w:val="9"/>
   </w:num>
-  <w:num w:numId="12" w16cid:durableId="1291398037">
-    <w:abstractNumId w:val="3"/>
+  <w:num w:numId="19" w16cid:durableId="1603105666">
+    <w:abstractNumId w:val="1"/>
   </w:num>
-  <w:num w:numId="13" w16cid:durableId="1274365881">
-    <w:abstractNumId w:val="5"/>
+  <w:num w:numId="20" w16cid:durableId="376051927">
+    <w:abstractNumId w:val="4"/>
   </w:num>
-  <w:num w:numId="14" w16cid:durableId="569733674">
-    <w:abstractNumId w:val="10"/>
-  </w:num>
-  <w:num w:numId="15" w16cid:durableId="1075132196">
-    <w:abstractNumId w:val="2"/>
-  </w:num>
-  <w:num w:numId="16" w16cid:durableId="1985357084">
-    <w:abstractNumId w:val="14"/>
+  <w:num w:numId="21" w16cid:durableId="1478108798">
+    <w:abstractNumId w:val="19"/>
   </w:num>
 </w:numbering>
 </file>
@@ -12045,7 +14224,6 @@
   <w:style w:type="character" w:default="1" w:styleId="DefaultParagraphFont">
     <w:name w:val="Default Paragraph Font"/>
     <w:uiPriority w:val="1"/>
-    <w:semiHidden/>
     <w:unhideWhenUsed/>
   </w:style>
   <w:style w:type="table" w:default="1" w:styleId="TableNormal">

</xml_diff>